<commit_message>
Přidání fighters do administrace
</commit_message>
<xml_diff>
--- a/bp_svobo229_v2.docx
+++ b/bp_svobo229_v2.docx
@@ -510,7 +510,7 @@
           <v:shape id="_x0000_i1025" type="#_x0000_t75" style="width:446.25pt;height:479.25pt" o:ole="">
             <v:imagedata r:id="rId12" o:title=""/>
           </v:shape>
-          <o:OLEObject Type="Embed" ProgID="Word.Document.12" ShapeID="_x0000_i1025" DrawAspect="Content" ObjectID="_1831999561" r:id="rId13">
+          <o:OLEObject Type="Embed" ProgID="Word.Document.12" ShapeID="_x0000_i1025" DrawAspect="Content" ObjectID="_1833101272" r:id="rId13">
             <o:FieldCodes>\s</o:FieldCodes>
           </o:OLEObject>
         </w:object>
@@ -6588,6 +6588,9 @@
       <w:r>
         <w:t>Kapitola pojednává o návrhu uživatelského prostředí, popisu uživatelských rolí, které budou se samotnou webovou stránkou interagovat a v neposlední řadě kapitola obsahuje návrh databáze, která bude zajišťovat práci s daty.</w:t>
       </w:r>
+      <w:r>
+        <w:t xml:space="preserve"> </w:t>
+      </w:r>
     </w:p>
     <w:p/>
     <w:p>
@@ -6613,6 +6616,9 @@
       </w:r>
       <w:r>
         <w:t xml:space="preserve">. Celé uživatelské prostředí bude vytvořeno v minimalistickém stylu, který pomůže přehlednosti webových stránek. </w:t>
+      </w:r>
+      <w:r>
+        <w:t>Důraz dále bude kladen na responzivitu webu, aby bylo možné web plnohodnotně zobrazit na jakémkoliv zařízení</w:t>
       </w:r>
     </w:p>
     <w:p/>
@@ -6669,6 +6675,7 @@
     <w:p/>
     <w:p>
       <w:r>
+        <w:lastRenderedPageBreak/>
         <w:t>Návrh toho jak bude vypadat závodník… Bude mít své id, profile_pic, jméno, příjmení, datum narození, login, heslo, id_role, id_pasku</w:t>
       </w:r>
       <w:r>
@@ -6716,6 +6723,22 @@
     <w:p>
       <w:r>
         <w:t>Struktura mého projektu  - vysvětlení proč co kde je, komponenty které se často opakují jsou ve složce components a ty které jsou unikátní jsou ve složce pro danou stránku</w:t>
+      </w:r>
+    </w:p>
+    <w:p/>
+    <w:p/>
+    <w:p/>
+    <w:p>
+      <w:pPr>
+        <w:pStyle w:val="Nadpis2"/>
+      </w:pPr>
+      <w:r>
+        <w:t>Struktura projektu</w:t>
+      </w:r>
+    </w:p>
+    <w:p>
+      <w:r>
+        <w:t>Projekt obsahuje dvě hlavní složky konkrétně se jedná o složky Frontend a Backend. Frontend složka obsahuje několik podsložek (node_modules, public, src)</w:t>
       </w:r>
     </w:p>
     <w:p>
@@ -13528,6 +13551,7 @@
     <w:rsid w:val="002173EE"/>
     <w:rsid w:val="0023678F"/>
     <w:rsid w:val="00246DA7"/>
+    <w:rsid w:val="002470A6"/>
     <w:rsid w:val="00256898"/>
     <w:rsid w:val="002708F3"/>
     <w:rsid w:val="002E68DF"/>
@@ -13577,6 +13601,7 @@
     <w:rsid w:val="00EB3F8A"/>
     <w:rsid w:val="00F73B1B"/>
     <w:rsid w:val="00FC053B"/>
+    <w:rsid w:val="00FE0195"/>
   </w:rsids>
   <m:mathPr>
     <m:mathFont m:val="Cambria Math"/>
@@ -14347,7 +14372,9 @@
 </file>
 
 <file path=customXml/item3.xml><?xml version="1.0" encoding="utf-8"?>
-<b:Sources xmlns:b="http://schemas.openxmlformats.org/officeDocument/2006/bibliography" xmlns="http://schemas.openxmlformats.org/officeDocument/2006/bibliography" SelectedStyle="\APASixthEditionOfficeOnline.xsl" StyleName="APA" Version="6"/>
+<p:properties xmlns:p="http://schemas.microsoft.com/office/2006/metadata/properties" xmlns:xsi="http://www.w3.org/2001/XMLSchema-instance" xmlns:pc="http://schemas.microsoft.com/office/infopath/2007/PartnerControls">
+  <documentManagement/>
+</p:properties>
 </file>
 
 <file path=customXml/item4.xml><?xml version="1.0" encoding="utf-8"?>
@@ -14483,9 +14510,7 @@
 </file>
 
 <file path=customXml/item5.xml><?xml version="1.0" encoding="utf-8"?>
-<p:properties xmlns:p="http://schemas.microsoft.com/office/2006/metadata/properties" xmlns:xsi="http://www.w3.org/2001/XMLSchema-instance" xmlns:pc="http://schemas.microsoft.com/office/infopath/2007/PartnerControls">
-  <documentManagement/>
-</p:properties>
+<b:Sources xmlns:b="http://schemas.openxmlformats.org/officeDocument/2006/bibliography" xmlns="http://schemas.openxmlformats.org/officeDocument/2006/bibliography" SelectedStyle="\APASixthEditionOfficeOnline.xsl" StyleName="APA" Version="6"/>
 </file>
 
 <file path=customXml/itemProps1.xml><?xml version="1.0" encoding="utf-8"?>
@@ -14505,9 +14530,10 @@
 </file>
 
 <file path=customXml/itemProps3.xml><?xml version="1.0" encoding="utf-8"?>
-<ds:datastoreItem xmlns:ds="http://schemas.openxmlformats.org/officeDocument/2006/customXml" ds:itemID="{016BB16A-1E0F-4115-AADC-10D5070CD6B8}">
+<ds:datastoreItem xmlns:ds="http://schemas.openxmlformats.org/officeDocument/2006/customXml" ds:itemID="{EDE7D767-2E0D-494D-8433-FAEBD4A37F8E}">
   <ds:schemaRefs>
-    <ds:schemaRef ds:uri="http://schemas.openxmlformats.org/officeDocument/2006/bibliography"/>
+    <ds:schemaRef ds:uri="http://schemas.microsoft.com/office/2006/metadata/properties"/>
+    <ds:schemaRef ds:uri="http://schemas.microsoft.com/office/infopath/2007/PartnerControls"/>
   </ds:schemaRefs>
 </ds:datastoreItem>
 </file>
@@ -14531,10 +14557,9 @@
 </file>
 
 <file path=customXml/itemProps5.xml><?xml version="1.0" encoding="utf-8"?>
-<ds:datastoreItem xmlns:ds="http://schemas.openxmlformats.org/officeDocument/2006/customXml" ds:itemID="{EDE7D767-2E0D-494D-8433-FAEBD4A37F8E}">
+<ds:datastoreItem xmlns:ds="http://schemas.openxmlformats.org/officeDocument/2006/customXml" ds:itemID="{016BB16A-1E0F-4115-AADC-10D5070CD6B8}">
   <ds:schemaRefs>
-    <ds:schemaRef ds:uri="http://schemas.microsoft.com/office/2006/metadata/properties"/>
-    <ds:schemaRef ds:uri="http://schemas.microsoft.com/office/infopath/2007/PartnerControls"/>
+    <ds:schemaRef ds:uri="http://schemas.openxmlformats.org/officeDocument/2006/bibliography"/>
   </ds:schemaRefs>
 </ds:datastoreItem>
 </file>
</xml_diff>

<commit_message>
Nová db, praktická část
</commit_message>
<xml_diff>
--- a/bp_svobo229_v2.docx
+++ b/bp_svobo229_v2.docx
@@ -510,7 +510,7 @@
           <v:shape id="_x0000_i1025" type="#_x0000_t75" style="width:446.25pt;height:479.25pt" o:ole="">
             <v:imagedata r:id="rId12" o:title=""/>
           </v:shape>
-          <o:OLEObject Type="Embed" ProgID="Word.Document.12" ShapeID="_x0000_i1025" DrawAspect="Content" ObjectID="_1833101272" r:id="rId13">
+          <o:OLEObject Type="Embed" ProgID="Word.Document.12" ShapeID="_x0000_i1025" DrawAspect="Content" ObjectID="_1833213113" r:id="rId13">
             <o:FieldCodes>\s</o:FieldCodes>
           </o:OLEObject>
         </w:object>
@@ -6663,27 +6663,82 @@
         <w:t xml:space="preserve">Pro správnou funkcionalitu webových stránek je potřeba navrhnout kvalitní a dobře strukturovanou databázi, která bude popsána v této sekci. Pro samotný návrh jsem využíval webovou </w:t>
       </w:r>
       <w:r>
-        <w:t>stránku dbdiagram, ve které jsem si specifikoval všechny potřebné entity a vazby mezi nimi.</w:t>
+        <w:t xml:space="preserve">stránku </w:t>
+      </w:r>
+      <w:proofErr w:type="spellStart"/>
+      <w:r>
+        <w:t>dbdiagram</w:t>
+      </w:r>
+      <w:proofErr w:type="spellEnd"/>
+      <w:r>
+        <w:t>, ve které jsem si specifikoval všechny potřebné entity a vazby mezi nimi.</w:t>
       </w:r>
     </w:p>
     <w:p/>
     <w:p>
       <w:r>
-        <w:t>První tabulka byla tabulka uživatelů, která vycházela z kapitoly o uživatelských rolích. V této entitě bylo potřeba vytvořit login, password</w:t>
-      </w:r>
+        <w:t xml:space="preserve">První tabulka byla tabulka uživatelů, která vycházela z kapitoly o uživatelských rolích. V této entitě bylo potřeba vytvořit login, </w:t>
+      </w:r>
+      <w:proofErr w:type="spellStart"/>
+      <w:r>
+        <w:t>password</w:t>
+      </w:r>
+      <w:proofErr w:type="spellEnd"/>
     </w:p>
     <w:p/>
     <w:p>
       <w:r>
         <w:lastRenderedPageBreak/>
-        <w:t>Návrh toho jak bude vypadat závodník… Bude mít své id, profile_pic, jméno, příjmení, datum narození, login, heslo, id_role, id_pasku</w:t>
-      </w:r>
-      <w:r>
-        <w:t xml:space="preserve"> a úspěch (m:n)</w:t>
-      </w:r>
-      <w:r>
-        <w:t>, váha, best, legend, active</w:t>
-      </w:r>
+        <w:t xml:space="preserve">Návrh toho jak bude vypadat závodník… Bude mít své id, </w:t>
+      </w:r>
+      <w:proofErr w:type="spellStart"/>
+      <w:r>
+        <w:t>profile_pic</w:t>
+      </w:r>
+      <w:proofErr w:type="spellEnd"/>
+      <w:r>
+        <w:t xml:space="preserve">, jméno, příjmení, datum narození, login, heslo, </w:t>
+      </w:r>
+      <w:proofErr w:type="spellStart"/>
+      <w:r>
+        <w:t>id_role</w:t>
+      </w:r>
+      <w:proofErr w:type="spellEnd"/>
+      <w:r>
+        <w:t xml:space="preserve">, </w:t>
+      </w:r>
+      <w:proofErr w:type="spellStart"/>
+      <w:r>
+        <w:t>id_pasku</w:t>
+      </w:r>
+      <w:proofErr w:type="spellEnd"/>
+      <w:r>
+        <w:t xml:space="preserve"> a úspěch (</w:t>
+      </w:r>
+      <w:proofErr w:type="spellStart"/>
+      <w:r>
+        <w:t>m:n</w:t>
+      </w:r>
+      <w:proofErr w:type="spellEnd"/>
+      <w:r>
+        <w:t>)</w:t>
+      </w:r>
+      <w:r>
+        <w:t xml:space="preserve">, váha, </w:t>
+      </w:r>
+      <w:proofErr w:type="spellStart"/>
+      <w:r>
+        <w:t>best</w:t>
+      </w:r>
+      <w:proofErr w:type="spellEnd"/>
+      <w:r>
+        <w:t xml:space="preserve">, legend, </w:t>
+      </w:r>
+      <w:proofErr w:type="spellStart"/>
+      <w:r>
+        <w:t>active</w:t>
+      </w:r>
+      <w:proofErr w:type="spellEnd"/>
     </w:p>
     <w:p/>
     <w:p>
@@ -6722,25 +6777,245 @@
     </w:p>
     <w:p>
       <w:r>
-        <w:t>Struktura mého projektu  - vysvětlení proč co kde je, komponenty které se často opakují jsou ve složce components a ty které jsou unikátní jsou ve složce pro danou stránku</w:t>
+        <w:t xml:space="preserve">Struktura mého projektu  - vysvětlení proč co kde je, komponenty které se často opakují jsou ve složce </w:t>
+      </w:r>
+      <w:proofErr w:type="spellStart"/>
+      <w:r>
+        <w:t>components</w:t>
+      </w:r>
+      <w:proofErr w:type="spellEnd"/>
+      <w:r>
+        <w:t xml:space="preserve"> a ty které jsou unikátní jsou ve složce pro danou stránku</w:t>
       </w:r>
     </w:p>
     <w:p/>
+    <w:p>
+      <w:pPr>
+        <w:pStyle w:val="Nadpis2"/>
+      </w:pPr>
+      <w:r>
+        <w:t>Uživatelské role</w:t>
+      </w:r>
+    </w:p>
+    <w:p>
+      <w:r>
+        <w:t xml:space="preserve">Nové řešení bude obsahovat 3 typy uživatelských účtů. Každý typ </w:t>
+      </w:r>
+      <w:r>
+        <w:t>bude mít své pravomoce na základě kterých bude moci s nově navrženým systémem interagovat</w:t>
+      </w:r>
+      <w:r>
+        <w:t xml:space="preserve">. Mezi tyto role patří administrátor, trenér, závodník. S webovou stránkou bude moci interagovat i běžný návštěvník, avšak </w:t>
+      </w:r>
+      <w:r>
+        <w:t>nebude mít přístup do administrace či nebude mít možnost přihlašovat se na různé turnaje nebo zkoušky.</w:t>
+      </w:r>
+      <w:r>
+        <w:t xml:space="preserve"> Definování uživatelských rolí je velmi důležitým </w:t>
+      </w:r>
+      <w:r>
+        <w:t>aspektem,</w:t>
+      </w:r>
+      <w:r>
+        <w:t xml:space="preserve"> který slouží k jasnému stanovení pravomocí a možností jednotlivých uživatelů a díky jemuž </w:t>
+      </w:r>
+      <w:r>
+        <w:t>nebudou mít neoprávněné uživatelské účty přístup do administrace</w:t>
+      </w:r>
+    </w:p>
     <w:p/>
+    <w:p>
+      <w:r>
+        <w:rPr>
+          <w:b/>
+          <w:bCs/>
+        </w:rPr>
+        <w:t>Administrátor</w:t>
+      </w:r>
+      <w:r>
+        <w:t xml:space="preserve"> – role disponující nejvyššími pravomocemi</w:t>
+      </w:r>
+      <w:r>
+        <w:t>, administrátor má plnou kontrolu nad webem, může přidávat, mazat a upravovat závody, zkoušky, aktuality. Pracovat s bannery, odkazy</w:t>
+      </w:r>
+      <w:r>
+        <w:t xml:space="preserve">, </w:t>
+      </w:r>
+      <w:r>
+        <w:t>sponzory</w:t>
+      </w:r>
+      <w:r>
+        <w:t xml:space="preserve"> a v neposlední řadě má přístup ke všem uživatelským účtům a rolím. </w:t>
+      </w:r>
+    </w:p>
+    <w:p>
+      <w:r>
+        <w:rPr>
+          <w:b/>
+          <w:bCs/>
+        </w:rPr>
+        <w:t>Trenér</w:t>
+      </w:r>
+      <w:r>
+        <w:t xml:space="preserve"> – </w:t>
+      </w:r>
+      <w:r>
+        <w:t xml:space="preserve">  může přidávat, mazat a upravovat závody, zkoušky, aktuality</w:t>
+      </w:r>
+      <w:r>
+        <w:t xml:space="preserve">, upravovat uživatelům technické stupně pásu, přidávat úspěchy, ocenění, měnit jejich stav a přidávat uživatelům roli trenér – nikoli vyšší </w:t>
+      </w:r>
+      <w:r>
+        <w:t>roli,</w:t>
+      </w:r>
+      <w:r>
+        <w:t xml:space="preserve"> jak mají oni sami.</w:t>
+      </w:r>
+    </w:p>
+    <w:p>
+      <w:r>
+        <w:rPr>
+          <w:b/>
+          <w:bCs/>
+        </w:rPr>
+        <w:t>Závodník</w:t>
+      </w:r>
+      <w:r>
+        <w:t xml:space="preserve"> </w:t>
+      </w:r>
+      <w:r>
+        <w:t>–</w:t>
+      </w:r>
+      <w:r>
+        <w:t xml:space="preserve"> </w:t>
+      </w:r>
+      <w:r>
+        <w:t xml:space="preserve">po vytvoření a schválení uživatelského účtu se může závodník přihlásit </w:t>
+      </w:r>
+      <w:r>
+        <w:t>na závody a zkoušky. Může si upravit informace týkající se jeho účtu</w:t>
+      </w:r>
+      <w:r>
+        <w:t xml:space="preserve"> jako je například emailová adresa, telefonní číslo, heslo nebo aktuální váhová kategorie, která je velmi důležitým aspektem při přihlašování se na zkoušky. Uživatelé s tímto oprávněním samozřejmě budou mít také přístup k</w:t>
+      </w:r>
+      <w:r>
+        <w:t xml:space="preserve"> webov</w:t>
+      </w:r>
+      <w:r>
+        <w:t>ým</w:t>
+      </w:r>
+      <w:r>
+        <w:t xml:space="preserve"> stránk</w:t>
+      </w:r>
+      <w:r>
+        <w:t>ám</w:t>
+      </w:r>
+      <w:r>
+        <w:t xml:space="preserve"> jako běžný návštěvník.</w:t>
+      </w:r>
+    </w:p>
+    <w:p>
+      <w:r>
+        <w:rPr>
+          <w:b/>
+          <w:bCs/>
+        </w:rPr>
+        <w:t>Návštěvník</w:t>
+      </w:r>
+      <w:r>
+        <w:t xml:space="preserve"> – návštěvník webu může procházet a interagovat se všemi částmi webu, které nejsou schované za administrací. Může si procházet aktuality, podívat se na informace týkající se oddílu, nastudovat si sestavy potřebné k úspěšnému zvládnutí zkoušek na vyšší </w:t>
+      </w:r>
+      <w:r>
+        <w:t xml:space="preserve">technický </w:t>
+      </w:r>
+      <w:r>
+        <w:t>stupeň pásu. Prohlédnout si závodníky oddílu, podívat se v jakých prostorách oddíl najde a v případě zájmu si podat přihlášku.</w:t>
+      </w:r>
+    </w:p>
+    <w:p>
+      <w:pPr>
+        <w:pStyle w:val="Nadpis2"/>
+      </w:pPr>
+      <w:r>
+        <w:lastRenderedPageBreak/>
+        <w:t>Frontend</w:t>
+      </w:r>
+    </w:p>
+    <w:p>
+      <w:r>
+        <w:t>Část frontendu byla realizována pomocí Java skriptového frameworku React a stylována CSS frameworkem TailwindCSS. Frontend má jasnou strukturu a představuje tu část, kterou samotný uživatel při interakci s webem vidí.</w:t>
+      </w:r>
+    </w:p>
+    <w:p>
+      <w:pPr>
+        <w:pStyle w:val="Nadpis3"/>
+      </w:pPr>
+      <w:r>
+        <w:t>Struktura frontendu</w:t>
+      </w:r>
+    </w:p>
+    <w:p>
+      <w:r>
+        <w:t>Projekt obsahuje dvě hlavní složky konkrétně se jedná o složky Frontend a Backend. Frontend složka obsahuje několik podsložek (</w:t>
+      </w:r>
+      <w:proofErr w:type="spellStart"/>
+      <w:r>
+        <w:t>node_modules</w:t>
+      </w:r>
+      <w:proofErr w:type="spellEnd"/>
+      <w:r>
+        <w:t xml:space="preserve">, public, </w:t>
+      </w:r>
+      <w:proofErr w:type="spellStart"/>
+      <w:r>
+        <w:t>src</w:t>
+      </w:r>
+      <w:proofErr w:type="spellEnd"/>
+      <w:r>
+        <w:t>)</w:t>
+      </w:r>
+    </w:p>
     <w:p/>
     <w:p>
       <w:pPr>
         <w:pStyle w:val="Nadpis2"/>
       </w:pPr>
       <w:r>
-        <w:t>Struktura projektu</w:t>
-      </w:r>
-    </w:p>
-    <w:p>
-      <w:r>
-        <w:t>Projekt obsahuje dvě hlavní složky konkrétně se jedná o složky Frontend a Backend. Frontend složka obsahuje několik podsložek (node_modules, public, src)</w:t>
-      </w:r>
-    </w:p>
+        <w:t>Backend</w:t>
+      </w:r>
+    </w:p>
+    <w:p>
+      <w:proofErr w:type="spellStart"/>
+      <w:r>
+        <w:t>Backendová</w:t>
+      </w:r>
+      <w:proofErr w:type="spellEnd"/>
+      <w:r>
+        <w:t xml:space="preserve"> část je postavena na JavaScriptovém </w:t>
+      </w:r>
+      <w:proofErr w:type="spellStart"/>
+      <w:r>
+        <w:t>enginu</w:t>
+      </w:r>
+      <w:proofErr w:type="spellEnd"/>
+      <w:r>
+        <w:t xml:space="preserve"> NodeJS. Ve složkách se nachází důležité soubory, které se starají o zabezpečení webu, navigaci a o výpis informací z databáze.</w:t>
+      </w:r>
+    </w:p>
+    <w:p>
+      <w:pPr>
+        <w:pStyle w:val="Nadpis3"/>
+      </w:pPr>
+      <w:r>
+        <w:t xml:space="preserve">Struktura </w:t>
+      </w:r>
+      <w:proofErr w:type="spellStart"/>
+      <w:r>
+        <w:t>backendu</w:t>
+      </w:r>
+      <w:proofErr w:type="spellEnd"/>
+    </w:p>
+    <w:p/>
     <w:p>
       <w:pPr>
         <w:pStyle w:val="Nadpis1"/>
@@ -6831,7 +7106,23 @@
         </w:numPr>
       </w:pPr>
       <w:r>
-        <w:t>Víc to rozepiš, excel export, nějaký zálohy, výpis/smlouvy pomocí .docx šablon jako jsi dělal ve Webrexu.</w:t>
+        <w:t>Víc to rozepiš, excel export, nějaký zálohy, výpis/smlouvy pomocí .</w:t>
+      </w:r>
+      <w:proofErr w:type="spellStart"/>
+      <w:r>
+        <w:t>docx</w:t>
+      </w:r>
+      <w:proofErr w:type="spellEnd"/>
+      <w:r>
+        <w:t xml:space="preserve"> šablon jako jsi dělal ve </w:t>
+      </w:r>
+      <w:proofErr w:type="spellStart"/>
+      <w:r>
+        <w:t>Webrexu</w:t>
+      </w:r>
+      <w:proofErr w:type="spellEnd"/>
+      <w:r>
+        <w:t>.</w:t>
       </w:r>
     </w:p>
     <w:p>
@@ -13572,6 +13863,7 @@
     <w:rsid w:val="006944B7"/>
     <w:rsid w:val="006A772E"/>
     <w:rsid w:val="00735BCF"/>
+    <w:rsid w:val="00822174"/>
     <w:rsid w:val="00892C81"/>
     <w:rsid w:val="008A243F"/>
     <w:rsid w:val="008A35E0"/>
@@ -13582,6 +13874,7 @@
     <w:rsid w:val="009A542B"/>
     <w:rsid w:val="00A21386"/>
     <w:rsid w:val="00A274E2"/>
+    <w:rsid w:val="00A43524"/>
     <w:rsid w:val="00A50638"/>
     <w:rsid w:val="00A766F6"/>
     <w:rsid w:val="00B50241"/>
@@ -14372,9 +14665,7 @@
 </file>
 
 <file path=customXml/item3.xml><?xml version="1.0" encoding="utf-8"?>
-<p:properties xmlns:p="http://schemas.microsoft.com/office/2006/metadata/properties" xmlns:xsi="http://www.w3.org/2001/XMLSchema-instance" xmlns:pc="http://schemas.microsoft.com/office/infopath/2007/PartnerControls">
-  <documentManagement/>
-</p:properties>
+<b:Sources xmlns:b="http://schemas.openxmlformats.org/officeDocument/2006/bibliography" xmlns="http://schemas.openxmlformats.org/officeDocument/2006/bibliography" SelectedStyle="\APASixthEditionOfficeOnline.xsl" StyleName="APA" Version="6"/>
 </file>
 
 <file path=customXml/item4.xml><?xml version="1.0" encoding="utf-8"?>
@@ -14510,7 +14801,9 @@
 </file>
 
 <file path=customXml/item5.xml><?xml version="1.0" encoding="utf-8"?>
-<b:Sources xmlns:b="http://schemas.openxmlformats.org/officeDocument/2006/bibliography" xmlns="http://schemas.openxmlformats.org/officeDocument/2006/bibliography" SelectedStyle="\APASixthEditionOfficeOnline.xsl" StyleName="APA" Version="6"/>
+<p:properties xmlns:p="http://schemas.microsoft.com/office/2006/metadata/properties" xmlns:xsi="http://www.w3.org/2001/XMLSchema-instance" xmlns:pc="http://schemas.microsoft.com/office/infopath/2007/PartnerControls">
+  <documentManagement/>
+</p:properties>
 </file>
 
 <file path=customXml/itemProps1.xml><?xml version="1.0" encoding="utf-8"?>
@@ -14530,10 +14823,9 @@
 </file>
 
 <file path=customXml/itemProps3.xml><?xml version="1.0" encoding="utf-8"?>
-<ds:datastoreItem xmlns:ds="http://schemas.openxmlformats.org/officeDocument/2006/customXml" ds:itemID="{EDE7D767-2E0D-494D-8433-FAEBD4A37F8E}">
+<ds:datastoreItem xmlns:ds="http://schemas.openxmlformats.org/officeDocument/2006/customXml" ds:itemID="{016BB16A-1E0F-4115-AADC-10D5070CD6B8}">
   <ds:schemaRefs>
-    <ds:schemaRef ds:uri="http://schemas.microsoft.com/office/2006/metadata/properties"/>
-    <ds:schemaRef ds:uri="http://schemas.microsoft.com/office/infopath/2007/PartnerControls"/>
+    <ds:schemaRef ds:uri="http://schemas.openxmlformats.org/officeDocument/2006/bibliography"/>
   </ds:schemaRefs>
 </ds:datastoreItem>
 </file>
@@ -14557,9 +14849,10 @@
 </file>
 
 <file path=customXml/itemProps5.xml><?xml version="1.0" encoding="utf-8"?>
-<ds:datastoreItem xmlns:ds="http://schemas.openxmlformats.org/officeDocument/2006/customXml" ds:itemID="{016BB16A-1E0F-4115-AADC-10D5070CD6B8}">
+<ds:datastoreItem xmlns:ds="http://schemas.openxmlformats.org/officeDocument/2006/customXml" ds:itemID="{EDE7D767-2E0D-494D-8433-FAEBD4A37F8E}">
   <ds:schemaRefs>
-    <ds:schemaRef ds:uri="http://schemas.openxmlformats.org/officeDocument/2006/bibliography"/>
+    <ds:schemaRef ds:uri="http://schemas.microsoft.com/office/2006/metadata/properties"/>
+    <ds:schemaRef ds:uri="http://schemas.microsoft.com/office/infopath/2007/PartnerControls"/>
   </ds:schemaRefs>
 </ds:datastoreItem>
 </file>
</xml_diff>

<commit_message>
BP textová část - struktura projektu - frontend
</commit_message>
<xml_diff>
--- a/bp_svobo229_v2.docx
+++ b/bp_svobo229_v2.docx
@@ -507,10 +507,10 @@
             <v:path o:extrusionok="f" gradientshapeok="t" o:connecttype="rect"/>
             <o:lock v:ext="edit" aspectratio="t"/>
           </v:shapetype>
-          <v:shape id="_x0000_i1025" type="#_x0000_t75" style="width:446.25pt;height:479.25pt" o:ole="">
+          <v:shape id="_x0000_i1025" type="#_x0000_t75" style="width:446.25pt;height:478.7pt" o:ole="">
             <v:imagedata r:id="rId12" o:title=""/>
           </v:shape>
-          <o:OLEObject Type="Embed" ProgID="Word.Document.12" ShapeID="_x0000_i1025" DrawAspect="Content" ObjectID="_1833302912" r:id="rId13">
+          <o:OLEObject Type="Embed" ProgID="Word.Document.12" ShapeID="_x0000_i1025" DrawAspect="Content" ObjectID="_1833364159" r:id="rId13">
             <o:FieldCodes>\s</o:FieldCodes>
           </o:OLEObject>
         </w:object>
@@ -6609,7 +6609,13 @@
     </w:p>
     <w:p>
       <w:r>
-        <w:t xml:space="preserve">Uživatelské prostředí bude obsahovat 3 základní barvy a to </w:t>
+        <w:t xml:space="preserve">Uživatelské prostředí bude obsahovat 3 základní </w:t>
+      </w:r>
+      <w:r>
+        <w:t>barvy,</w:t>
+      </w:r>
+      <w:r>
+        <w:t xml:space="preserve"> a to </w:t>
       </w:r>
       <w:r>
         <w:t>krémově bílou, zelenou v týmovém odstínu a černou</w:t>
@@ -6647,7 +6653,13 @@
         <w:t xml:space="preserve">S webovou stránkou budou moci interagovat určité role, které se mezi sebou liší v pravomocích. Základní rolí zde bude role návštěvníka, který si bude moci pouze web prohlížet případně </w:t>
       </w:r>
       <w:r>
-        <w:t>vyplnit formulář. Další rolí bude role pro závodníky, kteří se po přihlášení budou moci přihlašovat a ohlašovat z různých akcí či zkoušek. Nad rolí závodníka bude stát role trenéra, který může přidávat, odebírat a editovat různé akce, profily uživatelů a obsah na webové stránce. Rolí z nejvyššími právy je role administrátora, který má plné řízení webové stránky.</w:t>
+        <w:t xml:space="preserve">vyplnit formulář. Další rolí bude role pro závodníky, kteří se po přihlášení budou moci přihlašovat a ohlašovat z různých akcí či zkoušek. Nad rolí závodníka bude stát role trenéra, který může přidávat, odebírat a editovat různé akce, profily uživatelů a obsah na webové stránce. Rolí </w:t>
+      </w:r>
+      <w:r>
+        <w:t>s</w:t>
+      </w:r>
+      <w:r>
+        <w:t> nejvyššími právy je role administrátora, který má plné řízení webové stránky.</w:t>
       </w:r>
     </w:p>
     <w:p>
@@ -6663,27 +6675,82 @@
         <w:t xml:space="preserve">Pro správnou funkcionalitu webových stránek je potřeba navrhnout kvalitní a dobře strukturovanou databázi, která bude popsána v této sekci. Pro samotný návrh jsem využíval webovou </w:t>
       </w:r>
       <w:r>
-        <w:t>stránku dbdiagram, ve které jsem si specifikoval všechny potřebné entity a vazby mezi nimi.</w:t>
+        <w:t xml:space="preserve">stránku </w:t>
+      </w:r>
+      <w:proofErr w:type="spellStart"/>
+      <w:r>
+        <w:t>dbdiagram</w:t>
+      </w:r>
+      <w:proofErr w:type="spellEnd"/>
+      <w:r>
+        <w:t>, ve které jsem si specifikoval všechny potřebné entity a vazby mezi nimi.</w:t>
       </w:r>
     </w:p>
     <w:p/>
     <w:p>
       <w:r>
-        <w:t>První tabulka byla tabulka uživatelů, která vycházela z kapitoly o uživatelských rolích. V této entitě bylo potřeba vytvořit login, password</w:t>
-      </w:r>
+        <w:t xml:space="preserve">První tabulka byla tabulka uživatelů, která vycházela z kapitoly o uživatelských rolích. V této entitě bylo potřeba vytvořit login, </w:t>
+      </w:r>
+      <w:proofErr w:type="spellStart"/>
+      <w:r>
+        <w:t>password</w:t>
+      </w:r>
+      <w:proofErr w:type="spellEnd"/>
     </w:p>
     <w:p/>
     <w:p>
       <w:r>
         <w:lastRenderedPageBreak/>
-        <w:t>Návrh toho jak bude vypadat závodník… Bude mít své id, profile_pic, jméno, příjmení, datum narození, login, heslo, id_role, id_pasku</w:t>
-      </w:r>
-      <w:r>
-        <w:t xml:space="preserve"> a úspěch (m:n)</w:t>
-      </w:r>
-      <w:r>
-        <w:t>, váha, best, legend, active</w:t>
-      </w:r>
+        <w:t xml:space="preserve">Návrh toho jak bude vypadat závodník… Bude mít své id, </w:t>
+      </w:r>
+      <w:proofErr w:type="spellStart"/>
+      <w:r>
+        <w:t>profile_pic</w:t>
+      </w:r>
+      <w:proofErr w:type="spellEnd"/>
+      <w:r>
+        <w:t xml:space="preserve">, jméno, příjmení, datum narození, login, heslo, </w:t>
+      </w:r>
+      <w:proofErr w:type="spellStart"/>
+      <w:r>
+        <w:t>id_role</w:t>
+      </w:r>
+      <w:proofErr w:type="spellEnd"/>
+      <w:r>
+        <w:t xml:space="preserve">, </w:t>
+      </w:r>
+      <w:proofErr w:type="spellStart"/>
+      <w:r>
+        <w:t>id_pasku</w:t>
+      </w:r>
+      <w:proofErr w:type="spellEnd"/>
+      <w:r>
+        <w:t xml:space="preserve"> a úspěch (</w:t>
+      </w:r>
+      <w:proofErr w:type="spellStart"/>
+      <w:r>
+        <w:t>m:n</w:t>
+      </w:r>
+      <w:proofErr w:type="spellEnd"/>
+      <w:r>
+        <w:t>)</w:t>
+      </w:r>
+      <w:r>
+        <w:t xml:space="preserve">, váha, </w:t>
+      </w:r>
+      <w:proofErr w:type="spellStart"/>
+      <w:r>
+        <w:t>best</w:t>
+      </w:r>
+      <w:proofErr w:type="spellEnd"/>
+      <w:r>
+        <w:t xml:space="preserve">, legend, </w:t>
+      </w:r>
+      <w:proofErr w:type="spellStart"/>
+      <w:r>
+        <w:t>active</w:t>
+      </w:r>
+      <w:proofErr w:type="spellEnd"/>
     </w:p>
     <w:p/>
     <w:p>
@@ -6722,7 +6789,15 @@
     </w:p>
     <w:p>
       <w:r>
-        <w:t>Struktura mého projektu  - vysvětlení proč co kde je, komponenty které se často opakují jsou ve složce components a ty které jsou unikátní jsou ve složce pro danou stránku</w:t>
+        <w:t xml:space="preserve">Struktura mého projektu  - vysvětlení proč co kde je, komponenty které se často opakují jsou ve složce </w:t>
+      </w:r>
+      <w:proofErr w:type="spellStart"/>
+      <w:r>
+        <w:t>components</w:t>
+      </w:r>
+      <w:proofErr w:type="spellEnd"/>
+      <w:r>
+        <w:t xml:space="preserve"> a ty které jsou unikátní jsou ve složce pro danou stránku</w:t>
       </w:r>
     </w:p>
     <w:p/>
@@ -6893,7 +6968,18 @@
     </w:p>
     <w:p>
       <w:r>
-        <w:t xml:space="preserve">Frontend obsahuje několik hlavních složek ve kterých jsou uložené jednotlivé části </w:t>
+        <w:t>Frontend obsahuje několik hlavních složek ve kterých jsou uložené jednotlivé části</w:t>
+      </w:r>
+      <w:r>
+        <w:t xml:space="preserve">. Struktura odpovídá typickému </w:t>
+      </w:r>
+      <w:proofErr w:type="spellStart"/>
+      <w:r>
+        <w:t>Reactovému</w:t>
+      </w:r>
+      <w:proofErr w:type="spellEnd"/>
+      <w:r>
+        <w:t xml:space="preserve"> projektu.</w:t>
       </w:r>
     </w:p>
     <w:p>
@@ -6901,6 +6987,9 @@
         <w:jc w:val="center"/>
       </w:pPr>
       <w:r>
+        <w:rPr>
+          <w:noProof/>
+        </w:rPr>
         <w:drawing>
           <wp:inline distT="0" distB="0" distL="0" distR="0" wp14:anchorId="7B5E2BA2" wp14:editId="75E6EEDF">
             <wp:extent cx="1505160" cy="3810532"/>
@@ -6949,10 +7038,7 @@
         <w:t>14</w:t>
       </w:r>
       <w:r>
-        <w:t xml:space="preserve">: </w:t>
-      </w:r>
-      <w:r>
-        <w:t>Struktura frontendu</w:t>
+        <w:t>: Struktura frontendu</w:t>
       </w:r>
     </w:p>
     <w:p>
@@ -6965,8 +7051,40 @@
     </w:p>
     <w:p>
       <w:r>
+        <w:t>Kořenová složka</w:t>
+      </w:r>
+      <w:r>
+        <w:t xml:space="preserve"> obsahuje několik velmi důležitých podsložek</w:t>
+      </w:r>
+      <w:r>
+        <w:t xml:space="preserve"> a souborů</w:t>
+      </w:r>
+      <w:r>
+        <w:t>, které jsou důležité pro správnou a přehlednou strukturu projektu.</w:t>
+      </w:r>
+    </w:p>
+    <w:p>
+      <w:r>
+        <w:t xml:space="preserve">Adresáře: </w:t>
+      </w:r>
+    </w:p>
+    <w:p>
+      <w:proofErr w:type="spellStart"/>
+      <w:r>
+        <w:rPr>
+          <w:b/>
+          <w:bCs/>
+        </w:rPr>
         <w:t>node_modules</w:t>
       </w:r>
+      <w:proofErr w:type="spellEnd"/>
+      <w:r>
+        <w:rPr>
+          <w:b/>
+          <w:bCs/>
+        </w:rPr>
+        <w:t>/</w:t>
+      </w:r>
       <w:r>
         <w:t xml:space="preserve"> – adresář, který obsahuje veškeré externí knihovny a závislosti projektu stažené pomocí správce bal</w:t>
       </w:r>
@@ -6979,13 +7097,382 @@
     </w:p>
     <w:p>
       <w:r>
+        <w:rPr>
+          <w:b/>
+          <w:bCs/>
+        </w:rPr>
         <w:t>public</w:t>
       </w:r>
-    </w:p>
-    <w:p>
-      <w:r>
-        <w:t xml:space="preserve">src </w:t>
-      </w:r>
+      <w:r>
+        <w:rPr>
+          <w:b/>
+          <w:bCs/>
+        </w:rPr>
+        <w:t>/</w:t>
+      </w:r>
+      <w:r>
+        <w:rPr>
+          <w:b/>
+          <w:bCs/>
+        </w:rPr>
+        <w:t xml:space="preserve"> – </w:t>
+      </w:r>
+      <w:r>
+        <w:t xml:space="preserve">obsahuje statické soubory, které se při práci pouze zkopírují a </w:t>
+      </w:r>
+      <w:proofErr w:type="spellStart"/>
+      <w:r>
+        <w:t>webpack</w:t>
+      </w:r>
+      <w:proofErr w:type="spellEnd"/>
+      <w:r>
+        <w:t xml:space="preserve"> /</w:t>
+      </w:r>
+      <w:proofErr w:type="spellStart"/>
+      <w:r>
+        <w:t>vite</w:t>
+      </w:r>
+      <w:proofErr w:type="spellEnd"/>
+      <w:r>
+        <w:t xml:space="preserve"> je nezpracovává, ukládají se zde většinou favikony, loga a soubor index.html který slouží vstupní bod aplikace</w:t>
+      </w:r>
+    </w:p>
+    <w:p>
+      <w:proofErr w:type="spellStart"/>
+      <w:r>
+        <w:rPr>
+          <w:b/>
+          <w:bCs/>
+        </w:rPr>
+        <w:t>src</w:t>
+      </w:r>
+      <w:proofErr w:type="spellEnd"/>
+      <w:r>
+        <w:rPr>
+          <w:b/>
+          <w:bCs/>
+        </w:rPr>
+        <w:t>/</w:t>
+      </w:r>
+      <w:r>
+        <w:rPr>
+          <w:b/>
+          <w:bCs/>
+        </w:rPr>
+        <w:t xml:space="preserve"> </w:t>
+      </w:r>
+      <w:r>
+        <w:rPr>
+          <w:b/>
+          <w:bCs/>
+        </w:rPr>
+        <w:t xml:space="preserve">– </w:t>
+      </w:r>
+      <w:r>
+        <w:t xml:space="preserve">složka </w:t>
+      </w:r>
+      <w:r>
+        <w:t xml:space="preserve">obsahující přímo </w:t>
+      </w:r>
+      <w:proofErr w:type="spellStart"/>
+      <w:r>
+        <w:t>kod</w:t>
+      </w:r>
+      <w:proofErr w:type="spellEnd"/>
+      <w:r>
+        <w:t xml:space="preserve"> psaný programátorem ve které si sám definuje logiku i samotný vzhled aplikace</w:t>
+      </w:r>
+    </w:p>
+    <w:p>
+      <w:pPr>
+        <w:pStyle w:val="Odstavecseseznamem"/>
+        <w:numPr>
+          <w:ilvl w:val="0"/>
+          <w:numId w:val="42"/>
+        </w:numPr>
+      </w:pPr>
+      <w:proofErr w:type="spellStart"/>
+      <w:r>
+        <w:t>Assets</w:t>
+      </w:r>
+      <w:proofErr w:type="spellEnd"/>
+    </w:p>
+    <w:p>
+      <w:pPr>
+        <w:pStyle w:val="Odstavecseseznamem"/>
+        <w:numPr>
+          <w:ilvl w:val="0"/>
+          <w:numId w:val="42"/>
+        </w:numPr>
+      </w:pPr>
+      <w:proofErr w:type="spellStart"/>
+      <w:r>
+        <w:lastRenderedPageBreak/>
+        <w:t>Components</w:t>
+      </w:r>
+      <w:proofErr w:type="spellEnd"/>
+    </w:p>
+    <w:p>
+      <w:pPr>
+        <w:pStyle w:val="Odstavecseseznamem"/>
+        <w:numPr>
+          <w:ilvl w:val="0"/>
+          <w:numId w:val="42"/>
+        </w:numPr>
+      </w:pPr>
+      <w:r>
+        <w:t>Data</w:t>
+      </w:r>
+    </w:p>
+    <w:p>
+      <w:pPr>
+        <w:pStyle w:val="Odstavecseseznamem"/>
+        <w:numPr>
+          <w:ilvl w:val="0"/>
+          <w:numId w:val="42"/>
+        </w:numPr>
+      </w:pPr>
+      <w:r>
+        <w:t>Hooks</w:t>
+      </w:r>
+    </w:p>
+    <w:p>
+      <w:pPr>
+        <w:pStyle w:val="Odstavecseseznamem"/>
+        <w:numPr>
+          <w:ilvl w:val="0"/>
+          <w:numId w:val="42"/>
+        </w:numPr>
+      </w:pPr>
+      <w:r>
+        <w:t>Layout</w:t>
+      </w:r>
+    </w:p>
+    <w:p>
+      <w:pPr>
+        <w:pStyle w:val="Odstavecseseznamem"/>
+        <w:numPr>
+          <w:ilvl w:val="0"/>
+          <w:numId w:val="42"/>
+        </w:numPr>
+      </w:pPr>
+      <w:proofErr w:type="spellStart"/>
+      <w:r>
+        <w:t>Pages</w:t>
+      </w:r>
+      <w:proofErr w:type="spellEnd"/>
+      <w:r>
+        <w:t xml:space="preserve"> – obsahuje složky pojmenované po stránkách, kterými aplikace disponuje, každá složka obsahuje unikátní </w:t>
+      </w:r>
+      <w:proofErr w:type="spellStart"/>
+      <w:r>
+        <w:t>componenty</w:t>
+      </w:r>
+      <w:proofErr w:type="spellEnd"/>
+      <w:r>
+        <w:t>, které jsou na dané stránce použité</w:t>
+      </w:r>
+    </w:p>
+    <w:p>
+      <w:pPr>
+        <w:pStyle w:val="Odstavecseseznamem"/>
+        <w:numPr>
+          <w:ilvl w:val="0"/>
+          <w:numId w:val="42"/>
+        </w:numPr>
+      </w:pPr>
+      <w:proofErr w:type="spellStart"/>
+      <w:r>
+        <w:t>Utils</w:t>
+      </w:r>
+      <w:proofErr w:type="spellEnd"/>
+    </w:p>
+    <w:p>
+      <w:pPr>
+        <w:rPr>
+          <w:b/>
+          <w:bCs/>
+        </w:rPr>
+      </w:pPr>
+    </w:p>
+    <w:p>
+      <w:pPr>
+        <w:rPr>
+          <w:b/>
+          <w:bCs/>
+        </w:rPr>
+      </w:pPr>
+      <w:r>
+        <w:rPr>
+          <w:b/>
+          <w:bCs/>
+        </w:rPr>
+        <w:t>A následující soubory</w:t>
+      </w:r>
+    </w:p>
+    <w:p>
+      <w:r>
+        <w:rPr>
+          <w:b/>
+          <w:bCs/>
+        </w:rPr>
+        <w:t>.</w:t>
+      </w:r>
+      <w:proofErr w:type="spellStart"/>
+      <w:r>
+        <w:rPr>
+          <w:b/>
+          <w:bCs/>
+        </w:rPr>
+        <w:t>gitignore</w:t>
+      </w:r>
+      <w:proofErr w:type="spellEnd"/>
+      <w:r>
+        <w:t xml:space="preserve"> – jsou zde definovány složky a soubory, které nemají být zpracovávány verzovacími systémy jako je například Git</w:t>
+      </w:r>
+      <w:r>
+        <w:t>, typickým příkladem bývá soubor .env ve kterém se nachází citlivé údaje jako jsou API klíče či konfigurace databáze ke které je projekt napojený.</w:t>
+      </w:r>
+    </w:p>
+    <w:p>
+      <w:r>
+        <w:rPr>
+          <w:b/>
+          <w:bCs/>
+        </w:rPr>
+        <w:t>eslint.config.js</w:t>
+      </w:r>
+      <w:r>
+        <w:t xml:space="preserve"> – konfigurační soubor nástroje ESLint, který slouží k statické analýze zdrojového </w:t>
+      </w:r>
+      <w:r>
+        <w:t>kódu</w:t>
+      </w:r>
+      <w:r>
+        <w:t xml:space="preserve">, definuje sadu syntaktických a stylových pravidel, zajišťuje konzistenci </w:t>
+      </w:r>
+      <w:r>
+        <w:t>kódu</w:t>
+      </w:r>
+    </w:p>
+    <w:p>
+      <w:r>
+        <w:rPr>
+          <w:b/>
+          <w:bCs/>
+        </w:rPr>
+        <w:t>index.html</w:t>
+      </w:r>
+      <w:r>
+        <w:t xml:space="preserve"> –</w:t>
+      </w:r>
+      <w:r>
+        <w:t xml:space="preserve"> obsahuje</w:t>
+      </w:r>
+      <w:r>
+        <w:t xml:space="preserve"> HTML šablo</w:t>
+      </w:r>
+      <w:r>
+        <w:t>nu</w:t>
+      </w:r>
+      <w:r>
+        <w:t xml:space="preserve"> do které je vkládána React aplikace</w:t>
+      </w:r>
+    </w:p>
+    <w:p>
+      <w:r>
+        <w:rPr>
+          <w:b/>
+          <w:bCs/>
+        </w:rPr>
+        <w:t>package-lock.json</w:t>
+      </w:r>
+      <w:r>
+        <w:t xml:space="preserve"> – </w:t>
+      </w:r>
+      <w:r>
+        <w:t>generuje se automaticky při každé instalaci a uživatel by do něj neměl vůbec zasahovat</w:t>
+      </w:r>
+    </w:p>
+    <w:p>
+      <w:r>
+        <w:rPr>
+          <w:b/>
+          <w:bCs/>
+        </w:rPr>
+        <w:t>package.json</w:t>
+      </w:r>
+      <w:r>
+        <w:t xml:space="preserve"> – jsou zde základní informace o projektu a seznam hlavních závislostí </w:t>
+      </w:r>
+    </w:p>
+    <w:p>
+      <w:r>
+        <w:rPr>
+          <w:b/>
+          <w:bCs/>
+        </w:rPr>
+        <w:t>postcss.config.js</w:t>
+      </w:r>
+      <w:r>
+        <w:t xml:space="preserve"> – konfigurační soubor pro PostCSS, které optimalizuje CSS a umožňuje práci s TailWindCSS</w:t>
+      </w:r>
+    </w:p>
+    <w:p>
+      <w:r>
+        <w:rPr>
+          <w:b/>
+          <w:bCs/>
+        </w:rPr>
+        <w:t>tailwind.config.js</w:t>
+      </w:r>
+      <w:r>
+        <w:t xml:space="preserve"> </w:t>
+      </w:r>
+      <w:r>
+        <w:t>–</w:t>
+      </w:r>
+      <w:r>
+        <w:t xml:space="preserve"> </w:t>
+      </w:r>
+      <w:r>
+        <w:t>konfigurační soubor pro TailWindCSS</w:t>
+      </w:r>
+    </w:p>
+    <w:p>
+      <w:r>
+        <w:rPr>
+          <w:b/>
+          <w:bCs/>
+        </w:rPr>
+        <w:t>vite.config.js</w:t>
+      </w:r>
+      <w:r>
+        <w:t xml:space="preserve"> </w:t>
+      </w:r>
+      <w:r>
+        <w:t>–</w:t>
+      </w:r>
+      <w:r>
+        <w:t xml:space="preserve"> </w:t>
+      </w:r>
+      <w:r>
+        <w:t xml:space="preserve">nachází se zde definice </w:t>
+      </w:r>
+      <w:r>
+        <w:t>toho,</w:t>
+      </w:r>
+      <w:r>
+        <w:t xml:space="preserve"> jak se má projekt spouštět, sestavovat a jaké technologie má podporovat</w:t>
+      </w:r>
+    </w:p>
+    <w:p>
+      <w:pPr>
+        <w:rPr>
+          <w:b/>
+          <w:bCs/>
+        </w:rPr>
+      </w:pPr>
     </w:p>
     <w:p>
       <w:pPr>
@@ -8518,6 +9005,118 @@
     </w:lvl>
   </w:abstractNum>
   <w:abstractNum w:abstractNumId="6" w15:restartNumberingAfterBreak="0">
+    <w:nsid w:val="10A237BD"/>
+    <w:multiLevelType w:val="hybridMultilevel"/>
+    <w:tmpl w:val="1FE630BE"/>
+    <w:lvl w:ilvl="0" w:tplc="9C642D8E">
+      <w:numFmt w:val="bullet"/>
+      <w:lvlText w:val="-"/>
+      <w:lvlJc w:val="left"/>
+      <w:pPr>
+        <w:ind w:left="1065" w:hanging="360"/>
+      </w:pPr>
+      <w:rPr>
+        <w:rFonts w:ascii="Calibri" w:eastAsiaTheme="minorHAnsi" w:hAnsi="Calibri" w:cs="Calibri" w:hint="default"/>
+      </w:rPr>
+    </w:lvl>
+    <w:lvl w:ilvl="1" w:tplc="04050003" w:tentative="1">
+      <w:start w:val="1"/>
+      <w:numFmt w:val="bullet"/>
+      <w:lvlText w:val="o"/>
+      <w:lvlJc w:val="left"/>
+      <w:pPr>
+        <w:ind w:left="1785" w:hanging="360"/>
+      </w:pPr>
+      <w:rPr>
+        <w:rFonts w:ascii="Courier New" w:hAnsi="Courier New" w:cs="Courier New" w:hint="default"/>
+      </w:rPr>
+    </w:lvl>
+    <w:lvl w:ilvl="2" w:tplc="04050005" w:tentative="1">
+      <w:start w:val="1"/>
+      <w:numFmt w:val="bullet"/>
+      <w:lvlText w:val=""/>
+      <w:lvlJc w:val="left"/>
+      <w:pPr>
+        <w:ind w:left="2505" w:hanging="360"/>
+      </w:pPr>
+      <w:rPr>
+        <w:rFonts w:ascii="Wingdings" w:hAnsi="Wingdings" w:hint="default"/>
+      </w:rPr>
+    </w:lvl>
+    <w:lvl w:ilvl="3" w:tplc="04050001" w:tentative="1">
+      <w:start w:val="1"/>
+      <w:numFmt w:val="bullet"/>
+      <w:lvlText w:val=""/>
+      <w:lvlJc w:val="left"/>
+      <w:pPr>
+        <w:ind w:left="3225" w:hanging="360"/>
+      </w:pPr>
+      <w:rPr>
+        <w:rFonts w:ascii="Symbol" w:hAnsi="Symbol" w:hint="default"/>
+      </w:rPr>
+    </w:lvl>
+    <w:lvl w:ilvl="4" w:tplc="04050003" w:tentative="1">
+      <w:start w:val="1"/>
+      <w:numFmt w:val="bullet"/>
+      <w:lvlText w:val="o"/>
+      <w:lvlJc w:val="left"/>
+      <w:pPr>
+        <w:ind w:left="3945" w:hanging="360"/>
+      </w:pPr>
+      <w:rPr>
+        <w:rFonts w:ascii="Courier New" w:hAnsi="Courier New" w:cs="Courier New" w:hint="default"/>
+      </w:rPr>
+    </w:lvl>
+    <w:lvl w:ilvl="5" w:tplc="04050005" w:tentative="1">
+      <w:start w:val="1"/>
+      <w:numFmt w:val="bullet"/>
+      <w:lvlText w:val=""/>
+      <w:lvlJc w:val="left"/>
+      <w:pPr>
+        <w:ind w:left="4665" w:hanging="360"/>
+      </w:pPr>
+      <w:rPr>
+        <w:rFonts w:ascii="Wingdings" w:hAnsi="Wingdings" w:hint="default"/>
+      </w:rPr>
+    </w:lvl>
+    <w:lvl w:ilvl="6" w:tplc="04050001" w:tentative="1">
+      <w:start w:val="1"/>
+      <w:numFmt w:val="bullet"/>
+      <w:lvlText w:val=""/>
+      <w:lvlJc w:val="left"/>
+      <w:pPr>
+        <w:ind w:left="5385" w:hanging="360"/>
+      </w:pPr>
+      <w:rPr>
+        <w:rFonts w:ascii="Symbol" w:hAnsi="Symbol" w:hint="default"/>
+      </w:rPr>
+    </w:lvl>
+    <w:lvl w:ilvl="7" w:tplc="04050003" w:tentative="1">
+      <w:start w:val="1"/>
+      <w:numFmt w:val="bullet"/>
+      <w:lvlText w:val="o"/>
+      <w:lvlJc w:val="left"/>
+      <w:pPr>
+        <w:ind w:left="6105" w:hanging="360"/>
+      </w:pPr>
+      <w:rPr>
+        <w:rFonts w:ascii="Courier New" w:hAnsi="Courier New" w:cs="Courier New" w:hint="default"/>
+      </w:rPr>
+    </w:lvl>
+    <w:lvl w:ilvl="8" w:tplc="04050005" w:tentative="1">
+      <w:start w:val="1"/>
+      <w:numFmt w:val="bullet"/>
+      <w:lvlText w:val=""/>
+      <w:lvlJc w:val="left"/>
+      <w:pPr>
+        <w:ind w:left="6825" w:hanging="360"/>
+      </w:pPr>
+      <w:rPr>
+        <w:rFonts w:ascii="Wingdings" w:hAnsi="Wingdings" w:hint="default"/>
+      </w:rPr>
+    </w:lvl>
+  </w:abstractNum>
+  <w:abstractNum w:abstractNumId="7" w15:restartNumberingAfterBreak="0">
     <w:nsid w:val="13931792"/>
     <w:multiLevelType w:val="hybridMultilevel"/>
     <w:tmpl w:val="0405001D"/>
@@ -8603,7 +9202,7 @@
       </w:pPr>
     </w:lvl>
   </w:abstractNum>
-  <w:abstractNum w:abstractNumId="7" w15:restartNumberingAfterBreak="0">
+  <w:abstractNum w:abstractNumId="8" w15:restartNumberingAfterBreak="0">
     <w:nsid w:val="213A5FD2"/>
     <w:multiLevelType w:val="hybridMultilevel"/>
     <w:tmpl w:val="554E2680"/>
@@ -8715,7 +9314,7 @@
       </w:rPr>
     </w:lvl>
   </w:abstractNum>
-  <w:abstractNum w:abstractNumId="8" w15:restartNumberingAfterBreak="0">
+  <w:abstractNum w:abstractNumId="9" w15:restartNumberingAfterBreak="0">
     <w:nsid w:val="2CB96E15"/>
     <w:multiLevelType w:val="hybridMultilevel"/>
     <w:tmpl w:val="E3DADC78"/>
@@ -8828,7 +9427,7 @@
       </w:rPr>
     </w:lvl>
   </w:abstractNum>
-  <w:abstractNum w:abstractNumId="9" w15:restartNumberingAfterBreak="0">
+  <w:abstractNum w:abstractNumId="10" w15:restartNumberingAfterBreak="0">
     <w:nsid w:val="2E053A0E"/>
     <w:multiLevelType w:val="hybridMultilevel"/>
     <w:tmpl w:val="4204115C"/>
@@ -8914,7 +9513,7 @@
       </w:pPr>
     </w:lvl>
   </w:abstractNum>
-  <w:abstractNum w:abstractNumId="10" w15:restartNumberingAfterBreak="0">
+  <w:abstractNum w:abstractNumId="11" w15:restartNumberingAfterBreak="0">
     <w:nsid w:val="32385533"/>
     <w:multiLevelType w:val="hybridMultilevel"/>
     <w:tmpl w:val="8264DC56"/>
@@ -9027,7 +9626,7 @@
       </w:rPr>
     </w:lvl>
   </w:abstractNum>
-  <w:abstractNum w:abstractNumId="11" w15:restartNumberingAfterBreak="0">
+  <w:abstractNum w:abstractNumId="12" w15:restartNumberingAfterBreak="0">
     <w:nsid w:val="325E002C"/>
     <w:multiLevelType w:val="multilevel"/>
     <w:tmpl w:val="B28EA22A"/>
@@ -9176,7 +9775,7 @@
       </w:rPr>
     </w:lvl>
   </w:abstractNum>
-  <w:abstractNum w:abstractNumId="12" w15:restartNumberingAfterBreak="0">
+  <w:abstractNum w:abstractNumId="13" w15:restartNumberingAfterBreak="0">
     <w:nsid w:val="32D12EE2"/>
     <w:multiLevelType w:val="hybridMultilevel"/>
     <w:tmpl w:val="B394B5E8"/>
@@ -9289,7 +9888,7 @@
       </w:rPr>
     </w:lvl>
   </w:abstractNum>
-  <w:abstractNum w:abstractNumId="13" w15:restartNumberingAfterBreak="0">
+  <w:abstractNum w:abstractNumId="14" w15:restartNumberingAfterBreak="0">
     <w:nsid w:val="33864F3A"/>
     <w:multiLevelType w:val="hybridMultilevel"/>
     <w:tmpl w:val="37EEECB4"/>
@@ -9402,7 +10001,7 @@
       </w:rPr>
     </w:lvl>
   </w:abstractNum>
-  <w:abstractNum w:abstractNumId="14" w15:restartNumberingAfterBreak="0">
+  <w:abstractNum w:abstractNumId="15" w15:restartNumberingAfterBreak="0">
     <w:nsid w:val="379E634F"/>
     <w:multiLevelType w:val="multilevel"/>
     <w:tmpl w:val="A418C716"/>
@@ -9515,7 +10114,7 @@
       </w:pPr>
     </w:lvl>
   </w:abstractNum>
-  <w:abstractNum w:abstractNumId="15" w15:restartNumberingAfterBreak="0">
+  <w:abstractNum w:abstractNumId="16" w15:restartNumberingAfterBreak="0">
     <w:nsid w:val="387228FC"/>
     <w:multiLevelType w:val="hybridMultilevel"/>
     <w:tmpl w:val="9BB891CC"/>
@@ -9628,7 +10227,7 @@
       </w:rPr>
     </w:lvl>
   </w:abstractNum>
-  <w:abstractNum w:abstractNumId="16" w15:restartNumberingAfterBreak="0">
+  <w:abstractNum w:abstractNumId="17" w15:restartNumberingAfterBreak="0">
     <w:nsid w:val="3B5F5F7D"/>
     <w:multiLevelType w:val="multilevel"/>
     <w:tmpl w:val="F9142A4E"/>
@@ -9717,7 +10316,7 @@
       </w:pPr>
     </w:lvl>
   </w:abstractNum>
-  <w:abstractNum w:abstractNumId="17" w15:restartNumberingAfterBreak="0">
+  <w:abstractNum w:abstractNumId="18" w15:restartNumberingAfterBreak="0">
     <w:nsid w:val="3D286053"/>
     <w:multiLevelType w:val="hybridMultilevel"/>
     <w:tmpl w:val="2C90F8B6"/>
@@ -9830,7 +10429,7 @@
       </w:rPr>
     </w:lvl>
   </w:abstractNum>
-  <w:abstractNum w:abstractNumId="18" w15:restartNumberingAfterBreak="0">
+  <w:abstractNum w:abstractNumId="19" w15:restartNumberingAfterBreak="0">
     <w:nsid w:val="3D4F4E22"/>
     <w:multiLevelType w:val="hybridMultilevel"/>
     <w:tmpl w:val="49AEEBEC"/>
@@ -9943,7 +10542,7 @@
       </w:rPr>
     </w:lvl>
   </w:abstractNum>
-  <w:abstractNum w:abstractNumId="19" w15:restartNumberingAfterBreak="0">
+  <w:abstractNum w:abstractNumId="20" w15:restartNumberingAfterBreak="0">
     <w:nsid w:val="3F817BFF"/>
     <w:multiLevelType w:val="hybridMultilevel"/>
     <w:tmpl w:val="57363A44"/>
@@ -10056,7 +10655,7 @@
       </w:rPr>
     </w:lvl>
   </w:abstractNum>
-  <w:abstractNum w:abstractNumId="20" w15:restartNumberingAfterBreak="0">
+  <w:abstractNum w:abstractNumId="21" w15:restartNumberingAfterBreak="0">
     <w:nsid w:val="4575495E"/>
     <w:multiLevelType w:val="hybridMultilevel"/>
     <w:tmpl w:val="E4F064E0"/>
@@ -10169,7 +10768,7 @@
       </w:rPr>
     </w:lvl>
   </w:abstractNum>
-  <w:abstractNum w:abstractNumId="21" w15:restartNumberingAfterBreak="0">
+  <w:abstractNum w:abstractNumId="22" w15:restartNumberingAfterBreak="0">
     <w:nsid w:val="46E509FF"/>
     <w:multiLevelType w:val="hybridMultilevel"/>
     <w:tmpl w:val="16E6C92C"/>
@@ -10294,7 +10893,7 @@
       </w:rPr>
     </w:lvl>
   </w:abstractNum>
-  <w:abstractNum w:abstractNumId="22" w15:restartNumberingAfterBreak="0">
+  <w:abstractNum w:abstractNumId="23" w15:restartNumberingAfterBreak="0">
     <w:nsid w:val="46FE4CC4"/>
     <w:multiLevelType w:val="hybridMultilevel"/>
     <w:tmpl w:val="7234943C"/>
@@ -10407,7 +11006,7 @@
       </w:rPr>
     </w:lvl>
   </w:abstractNum>
-  <w:abstractNum w:abstractNumId="23" w15:restartNumberingAfterBreak="0">
+  <w:abstractNum w:abstractNumId="24" w15:restartNumberingAfterBreak="0">
     <w:nsid w:val="4BBD4598"/>
     <w:multiLevelType w:val="hybridMultilevel"/>
     <w:tmpl w:val="5A8E75B6"/>
@@ -10520,7 +11119,7 @@
       </w:rPr>
     </w:lvl>
   </w:abstractNum>
-  <w:abstractNum w:abstractNumId="24" w15:restartNumberingAfterBreak="0">
+  <w:abstractNum w:abstractNumId="25" w15:restartNumberingAfterBreak="0">
     <w:nsid w:val="4C0F14F5"/>
     <w:multiLevelType w:val="hybridMultilevel"/>
     <w:tmpl w:val="5A12B6E6"/>
@@ -10609,7 +11208,7 @@
       </w:pPr>
     </w:lvl>
   </w:abstractNum>
-  <w:abstractNum w:abstractNumId="25" w15:restartNumberingAfterBreak="0">
+  <w:abstractNum w:abstractNumId="26" w15:restartNumberingAfterBreak="0">
     <w:nsid w:val="51167291"/>
     <w:multiLevelType w:val="hybridMultilevel"/>
     <w:tmpl w:val="8CFC3FCC"/>
@@ -10698,7 +11297,7 @@
       </w:pPr>
     </w:lvl>
   </w:abstractNum>
-  <w:abstractNum w:abstractNumId="26" w15:restartNumberingAfterBreak="0">
+  <w:abstractNum w:abstractNumId="27" w15:restartNumberingAfterBreak="0">
     <w:nsid w:val="557649DC"/>
     <w:multiLevelType w:val="multilevel"/>
     <w:tmpl w:val="45B45B66"/>
@@ -10793,7 +11392,7 @@
       </w:pPr>
     </w:lvl>
   </w:abstractNum>
-  <w:abstractNum w:abstractNumId="27" w15:restartNumberingAfterBreak="0">
+  <w:abstractNum w:abstractNumId="28" w15:restartNumberingAfterBreak="0">
     <w:nsid w:val="5E2B5BFA"/>
     <w:multiLevelType w:val="hybridMultilevel"/>
     <w:tmpl w:val="8EEEDC5A"/>
@@ -10906,7 +11505,7 @@
       </w:rPr>
     </w:lvl>
   </w:abstractNum>
-  <w:abstractNum w:abstractNumId="28" w15:restartNumberingAfterBreak="0">
+  <w:abstractNum w:abstractNumId="29" w15:restartNumberingAfterBreak="0">
     <w:nsid w:val="5F9F248F"/>
     <w:multiLevelType w:val="hybridMultilevel"/>
     <w:tmpl w:val="04050021"/>
@@ -11019,7 +11618,7 @@
       </w:rPr>
     </w:lvl>
   </w:abstractNum>
-  <w:abstractNum w:abstractNumId="29" w15:restartNumberingAfterBreak="0">
+  <w:abstractNum w:abstractNumId="30" w15:restartNumberingAfterBreak="0">
     <w:nsid w:val="610C5558"/>
     <w:multiLevelType w:val="hybridMultilevel"/>
     <w:tmpl w:val="BD84002E"/>
@@ -11132,7 +11731,7 @@
       </w:rPr>
     </w:lvl>
   </w:abstractNum>
-  <w:abstractNum w:abstractNumId="30" w15:restartNumberingAfterBreak="0">
+  <w:abstractNum w:abstractNumId="31" w15:restartNumberingAfterBreak="0">
     <w:nsid w:val="6AD42460"/>
     <w:multiLevelType w:val="hybridMultilevel"/>
     <w:tmpl w:val="8CFC3FCC"/>
@@ -11221,7 +11820,7 @@
       </w:pPr>
     </w:lvl>
   </w:abstractNum>
-  <w:abstractNum w:abstractNumId="31" w15:restartNumberingAfterBreak="0">
+  <w:abstractNum w:abstractNumId="32" w15:restartNumberingAfterBreak="0">
     <w:nsid w:val="6B4E5A6F"/>
     <w:multiLevelType w:val="multilevel"/>
     <w:tmpl w:val="200A6AF6"/>
@@ -11334,7 +11933,7 @@
       </w:pPr>
     </w:lvl>
   </w:abstractNum>
-  <w:abstractNum w:abstractNumId="32" w15:restartNumberingAfterBreak="0">
+  <w:abstractNum w:abstractNumId="33" w15:restartNumberingAfterBreak="0">
     <w:nsid w:val="6C497107"/>
     <w:multiLevelType w:val="hybridMultilevel"/>
     <w:tmpl w:val="EB7A42A0"/>
@@ -11447,7 +12046,7 @@
       </w:rPr>
     </w:lvl>
   </w:abstractNum>
-  <w:abstractNum w:abstractNumId="33" w15:restartNumberingAfterBreak="0">
+  <w:abstractNum w:abstractNumId="34" w15:restartNumberingAfterBreak="0">
     <w:nsid w:val="6EAE5475"/>
     <w:multiLevelType w:val="hybridMultilevel"/>
     <w:tmpl w:val="C0806FF2"/>
@@ -11560,7 +12159,7 @@
       </w:rPr>
     </w:lvl>
   </w:abstractNum>
-  <w:abstractNum w:abstractNumId="34" w15:restartNumberingAfterBreak="0">
+  <w:abstractNum w:abstractNumId="35" w15:restartNumberingAfterBreak="0">
     <w:nsid w:val="782750EB"/>
     <w:multiLevelType w:val="hybridMultilevel"/>
     <w:tmpl w:val="0D6AF1E4"/>
@@ -11673,7 +12272,7 @@
       </w:rPr>
     </w:lvl>
   </w:abstractNum>
-  <w:abstractNum w:abstractNumId="35" w15:restartNumberingAfterBreak="0">
+  <w:abstractNum w:abstractNumId="36" w15:restartNumberingAfterBreak="0">
     <w:nsid w:val="7A4B5D5C"/>
     <w:multiLevelType w:val="hybridMultilevel"/>
     <w:tmpl w:val="D496FADC"/>
@@ -11759,7 +12358,7 @@
       </w:pPr>
     </w:lvl>
   </w:abstractNum>
-  <w:abstractNum w:abstractNumId="36" w15:restartNumberingAfterBreak="0">
+  <w:abstractNum w:abstractNumId="37" w15:restartNumberingAfterBreak="0">
     <w:nsid w:val="7AF7268C"/>
     <w:multiLevelType w:val="hybridMultilevel"/>
     <w:tmpl w:val="09D0B6A0"/>
@@ -11871,7 +12470,7 @@
       </w:rPr>
     </w:lvl>
   </w:abstractNum>
-  <w:abstractNum w:abstractNumId="37" w15:restartNumberingAfterBreak="0">
+  <w:abstractNum w:abstractNumId="38" w15:restartNumberingAfterBreak="0">
     <w:nsid w:val="7D6D0E59"/>
     <w:multiLevelType w:val="hybridMultilevel"/>
     <w:tmpl w:val="5720D306"/>
@@ -11984,7 +12583,119 @@
       </w:rPr>
     </w:lvl>
   </w:abstractNum>
-  <w:abstractNum w:abstractNumId="38" w15:restartNumberingAfterBreak="0">
+  <w:abstractNum w:abstractNumId="39" w15:restartNumberingAfterBreak="0">
+    <w:nsid w:val="7D8102B7"/>
+    <w:multiLevelType w:val="hybridMultilevel"/>
+    <w:tmpl w:val="E21AA672"/>
+    <w:lvl w:ilvl="0" w:tplc="EBF6F9C6">
+      <w:numFmt w:val="bullet"/>
+      <w:lvlText w:val="-"/>
+      <w:lvlJc w:val="left"/>
+      <w:pPr>
+        <w:ind w:left="1065" w:hanging="360"/>
+      </w:pPr>
+      <w:rPr>
+        <w:rFonts w:ascii="Calibri" w:eastAsiaTheme="minorHAnsi" w:hAnsi="Calibri" w:cs="Calibri" w:hint="default"/>
+      </w:rPr>
+    </w:lvl>
+    <w:lvl w:ilvl="1" w:tplc="04050003" w:tentative="1">
+      <w:start w:val="1"/>
+      <w:numFmt w:val="bullet"/>
+      <w:lvlText w:val="o"/>
+      <w:lvlJc w:val="left"/>
+      <w:pPr>
+        <w:ind w:left="1785" w:hanging="360"/>
+      </w:pPr>
+      <w:rPr>
+        <w:rFonts w:ascii="Courier New" w:hAnsi="Courier New" w:cs="Courier New" w:hint="default"/>
+      </w:rPr>
+    </w:lvl>
+    <w:lvl w:ilvl="2" w:tplc="04050005" w:tentative="1">
+      <w:start w:val="1"/>
+      <w:numFmt w:val="bullet"/>
+      <w:lvlText w:val=""/>
+      <w:lvlJc w:val="left"/>
+      <w:pPr>
+        <w:ind w:left="2505" w:hanging="360"/>
+      </w:pPr>
+      <w:rPr>
+        <w:rFonts w:ascii="Wingdings" w:hAnsi="Wingdings" w:hint="default"/>
+      </w:rPr>
+    </w:lvl>
+    <w:lvl w:ilvl="3" w:tplc="04050001" w:tentative="1">
+      <w:start w:val="1"/>
+      <w:numFmt w:val="bullet"/>
+      <w:lvlText w:val=""/>
+      <w:lvlJc w:val="left"/>
+      <w:pPr>
+        <w:ind w:left="3225" w:hanging="360"/>
+      </w:pPr>
+      <w:rPr>
+        <w:rFonts w:ascii="Symbol" w:hAnsi="Symbol" w:hint="default"/>
+      </w:rPr>
+    </w:lvl>
+    <w:lvl w:ilvl="4" w:tplc="04050003" w:tentative="1">
+      <w:start w:val="1"/>
+      <w:numFmt w:val="bullet"/>
+      <w:lvlText w:val="o"/>
+      <w:lvlJc w:val="left"/>
+      <w:pPr>
+        <w:ind w:left="3945" w:hanging="360"/>
+      </w:pPr>
+      <w:rPr>
+        <w:rFonts w:ascii="Courier New" w:hAnsi="Courier New" w:cs="Courier New" w:hint="default"/>
+      </w:rPr>
+    </w:lvl>
+    <w:lvl w:ilvl="5" w:tplc="04050005" w:tentative="1">
+      <w:start w:val="1"/>
+      <w:numFmt w:val="bullet"/>
+      <w:lvlText w:val=""/>
+      <w:lvlJc w:val="left"/>
+      <w:pPr>
+        <w:ind w:left="4665" w:hanging="360"/>
+      </w:pPr>
+      <w:rPr>
+        <w:rFonts w:ascii="Wingdings" w:hAnsi="Wingdings" w:hint="default"/>
+      </w:rPr>
+    </w:lvl>
+    <w:lvl w:ilvl="6" w:tplc="04050001" w:tentative="1">
+      <w:start w:val="1"/>
+      <w:numFmt w:val="bullet"/>
+      <w:lvlText w:val=""/>
+      <w:lvlJc w:val="left"/>
+      <w:pPr>
+        <w:ind w:left="5385" w:hanging="360"/>
+      </w:pPr>
+      <w:rPr>
+        <w:rFonts w:ascii="Symbol" w:hAnsi="Symbol" w:hint="default"/>
+      </w:rPr>
+    </w:lvl>
+    <w:lvl w:ilvl="7" w:tplc="04050003" w:tentative="1">
+      <w:start w:val="1"/>
+      <w:numFmt w:val="bullet"/>
+      <w:lvlText w:val="o"/>
+      <w:lvlJc w:val="left"/>
+      <w:pPr>
+        <w:ind w:left="6105" w:hanging="360"/>
+      </w:pPr>
+      <w:rPr>
+        <w:rFonts w:ascii="Courier New" w:hAnsi="Courier New" w:cs="Courier New" w:hint="default"/>
+      </w:rPr>
+    </w:lvl>
+    <w:lvl w:ilvl="8" w:tplc="04050005" w:tentative="1">
+      <w:start w:val="1"/>
+      <w:numFmt w:val="bullet"/>
+      <w:lvlText w:val=""/>
+      <w:lvlJc w:val="left"/>
+      <w:pPr>
+        <w:ind w:left="6825" w:hanging="360"/>
+      </w:pPr>
+      <w:rPr>
+        <w:rFonts w:ascii="Wingdings" w:hAnsi="Wingdings" w:hint="default"/>
+      </w:rPr>
+    </w:lvl>
+  </w:abstractNum>
+  <w:abstractNum w:abstractNumId="40" w15:restartNumberingAfterBreak="0">
     <w:nsid w:val="7E7804A0"/>
     <w:multiLevelType w:val="hybridMultilevel"/>
     <w:tmpl w:val="4BF8FF76"/>
@@ -12098,25 +12809,25 @@
     </w:lvl>
   </w:abstractNum>
   <w:num w:numId="1" w16cid:durableId="620039191">
-    <w:abstractNumId w:val="12"/>
+    <w:abstractNumId w:val="13"/>
   </w:num>
   <w:num w:numId="2" w16cid:durableId="1385447912">
     <w:abstractNumId w:val="4"/>
   </w:num>
   <w:num w:numId="3" w16cid:durableId="402947605">
-    <w:abstractNumId w:val="26"/>
+    <w:abstractNumId w:val="27"/>
   </w:num>
   <w:num w:numId="4" w16cid:durableId="1949000298">
+    <w:abstractNumId w:val="35"/>
+  </w:num>
+  <w:num w:numId="5" w16cid:durableId="89399167">
     <w:abstractNumId w:val="34"/>
   </w:num>
-  <w:num w:numId="5" w16cid:durableId="89399167">
-    <w:abstractNumId w:val="33"/>
-  </w:num>
   <w:num w:numId="6" w16cid:durableId="469175344">
-    <w:abstractNumId w:val="29"/>
+    <w:abstractNumId w:val="30"/>
   </w:num>
   <w:num w:numId="7" w16cid:durableId="208298722">
-    <w:abstractNumId w:val="21"/>
+    <w:abstractNumId w:val="22"/>
   </w:num>
   <w:num w:numId="8" w16cid:durableId="177620192">
     <w:abstractNumId w:val="2"/>
@@ -12125,31 +12836,31 @@
     <w:abstractNumId w:val="0"/>
   </w:num>
   <w:num w:numId="10" w16cid:durableId="557058186">
-    <w:abstractNumId w:val="35"/>
+    <w:abstractNumId w:val="36"/>
   </w:num>
   <w:num w:numId="11" w16cid:durableId="813908948">
+    <w:abstractNumId w:val="17"/>
+  </w:num>
+  <w:num w:numId="12" w16cid:durableId="1457066175">
+    <w:abstractNumId w:val="7"/>
+  </w:num>
+  <w:num w:numId="13" w16cid:durableId="1187863165">
+    <w:abstractNumId w:val="29"/>
+  </w:num>
+  <w:num w:numId="14" w16cid:durableId="1258904774">
     <w:abstractNumId w:val="16"/>
   </w:num>
-  <w:num w:numId="12" w16cid:durableId="1457066175">
-    <w:abstractNumId w:val="6"/>
-  </w:num>
-  <w:num w:numId="13" w16cid:durableId="1187863165">
-    <w:abstractNumId w:val="28"/>
-  </w:num>
-  <w:num w:numId="14" w16cid:durableId="1258904774">
-    <w:abstractNumId w:val="15"/>
-  </w:num>
   <w:num w:numId="15" w16cid:durableId="625307972">
-    <w:abstractNumId w:val="30"/>
+    <w:abstractNumId w:val="31"/>
   </w:num>
   <w:num w:numId="16" w16cid:durableId="1657297398">
-    <w:abstractNumId w:val="25"/>
+    <w:abstractNumId w:val="26"/>
   </w:num>
   <w:num w:numId="17" w16cid:durableId="723871448">
-    <w:abstractNumId w:val="32"/>
+    <w:abstractNumId w:val="33"/>
   </w:num>
   <w:num w:numId="18" w16cid:durableId="137112280">
-    <w:abstractNumId w:val="37"/>
+    <w:abstractNumId w:val="38"/>
   </w:num>
   <w:num w:numId="19" w16cid:durableId="352072345">
     <w:abstractNumId w:val="3"/>
@@ -12158,64 +12869,70 @@
     <w:abstractNumId w:val="1"/>
   </w:num>
   <w:num w:numId="21" w16cid:durableId="1462190647">
-    <w:abstractNumId w:val="8"/>
+    <w:abstractNumId w:val="9"/>
   </w:num>
   <w:num w:numId="22" w16cid:durableId="747113366">
-    <w:abstractNumId w:val="36"/>
+    <w:abstractNumId w:val="37"/>
   </w:num>
   <w:num w:numId="23" w16cid:durableId="1057168060">
-    <w:abstractNumId w:val="14"/>
+    <w:abstractNumId w:val="15"/>
   </w:num>
   <w:num w:numId="24" w16cid:durableId="829751300">
     <w:abstractNumId w:val="5"/>
   </w:num>
   <w:num w:numId="25" w16cid:durableId="98837639">
+    <w:abstractNumId w:val="25"/>
+  </w:num>
+  <w:num w:numId="26" w16cid:durableId="693266025">
+    <w:abstractNumId w:val="28"/>
+  </w:num>
+  <w:num w:numId="27" w16cid:durableId="1892493753">
+    <w:abstractNumId w:val="32"/>
+  </w:num>
+  <w:num w:numId="28" w16cid:durableId="1558861174">
+    <w:abstractNumId w:val="27"/>
+  </w:num>
+  <w:num w:numId="29" w16cid:durableId="1134061409">
+    <w:abstractNumId w:val="18"/>
+  </w:num>
+  <w:num w:numId="30" w16cid:durableId="1744794599">
+    <w:abstractNumId w:val="21"/>
+  </w:num>
+  <w:num w:numId="31" w16cid:durableId="1817844041">
+    <w:abstractNumId w:val="23"/>
+  </w:num>
+  <w:num w:numId="32" w16cid:durableId="472908971">
+    <w:abstractNumId w:val="14"/>
+  </w:num>
+  <w:num w:numId="33" w16cid:durableId="429549034">
+    <w:abstractNumId w:val="40"/>
+  </w:num>
+  <w:num w:numId="34" w16cid:durableId="1563367793">
+    <w:abstractNumId w:val="12"/>
+  </w:num>
+  <w:num w:numId="35" w16cid:durableId="2117627208">
+    <w:abstractNumId w:val="10"/>
+  </w:num>
+  <w:num w:numId="36" w16cid:durableId="1190070517">
+    <w:abstractNumId w:val="20"/>
+  </w:num>
+  <w:num w:numId="37" w16cid:durableId="1535191084">
     <w:abstractNumId w:val="24"/>
   </w:num>
-  <w:num w:numId="26" w16cid:durableId="693266025">
-    <w:abstractNumId w:val="27"/>
+  <w:num w:numId="38" w16cid:durableId="1616475969">
+    <w:abstractNumId w:val="19"/>
   </w:num>
-  <w:num w:numId="27" w16cid:durableId="1892493753">
-    <w:abstractNumId w:val="31"/>
-  </w:num>
-  <w:num w:numId="28" w16cid:durableId="1558861174">
-    <w:abstractNumId w:val="26"/>
-  </w:num>
-  <w:num w:numId="29" w16cid:durableId="1134061409">
-    <w:abstractNumId w:val="17"/>
-  </w:num>
-  <w:num w:numId="30" w16cid:durableId="1744794599">
-    <w:abstractNumId w:val="20"/>
-  </w:num>
-  <w:num w:numId="31" w16cid:durableId="1817844041">
-    <w:abstractNumId w:val="22"/>
-  </w:num>
-  <w:num w:numId="32" w16cid:durableId="472908971">
-    <w:abstractNumId w:val="13"/>
-  </w:num>
-  <w:num w:numId="33" w16cid:durableId="429549034">
-    <w:abstractNumId w:val="38"/>
-  </w:num>
-  <w:num w:numId="34" w16cid:durableId="1563367793">
+  <w:num w:numId="39" w16cid:durableId="1976718596">
     <w:abstractNumId w:val="11"/>
   </w:num>
-  <w:num w:numId="35" w16cid:durableId="2117627208">
-    <w:abstractNumId w:val="9"/>
+  <w:num w:numId="40" w16cid:durableId="1667172072">
+    <w:abstractNumId w:val="8"/>
   </w:num>
-  <w:num w:numId="36" w16cid:durableId="1190070517">
-    <w:abstractNumId w:val="19"/>
+  <w:num w:numId="41" w16cid:durableId="1244728155">
+    <w:abstractNumId w:val="6"/>
   </w:num>
-  <w:num w:numId="37" w16cid:durableId="1535191084">
-    <w:abstractNumId w:val="23"/>
-  </w:num>
-  <w:num w:numId="38" w16cid:durableId="1616475969">
-    <w:abstractNumId w:val="18"/>
-  </w:num>
-  <w:num w:numId="39" w16cid:durableId="1976718596">
-    <w:abstractNumId w:val="10"/>
-  </w:num>
-  <w:num w:numId="40" w16cid:durableId="1667172072">
-    <w:abstractNumId w:val="7"/>
+  <w:num w:numId="42" w16cid:durableId="1439136245">
+    <w:abstractNumId w:val="39"/>
   </w:num>
 </w:numbering>
 </file>
@@ -13823,7 +14540,9 @@
     <w:rsid w:val="002470A6"/>
     <w:rsid w:val="00256898"/>
     <w:rsid w:val="002708F3"/>
+    <w:rsid w:val="002B1941"/>
     <w:rsid w:val="002E68DF"/>
+    <w:rsid w:val="00334563"/>
     <w:rsid w:val="003458A9"/>
     <w:rsid w:val="003E0F7E"/>
     <w:rsid w:val="00406C6A"/>
@@ -14644,9 +15363,7 @@
 </file>
 
 <file path=customXml/item3.xml><?xml version="1.0" encoding="utf-8"?>
-<p:properties xmlns:p="http://schemas.microsoft.com/office/2006/metadata/properties" xmlns:xsi="http://www.w3.org/2001/XMLSchema-instance" xmlns:pc="http://schemas.microsoft.com/office/infopath/2007/PartnerControls">
-  <documentManagement/>
-</p:properties>
+<b:Sources xmlns:b="http://schemas.openxmlformats.org/officeDocument/2006/bibliography" xmlns="http://schemas.openxmlformats.org/officeDocument/2006/bibliography" SelectedStyle="\APASixthEditionOfficeOnline.xsl" StyleName="APA" Version="6"/>
 </file>
 
 <file path=customXml/item4.xml><?xml version="1.0" encoding="utf-8"?>
@@ -14782,7 +15499,9 @@
 </file>
 
 <file path=customXml/item5.xml><?xml version="1.0" encoding="utf-8"?>
-<b:Sources xmlns:b="http://schemas.openxmlformats.org/officeDocument/2006/bibliography" xmlns="http://schemas.openxmlformats.org/officeDocument/2006/bibliography" SelectedStyle="\APASixthEditionOfficeOnline.xsl" StyleName="APA" Version="6"/>
+<p:properties xmlns:p="http://schemas.microsoft.com/office/2006/metadata/properties" xmlns:xsi="http://www.w3.org/2001/XMLSchema-instance" xmlns:pc="http://schemas.microsoft.com/office/infopath/2007/PartnerControls">
+  <documentManagement/>
+</p:properties>
 </file>
 
 <file path=customXml/itemProps1.xml><?xml version="1.0" encoding="utf-8"?>
@@ -14802,10 +15521,9 @@
 </file>
 
 <file path=customXml/itemProps3.xml><?xml version="1.0" encoding="utf-8"?>
-<ds:datastoreItem xmlns:ds="http://schemas.openxmlformats.org/officeDocument/2006/customXml" ds:itemID="{EDE7D767-2E0D-494D-8433-FAEBD4A37F8E}">
+<ds:datastoreItem xmlns:ds="http://schemas.openxmlformats.org/officeDocument/2006/customXml" ds:itemID="{016BB16A-1E0F-4115-AADC-10D5070CD6B8}">
   <ds:schemaRefs>
-    <ds:schemaRef ds:uri="http://schemas.microsoft.com/office/2006/metadata/properties"/>
-    <ds:schemaRef ds:uri="http://schemas.microsoft.com/office/infopath/2007/PartnerControls"/>
+    <ds:schemaRef ds:uri="http://schemas.openxmlformats.org/officeDocument/2006/bibliography"/>
   </ds:schemaRefs>
 </ds:datastoreItem>
 </file>
@@ -14829,9 +15547,10 @@
 </file>
 
 <file path=customXml/itemProps5.xml><?xml version="1.0" encoding="utf-8"?>
-<ds:datastoreItem xmlns:ds="http://schemas.openxmlformats.org/officeDocument/2006/customXml" ds:itemID="{016BB16A-1E0F-4115-AADC-10D5070CD6B8}">
+<ds:datastoreItem xmlns:ds="http://schemas.openxmlformats.org/officeDocument/2006/customXml" ds:itemID="{EDE7D767-2E0D-494D-8433-FAEBD4A37F8E}">
   <ds:schemaRefs>
-    <ds:schemaRef ds:uri="http://schemas.openxmlformats.org/officeDocument/2006/bibliography"/>
+    <ds:schemaRef ds:uri="http://schemas.microsoft.com/office/2006/metadata/properties"/>
+    <ds:schemaRef ds:uri="http://schemas.microsoft.com/office/infopath/2007/PartnerControls"/>
   </ds:schemaRefs>
 </ds:datastoreItem>
 </file>
</xml_diff>

<commit_message>
BP a aktuální db
</commit_message>
<xml_diff>
--- a/bp_svobo229_v2.docx
+++ b/bp_svobo229_v2.docx
@@ -510,7 +510,7 @@
           <v:shape id="_x0000_i1025" type="#_x0000_t75" style="width:446.25pt;height:478.7pt" o:ole="">
             <v:imagedata r:id="rId12" o:title=""/>
           </v:shape>
-          <o:OLEObject Type="Embed" ProgID="Word.Document.12" ShapeID="_x0000_i1025" DrawAspect="Content" ObjectID="_1833391329" r:id="rId13">
+          <o:OLEObject Type="Embed" ProgID="Word.Document.12" ShapeID="_x0000_i1025" DrawAspect="Content" ObjectID="_1833477119" r:id="rId13">
             <o:FieldCodes>\s</o:FieldCodes>
           </o:OLEObject>
         </w:object>
@@ -6591,116 +6591,1544 @@
       <w:r>
         <w:t xml:space="preserve"> </w:t>
       </w:r>
+      <w:r>
+        <w:t>Z této kapitoly poté bude vycházet finální řešení mé bakalářské práce</w:t>
+      </w:r>
+      <w:r>
+        <w:t>.</w:t>
+      </w:r>
     </w:p>
     <w:p/>
     <w:p>
-      <w:r>
-        <w:t>PŘIDAT SEM TEXT</w:t>
+      <w:pPr>
+        <w:pStyle w:val="Nadpis2"/>
+      </w:pPr>
+      <w:r>
+        <w:t>Uživatelské prostředí</w:t>
+      </w:r>
+    </w:p>
+    <w:p>
+      <w:r>
+        <w:t xml:space="preserve">Uživatelské prostředí bude obsahovat 3 základní </w:t>
+      </w:r>
+      <w:r>
+        <w:t>barvy,</w:t>
+      </w:r>
+      <w:r>
+        <w:t xml:space="preserve"> a to </w:t>
+      </w:r>
+      <w:r>
+        <w:t>krémově bílou, zelenou v týmovém odstínu a černou</w:t>
+      </w:r>
+      <w:r>
+        <w:t>. Celé uživatelské prostředí bude vytvořeno v minimalistickém stylu</w:t>
+      </w:r>
+      <w:r>
+        <w:t xml:space="preserve"> a bude kombinovat prvky moderního designu</w:t>
+      </w:r>
+      <w:r>
+        <w:t xml:space="preserve">, </w:t>
+      </w:r>
+      <w:r>
+        <w:t>tato kombinace</w:t>
+      </w:r>
+      <w:r>
+        <w:t xml:space="preserve"> pomůže přehlednosti webových stránek. </w:t>
+      </w:r>
+      <w:r>
+        <w:t xml:space="preserve">Webová stránka bude mít fixní mezery mezi jednotlivými prvky a bude zde použito </w:t>
+      </w:r>
+      <w:r>
+        <w:t>zakulacení</w:t>
+      </w:r>
+      <w:r>
+        <w:t xml:space="preserve"> ostrých hran</w:t>
+      </w:r>
+      <w:r>
+        <w:t xml:space="preserve">. </w:t>
+      </w:r>
+      <w:r>
+        <w:t>Důraz dále bude kladen na responzivitu webu, aby bylo možné web plnohodnotně zobrazit na jakémkoliv zařízení</w:t>
+      </w:r>
+      <w:r>
+        <w:t xml:space="preserve">. </w:t>
+      </w:r>
+      <w:r>
+        <w:t>Uživatelské prostředí bylo navrženo v programu Figma a při samotné tvorbě bylo vše stylováno pomocí TailwindCSS.</w:t>
+      </w:r>
+    </w:p>
+    <w:p>
+      <w:pPr>
+        <w:keepNext/>
+        <w:jc w:val="center"/>
+      </w:pPr>
+      <w:r>
+        <w:drawing>
+          <wp:inline distT="0" distB="0" distL="0" distR="0" wp14:anchorId="7F19650A" wp14:editId="5C631017">
+            <wp:extent cx="4652387" cy="4543505"/>
+            <wp:effectExtent l="0" t="0" r="0" b="0"/>
+            <wp:docPr id="723304867" name="Obrázek 1" descr="Obsah obrázku text, elektronika, software, snímek obrazovky&#10;&#10;Obsah generovaný pomocí AI může být nesprávný."/>
+            <wp:cNvGraphicFramePr>
+              <a:graphicFrameLocks xmlns:a="http://schemas.openxmlformats.org/drawingml/2006/main" noChangeAspect="1"/>
+            </wp:cNvGraphicFramePr>
+            <a:graphic xmlns:a="http://schemas.openxmlformats.org/drawingml/2006/main">
+              <a:graphicData uri="http://schemas.openxmlformats.org/drawingml/2006/picture">
+                <pic:pic xmlns:pic="http://schemas.openxmlformats.org/drawingml/2006/picture">
+                  <pic:nvPicPr>
+                    <pic:cNvPr id="723304867" name="Obrázek 1" descr="Obsah obrázku text, elektronika, software, snímek obrazovky&#10;&#10;Obsah generovaný pomocí AI může být nesprávný."/>
+                    <pic:cNvPicPr/>
+                  </pic:nvPicPr>
+                  <pic:blipFill>
+                    <a:blip r:embed="rId34"/>
+                    <a:stretch>
+                      <a:fillRect/>
+                    </a:stretch>
+                  </pic:blipFill>
+                  <pic:spPr>
+                    <a:xfrm>
+                      <a:off x="0" y="0"/>
+                      <a:ext cx="4660498" cy="4551426"/>
+                    </a:xfrm>
+                    <a:prstGeom prst="rect">
+                      <a:avLst/>
+                    </a:prstGeom>
+                  </pic:spPr>
+                </pic:pic>
+              </a:graphicData>
+            </a:graphic>
+          </wp:inline>
+        </w:drawing>
+      </w:r>
+    </w:p>
+    <w:p>
+      <w:pPr>
+        <w:pStyle w:val="Titulek"/>
+      </w:pPr>
+      <w:r>
+        <w:t xml:space="preserve">Obr. </w:t>
+      </w:r>
+      <w:fldSimple w:instr=" SEQ Obr. \* ARABIC ">
+        <w:r>
+          <w:rPr>
+            <w:noProof/>
+          </w:rPr>
+          <w:t>14</w:t>
+        </w:r>
+      </w:fldSimple>
+      <w:r>
+        <w:t>: Návrh úvodní stránky</w:t>
+      </w:r>
+    </w:p>
+    <w:p>
+      <w:pPr>
+        <w:jc w:val="center"/>
+        <w:rPr>
+          <w:i/>
+          <w:iCs/>
+        </w:rPr>
+      </w:pPr>
+      <w:r>
+        <w:rPr>
+          <w:i/>
+          <w:iCs/>
+        </w:rPr>
+        <w:t>Zdroj: vlastní</w:t>
+      </w:r>
+    </w:p>
+    <w:p>
+      <w:pPr>
+        <w:keepNext/>
+        <w:jc w:val="left"/>
+      </w:pPr>
+      <w:r>
+        <w:rPr>
+          <w:noProof/>
+        </w:rPr>
+        <w:lastRenderedPageBreak/>
+        <w:drawing>
+          <wp:inline distT="0" distB="0" distL="0" distR="0" wp14:anchorId="03AC6D39" wp14:editId="7BFFBDF0">
+            <wp:extent cx="5399405" cy="3037205"/>
+            <wp:effectExtent l="0" t="0" r="0" b="0"/>
+            <wp:docPr id="1413056992" name="Obrázek 1" descr="Obsah obrázku text, snímek obrazovky, software, Multimediální software&#10;&#10;Obsah generovaný pomocí AI může být nesprávný."/>
+            <wp:cNvGraphicFramePr>
+              <a:graphicFrameLocks xmlns:a="http://schemas.openxmlformats.org/drawingml/2006/main" noChangeAspect="1"/>
+            </wp:cNvGraphicFramePr>
+            <a:graphic xmlns:a="http://schemas.openxmlformats.org/drawingml/2006/main">
+              <a:graphicData uri="http://schemas.openxmlformats.org/drawingml/2006/picture">
+                <pic:pic xmlns:pic="http://schemas.openxmlformats.org/drawingml/2006/picture">
+                  <pic:nvPicPr>
+                    <pic:cNvPr id="1413056992" name="Obrázek 1" descr="Obsah obrázku text, snímek obrazovky, software, Multimediální software&#10;&#10;Obsah generovaný pomocí AI může být nesprávný."/>
+                    <pic:cNvPicPr/>
+                  </pic:nvPicPr>
+                  <pic:blipFill>
+                    <a:blip r:embed="rId35"/>
+                    <a:stretch>
+                      <a:fillRect/>
+                    </a:stretch>
+                  </pic:blipFill>
+                  <pic:spPr>
+                    <a:xfrm>
+                      <a:off x="0" y="0"/>
+                      <a:ext cx="5399405" cy="3037205"/>
+                    </a:xfrm>
+                    <a:prstGeom prst="rect">
+                      <a:avLst/>
+                    </a:prstGeom>
+                  </pic:spPr>
+                </pic:pic>
+              </a:graphicData>
+            </a:graphic>
+          </wp:inline>
+        </w:drawing>
+      </w:r>
+    </w:p>
+    <w:p>
+      <w:pPr>
+        <w:pStyle w:val="Titulek"/>
+      </w:pPr>
+      <w:r>
+        <w:t xml:space="preserve">Obr. </w:t>
+      </w:r>
+      <w:fldSimple w:instr=" SEQ Obr. \* ARABIC ">
+        <w:r>
+          <w:rPr>
+            <w:noProof/>
+          </w:rPr>
+          <w:t>15</w:t>
+        </w:r>
+      </w:fldSimple>
+      <w:r>
+        <w:t>: Návrh administrace</w:t>
+      </w:r>
+    </w:p>
+    <w:p>
+      <w:pPr>
+        <w:jc w:val="center"/>
+        <w:rPr>
+          <w:i/>
+          <w:iCs/>
+        </w:rPr>
+      </w:pPr>
+      <w:r>
+        <w:rPr>
+          <w:i/>
+          <w:iCs/>
+        </w:rPr>
+        <w:t>Zdroj: vlastní</w:t>
+      </w:r>
+    </w:p>
+    <w:p>
+      <w:pPr>
+        <w:pStyle w:val="Nadpis2"/>
+      </w:pPr>
+      <w:r>
+        <w:t>Uživatelské role</w:t>
+      </w:r>
+    </w:p>
+    <w:p>
+      <w:r>
+        <w:t>Nové řešení bude obsahovat 3 typy uživatelských účtů. Každý typ bude mít své pravomoce na základě kterých bude moci s nově navrženým systémem interagovat. Mezi tyto role patří administrátor, trenér, závodník. S webovou stránkou bude moci interagovat i běžný návštěvník, avšak nebude mít přístup do administrace či nebude mít možnost přihlašovat se na různé turnaje nebo zkoušky. Definování uživatelských rolí je velmi důležitým aspektem, který slouží k jasnému stanovení pravomocí a možností jednotlivých uživatelů a díky jemuž nebudou mít neoprávněné uživatelské účty přístup do administrace</w:t>
+      </w:r>
+      <w:r>
+        <w:t>.</w:t>
       </w:r>
     </w:p>
     <w:p/>
     <w:p>
+      <w:r>
+        <w:rPr>
+          <w:b/>
+          <w:bCs/>
+        </w:rPr>
+        <w:t>Administrátor</w:t>
+      </w:r>
+      <w:r>
+        <w:t xml:space="preserve"> – role disponující nejvyššími pravomocemi, administrátor má plnou kontrolu nad webem, může přidávat, mazat a upravovat závody, zkoušky, aktuality. Pracovat s bannery, odkazy, sponzory a v neposlední řadě má přístup ke všem uživatelským účtům a rolím. </w:t>
+      </w:r>
+    </w:p>
+    <w:p>
+      <w:r>
+        <w:rPr>
+          <w:b/>
+          <w:bCs/>
+        </w:rPr>
+        <w:t>Trenér</w:t>
+      </w:r>
+      <w:r>
+        <w:t xml:space="preserve"> –   může přidávat, mazat a upravovat závody, zkoušky, aktuality, upravovat uživatelům technické stupně pásu, přidávat úspěchy, ocenění, měnit jejich stav a přidávat uživatelům roli trenér – nikoli vyšší roli, jak mají oni sami.</w:t>
+      </w:r>
+    </w:p>
+    <w:p>
+      <w:r>
+        <w:rPr>
+          <w:b/>
+          <w:bCs/>
+        </w:rPr>
+        <w:t>Závodník</w:t>
+      </w:r>
+      <w:r>
+        <w:t xml:space="preserve"> – po vytvoření a schválení uživatelského účtu se může závodník přihlásit na závody a zkoušky. Může si upravit informace týkající se jeho účtu jako je například emailová adresa, telefonní číslo, heslo nebo aktuální váhová kategorie, která je velmi důležitým aspektem při přihlašování se na zkoušky. Uživatelé s tímto oprávněním samozřejmě budou mít také přístup k webovým stránkám jako běžný návštěvník.</w:t>
+      </w:r>
+    </w:p>
+    <w:p>
+      <w:r>
+        <w:rPr>
+          <w:b/>
+          <w:bCs/>
+        </w:rPr>
+        <w:t>Návštěvník</w:t>
+      </w:r>
+      <w:r>
+        <w:t xml:space="preserve"> – návštěvník webu může procházet a interagovat se všemi částmi webu, které nejsou schované za administrací. Může si procházet aktuality, podívat se na informace týkající se oddílu, nastudovat si sestavy potřebné k úspěšnému zvládnutí zkoušek na vyšší technický stupeň pásu. </w:t>
+      </w:r>
+      <w:r>
+        <w:lastRenderedPageBreak/>
+        <w:t>Prohlédnout si závodníky oddílu, podívat se v jakých prostorách oddíl najde a v případě zájmu si podat přihlášku.</w:t>
+      </w:r>
+    </w:p>
+    <w:p/>
+    <w:p>
       <w:pPr>
         <w:pStyle w:val="Nadpis2"/>
       </w:pPr>
       <w:r>
-        <w:t>Uživatelské prostředí</w:t>
-      </w:r>
-    </w:p>
-    <w:p>
-      <w:r>
-        <w:t xml:space="preserve">Uživatelské prostředí bude obsahovat 3 základní </w:t>
-      </w:r>
-      <w:r>
-        <w:t>barvy,</w:t>
-      </w:r>
-      <w:r>
-        <w:t xml:space="preserve"> a to </w:t>
-      </w:r>
-      <w:r>
-        <w:t>krémově bílou, zelenou v týmovém odstínu a černou</w:t>
-      </w:r>
-      <w:r>
-        <w:t xml:space="preserve">. Celé uživatelské prostředí bude vytvořeno v minimalistickém stylu, který pomůže přehlednosti webových stránek. </w:t>
-      </w:r>
-      <w:r>
-        <w:t>Důraz dále bude kladen na responzivitu webu, aby bylo možné web plnohodnotně zobrazit na jakémkoliv zařízení</w:t>
+        <w:t>Databáze</w:t>
+      </w:r>
+    </w:p>
+    <w:p>
+      <w:r>
+        <w:t xml:space="preserve">Pro správnou funkcionalitu webových stránek je potřeba navrhnout kvalitní a dobře strukturovanou databázi, která bude popsána v této sekci. Pro samotný návrh jsem využíval webovou </w:t>
+      </w:r>
+      <w:r>
+        <w:t xml:space="preserve">stránku </w:t>
+      </w:r>
+      <w:proofErr w:type="spellStart"/>
+      <w:r>
+        <w:t>dbdiagram</w:t>
+      </w:r>
+      <w:proofErr w:type="spellEnd"/>
+      <w:r>
+        <w:t>, ve které jsem si specifikoval všechny potřebné entity a vazby mezi nimi.</w:t>
+      </w:r>
+      <w:r>
+        <w:t xml:space="preserve"> Databáze je implementována v relačním databázovém systému MySQL a obsahuje celkem 14 tabulek, které jsou vzájemně provázány pomocí cizích klíčů.</w:t>
+      </w:r>
+    </w:p>
+    <w:p>
+      <w:pPr>
+        <w:pStyle w:val="Nadpis3"/>
+      </w:pPr>
+      <w:r>
+        <w:t>Popis jednotlivých tabulek</w:t>
+      </w:r>
+    </w:p>
+    <w:p>
+      <w:proofErr w:type="spellStart"/>
+      <w:r>
+        <w:rPr>
+          <w:b/>
+          <w:bCs/>
+        </w:rPr>
+        <w:t>Fighters</w:t>
+      </w:r>
+      <w:proofErr w:type="spellEnd"/>
+      <w:r>
+        <w:rPr>
+          <w:b/>
+          <w:bCs/>
+        </w:rPr>
+        <w:t xml:space="preserve"> – závodníci</w:t>
+      </w:r>
+    </w:p>
+    <w:p>
+      <w:r>
+        <w:t xml:space="preserve">Tabulka </w:t>
+      </w:r>
+      <w:proofErr w:type="spellStart"/>
+      <w:r>
+        <w:t>fighters</w:t>
+      </w:r>
+      <w:proofErr w:type="spellEnd"/>
+      <w:r>
+        <w:t xml:space="preserve"> představuje centrální entitu celého systému a uchovává informace o všech závodnících oddílu. Každý záznam obsahuje základní osobní údaje jako jméno (</w:t>
+      </w:r>
+      <w:proofErr w:type="spellStart"/>
+      <w:r>
+        <w:t>name</w:t>
+      </w:r>
+      <w:proofErr w:type="spellEnd"/>
+      <w:r>
+        <w:t>), příjmení (</w:t>
+      </w:r>
+      <w:proofErr w:type="spellStart"/>
+      <w:r>
+        <w:t>surname</w:t>
+      </w:r>
+      <w:proofErr w:type="spellEnd"/>
+      <w:r>
+        <w:t>) a datum narození (</w:t>
+      </w:r>
+      <w:proofErr w:type="spellStart"/>
+      <w:r>
+        <w:t>birth</w:t>
+      </w:r>
+      <w:proofErr w:type="spellEnd"/>
+      <w:r>
+        <w:t xml:space="preserve">). Dále jsou zde uloženy </w:t>
+      </w:r>
+      <w:r>
+        <w:t>záznamy týkající se úspěchů závodníků</w:t>
+      </w:r>
+      <w:r>
+        <w:t xml:space="preserve"> – cizí klíč </w:t>
+      </w:r>
+      <w:proofErr w:type="spellStart"/>
+      <w:r>
+        <w:t>belts_id</w:t>
+      </w:r>
+      <w:proofErr w:type="spellEnd"/>
+      <w:r>
+        <w:t xml:space="preserve"> odkazující na aktuální technický stupeň závodníka, </w:t>
+      </w:r>
+      <w:proofErr w:type="spellStart"/>
+      <w:r>
+        <w:t>category_id</w:t>
+      </w:r>
+      <w:proofErr w:type="spellEnd"/>
+      <w:r>
+        <w:t xml:space="preserve"> určující věkovou kategorii a </w:t>
+      </w:r>
+      <w:proofErr w:type="spellStart"/>
+      <w:r>
+        <w:t>actual_weight_category</w:t>
+      </w:r>
+      <w:proofErr w:type="spellEnd"/>
+      <w:r>
+        <w:t xml:space="preserve"> reprezentující aktuální váhovou kategorii závodníka v kilogramech.</w:t>
+      </w:r>
+    </w:p>
+    <w:p>
+      <w:r>
+        <w:t xml:space="preserve">Tabulka také obsahuje booleovské </w:t>
+      </w:r>
+      <w:r>
+        <w:t>hodnoty</w:t>
+      </w:r>
+      <w:r>
+        <w:t xml:space="preserve"> </w:t>
+      </w:r>
+      <w:proofErr w:type="spellStart"/>
+      <w:r>
+        <w:t>best</w:t>
+      </w:r>
+      <w:proofErr w:type="spellEnd"/>
+      <w:r>
+        <w:t xml:space="preserve"> a legend, které slouží k označení výjimečných závodníků zobrazovaných na veřejné části webu, a </w:t>
+      </w:r>
+      <w:r>
+        <w:t>stav</w:t>
+      </w:r>
+      <w:r>
+        <w:t xml:space="preserve"> </w:t>
+      </w:r>
+      <w:proofErr w:type="spellStart"/>
+      <w:r>
+        <w:t>active</w:t>
+      </w:r>
+      <w:proofErr w:type="spellEnd"/>
+      <w:r>
+        <w:t xml:space="preserve"> určující, zda je závodník aktuálně aktivním členem oddílu</w:t>
+      </w:r>
+      <w:r>
+        <w:t xml:space="preserve"> či nikoliv</w:t>
+      </w:r>
+      <w:r>
+        <w:t xml:space="preserve">. Sloupec </w:t>
+      </w:r>
+      <w:proofErr w:type="spellStart"/>
+      <w:r>
+        <w:t>img_path</w:t>
+      </w:r>
+      <w:proofErr w:type="spellEnd"/>
+      <w:r>
+        <w:t xml:space="preserve"> uchovává cestu k profilové fotografii závodníka.</w:t>
       </w:r>
     </w:p>
     <w:p/>
+    <w:p>
+      <w:pPr>
+        <w:rPr>
+          <w:b/>
+          <w:bCs/>
+        </w:rPr>
+      </w:pPr>
+      <w:proofErr w:type="spellStart"/>
+      <w:r>
+        <w:rPr>
+          <w:b/>
+          <w:bCs/>
+        </w:rPr>
+        <w:t>Belts</w:t>
+      </w:r>
+      <w:proofErr w:type="spellEnd"/>
+      <w:r>
+        <w:rPr>
+          <w:b/>
+          <w:bCs/>
+        </w:rPr>
+        <w:t xml:space="preserve"> – pásky</w:t>
+      </w:r>
+    </w:p>
+    <w:p>
+      <w:r>
+        <w:t xml:space="preserve">Tabulka </w:t>
+      </w:r>
+      <w:proofErr w:type="spellStart"/>
+      <w:r>
+        <w:t>belts</w:t>
+      </w:r>
+      <w:proofErr w:type="spellEnd"/>
+      <w:r>
+        <w:t xml:space="preserve"> </w:t>
+      </w:r>
+      <w:r>
+        <w:t>obsahuje všechny</w:t>
+      </w:r>
+      <w:r>
+        <w:t xml:space="preserve"> dostupné technické stupně v </w:t>
+      </w:r>
+      <w:proofErr w:type="spellStart"/>
+      <w:r>
+        <w:t>Taekwodnu</w:t>
+      </w:r>
+      <w:proofErr w:type="spellEnd"/>
+      <w:r>
+        <w:t xml:space="preserve">, od </w:t>
+      </w:r>
+      <w:r>
+        <w:t>bílého</w:t>
+      </w:r>
+      <w:r>
+        <w:t xml:space="preserve"> pásku přes barevné pásky až po jednotlivé dany černého pásku. Každý stupeň má svůj název (</w:t>
+      </w:r>
+      <w:proofErr w:type="spellStart"/>
+      <w:r>
+        <w:t>belt_name</w:t>
+      </w:r>
+      <w:proofErr w:type="spellEnd"/>
+      <w:r>
+        <w:t xml:space="preserve">), označení </w:t>
+      </w:r>
+      <w:proofErr w:type="spellStart"/>
+      <w:r>
+        <w:t>cupu</w:t>
+      </w:r>
+      <w:proofErr w:type="spellEnd"/>
+      <w:r>
+        <w:t xml:space="preserve"> (cup, např. „8. CUP" nebo „1. DAN"</w:t>
+      </w:r>
+      <w:proofErr w:type="gramStart"/>
+      <w:r>
+        <w:t>),  cenu</w:t>
+      </w:r>
+      <w:proofErr w:type="gramEnd"/>
+      <w:r>
+        <w:t xml:space="preserve"> zkoušky (</w:t>
+      </w:r>
+      <w:proofErr w:type="spellStart"/>
+      <w:r>
+        <w:t>price</w:t>
+      </w:r>
+      <w:proofErr w:type="spellEnd"/>
+      <w:r>
+        <w:t>), cestu k obrázku pásku (</w:t>
+      </w:r>
+      <w:proofErr w:type="spellStart"/>
+      <w:r>
+        <w:t>img_path</w:t>
+      </w:r>
+      <w:proofErr w:type="spellEnd"/>
+      <w:r>
+        <w:t>), doplňující informace (</w:t>
+      </w:r>
+      <w:proofErr w:type="spellStart"/>
+      <w:r>
+        <w:t>info</w:t>
+      </w:r>
+      <w:proofErr w:type="spellEnd"/>
+      <w:r>
+        <w:t>) a cestu k výukovému videu (</w:t>
+      </w:r>
+      <w:proofErr w:type="spellStart"/>
+      <w:r>
+        <w:t>video_path</w:t>
+      </w:r>
+      <w:proofErr w:type="spellEnd"/>
+      <w:r>
+        <w:t xml:space="preserve">). Tabulka je ve vztahu </w:t>
+      </w:r>
+      <w:proofErr w:type="gramStart"/>
+      <w:r>
+        <w:t>1:N</w:t>
+      </w:r>
+      <w:proofErr w:type="gramEnd"/>
+      <w:r>
+        <w:t xml:space="preserve"> s tabulkou </w:t>
+      </w:r>
+      <w:proofErr w:type="spellStart"/>
+      <w:r>
+        <w:t>fighters</w:t>
+      </w:r>
+      <w:proofErr w:type="spellEnd"/>
+      <w:r>
+        <w:t xml:space="preserve"> – jeden technický stupeň může mít více závodníků, ale každý závodník má právě jeden aktuální stupeň.</w:t>
+      </w:r>
+    </w:p>
     <w:p/>
     <w:p>
-      <w:r>
-        <w:t>Napsat něco o struktuře projektu a napsat něco o expressu</w:t>
-      </w:r>
-    </w:p>
-    <w:p>
-      <w:r>
+      <w:proofErr w:type="spellStart"/>
+      <w:r>
+        <w:rPr>
+          <w:b/>
+          <w:bCs/>
+        </w:rPr>
+        <w:t>Category</w:t>
+      </w:r>
+      <w:proofErr w:type="spellEnd"/>
+      <w:r>
+        <w:rPr>
+          <w:b/>
+          <w:bCs/>
+        </w:rPr>
+        <w:t xml:space="preserve"> – kategorie</w:t>
+      </w:r>
+    </w:p>
+    <w:p>
+      <w:r>
+        <w:t xml:space="preserve">Tabulka </w:t>
+      </w:r>
+      <w:proofErr w:type="spellStart"/>
+      <w:r>
+        <w:t>category</w:t>
+      </w:r>
+      <w:proofErr w:type="spellEnd"/>
+      <w:r>
+        <w:t xml:space="preserve"> definuje věkové kategorie závodníků používané v soutěž</w:t>
+      </w:r>
+      <w:r>
+        <w:t>ích</w:t>
+      </w:r>
+      <w:r>
+        <w:t xml:space="preserve"> taekwondo. Každá kategorie je charakterizována názvem (</w:t>
+      </w:r>
+      <w:proofErr w:type="spellStart"/>
+      <w:r>
+        <w:t>name</w:t>
+      </w:r>
+      <w:proofErr w:type="spellEnd"/>
+      <w:r>
+        <w:t xml:space="preserve">, např. </w:t>
+      </w:r>
+      <w:proofErr w:type="spellStart"/>
+      <w:r>
+        <w:t>Youth</w:t>
+      </w:r>
+      <w:proofErr w:type="spellEnd"/>
+      <w:r>
+        <w:t xml:space="preserve">, </w:t>
+      </w:r>
+      <w:proofErr w:type="spellStart"/>
+      <w:r>
+        <w:t>Cadet</w:t>
+      </w:r>
+      <w:proofErr w:type="spellEnd"/>
+      <w:r>
+        <w:t xml:space="preserve">, Junior, Senior, Ultra) a věkovým rozsahem vyjádřeným sloupci min a max. Vztah s tabulkou </w:t>
+      </w:r>
+      <w:proofErr w:type="spellStart"/>
+      <w:r>
+        <w:t>fighters</w:t>
+      </w:r>
+      <w:proofErr w:type="spellEnd"/>
+      <w:r>
+        <w:t xml:space="preserve"> je opět </w:t>
+      </w:r>
+      <w:proofErr w:type="gramStart"/>
+      <w:r>
+        <w:t>1:N</w:t>
+      </w:r>
+      <w:proofErr w:type="gramEnd"/>
+      <w:r>
+        <w:t xml:space="preserve"> – v jedné kategorii může závodit více závodníků, ale každý závodník patří do právě jedné kategorie.</w:t>
+      </w:r>
+    </w:p>
+    <w:p/>
+    <w:p>
+      <w:r>
+        <w:rPr>
+          <w:b/>
+          <w:bCs/>
+        </w:rPr>
+        <w:t>Users – uživatelé</w:t>
+      </w:r>
+    </w:p>
+    <w:p>
+      <w:r>
+        <w:lastRenderedPageBreak/>
+        <w:t xml:space="preserve">Tabulka users spravuje uživatelské účty systému. Každý uživatel má přihlašovací jméno (login), </w:t>
+      </w:r>
+      <w:proofErr w:type="spellStart"/>
+      <w:r>
+        <w:t>zahashované</w:t>
+      </w:r>
+      <w:proofErr w:type="spellEnd"/>
+      <w:r>
+        <w:t xml:space="preserve"> heslo (</w:t>
+      </w:r>
+      <w:proofErr w:type="spellStart"/>
+      <w:r>
+        <w:t>password</w:t>
+      </w:r>
+      <w:proofErr w:type="spellEnd"/>
+      <w:r>
+        <w:t>)</w:t>
+      </w:r>
+      <w:r>
+        <w:t xml:space="preserve"> pomocí </w:t>
+      </w:r>
+      <w:proofErr w:type="spellStart"/>
+      <w:r>
+        <w:t>byCriptu</w:t>
+      </w:r>
+      <w:proofErr w:type="spellEnd"/>
+      <w:r>
+        <w:t xml:space="preserve">, volitelný e-mail (email) a telefonní číslo (phone). Sloupec </w:t>
+      </w:r>
+      <w:proofErr w:type="spellStart"/>
+      <w:r>
+        <w:t>role_id</w:t>
+      </w:r>
+      <w:proofErr w:type="spellEnd"/>
+      <w:r>
+        <w:t xml:space="preserve"> určuje oprávnění uživatele v systému a </w:t>
+      </w:r>
+      <w:proofErr w:type="spellStart"/>
+      <w:r>
+        <w:t>fighter_id</w:t>
+      </w:r>
+      <w:proofErr w:type="spellEnd"/>
+      <w:r>
+        <w:t xml:space="preserve"> umožňuje provázání uživatelského účtu s konkrétním závodníkem. Toto propojení je ve vztahu 1:1 – jeden závodník může mít právě jeden uživatelský účet a jeden uživatelský účet může být přiřazen právě jednomu závodníkovi. Toto provázání umožňuje závodníkům přihlásit se do systému a spravovat vlastní profil nebo</w:t>
+      </w:r>
+      <w:r>
+        <w:t xml:space="preserve"> své</w:t>
+      </w:r>
+      <w:r>
+        <w:t xml:space="preserve"> registrace na turnaje</w:t>
+      </w:r>
+      <w:r>
+        <w:t xml:space="preserve"> či zkoušky</w:t>
+      </w:r>
+      <w:r>
+        <w:t>.</w:t>
+      </w:r>
+    </w:p>
+    <w:p/>
+    <w:p>
+      <w:pPr>
+        <w:rPr>
+          <w:b/>
+          <w:bCs/>
+        </w:rPr>
+      </w:pPr>
+      <w:r>
+        <w:rPr>
+          <w:b/>
+          <w:bCs/>
+        </w:rPr>
+        <w:t>Role</w:t>
+      </w:r>
+    </w:p>
+    <w:p>
+      <w:r>
+        <w:t>Tabulka role definuje role a oprávnění uživatelů v systému. Aktuálně jsou definovány role jako administrátor (admin), trenér (</w:t>
+      </w:r>
+      <w:proofErr w:type="spellStart"/>
+      <w:r>
+        <w:t>trainer</w:t>
+      </w:r>
+      <w:proofErr w:type="spellEnd"/>
+      <w:r>
+        <w:t xml:space="preserve">), uživatel (user) a různé třídy trenérů. Vztah s tabulkou users je </w:t>
+      </w:r>
+      <w:proofErr w:type="gramStart"/>
+      <w:r>
+        <w:t>1:N</w:t>
+      </w:r>
+      <w:proofErr w:type="gramEnd"/>
+      <w:r>
+        <w:t xml:space="preserve"> – jedna role může být přiřazena více uživatelům, ale každý uživatel má právě jednu roli. Tato tabulka je klíčová pro řízení přístupu k administraci systému.</w:t>
+      </w:r>
+    </w:p>
+    <w:p/>
+    <w:p>
+      <w:proofErr w:type="spellStart"/>
+      <w:r>
+        <w:rPr>
+          <w:b/>
+          <w:bCs/>
+        </w:rPr>
+        <w:t>Tournament</w:t>
+      </w:r>
+      <w:proofErr w:type="spellEnd"/>
+      <w:r>
+        <w:rPr>
+          <w:b/>
+          <w:bCs/>
+        </w:rPr>
+        <w:t xml:space="preserve"> – turnaje a akce</w:t>
+      </w:r>
+      <w:r>
+        <w:rPr>
+          <w:b/>
+          <w:bCs/>
+        </w:rPr>
         <w:t xml:space="preserve"> </w:t>
       </w:r>
     </w:p>
+    <w:p>
+      <w:r>
+        <w:t xml:space="preserve">Tabulka </w:t>
+      </w:r>
+      <w:proofErr w:type="spellStart"/>
+      <w:r>
+        <w:t>tournament</w:t>
+      </w:r>
+      <w:proofErr w:type="spellEnd"/>
+      <w:r>
+        <w:t xml:space="preserve"> uchovává informace o plánovaných i proběhlých turnajích a soustředěních oddílu. Každý záznam obsahuje název akce (</w:t>
+      </w:r>
+      <w:proofErr w:type="spellStart"/>
+      <w:r>
+        <w:t>name</w:t>
+      </w:r>
+      <w:proofErr w:type="spellEnd"/>
+      <w:r>
+        <w:t>), místo konání (</w:t>
+      </w:r>
+      <w:proofErr w:type="spellStart"/>
+      <w:r>
+        <w:t>location</w:t>
+      </w:r>
+      <w:proofErr w:type="spellEnd"/>
+      <w:r>
+        <w:t>), startovné (</w:t>
+      </w:r>
+      <w:proofErr w:type="spellStart"/>
+      <w:r>
+        <w:t>price</w:t>
+      </w:r>
+      <w:proofErr w:type="spellEnd"/>
+      <w:r>
+        <w:t>), datum začátku a konce (</w:t>
+      </w:r>
+      <w:proofErr w:type="spellStart"/>
+      <w:r>
+        <w:t>start_date</w:t>
+      </w:r>
+      <w:proofErr w:type="spellEnd"/>
+      <w:r>
+        <w:t xml:space="preserve">, </w:t>
+      </w:r>
+      <w:proofErr w:type="spellStart"/>
+      <w:r>
+        <w:t>end_date</w:t>
+      </w:r>
+      <w:proofErr w:type="spellEnd"/>
+      <w:r>
+        <w:t>), datum uzávěrky přihlášek (</w:t>
+      </w:r>
+      <w:proofErr w:type="spellStart"/>
+      <w:r>
+        <w:t>registrable_date</w:t>
+      </w:r>
+      <w:proofErr w:type="spellEnd"/>
+      <w:r>
+        <w:t>), doplňující informace (</w:t>
+      </w:r>
+      <w:proofErr w:type="spellStart"/>
+      <w:r>
+        <w:t>info</w:t>
+      </w:r>
+      <w:proofErr w:type="spellEnd"/>
+      <w:r>
+        <w:t>) a cestu k fotografii nebo plakátu akce (</w:t>
+      </w:r>
+      <w:proofErr w:type="spellStart"/>
+      <w:r>
+        <w:t>img_path</w:t>
+      </w:r>
+      <w:proofErr w:type="spellEnd"/>
+      <w:r>
+        <w:t xml:space="preserve">). Sloupec </w:t>
+      </w:r>
+      <w:proofErr w:type="spellStart"/>
+      <w:r>
+        <w:t>type_id</w:t>
+      </w:r>
+      <w:proofErr w:type="spellEnd"/>
+      <w:r>
+        <w:t xml:space="preserve"> odkazuje na typ akce a </w:t>
+      </w:r>
+      <w:proofErr w:type="spellStart"/>
+      <w:r>
+        <w:t>users_id</w:t>
+      </w:r>
+      <w:proofErr w:type="spellEnd"/>
+      <w:r>
+        <w:t xml:space="preserve"> eviduje, který uživatel akci vytvořil. </w:t>
+      </w:r>
+      <w:r>
+        <w:t xml:space="preserve"> S</w:t>
+      </w:r>
+      <w:r>
+        <w:t xml:space="preserve">loupec </w:t>
+      </w:r>
+      <w:proofErr w:type="spellStart"/>
+      <w:r>
+        <w:t>google_event_id</w:t>
+      </w:r>
+      <w:proofErr w:type="spellEnd"/>
+      <w:r>
+        <w:t xml:space="preserve"> </w:t>
+      </w:r>
+      <w:r>
+        <w:t>slouží pro interakci a zobrazování turnajů a akcí pomocí integrace</w:t>
+      </w:r>
+      <w:r>
+        <w:t xml:space="preserve"> Google </w:t>
+      </w:r>
+      <w:proofErr w:type="spellStart"/>
+      <w:r>
+        <w:t>Calendar</w:t>
+      </w:r>
+      <w:proofErr w:type="spellEnd"/>
+      <w:r>
+        <w:t xml:space="preserve"> API.</w:t>
+      </w:r>
+    </w:p>
     <w:p/>
     <w:p>
       <w:pPr>
-        <w:pStyle w:val="Nadpis2"/>
-      </w:pPr>
-      <w:r>
-        <w:t>Uživatelské role</w:t>
-      </w:r>
-    </w:p>
-    <w:p>
-      <w:r>
-        <w:t xml:space="preserve">S webovou stránkou budou moci interagovat určité role, které se mezi sebou liší v pravomocích. Základní rolí zde bude role návštěvníka, který si bude moci pouze web prohlížet případně </w:t>
-      </w:r>
-      <w:r>
-        <w:t xml:space="preserve">vyplnit formulář. Další rolí bude role pro závodníky, kteří se po přihlášení budou moci přihlašovat a ohlašovat z různých akcí či zkoušek. Nad rolí závodníka bude stát role trenéra, který může přidávat, odebírat a editovat různé akce, profily uživatelů a obsah na webové stránce. Rolí </w:t>
-      </w:r>
-      <w:r>
-        <w:t>s</w:t>
-      </w:r>
-      <w:r>
-        <w:t> nejvyššími právy je role administrátora, který má plné řízení webové stránky.</w:t>
-      </w:r>
-    </w:p>
-    <w:p>
-      <w:pPr>
-        <w:pStyle w:val="Nadpis2"/>
-      </w:pPr>
-      <w:r>
-        <w:t>Databáze</w:t>
-      </w:r>
-    </w:p>
-    <w:p>
-      <w:r>
-        <w:t xml:space="preserve">Pro správnou funkcionalitu webových stránek je potřeba navrhnout kvalitní a dobře strukturovanou databázi, která bude popsána v této sekci. Pro samotný návrh jsem využíval webovou </w:t>
-      </w:r>
-      <w:r>
-        <w:t>stránku dbdiagram, ve které jsem si specifikoval všechny potřebné entity a vazby mezi nimi.</w:t>
+        <w:rPr>
+          <w:b/>
+          <w:bCs/>
+        </w:rPr>
+      </w:pPr>
+      <w:r>
+        <w:rPr>
+          <w:b/>
+          <w:bCs/>
+        </w:rPr>
+        <w:t xml:space="preserve">Type – typy akcí </w:t>
+      </w:r>
+    </w:p>
+    <w:p>
+      <w:r>
+        <w:t xml:space="preserve">Tabulka type je pomocná tabulka definující typy akcí, například Turnaj nebo Soustředění. Je ve vztahu </w:t>
+      </w:r>
+      <w:proofErr w:type="gramStart"/>
+      <w:r>
+        <w:t>1:N</w:t>
+      </w:r>
+      <w:proofErr w:type="gramEnd"/>
+      <w:r>
+        <w:t xml:space="preserve"> s tabulkou </w:t>
+      </w:r>
+      <w:proofErr w:type="spellStart"/>
+      <w:r>
+        <w:t>tournament</w:t>
+      </w:r>
+      <w:proofErr w:type="spellEnd"/>
+      <w:r>
+        <w:t xml:space="preserve"> – jeden typ může zahrnovat více turnajů.</w:t>
       </w:r>
     </w:p>
     <w:p/>
     <w:p>
-      <w:r>
-        <w:t>První tabulka byla tabulka uživatelů, která vycházela z kapitoly o uživatelských rolích. V této entitě bylo potřeba vytvořit login, password</w:t>
+      <w:pPr>
+        <w:rPr>
+          <w:b/>
+          <w:bCs/>
+        </w:rPr>
+      </w:pPr>
+      <w:proofErr w:type="spellStart"/>
+      <w:r>
+        <w:rPr>
+          <w:b/>
+          <w:bCs/>
+        </w:rPr>
+        <w:t>Tournament_registration</w:t>
+      </w:r>
+      <w:proofErr w:type="spellEnd"/>
+      <w:r>
+        <w:rPr>
+          <w:b/>
+          <w:bCs/>
+        </w:rPr>
+        <w:t xml:space="preserve"> – registrace na turnaje</w:t>
+      </w:r>
+    </w:p>
+    <w:p>
+      <w:r>
+        <w:t xml:space="preserve">Tabulka </w:t>
+      </w:r>
+      <w:proofErr w:type="spellStart"/>
+      <w:r>
+        <w:t>tournament_registration</w:t>
+      </w:r>
+      <w:proofErr w:type="spellEnd"/>
+      <w:r>
+        <w:t xml:space="preserve"> realizuje vazební tabulku vztahu </w:t>
+      </w:r>
+      <w:proofErr w:type="gramStart"/>
+      <w:r>
+        <w:t>M:N</w:t>
+      </w:r>
+      <w:proofErr w:type="gramEnd"/>
+      <w:r>
+        <w:t xml:space="preserve"> mezi závodníky a turnaji. Závodník se může registrovat na více turnajů a jeden turnaj může mít více registrovaných závodníků. Každá registrace obsahuje volitelnou poznámku (</w:t>
+      </w:r>
+      <w:proofErr w:type="spellStart"/>
+      <w:r>
+        <w:t>note</w:t>
+      </w:r>
+      <w:proofErr w:type="spellEnd"/>
+      <w:r>
+        <w:t>), stav registrace (status) a dosažené umístění (place), které lze vyplnit zpětně po skončení turnaje.</w:t>
       </w:r>
     </w:p>
     <w:p/>
     <w:p>
       <w:r>
+        <w:rPr>
+          <w:b/>
+          <w:bCs/>
+        </w:rPr>
+        <w:t>Event – aktuality</w:t>
+      </w:r>
+    </w:p>
+    <w:p>
+      <w:r>
+        <w:t>Tabulka event uchovává aktuality a příspěvky zveřejňované na webu oddílu. Každá aktualita má název (</w:t>
+      </w:r>
+      <w:proofErr w:type="spellStart"/>
+      <w:r>
+        <w:t>title</w:t>
+      </w:r>
+      <w:proofErr w:type="spellEnd"/>
+      <w:r>
+        <w:t>), textový obsah (body), stav (status), datum zveřejnění (</w:t>
+      </w:r>
+      <w:proofErr w:type="spellStart"/>
+      <w:r>
+        <w:t>date_start</w:t>
+      </w:r>
+      <w:proofErr w:type="spellEnd"/>
+      <w:r>
+        <w:t>), časové razítko poslední úpravy (</w:t>
+      </w:r>
+      <w:proofErr w:type="spellStart"/>
+      <w:r>
+        <w:t>created_at</w:t>
+      </w:r>
+      <w:proofErr w:type="spellEnd"/>
+      <w:r>
+        <w:t>) a cestu k titulní fotografii (</w:t>
+      </w:r>
+      <w:proofErr w:type="spellStart"/>
+      <w:r>
+        <w:t>photo</w:t>
+      </w:r>
+      <w:proofErr w:type="spellEnd"/>
+      <w:r>
+        <w:t xml:space="preserve">). Cizí klíč </w:t>
+      </w:r>
+      <w:proofErr w:type="spellStart"/>
+      <w:r>
+        <w:t>user_id</w:t>
+      </w:r>
+      <w:proofErr w:type="spellEnd"/>
+      <w:r>
+        <w:t xml:space="preserve"> odkazuje na autora příspěvku. Vztah s tabulkou users je </w:t>
+      </w:r>
+      <w:proofErr w:type="gramStart"/>
+      <w:r>
+        <w:t>1:N</w:t>
+      </w:r>
+      <w:proofErr w:type="gramEnd"/>
+      <w:r>
+        <w:t xml:space="preserve"> – jeden uživatel může vytvořit více aktualit.</w:t>
+      </w:r>
+    </w:p>
+    <w:p/>
+    <w:p>
+      <w:pPr>
+        <w:rPr>
+          <w:b/>
+          <w:bCs/>
+        </w:rPr>
+      </w:pPr>
+      <w:proofErr w:type="spellStart"/>
+      <w:r>
+        <w:rPr>
+          <w:b/>
+          <w:bCs/>
+        </w:rPr>
         <w:lastRenderedPageBreak/>
-        <w:t>Návrh toho jak bude vypadat závodník… Bude mít své id, profile_pic, jméno, příjmení, datum narození, login, heslo, id_role, id_pasku</w:t>
-      </w:r>
-      <w:r>
-        <w:t xml:space="preserve"> a úspěch (m:n)</w:t>
-      </w:r>
-      <w:r>
-        <w:t>, váha, best, legend, active</w:t>
+        <w:t>Event_photos</w:t>
+      </w:r>
+      <w:proofErr w:type="spellEnd"/>
+      <w:r>
+        <w:rPr>
+          <w:b/>
+          <w:bCs/>
+        </w:rPr>
+        <w:t xml:space="preserve"> – fotogalerie aktualit</w:t>
+      </w:r>
+    </w:p>
+    <w:p>
+      <w:r>
+        <w:t xml:space="preserve">Tabulka </w:t>
+      </w:r>
+      <w:proofErr w:type="spellStart"/>
+      <w:r>
+        <w:t>event_photos</w:t>
+      </w:r>
+      <w:proofErr w:type="spellEnd"/>
+      <w:r>
+        <w:t xml:space="preserve"> rozšiřuje systém aktualit o podporu více fotografií u jednoho příspěvku. Každý záznam obsahuje cestu k souboru (</w:t>
+      </w:r>
+      <w:proofErr w:type="spellStart"/>
+      <w:r>
+        <w:t>img_path</w:t>
+      </w:r>
+      <w:proofErr w:type="spellEnd"/>
+      <w:r>
+        <w:t>), pořadí fotografie (</w:t>
+      </w:r>
+      <w:proofErr w:type="spellStart"/>
+      <w:r>
+        <w:t>sort_order</w:t>
+      </w:r>
+      <w:proofErr w:type="spellEnd"/>
+      <w:r>
+        <w:t xml:space="preserve">) pro správné zobrazení galerie a cizí klíč </w:t>
+      </w:r>
+      <w:proofErr w:type="spellStart"/>
+      <w:r>
+        <w:t>event_id</w:t>
+      </w:r>
+      <w:proofErr w:type="spellEnd"/>
+      <w:r>
+        <w:t xml:space="preserve"> odkazující na příslušnou aktualitu. Vazba na tabulku event je definována s kaskádovým mazáním (ON DELETE CASCADE), což zajišťuje, že při smazání aktuality se automaticky odstraní i všechny její fotografie. Vztah je </w:t>
+      </w:r>
+      <w:proofErr w:type="gramStart"/>
+      <w:r>
+        <w:t>1:N</w:t>
+      </w:r>
+      <w:proofErr w:type="gramEnd"/>
+      <w:r>
+        <w:t xml:space="preserve"> – jedna aktualita může mít více fotografií.</w:t>
       </w:r>
     </w:p>
     <w:p/>
     <w:p>
-      <w:r>
-        <w:t>Pásek – id, korejské jméno, cup, cenu, obrázek</w:t>
+      <w:pPr>
+        <w:rPr>
+          <w:b/>
+          <w:bCs/>
+        </w:rPr>
+      </w:pPr>
+      <w:proofErr w:type="spellStart"/>
+      <w:r>
+        <w:rPr>
+          <w:b/>
+          <w:bCs/>
+        </w:rPr>
+        <w:t>Sponsors</w:t>
+      </w:r>
+      <w:proofErr w:type="spellEnd"/>
+      <w:r>
+        <w:rPr>
+          <w:b/>
+          <w:bCs/>
+        </w:rPr>
+        <w:t xml:space="preserve"> – sponzoři</w:t>
+      </w:r>
+    </w:p>
+    <w:p>
+      <w:r>
+        <w:t xml:space="preserve">Tabulka </w:t>
+      </w:r>
+      <w:proofErr w:type="spellStart"/>
+      <w:r>
+        <w:t>sponsors</w:t>
+      </w:r>
+      <w:proofErr w:type="spellEnd"/>
+      <w:r>
+        <w:t xml:space="preserve"> eviduje sponzory oddílu zobrazované na webu. Každý sponzor má název (</w:t>
+      </w:r>
+      <w:proofErr w:type="spellStart"/>
+      <w:r>
+        <w:t>sponsor_name</w:t>
+      </w:r>
+      <w:proofErr w:type="spellEnd"/>
+      <w:r>
+        <w:t>), volitelný odkaz na web (</w:t>
+      </w:r>
+      <w:proofErr w:type="spellStart"/>
+      <w:r>
+        <w:t>url</w:t>
+      </w:r>
+      <w:proofErr w:type="spellEnd"/>
+      <w:r>
+        <w:t>) a cestu k logu (</w:t>
+      </w:r>
+      <w:proofErr w:type="spellStart"/>
+      <w:r>
+        <w:t>img_path</w:t>
+      </w:r>
+      <w:proofErr w:type="spellEnd"/>
+      <w:r>
+        <w:t>).</w:t>
+      </w:r>
+    </w:p>
+    <w:p/>
+    <w:p>
+      <w:pPr>
+        <w:rPr>
+          <w:b/>
+          <w:bCs/>
+        </w:rPr>
+      </w:pPr>
+      <w:r>
+        <w:rPr>
+          <w:b/>
+          <w:bCs/>
+        </w:rPr>
+        <w:t>Banner</w:t>
+      </w:r>
+    </w:p>
+    <w:p>
+      <w:r>
+        <w:t>Tabulka banner spravuje reklamní bannery zobrazované na úvodní stránce webu. Každý banner má název (</w:t>
+      </w:r>
+      <w:proofErr w:type="spellStart"/>
+      <w:r>
+        <w:t>banner_name</w:t>
+      </w:r>
+      <w:proofErr w:type="spellEnd"/>
+      <w:r>
+        <w:t>), cestu k obrázku (</w:t>
+      </w:r>
+      <w:proofErr w:type="spellStart"/>
+      <w:r>
+        <w:t>img_path</w:t>
+      </w:r>
+      <w:proofErr w:type="spellEnd"/>
+      <w:r>
+        <w:t xml:space="preserve">) a příznak </w:t>
+      </w:r>
+      <w:proofErr w:type="spellStart"/>
+      <w:r>
+        <w:t>active</w:t>
+      </w:r>
+      <w:proofErr w:type="spellEnd"/>
+      <w:r>
+        <w:t xml:space="preserve"> určující, zda je banner aktuálně zobrazen.</w:t>
+      </w:r>
+    </w:p>
+    <w:p/>
+    <w:p>
+      <w:pPr>
+        <w:rPr>
+          <w:b/>
+          <w:bCs/>
+        </w:rPr>
+      </w:pPr>
+      <w:proofErr w:type="spellStart"/>
+      <w:r>
+        <w:rPr>
+          <w:b/>
+          <w:bCs/>
+        </w:rPr>
+        <w:t>Trainings</w:t>
+      </w:r>
+      <w:proofErr w:type="spellEnd"/>
+      <w:r>
+        <w:rPr>
+          <w:b/>
+          <w:bCs/>
+        </w:rPr>
+        <w:t xml:space="preserve"> – tréninky</w:t>
+      </w:r>
+    </w:p>
+    <w:p>
+      <w:r>
+        <w:t xml:space="preserve">Tabulka </w:t>
+      </w:r>
+      <w:proofErr w:type="spellStart"/>
+      <w:r>
+        <w:t>trainings</w:t>
+      </w:r>
+      <w:proofErr w:type="spellEnd"/>
+      <w:r>
+        <w:t xml:space="preserve"> uchovává pravidelný tréninkový rozvrh oddílu. Každý záznam definuje den začátku a konce tréninku (</w:t>
+      </w:r>
+      <w:proofErr w:type="spellStart"/>
+      <w:r>
+        <w:t>day_start</w:t>
+      </w:r>
+      <w:proofErr w:type="spellEnd"/>
+      <w:r>
+        <w:t xml:space="preserve">, </w:t>
+      </w:r>
+      <w:proofErr w:type="spellStart"/>
+      <w:r>
+        <w:t>day_end</w:t>
+      </w:r>
+      <w:proofErr w:type="spellEnd"/>
+      <w:r>
+        <w:t xml:space="preserve">), typ tréninku (type, např. začátečníci nebo pokročilí) a čas </w:t>
+      </w:r>
+      <w:r>
+        <w:t>začátku i konce</w:t>
+      </w:r>
+      <w:r>
+        <w:t xml:space="preserve"> (</w:t>
+      </w:r>
+      <w:proofErr w:type="spellStart"/>
+      <w:r>
+        <w:t>time_start</w:t>
+      </w:r>
+      <w:proofErr w:type="spellEnd"/>
+      <w:r>
+        <w:t xml:space="preserve">, </w:t>
+      </w:r>
+      <w:proofErr w:type="spellStart"/>
+      <w:r>
+        <w:t>time_end</w:t>
+      </w:r>
+      <w:proofErr w:type="spellEnd"/>
+      <w:r>
+        <w:t>).</w:t>
+      </w:r>
+    </w:p>
+    <w:p/>
+    <w:p>
+      <w:pPr>
+        <w:rPr>
+          <w:b/>
+          <w:bCs/>
+        </w:rPr>
+      </w:pPr>
+      <w:proofErr w:type="spellStart"/>
+      <w:r>
+        <w:rPr>
+          <w:b/>
+          <w:bCs/>
+        </w:rPr>
+        <w:t>Subscriber_email</w:t>
+      </w:r>
+      <w:proofErr w:type="spellEnd"/>
+      <w:r>
+        <w:rPr>
+          <w:b/>
+          <w:bCs/>
+        </w:rPr>
+        <w:t xml:space="preserve"> – newsletter</w:t>
+      </w:r>
+    </w:p>
+    <w:p>
+      <w:r>
+        <w:t xml:space="preserve">Tabulka </w:t>
+      </w:r>
+      <w:proofErr w:type="spellStart"/>
+      <w:r>
+        <w:t>subscriber_email</w:t>
+      </w:r>
+      <w:proofErr w:type="spellEnd"/>
+      <w:r>
+        <w:t xml:space="preserve"> spravuje odběratele e-mailového newsletteru. Každý odběratel je identifikován e-mailovou adresou (email), </w:t>
+      </w:r>
+      <w:r>
+        <w:t>zobrazení</w:t>
+      </w:r>
+      <w:r>
+        <w:t xml:space="preserve"> aktivního odběru (</w:t>
+      </w:r>
+      <w:proofErr w:type="spellStart"/>
+      <w:r>
+        <w:t>active</w:t>
+      </w:r>
+      <w:proofErr w:type="spellEnd"/>
+      <w:r>
+        <w:t>), odkazem na konkrétní novinku (</w:t>
+      </w:r>
+      <w:proofErr w:type="spellStart"/>
+      <w:r>
+        <w:t>news_id</w:t>
+      </w:r>
+      <w:proofErr w:type="spellEnd"/>
+      <w:r>
+        <w:t>) a ověřovacím tokenem (token) používaným pro potvrzení odběru nebo odhlášení.</w:t>
+      </w:r>
+    </w:p>
+    <w:p/>
+    <w:p>
+      <w:pPr>
+        <w:rPr>
+          <w:b/>
+          <w:bCs/>
+        </w:rPr>
+      </w:pPr>
+      <w:r>
+        <w:rPr>
+          <w:b/>
+          <w:bCs/>
+        </w:rPr>
+        <w:t>Relace mezi tabulkami</w:t>
+      </w:r>
+    </w:p>
+    <w:p>
+      <w:r>
+        <w:t xml:space="preserve">Databáze využívá standardní typy relací relačního modelu. Vztahy </w:t>
+      </w:r>
+      <w:proofErr w:type="gramStart"/>
+      <w:r>
+        <w:t>1:N</w:t>
+      </w:r>
+      <w:proofErr w:type="gramEnd"/>
+      <w:r>
+        <w:t xml:space="preserve"> jsou nejčastější – například jeden technický stupeň může mít více závodníků, jedna role více uživatelů nebo jedna aktualita více fotografií. Vztah 1:1 je realizován mezi tabulkami users a </w:t>
+      </w:r>
+      <w:proofErr w:type="spellStart"/>
+      <w:r>
+        <w:t>fighters</w:t>
+      </w:r>
+      <w:proofErr w:type="spellEnd"/>
+      <w:r>
+        <w:t xml:space="preserve">, kde každý závodník může mít nejvýše jeden uživatelský účet. Vztah </w:t>
+      </w:r>
+      <w:proofErr w:type="gramStart"/>
+      <w:r>
+        <w:t>M:N</w:t>
+      </w:r>
+      <w:proofErr w:type="gramEnd"/>
+      <w:r>
+        <w:t xml:space="preserve"> je implementován prostřednictvím vazební tabulky </w:t>
+      </w:r>
+      <w:proofErr w:type="spellStart"/>
+      <w:r>
+        <w:t>tournament_registration</w:t>
+      </w:r>
+      <w:proofErr w:type="spellEnd"/>
+      <w:r>
+        <w:t>, která propojuje závodníky s turnaji a umožňuje evidovat jejich přihlášky a výsledky.</w:t>
+      </w:r>
+    </w:p>
+    <w:p>
+      <w:r>
+        <w:t xml:space="preserve">Referenční integrita je vynucována pomocí cizích klíčů s různými strategiemi při mazání záznamů. Tabulka </w:t>
+      </w:r>
+      <w:proofErr w:type="spellStart"/>
+      <w:r>
+        <w:t>event_photos</w:t>
+      </w:r>
+      <w:proofErr w:type="spellEnd"/>
+      <w:r>
+        <w:t xml:space="preserve"> používá kaskádové mazání, zatímco ostatní vazby používají </w:t>
+      </w:r>
+      <w:r>
+        <w:lastRenderedPageBreak/>
+        <w:t>výchozí omezení zabraňující smazání rodičovského záznamu, pokud na něj existují závislé záznamy.</w:t>
+      </w:r>
+    </w:p>
+    <w:p>
+      <w:pPr>
+        <w:keepNext/>
+      </w:pPr>
+      <w:r>
+        <w:drawing>
+          <wp:inline distT="0" distB="0" distL="0" distR="0" wp14:anchorId="0A479DE2" wp14:editId="3B987C7F">
+            <wp:extent cx="5399405" cy="2806700"/>
+            <wp:effectExtent l="0" t="0" r="0" b="0"/>
+            <wp:docPr id="1452830420" name="Obrázek 1" descr="Obsah obrázku text, snímek obrazovky, číslo&#10;&#10;Obsah generovaný pomocí AI může být nesprávný."/>
+            <wp:cNvGraphicFramePr>
+              <a:graphicFrameLocks xmlns:a="http://schemas.openxmlformats.org/drawingml/2006/main" noChangeAspect="1"/>
+            </wp:cNvGraphicFramePr>
+            <a:graphic xmlns:a="http://schemas.openxmlformats.org/drawingml/2006/main">
+              <a:graphicData uri="http://schemas.openxmlformats.org/drawingml/2006/picture">
+                <pic:pic xmlns:pic="http://schemas.openxmlformats.org/drawingml/2006/picture">
+                  <pic:nvPicPr>
+                    <pic:cNvPr id="1452830420" name="Obrázek 1" descr="Obsah obrázku text, snímek obrazovky, číslo&#10;&#10;Obsah generovaný pomocí AI může být nesprávný."/>
+                    <pic:cNvPicPr/>
+                  </pic:nvPicPr>
+                  <pic:blipFill>
+                    <a:blip r:embed="rId36"/>
+                    <a:stretch>
+                      <a:fillRect/>
+                    </a:stretch>
+                  </pic:blipFill>
+                  <pic:spPr>
+                    <a:xfrm>
+                      <a:off x="0" y="0"/>
+                      <a:ext cx="5399405" cy="2806700"/>
+                    </a:xfrm>
+                    <a:prstGeom prst="rect">
+                      <a:avLst/>
+                    </a:prstGeom>
+                  </pic:spPr>
+                </pic:pic>
+              </a:graphicData>
+            </a:graphic>
+          </wp:inline>
+        </w:drawing>
+      </w:r>
+    </w:p>
+    <w:p>
+      <w:pPr>
+        <w:pStyle w:val="Titulek"/>
+      </w:pPr>
+      <w:r>
+        <w:t xml:space="preserve">Obr. </w:t>
+      </w:r>
+      <w:fldSimple w:instr=" SEQ Obr. \* ARABIC ">
+        <w:r>
+          <w:rPr>
+            <w:noProof/>
+          </w:rPr>
+          <w:t>16</w:t>
+        </w:r>
+      </w:fldSimple>
+      <w:r>
+        <w:t xml:space="preserve"> </w:t>
+      </w:r>
+      <w:r>
+        <w:t>Diagram</w:t>
+      </w:r>
+    </w:p>
+    <w:p>
+      <w:pPr>
+        <w:jc w:val="center"/>
+      </w:pPr>
+      <w:r>
+        <w:rPr>
+          <w:i/>
+          <w:iCs/>
+        </w:rPr>
+        <w:t>Zdroj: vlastní</w:t>
       </w:r>
     </w:p>
     <w:p>
@@ -6712,6 +8140,7 @@
         <w:t>Praktická část</w:t>
       </w:r>
     </w:p>
+    <w:p/>
     <w:p>
       <w:r>
         <w:t>Kapitola zabývající se samotnou realizací bakalářské práce</w:t>
@@ -6743,150 +8172,6 @@
         <w:pStyle w:val="Nadpis2"/>
       </w:pPr>
       <w:r>
-        <w:t>Uživatelské role</w:t>
-      </w:r>
-    </w:p>
-    <w:p>
-      <w:r>
-        <w:t xml:space="preserve">Nové řešení bude obsahovat 3 typy uživatelských účtů. Každý typ </w:t>
-      </w:r>
-      <w:r>
-        <w:t>bude mít své pravomoce na základě kterých bude moci s nově navrženým systémem interagovat</w:t>
-      </w:r>
-      <w:r>
-        <w:t xml:space="preserve">. Mezi tyto role patří administrátor, trenér, závodník. S webovou stránkou bude moci interagovat i běžný návštěvník, avšak </w:t>
-      </w:r>
-      <w:r>
-        <w:t>nebude mít přístup do administrace či nebude mít možnost přihlašovat se na různé turnaje nebo zkoušky.</w:t>
-      </w:r>
-      <w:r>
-        <w:t xml:space="preserve"> Definování uživatelských rolí je velmi důležitým </w:t>
-      </w:r>
-      <w:r>
-        <w:t>aspektem,</w:t>
-      </w:r>
-      <w:r>
-        <w:t xml:space="preserve"> který slouží k jasnému stanovení pravomocí a možností jednotlivých uživatelů a díky jemuž </w:t>
-      </w:r>
-      <w:r>
-        <w:t>nebudou mít neoprávněné uživatelské účty přístup do administrace</w:t>
-      </w:r>
-    </w:p>
-    <w:p/>
-    <w:p>
-      <w:r>
-        <w:rPr>
-          <w:b/>
-          <w:bCs/>
-        </w:rPr>
-        <w:t>Administrátor</w:t>
-      </w:r>
-      <w:r>
-        <w:t xml:space="preserve"> – role disponující nejvyššími pravomocemi</w:t>
-      </w:r>
-      <w:r>
-        <w:t>, administrátor má plnou kontrolu nad webem, může přidávat, mazat a upravovat závody, zkoušky, aktuality. Pracovat s bannery, odkazy</w:t>
-      </w:r>
-      <w:r>
-        <w:t xml:space="preserve">, </w:t>
-      </w:r>
-      <w:r>
-        <w:t>sponzory</w:t>
-      </w:r>
-      <w:r>
-        <w:t xml:space="preserve"> a v neposlední řadě má přístup ke všem uživatelským účtům a rolím. </w:t>
-      </w:r>
-    </w:p>
-    <w:p>
-      <w:r>
-        <w:rPr>
-          <w:b/>
-          <w:bCs/>
-        </w:rPr>
-        <w:t>Trenér</w:t>
-      </w:r>
-      <w:r>
-        <w:t xml:space="preserve"> – </w:t>
-      </w:r>
-      <w:r>
-        <w:t xml:space="preserve">  může přidávat, mazat a upravovat závody, zkoušky, aktuality</w:t>
-      </w:r>
-      <w:r>
-        <w:t xml:space="preserve">, upravovat uživatelům technické stupně pásu, přidávat úspěchy, ocenění, měnit jejich stav a přidávat uživatelům roli trenér – nikoli vyšší </w:t>
-      </w:r>
-      <w:r>
-        <w:t>roli,</w:t>
-      </w:r>
-      <w:r>
-        <w:t xml:space="preserve"> jak mají oni sami.</w:t>
-      </w:r>
-    </w:p>
-    <w:p>
-      <w:r>
-        <w:rPr>
-          <w:b/>
-          <w:bCs/>
-        </w:rPr>
-        <w:t>Závodník</w:t>
-      </w:r>
-      <w:r>
-        <w:t xml:space="preserve"> </w:t>
-      </w:r>
-      <w:r>
-        <w:t>–</w:t>
-      </w:r>
-      <w:r>
-        <w:t xml:space="preserve"> </w:t>
-      </w:r>
-      <w:r>
-        <w:t xml:space="preserve">po vytvoření a schválení uživatelského účtu se může závodník přihlásit </w:t>
-      </w:r>
-      <w:r>
-        <w:t>na závody a zkoušky. Může si upravit informace týkající se jeho účtu</w:t>
-      </w:r>
-      <w:r>
-        <w:t xml:space="preserve"> jako je například emailová adresa, telefonní číslo, heslo nebo aktuální váhová kategorie, která je velmi důležitým aspektem při přihlašování se na zkoušky. Uživatelé s tímto oprávněním samozřejmě budou mít také přístup k</w:t>
-      </w:r>
-      <w:r>
-        <w:t xml:space="preserve"> webov</w:t>
-      </w:r>
-      <w:r>
-        <w:t>ým</w:t>
-      </w:r>
-      <w:r>
-        <w:t xml:space="preserve"> stránk</w:t>
-      </w:r>
-      <w:r>
-        <w:t>ám</w:t>
-      </w:r>
-      <w:r>
-        <w:t xml:space="preserve"> jako běžný návštěvník.</w:t>
-      </w:r>
-    </w:p>
-    <w:p>
-      <w:r>
-        <w:rPr>
-          <w:b/>
-          <w:bCs/>
-        </w:rPr>
-        <w:t>Návštěvník</w:t>
-      </w:r>
-      <w:r>
-        <w:t xml:space="preserve"> – návštěvník webu může procházet a interagovat se všemi částmi webu, které nejsou schované za administrací. Může si procházet aktuality, podívat se na informace týkající se oddílu, nastudovat si sestavy potřebné k úspěšnému zvládnutí zkoušek na vyšší </w:t>
-      </w:r>
-      <w:r>
-        <w:t xml:space="preserve">technický </w:t>
-      </w:r>
-      <w:r>
-        <w:t>stupeň pásu. Prohlédnout si závodníky oddílu, podívat se v jakých prostorách oddíl najde a v případě zájmu si podat přihlášku.</w:t>
-      </w:r>
-    </w:p>
-    <w:p>
-      <w:pPr>
-        <w:pStyle w:val="Nadpis2"/>
-      </w:pPr>
-      <w:r>
-        <w:lastRenderedPageBreak/>
         <w:t>Frontend</w:t>
       </w:r>
     </w:p>
@@ -6913,6 +8198,7 @@
     </w:p>
     <w:p>
       <w:pPr>
+        <w:keepNext/>
         <w:jc w:val="center"/>
       </w:pPr>
       <w:r>
@@ -6935,7 +8221,7 @@
                     <pic:cNvPicPr/>
                   </pic:nvPicPr>
                   <pic:blipFill>
-                    <a:blip r:embed="rId34"/>
+                    <a:blip r:embed="rId37"/>
                     <a:stretch>
                       <a:fillRect/>
                     </a:stretch>
@@ -6961,11 +8247,16 @@
         <w:pStyle w:val="Titulek"/>
       </w:pPr>
       <w:r>
-        <w:t>Obr.</w:t>
-      </w:r>
-      <w:r>
-        <w:t>14</w:t>
-      </w:r>
+        <w:t xml:space="preserve">Obr. </w:t>
+      </w:r>
+      <w:fldSimple w:instr=" SEQ Obr. \* ARABIC ">
+        <w:r>
+          <w:rPr>
+            <w:noProof/>
+          </w:rPr>
+          <w:t>17</w:t>
+        </w:r>
+      </w:fldSimple>
       <w:r>
         <w:t>: Struktura frontendu</w:t>
       </w:r>
@@ -6980,6 +8271,7 @@
     </w:p>
     <w:p>
       <w:r>
+        <w:lastRenderedPageBreak/>
         <w:t>Kořenová složka</w:t>
       </w:r>
       <w:r>
@@ -7076,7 +8368,6 @@
           <w:b/>
           <w:bCs/>
         </w:rPr>
-        <w:lastRenderedPageBreak/>
         <w:t>src</w:t>
       </w:r>
       <w:r>
@@ -7104,7 +8395,13 @@
         <w:t xml:space="preserve">složka </w:t>
       </w:r>
       <w:r>
-        <w:t>obsahující přímo kod psaný programátorem ve které si sám definuje logiku i samotný vzhled aplikace</w:t>
+        <w:t xml:space="preserve">obsahující přímo </w:t>
+      </w:r>
+      <w:r>
+        <w:t>kód</w:t>
+      </w:r>
+      <w:r>
+        <w:t xml:space="preserve"> psaný programátorem ve které si sám definuje logiku i samotný vzhled aplikace</w:t>
       </w:r>
     </w:p>
     <w:p>
@@ -7131,7 +8428,13 @@
         <w:t>Components</w:t>
       </w:r>
       <w:r>
-        <w:t xml:space="preserve"> – složka s react componentamy, které jsou znovu použitelné jako jsou například tlačítka, header, autentizace uživatele </w:t>
+        <w:t xml:space="preserve"> – složka s react componentamy, které jsou znovu použitelné jako jsou například tlačítka, </w:t>
+      </w:r>
+      <w:r>
+        <w:t>formuláře</w:t>
+      </w:r>
+      <w:r>
+        <w:t xml:space="preserve">, autentizace uživatele </w:t>
       </w:r>
       <w:r>
         <w:t>zkrátka komponenty, které se využívají na více stránkách</w:t>
@@ -7172,6 +8475,14 @@
       <w:r>
         <w:t>Layout</w:t>
       </w:r>
+      <w:r>
+        <w:t xml:space="preserve"> – skládá se z částí, které tvoří layout aplikace, patří sem například header, footer, </w:t>
+      </w:r>
+      <w:proofErr w:type="spellStart"/>
+      <w:r>
+        <w:t>container</w:t>
+      </w:r>
+      <w:proofErr w:type="spellEnd"/>
     </w:p>
     <w:p>
       <w:pPr>
@@ -7181,11 +8492,21 @@
           <w:numId w:val="42"/>
         </w:numPr>
       </w:pPr>
+      <w:proofErr w:type="spellStart"/>
       <w:r>
         <w:t>Pages</w:t>
       </w:r>
-      <w:r>
-        <w:t xml:space="preserve"> – obsahuje složky pojmenované po stránkách, kterými aplikace disponuje, každá složka obsahuje unikátní componenty, které jsou na dané stránce použité</w:t>
+      <w:proofErr w:type="spellEnd"/>
+      <w:r>
+        <w:t xml:space="preserve"> – obsahuje složky pojmenované po stránkách, kterými aplikace disponuje, každá složka obsahuje unikátní </w:t>
+      </w:r>
+      <w:proofErr w:type="spellStart"/>
+      <w:r>
+        <w:t>componenty</w:t>
+      </w:r>
+      <w:proofErr w:type="spellEnd"/>
+      <w:r>
+        <w:t>, které jsou na dané stránce použité</w:t>
       </w:r>
     </w:p>
     <w:p>
@@ -7196,9 +8517,11 @@
           <w:numId w:val="42"/>
         </w:numPr>
       </w:pPr>
+      <w:proofErr w:type="spellStart"/>
       <w:r>
         <w:t>Utils</w:t>
       </w:r>
+      <w:proofErr w:type="spellEnd"/>
     </w:p>
     <w:p>
       <w:pPr>
@@ -7220,74 +8543,60 @@
           <w:b/>
           <w:bCs/>
         </w:rPr>
-        <w:t>A následující soubory</w:t>
+        <w:t>S</w:t>
       </w:r>
       <w:r>
         <w:rPr>
           <w:b/>
           <w:bCs/>
         </w:rPr>
-        <w:t>:</w:t>
-      </w:r>
-    </w:p>
-    <w:p>
+        <w:t>oubory</w:t>
+      </w:r>
       <w:r>
         <w:rPr>
           <w:b/>
           <w:bCs/>
         </w:rPr>
-        <w:t>.gitignore</w:t>
-      </w:r>
-      <w:r>
-        <w:t xml:space="preserve"> – jsou zde definovány složky a soubory, které nemají být zpracovávány verzovacími systémy jako je například Git</w:t>
-      </w:r>
-      <w:r>
-        <w:t>, typickým příkladem bývá soubor .env ve kterém se nachází citlivé údaje jako jsou API klíče či konfigurace databáze ke které je projekt napojený.</w:t>
-      </w:r>
-    </w:p>
-    <w:p>
+        <w:t>:</w:t>
+      </w:r>
+    </w:p>
+    <w:p>
+      <w:proofErr w:type="gramStart"/>
       <w:r>
         <w:rPr>
           <w:b/>
           <w:bCs/>
         </w:rPr>
-        <w:t>eslint.config.js</w:t>
-      </w:r>
-      <w:r>
-        <w:t xml:space="preserve"> – konfigurační soubor nástroje ESLint, který slouží k statické analýze zdrojového </w:t>
-      </w:r>
-      <w:r>
-        <w:t>kódu</w:t>
-      </w:r>
-      <w:r>
-        <w:t xml:space="preserve">, definuje sadu syntaktických a stylových pravidel, zajišťuje konzistenci </w:t>
-      </w:r>
-      <w:r>
-        <w:t>kódu</w:t>
-      </w:r>
-    </w:p>
-    <w:p>
+        <w:t>.</w:t>
+      </w:r>
+      <w:proofErr w:type="spellStart"/>
       <w:r>
         <w:rPr>
           <w:b/>
           <w:bCs/>
         </w:rPr>
-        <w:t>index.html</w:t>
-      </w:r>
-      <w:r>
-        <w:t xml:space="preserve"> –</w:t>
-      </w:r>
-      <w:r>
-        <w:t xml:space="preserve"> obsahuje</w:t>
-      </w:r>
-      <w:r>
-        <w:t xml:space="preserve"> HTML šablo</w:t>
-      </w:r>
-      <w:r>
-        <w:t>nu</w:t>
-      </w:r>
-      <w:r>
-        <w:t xml:space="preserve"> do které je vkládána React aplikace</w:t>
+        <w:t>gitignore</w:t>
+      </w:r>
+      <w:proofErr w:type="spellEnd"/>
+      <w:proofErr w:type="gramEnd"/>
+      <w:r>
+        <w:t xml:space="preserve"> – jsou zde definovány složky a soubory, které nemají být zpracovávány verzovacími systémy jako je například Git</w:t>
+      </w:r>
+      <w:r>
+        <w:t xml:space="preserve">, typickým příkladem bývá </w:t>
+      </w:r>
+      <w:proofErr w:type="gramStart"/>
+      <w:r>
+        <w:t>soubor .</w:t>
+      </w:r>
+      <w:proofErr w:type="spellStart"/>
+      <w:r>
+        <w:t>env</w:t>
+      </w:r>
+      <w:proofErr w:type="spellEnd"/>
+      <w:proofErr w:type="gramEnd"/>
+      <w:r>
+        <w:t xml:space="preserve"> ve kterém se nachází citlivé údaje jako jsou API klíče či konfigurace databáze ke které je projekt napojený.</w:t>
       </w:r>
     </w:p>
     <w:p>
@@ -7296,13 +8605,22 @@
           <w:b/>
           <w:bCs/>
         </w:rPr>
-        <w:t>package-lock.json</w:t>
-      </w:r>
-      <w:r>
-        <w:t xml:space="preserve"> – </w:t>
-      </w:r>
-      <w:r>
-        <w:t>generuje se automaticky při každé instalaci a uživatel by do něj neměl vůbec zasahovat</w:t>
+        <w:t>index.html</w:t>
+      </w:r>
+      <w:r>
+        <w:t xml:space="preserve"> –</w:t>
+      </w:r>
+      <w:r>
+        <w:t xml:space="preserve"> obsahuje</w:t>
+      </w:r>
+      <w:r>
+        <w:t xml:space="preserve"> HTML šablo</w:t>
+      </w:r>
+      <w:r>
+        <w:t>nu</w:t>
+      </w:r>
+      <w:r>
+        <w:t xml:space="preserve"> do které je vkládána React aplikace</w:t>
       </w:r>
     </w:p>
     <w:p>
@@ -7311,80 +8629,286 @@
           <w:b/>
           <w:bCs/>
         </w:rPr>
-        <w:t>package.json</w:t>
-      </w:r>
-      <w:r>
-        <w:t xml:space="preserve"> – jsou zde základní informace o projektu a seznam hlavních závislostí </w:t>
-      </w:r>
-    </w:p>
-    <w:p>
+        <w:t>package-</w:t>
+      </w:r>
+      <w:proofErr w:type="gramStart"/>
       <w:r>
         <w:rPr>
           <w:b/>
           <w:bCs/>
         </w:rPr>
-        <w:t>postcss.config.js</w:t>
-      </w:r>
-      <w:r>
-        <w:t xml:space="preserve"> – konfigurační soubor pro PostCSS, které optimalizuje CSS a umožňuje práci s TailWindCSS</w:t>
-      </w:r>
-    </w:p>
-    <w:p>
+        <w:t>lock.json</w:t>
+      </w:r>
+      <w:proofErr w:type="gramEnd"/>
+      <w:r>
+        <w:t xml:space="preserve"> – </w:t>
+      </w:r>
+      <w:r>
+        <w:t>generuje se automaticky při každé instalaci a uživatel by do něj neměl vůbec zasahovat</w:t>
+      </w:r>
+    </w:p>
+    <w:p>
+      <w:proofErr w:type="gramStart"/>
       <w:r>
         <w:rPr>
           <w:b/>
           <w:bCs/>
         </w:rPr>
-        <w:t>tailwind.config.js</w:t>
-      </w:r>
-      <w:r>
-        <w:t xml:space="preserve"> </w:t>
-      </w:r>
-      <w:r>
-        <w:t>–</w:t>
-      </w:r>
-      <w:r>
-        <w:t xml:space="preserve"> </w:t>
-      </w:r>
-      <w:r>
-        <w:t>konfigurační soubor pro TailWindCSS</w:t>
-      </w:r>
-    </w:p>
-    <w:p>
-      <w:r>
+        <w:t>package.json</w:t>
+      </w:r>
+      <w:proofErr w:type="gramEnd"/>
+      <w:r>
+        <w:t xml:space="preserve"> – jsou zde základní informace o projektu a seznam hlavních závislostí </w:t>
+      </w:r>
+    </w:p>
+    <w:p/>
+    <w:p>
+      <w:pPr>
         <w:rPr>
           <w:b/>
           <w:bCs/>
         </w:rPr>
-        <w:t>vite.config.js</w:t>
-      </w:r>
-      <w:r>
-        <w:t xml:space="preserve"> </w:t>
-      </w:r>
-      <w:r>
-        <w:t>–</w:t>
-      </w:r>
-      <w:r>
-        <w:t xml:space="preserve"> </w:t>
-      </w:r>
-      <w:r>
-        <w:t xml:space="preserve">nachází se zde definice </w:t>
-      </w:r>
-      <w:r>
-        <w:t>toho,</w:t>
-      </w:r>
-      <w:r>
-        <w:t xml:space="preserve"> jak se má projekt spouštět, sestavovat a jaké technologie má podporovat</w:t>
-      </w:r>
-    </w:p>
-    <w:p>
-      <w:pPr>
+      </w:pPr>
+      <w:r>
         <w:rPr>
           <w:b/>
           <w:bCs/>
         </w:rPr>
-      </w:pPr>
-    </w:p>
+        <w:t>Konfigurační soubory:</w:t>
+      </w:r>
+    </w:p>
+    <w:p>
+      <w:r>
+        <w:rPr>
+          <w:b/>
+          <w:bCs/>
+        </w:rPr>
+        <w:t>eslint.config.js</w:t>
+      </w:r>
+      <w:r>
+        <w:t xml:space="preserve"> – konfigurační soubor nástroje ESLint, který slouží k statické analýze zdrojového kódu, definuje sadu syntaktických a stylových pravidel, zajišťuje konzistenci kódu</w:t>
+      </w:r>
+    </w:p>
+    <w:p>
+      <w:r>
+        <w:rPr>
+          <w:b/>
+          <w:bCs/>
+        </w:rPr>
+        <w:t>postcss.config.js</w:t>
+      </w:r>
+      <w:r>
+        <w:t xml:space="preserve"> – konfigurační soubor pro PostCSS, které optimalizuje CSS a umožňuje práci s TailWindCSS</w:t>
+      </w:r>
+    </w:p>
+    <w:p>
+      <w:r>
+        <w:rPr>
+          <w:b/>
+          <w:bCs/>
+        </w:rPr>
+        <w:lastRenderedPageBreak/>
+        <w:t>tailwind.config.js</w:t>
+      </w:r>
+      <w:r>
+        <w:t xml:space="preserve"> – konfigurační soubor pro TailWindCSS</w:t>
+      </w:r>
+    </w:p>
+    <w:p>
+      <w:r>
+        <w:rPr>
+          <w:b/>
+          <w:bCs/>
+        </w:rPr>
+        <w:t>vite.config.js</w:t>
+      </w:r>
+      <w:r>
+        <w:t xml:space="preserve"> – nachází se zde definice toho, jak se má projekt spouštět, sestavovat a jaké technologie má podporovat</w:t>
+      </w:r>
+    </w:p>
+    <w:p>
+      <w:pPr>
+        <w:rPr>
+          <w:b/>
+          <w:bCs/>
+        </w:rPr>
+      </w:pPr>
+    </w:p>
+    <w:p>
+      <w:pPr>
+        <w:pStyle w:val="Nadpis3"/>
+      </w:pPr>
+      <w:r>
+        <w:t>Layout</w:t>
+      </w:r>
+    </w:p>
+    <w:p>
+      <w:r>
+        <w:t xml:space="preserve">V projektu se nachází složka </w:t>
+      </w:r>
+      <w:proofErr w:type="gramStart"/>
+      <w:r>
+        <w:t>layout</w:t>
+      </w:r>
+      <w:proofErr w:type="gramEnd"/>
+      <w:r>
+        <w:t xml:space="preserve"> ve které jsou definovány všechny klíčové komponenty, které definují </w:t>
+      </w:r>
+      <w:proofErr w:type="gramStart"/>
+      <w:r>
+        <w:t>to</w:t>
+      </w:r>
+      <w:proofErr w:type="gramEnd"/>
+      <w:r>
+        <w:t xml:space="preserve"> jak bude stránka vypadat. Nachází se zde </w:t>
+      </w:r>
+      <w:proofErr w:type="spellStart"/>
+      <w:r>
+        <w:t>header</w:t>
+      </w:r>
+      <w:proofErr w:type="spellEnd"/>
+      <w:r>
+        <w:t xml:space="preserve">, footer, </w:t>
+      </w:r>
+      <w:proofErr w:type="spellStart"/>
+      <w:r>
+        <w:t>sidebar</w:t>
+      </w:r>
+      <w:proofErr w:type="spellEnd"/>
+      <w:r>
+        <w:t xml:space="preserve"> a také </w:t>
+      </w:r>
+      <w:proofErr w:type="spellStart"/>
+      <w:r>
+        <w:t>container</w:t>
+      </w:r>
+      <w:proofErr w:type="spellEnd"/>
+      <w:r>
+        <w:t xml:space="preserve"> ve kterém se vykreslují všechny komponenty specifické pro určité stránky.</w:t>
+      </w:r>
+      <w:r>
+        <w:t xml:space="preserve"> Komponenty z této složky jsou poté importovány do souboru </w:t>
+      </w:r>
+      <w:proofErr w:type="spellStart"/>
+      <w:r>
+        <w:t>App.jsx</w:t>
+      </w:r>
+      <w:proofErr w:type="spellEnd"/>
+      <w:r>
+        <w:t>.</w:t>
+      </w:r>
+    </w:p>
+    <w:p/>
+    <w:p>
+      <w:pPr>
+        <w:pStyle w:val="Nadpis3"/>
+      </w:pPr>
+      <w:proofErr w:type="spellStart"/>
+      <w:r>
+        <w:t>App.jsx</w:t>
+      </w:r>
+      <w:proofErr w:type="spellEnd"/>
+    </w:p>
+    <w:p>
+      <w:r>
+        <w:t>Soubor,</w:t>
+      </w:r>
+      <w:r>
+        <w:t xml:space="preserve"> který slouží jako hlavní komponenta aplikace a kde se skládá celá struktura aplikace</w:t>
+      </w:r>
+      <w:r>
+        <w:t xml:space="preserve">. Jsou zde </w:t>
+      </w:r>
+      <w:r>
+        <w:t>naimportovány všechny stránky</w:t>
+      </w:r>
+    </w:p>
+    <w:p>
+      <w:r>
+        <w:rPr>
+          <w:noProof/>
+        </w:rPr>
+        <w:drawing>
+          <wp:inline distT="0" distB="0" distL="0" distR="0" wp14:anchorId="7B47F5EC" wp14:editId="5DF3F7B5">
+            <wp:extent cx="5399405" cy="3037205"/>
+            <wp:effectExtent l="0" t="0" r="0" b="0"/>
+            <wp:docPr id="1519902485" name="Obrázek 1" descr="Obsah obrázku text, snímek obrazovky, software, počítač&#10;&#10;Obsah generovaný pomocí AI může být nesprávný."/>
+            <wp:cNvGraphicFramePr>
+              <a:graphicFrameLocks xmlns:a="http://schemas.openxmlformats.org/drawingml/2006/main" noChangeAspect="1"/>
+            </wp:cNvGraphicFramePr>
+            <a:graphic xmlns:a="http://schemas.openxmlformats.org/drawingml/2006/main">
+              <a:graphicData uri="http://schemas.openxmlformats.org/drawingml/2006/picture">
+                <pic:pic xmlns:pic="http://schemas.openxmlformats.org/drawingml/2006/picture">
+                  <pic:nvPicPr>
+                    <pic:cNvPr id="1519902485" name="Obrázek 1" descr="Obsah obrázku text, snímek obrazovky, software, počítač&#10;&#10;Obsah generovaný pomocí AI může být nesprávný."/>
+                    <pic:cNvPicPr/>
+                  </pic:nvPicPr>
+                  <pic:blipFill>
+                    <a:blip r:embed="rId38"/>
+                    <a:stretch>
+                      <a:fillRect/>
+                    </a:stretch>
+                  </pic:blipFill>
+                  <pic:spPr>
+                    <a:xfrm>
+                      <a:off x="0" y="0"/>
+                      <a:ext cx="5399405" cy="3037205"/>
+                    </a:xfrm>
+                    <a:prstGeom prst="rect">
+                      <a:avLst/>
+                    </a:prstGeom>
+                  </pic:spPr>
+                </pic:pic>
+              </a:graphicData>
+            </a:graphic>
+          </wp:inline>
+        </w:drawing>
+      </w:r>
+    </w:p>
+    <w:p>
+      <w:r>
+        <w:rPr>
+          <w:noProof/>
+        </w:rPr>
+        <w:lastRenderedPageBreak/>
+        <w:drawing>
+          <wp:inline distT="0" distB="0" distL="0" distR="0" wp14:anchorId="12AA7C56" wp14:editId="3BD907A1">
+            <wp:extent cx="5399405" cy="3037205"/>
+            <wp:effectExtent l="0" t="0" r="0" b="0"/>
+            <wp:docPr id="1180943489" name="Obrázek 1" descr="Obsah obrázku text, snímek obrazovky, software, Počítačová ikona&#10;&#10;Obsah generovaný pomocí AI může být nesprávný."/>
+            <wp:cNvGraphicFramePr>
+              <a:graphicFrameLocks xmlns:a="http://schemas.openxmlformats.org/drawingml/2006/main" noChangeAspect="1"/>
+            </wp:cNvGraphicFramePr>
+            <a:graphic xmlns:a="http://schemas.openxmlformats.org/drawingml/2006/main">
+              <a:graphicData uri="http://schemas.openxmlformats.org/drawingml/2006/picture">
+                <pic:pic xmlns:pic="http://schemas.openxmlformats.org/drawingml/2006/picture">
+                  <pic:nvPicPr>
+                    <pic:cNvPr id="1180943489" name="Obrázek 1" descr="Obsah obrázku text, snímek obrazovky, software, Počítačová ikona&#10;&#10;Obsah generovaný pomocí AI může být nesprávný."/>
+                    <pic:cNvPicPr/>
+                  </pic:nvPicPr>
+                  <pic:blipFill>
+                    <a:blip r:embed="rId39"/>
+                    <a:stretch>
+                      <a:fillRect/>
+                    </a:stretch>
+                  </pic:blipFill>
+                  <pic:spPr>
+                    <a:xfrm>
+                      <a:off x="0" y="0"/>
+                      <a:ext cx="5399405" cy="3037205"/>
+                    </a:xfrm>
+                    <a:prstGeom prst="rect">
+                      <a:avLst/>
+                    </a:prstGeom>
+                  </pic:spPr>
+                </pic:pic>
+              </a:graphicData>
+            </a:graphic>
+          </wp:inline>
+        </w:drawing>
+      </w:r>
+    </w:p>
+    <w:p/>
     <w:p>
       <w:pPr>
         <w:pStyle w:val="Nadpis2"/>
@@ -7404,6 +8928,207 @@
       </w:pPr>
       <w:r>
         <w:t>Struktura backendu</w:t>
+      </w:r>
+    </w:p>
+    <w:p>
+      <w:pPr>
+        <w:keepNext/>
+        <w:jc w:val="center"/>
+      </w:pPr>
+      <w:r>
+        <w:drawing>
+          <wp:inline distT="0" distB="0" distL="0" distR="0" wp14:anchorId="7B1861B0" wp14:editId="56468741">
+            <wp:extent cx="1552792" cy="3534268"/>
+            <wp:effectExtent l="0" t="0" r="9525" b="0"/>
+            <wp:docPr id="1177450098" name="Obrázek 1" descr="Obsah obrázku text, snímek obrazovky, Písmo&#10;&#10;Obsah generovaný pomocí AI může být nesprávný."/>
+            <wp:cNvGraphicFramePr>
+              <a:graphicFrameLocks xmlns:a="http://schemas.openxmlformats.org/drawingml/2006/main" noChangeAspect="1"/>
+            </wp:cNvGraphicFramePr>
+            <a:graphic xmlns:a="http://schemas.openxmlformats.org/drawingml/2006/main">
+              <a:graphicData uri="http://schemas.openxmlformats.org/drawingml/2006/picture">
+                <pic:pic xmlns:pic="http://schemas.openxmlformats.org/drawingml/2006/picture">
+                  <pic:nvPicPr>
+                    <pic:cNvPr id="1177450098" name="Obrázek 1" descr="Obsah obrázku text, snímek obrazovky, Písmo&#10;&#10;Obsah generovaný pomocí AI může být nesprávný."/>
+                    <pic:cNvPicPr/>
+                  </pic:nvPicPr>
+                  <pic:blipFill>
+                    <a:blip r:embed="rId40"/>
+                    <a:stretch>
+                      <a:fillRect/>
+                    </a:stretch>
+                  </pic:blipFill>
+                  <pic:spPr>
+                    <a:xfrm>
+                      <a:off x="0" y="0"/>
+                      <a:ext cx="1552792" cy="3534268"/>
+                    </a:xfrm>
+                    <a:prstGeom prst="rect">
+                      <a:avLst/>
+                    </a:prstGeom>
+                  </pic:spPr>
+                </pic:pic>
+              </a:graphicData>
+            </a:graphic>
+          </wp:inline>
+        </w:drawing>
+      </w:r>
+    </w:p>
+    <w:p>
+      <w:pPr>
+        <w:pStyle w:val="Titulek"/>
+        <w:rPr>
+          <w:i/>
+          <w:iCs w:val="0"/>
+        </w:rPr>
+      </w:pPr>
+      <w:r>
+        <w:rPr>
+          <w:i/>
+          <w:iCs w:val="0"/>
+        </w:rPr>
+        <w:t xml:space="preserve">Obr. </w:t>
+      </w:r>
+      <w:r>
+        <w:rPr>
+          <w:i/>
+          <w:iCs w:val="0"/>
+        </w:rPr>
+        <w:fldChar w:fldCharType="begin"/>
+      </w:r>
+      <w:r>
+        <w:rPr>
+          <w:i/>
+          <w:iCs w:val="0"/>
+        </w:rPr>
+        <w:instrText xml:space="preserve"> SEQ Obr. \* ARABIC </w:instrText>
+      </w:r>
+      <w:r>
+        <w:rPr>
+          <w:i/>
+          <w:iCs w:val="0"/>
+        </w:rPr>
+        <w:fldChar w:fldCharType="separate"/>
+      </w:r>
+      <w:r>
+        <w:rPr>
+          <w:i/>
+          <w:iCs w:val="0"/>
+          <w:noProof/>
+        </w:rPr>
+        <w:t>18</w:t>
+      </w:r>
+      <w:r>
+        <w:rPr>
+          <w:i/>
+          <w:iCs w:val="0"/>
+        </w:rPr>
+        <w:fldChar w:fldCharType="end"/>
+      </w:r>
+      <w:r>
+        <w:rPr>
+          <w:i/>
+          <w:iCs w:val="0"/>
+        </w:rPr>
+        <w:t>: Struktura backendu</w:t>
+      </w:r>
+    </w:p>
+    <w:p>
+      <w:pPr>
+        <w:jc w:val="center"/>
+        <w:rPr>
+          <w:i/>
+        </w:rPr>
+      </w:pPr>
+      <w:r>
+        <w:rPr>
+          <w:i/>
+        </w:rPr>
+        <w:t>Zdroj: vlastní</w:t>
+      </w:r>
+    </w:p>
+    <w:p>
+      <w:pPr>
+        <w:pStyle w:val="Nadpis3"/>
+      </w:pPr>
+      <w:r>
+        <w:lastRenderedPageBreak/>
+        <w:t xml:space="preserve">Získávání dat </w:t>
+      </w:r>
+    </w:p>
+    <w:p>
+      <w:r>
+        <w:t xml:space="preserve">Komunikace mezi </w:t>
+      </w:r>
+      <w:proofErr w:type="spellStart"/>
+      <w:r>
+        <w:t>frontendovou</w:t>
+      </w:r>
+      <w:proofErr w:type="spellEnd"/>
+      <w:r>
+        <w:t xml:space="preserve"> a </w:t>
+      </w:r>
+      <w:proofErr w:type="spellStart"/>
+      <w:r>
+        <w:t>backendovou</w:t>
+      </w:r>
+      <w:proofErr w:type="spellEnd"/>
+      <w:r>
+        <w:t xml:space="preserve"> částí aplikace je realizována prostřednictvím REST API. Backend postaven na Node.js s frameworkem Express.js vystavuje sadu </w:t>
+      </w:r>
+      <w:proofErr w:type="spellStart"/>
+      <w:r>
+        <w:t>endpointů</w:t>
+      </w:r>
+      <w:proofErr w:type="spellEnd"/>
+      <w:r>
+        <w:t xml:space="preserve"> organizovaných podle jednotlivých zdrojů (</w:t>
+      </w:r>
+      <w:proofErr w:type="spellStart"/>
+      <w:r>
+        <w:t>resources</w:t>
+      </w:r>
+      <w:proofErr w:type="spellEnd"/>
+      <w:r>
+        <w:t>). Každý zdroj má vlastní router umístěný v samostatném souboru, přičemž HTTP metody GET, POST, PUT a DELETE odpovídají operacím čtení, vytváření, úpravy a mazání dat. Přenos dat probíhá ve formátu JSON. Autentizace je řešena pomocí JWT tokenu předávaného v hlavičce každého požadavku.</w:t>
+      </w:r>
+    </w:p>
+    <w:p>
+      <w:r>
+        <w:drawing>
+          <wp:inline distT="0" distB="0" distL="0" distR="0" wp14:anchorId="04590C5C" wp14:editId="312B536B">
+            <wp:extent cx="5399405" cy="1932305"/>
+            <wp:effectExtent l="0" t="0" r="0" b="0"/>
+            <wp:docPr id="1405460977" name="Obrázek 1" descr="Obsah obrázku text, snímek obrazovky, Písmo, číslo&#10;&#10;Obsah generovaný pomocí AI může být nesprávný."/>
+            <wp:cNvGraphicFramePr>
+              <a:graphicFrameLocks xmlns:a="http://schemas.openxmlformats.org/drawingml/2006/main" noChangeAspect="1"/>
+            </wp:cNvGraphicFramePr>
+            <a:graphic xmlns:a="http://schemas.openxmlformats.org/drawingml/2006/main">
+              <a:graphicData uri="http://schemas.openxmlformats.org/drawingml/2006/picture">
+                <pic:pic xmlns:pic="http://schemas.openxmlformats.org/drawingml/2006/picture">
+                  <pic:nvPicPr>
+                    <pic:cNvPr id="1405460977" name="Obrázek 1" descr="Obsah obrázku text, snímek obrazovky, Písmo, číslo&#10;&#10;Obsah generovaný pomocí AI může být nesprávný."/>
+                    <pic:cNvPicPr/>
+                  </pic:nvPicPr>
+                  <pic:blipFill>
+                    <a:blip r:embed="rId41"/>
+                    <a:stretch>
+                      <a:fillRect/>
+                    </a:stretch>
+                  </pic:blipFill>
+                  <pic:spPr>
+                    <a:xfrm>
+                      <a:off x="0" y="0"/>
+                      <a:ext cx="5399405" cy="1932305"/>
+                    </a:xfrm>
+                    <a:prstGeom prst="rect">
+                      <a:avLst/>
+                    </a:prstGeom>
+                  </pic:spPr>
+                </pic:pic>
+              </a:graphicData>
+            </a:graphic>
+          </wp:inline>
+        </w:drawing>
       </w:r>
     </w:p>
     <w:p/>
@@ -7530,7 +9255,7 @@
       <w:r>
         <w:t>. Online. 2024. Dostupné z: </w:t>
       </w:r>
-      <w:hyperlink r:id="rId35" w:history="1">
+      <w:hyperlink r:id="rId42" w:history="1">
         <w:r>
           <w:rPr>
             <w:rStyle w:val="Hypertextovodkaz"/>
@@ -7556,7 +9281,7 @@
       <w:r>
         <w:t xml:space="preserve">, T. The World Wide Web. Online. 1991. Dostupné z: </w:t>
       </w:r>
-      <w:hyperlink r:id="rId36" w:history="1">
+      <w:hyperlink r:id="rId43" w:history="1">
         <w:r>
           <w:rPr>
             <w:rStyle w:val="Hypertextovodkaz"/>
@@ -7582,7 +9307,7 @@
       <w:r>
         <w:t>. Online. 2024. Dostupné z: </w:t>
       </w:r>
-      <w:hyperlink r:id="rId37" w:history="1">
+      <w:hyperlink r:id="rId44" w:history="1">
         <w:r>
           <w:rPr>
             <w:rStyle w:val="Hypertextovodkaz"/>
@@ -7608,7 +9333,7 @@
       <w:r>
         <w:t>. Online. 2016. Dostupné z: </w:t>
       </w:r>
-      <w:hyperlink r:id="rId38" w:history="1">
+      <w:hyperlink r:id="rId45" w:history="1">
         <w:r>
           <w:rPr>
             <w:rStyle w:val="Hypertextovodkaz"/>
@@ -7634,7 +9359,7 @@
       <w:r>
         <w:t>. Online. HTTPS://WWW.WORLDTAEKWONDO.CZ/CZ/O-TAEKWONDO-CO-JE-TO-TAEKWONDO.HTML. Český svaz Taekwondo. 2024. Dostupné z: </w:t>
       </w:r>
-      <w:hyperlink r:id="rId39" w:history="1">
+      <w:hyperlink r:id="rId46" w:history="1">
         <w:r>
           <w:rPr>
             <w:rStyle w:val="Hypertextovodkaz"/>
@@ -7660,7 +9385,7 @@
       <w:r>
         <w:t>. Online. 2016. Dostupné z: </w:t>
       </w:r>
-      <w:hyperlink r:id="rId40" w:history="1">
+      <w:hyperlink r:id="rId47" w:history="1">
         <w:r>
           <w:rPr>
             <w:rStyle w:val="Hypertextovodkaz"/>
@@ -7689,7 +9414,7 @@
       <w:r>
         <w:t>. 2023, roč. 2023, č. 12, s. 1. Dostupné z: </w:t>
       </w:r>
-      <w:hyperlink r:id="rId41" w:history="1">
+      <w:hyperlink r:id="rId48" w:history="1">
         <w:r>
           <w:rPr>
             <w:rStyle w:val="Hypertextovodkaz"/>
@@ -7715,7 +9440,7 @@
       <w:r>
         <w:t xml:space="preserve">, D., &amp; Ellis-Chadwick, F. Digital Marketing. Online. 2022. Dostupné z: </w:t>
       </w:r>
-      <w:hyperlink r:id="rId42" w:history="1">
+      <w:hyperlink r:id="rId49" w:history="1">
         <w:r>
           <w:rPr>
             <w:rStyle w:val="Hypertextovodkaz"/>
@@ -7741,7 +9466,7 @@
       <w:r>
         <w:t xml:space="preserve">, E. Responsive Web Design. Online. 2010. Dostupné z: </w:t>
       </w:r>
-      <w:hyperlink r:id="rId43" w:history="1">
+      <w:hyperlink r:id="rId50" w:history="1">
         <w:r>
           <w:rPr>
             <w:rStyle w:val="Hypertextovodkaz"/>
@@ -7767,7 +9492,7 @@
       <w:r>
         <w:t xml:space="preserve">. Online. 2024. Dostupné z: </w:t>
       </w:r>
-      <w:hyperlink r:id="rId44" w:tgtFrame="_new" w:history="1">
+      <w:hyperlink r:id="rId51" w:tgtFrame="_new" w:history="1">
         <w:r>
           <w:rPr>
             <w:rStyle w:val="Hypertextovodkaz"/>
@@ -7793,7 +9518,7 @@
       <w:r>
         <w:t>. Online. 2016. Dostupné z: </w:t>
       </w:r>
-      <w:hyperlink r:id="rId45" w:history="1">
+      <w:hyperlink r:id="rId52" w:history="1">
         <w:r>
           <w:rPr>
             <w:rStyle w:val="Hypertextovodkaz"/>
@@ -7819,7 +9544,7 @@
       <w:r>
         <w:t>. Online. 2009. Dostupné z: </w:t>
       </w:r>
-      <w:hyperlink r:id="rId46" w:history="1">
+      <w:hyperlink r:id="rId53" w:history="1">
         <w:r>
           <w:rPr>
             <w:rStyle w:val="Hypertextovodkaz"/>
@@ -7845,7 +9570,7 @@
       <w:r>
         <w:t xml:space="preserve">, T. What Is Web 2.0. Online. 2005. Dostupné z: </w:t>
       </w:r>
-      <w:hyperlink r:id="rId47" w:history="1">
+      <w:hyperlink r:id="rId54" w:history="1">
         <w:r>
           <w:rPr>
             <w:rStyle w:val="Hypertextovodkaz"/>
@@ -7871,7 +9596,7 @@
       <w:r>
         <w:t xml:space="preserve">. OWASP Top Ten. Online. 2024. Dostupné z: </w:t>
       </w:r>
-      <w:hyperlink r:id="rId48" w:history="1">
+      <w:hyperlink r:id="rId55" w:history="1">
         <w:r>
           <w:rPr>
             <w:rStyle w:val="Hypertextovodkaz"/>
@@ -7897,7 +9622,7 @@
       <w:r>
         <w:t>. Online. 2016. Dostupné z: </w:t>
       </w:r>
-      <w:hyperlink r:id="rId49" w:history="1">
+      <w:hyperlink r:id="rId56" w:history="1">
         <w:r>
           <w:rPr>
             <w:rStyle w:val="Hypertextovodkaz"/>
@@ -7923,7 +9648,7 @@
       <w:r>
         <w:t>. Online. 2013. Dostupné z: </w:t>
       </w:r>
-      <w:hyperlink r:id="rId50" w:history="1">
+      <w:hyperlink r:id="rId57" w:history="1">
         <w:r>
           <w:rPr>
             <w:rStyle w:val="Hypertextovodkaz"/>
@@ -7949,7 +9674,7 @@
       <w:r>
         <w:t>. Online. 2024. Dostupné z: </w:t>
       </w:r>
-      <w:hyperlink r:id="rId51" w:history="1">
+      <w:hyperlink r:id="rId58" w:history="1">
         <w:r>
           <w:rPr>
             <w:rStyle w:val="Hypertextovodkaz"/>
@@ -7975,7 +9700,7 @@
       <w:r>
         <w:t xml:space="preserve">. The Transport Layer Security (TLS) Protocol. Online. 2008. Dostupné z: </w:t>
       </w:r>
-      <w:hyperlink r:id="rId52" w:history="1">
+      <w:hyperlink r:id="rId59" w:history="1">
         <w:r>
           <w:rPr>
             <w:rStyle w:val="Hypertextovodkaz"/>
@@ -8001,7 +9726,7 @@
       <w:r>
         <w:t xml:space="preserve">, B. Artificial Intelligence in web Development. Online. 2023. Dostupné z: </w:t>
       </w:r>
-      <w:hyperlink r:id="rId53" w:history="1">
+      <w:hyperlink r:id="rId60" w:history="1">
         <w:r>
           <w:rPr>
             <w:rStyle w:val="Hypertextovodkaz"/>
@@ -8028,7 +9753,7 @@
       <w:r>
         <w:t>. Online. 2024. Dostupné z: </w:t>
       </w:r>
-      <w:hyperlink r:id="rId54" w:history="1">
+      <w:hyperlink r:id="rId61" w:history="1">
         <w:r>
           <w:rPr>
             <w:rStyle w:val="Hypertextovodkaz"/>
@@ -8054,7 +9779,7 @@
       <w:r>
         <w:t>. Online. 2024. Dostupné z: </w:t>
       </w:r>
-      <w:hyperlink r:id="rId55" w:history="1">
+      <w:hyperlink r:id="rId62" w:history="1">
         <w:r>
           <w:rPr>
             <w:rStyle w:val="Hypertextovodkaz"/>
@@ -8080,7 +9805,7 @@
       <w:r>
         <w:t xml:space="preserve">. HTML and Web Standards. Online. 2024. Dostupné z: </w:t>
       </w:r>
-      <w:hyperlink r:id="rId56" w:history="1">
+      <w:hyperlink r:id="rId63" w:history="1">
         <w:r>
           <w:rPr>
             <w:rStyle w:val="Hypertextovodkaz"/>
@@ -8093,7 +9818,7 @@
       </w:r>
     </w:p>
     <w:sectPr>
-      <w:footerReference w:type="default" r:id="rId57"/>
+      <w:footerReference w:type="default" r:id="rId64"/>
       <w:pgSz w:w="11906" w:h="16838"/>
       <w:pgMar w:top="1418" w:right="1418" w:bottom="1418" w:left="1985" w:header="709" w:footer="709" w:gutter="0"/>
       <w:cols w:space="708"/>
@@ -13595,7 +15320,6 @@
   <w:style w:type="character" w:default="1" w:styleId="Standardnpsmoodstavce">
     <w:name w:val="Default Paragraph Font"/>
     <w:uiPriority w:val="1"/>
-    <w:semiHidden/>
     <w:unhideWhenUsed/>
   </w:style>
   <w:style w:type="table" w:default="1" w:styleId="Normlntabulka">
@@ -14583,6 +16307,7 @@
     <w:rsid w:val="005B74A1"/>
     <w:rsid w:val="005D768A"/>
     <w:rsid w:val="00604492"/>
+    <w:rsid w:val="00667E7A"/>
     <w:rsid w:val="00684E0D"/>
     <w:rsid w:val="006944B7"/>
     <w:rsid w:val="006A772E"/>
@@ -14609,6 +16334,7 @@
     <w:rsid w:val="00B9668D"/>
     <w:rsid w:val="00BD304C"/>
     <w:rsid w:val="00BE008A"/>
+    <w:rsid w:val="00C0644A"/>
     <w:rsid w:val="00C576BC"/>
     <w:rsid w:val="00C75662"/>
     <w:rsid w:val="00C91DEC"/>
@@ -15391,9 +17117,7 @@
 </file>
 
 <file path=customXml/item3.xml><?xml version="1.0" encoding="utf-8"?>
-<p:properties xmlns:p="http://schemas.microsoft.com/office/2006/metadata/properties" xmlns:xsi="http://www.w3.org/2001/XMLSchema-instance" xmlns:pc="http://schemas.microsoft.com/office/infopath/2007/PartnerControls">
-  <documentManagement/>
-</p:properties>
+<b:Sources xmlns:b="http://schemas.openxmlformats.org/officeDocument/2006/bibliography" xmlns="http://schemas.openxmlformats.org/officeDocument/2006/bibliography" SelectedStyle="\APASixthEditionOfficeOnline.xsl" StyleName="APA" Version="6"/>
 </file>
 
 <file path=customXml/item4.xml><?xml version="1.0" encoding="utf-8"?>
@@ -15529,7 +17253,9 @@
 </file>
 
 <file path=customXml/item5.xml><?xml version="1.0" encoding="utf-8"?>
-<b:Sources xmlns:b="http://schemas.openxmlformats.org/officeDocument/2006/bibliography" xmlns="http://schemas.openxmlformats.org/officeDocument/2006/bibliography" SelectedStyle="\APASixthEditionOfficeOnline.xsl" StyleName="APA" Version="6"/>
+<p:properties xmlns:p="http://schemas.microsoft.com/office/2006/metadata/properties" xmlns:xsi="http://www.w3.org/2001/XMLSchema-instance" xmlns:pc="http://schemas.microsoft.com/office/infopath/2007/PartnerControls">
+  <documentManagement/>
+</p:properties>
 </file>
 
 <file path=customXml/itemProps1.xml><?xml version="1.0" encoding="utf-8"?>
@@ -15549,10 +17275,9 @@
 </file>
 
 <file path=customXml/itemProps3.xml><?xml version="1.0" encoding="utf-8"?>
-<ds:datastoreItem xmlns:ds="http://schemas.openxmlformats.org/officeDocument/2006/customXml" ds:itemID="{EDE7D767-2E0D-494D-8433-FAEBD4A37F8E}">
+<ds:datastoreItem xmlns:ds="http://schemas.openxmlformats.org/officeDocument/2006/customXml" ds:itemID="{016BB16A-1E0F-4115-AADC-10D5070CD6B8}">
   <ds:schemaRefs>
-    <ds:schemaRef ds:uri="http://schemas.microsoft.com/office/2006/metadata/properties"/>
-    <ds:schemaRef ds:uri="http://schemas.microsoft.com/office/infopath/2007/PartnerControls"/>
+    <ds:schemaRef ds:uri="http://schemas.openxmlformats.org/officeDocument/2006/bibliography"/>
   </ds:schemaRefs>
 </ds:datastoreItem>
 </file>
@@ -15576,9 +17301,10 @@
 </file>
 
 <file path=customXml/itemProps5.xml><?xml version="1.0" encoding="utf-8"?>
-<ds:datastoreItem xmlns:ds="http://schemas.openxmlformats.org/officeDocument/2006/customXml" ds:itemID="{016BB16A-1E0F-4115-AADC-10D5070CD6B8}">
+<ds:datastoreItem xmlns:ds="http://schemas.openxmlformats.org/officeDocument/2006/customXml" ds:itemID="{EDE7D767-2E0D-494D-8433-FAEBD4A37F8E}">
   <ds:schemaRefs>
-    <ds:schemaRef ds:uri="http://schemas.openxmlformats.org/officeDocument/2006/bibliography"/>
+    <ds:schemaRef ds:uri="http://schemas.microsoft.com/office/2006/metadata/properties"/>
+    <ds:schemaRef ds:uri="http://schemas.microsoft.com/office/infopath/2007/PartnerControls"/>
   </ds:schemaRefs>
 </ds:datastoreItem>
 </file>
</xml_diff>

<commit_message>
BP a  úprava zobrazení náhledovek
</commit_message>
<xml_diff>
--- a/bp_svobo229_v2.docx
+++ b/bp_svobo229_v2.docx
@@ -510,7 +510,7 @@
           <v:shape id="_x0000_i1025" type="#_x0000_t75" style="width:446.25pt;height:478.7pt" o:ole="">
             <v:imagedata r:id="rId12" o:title=""/>
           </v:shape>
-          <o:OLEObject Type="Embed" ProgID="Word.Document.12" ShapeID="_x0000_i1025" DrawAspect="Content" ObjectID="_1833477119" r:id="rId13">
+          <o:OLEObject Type="Embed" ProgID="Word.Document.12" ShapeID="_x0000_i1025" DrawAspect="Content" ObjectID="_1833529856" r:id="rId13">
             <o:FieldCodes>\s</o:FieldCodes>
           </o:OLEObject>
         </w:object>
@@ -6663,6 +6663,9 @@
         <w:jc w:val="center"/>
       </w:pPr>
       <w:r>
+        <w:rPr>
+          <w:noProof/>
+        </w:rPr>
         <w:drawing>
           <wp:inline distT="0" distB="0" distL="0" distR="0" wp14:anchorId="7F19650A" wp14:editId="5C631017">
             <wp:extent cx="4652387" cy="4543505"/>
@@ -6827,10 +6830,7 @@
     </w:p>
     <w:p>
       <w:r>
-        <w:t>Nové řešení bude obsahovat 3 typy uživatelských účtů. Každý typ bude mít své pravomoce na základě kterých bude moci s nově navrženým systémem interagovat. Mezi tyto role patří administrátor, trenér, závodník. S webovou stránkou bude moci interagovat i běžný návštěvník, avšak nebude mít přístup do administrace či nebude mít možnost přihlašovat se na různé turnaje nebo zkoušky. Definování uživatelských rolí je velmi důležitým aspektem, který slouží k jasnému stanovení pravomocí a možností jednotlivých uživatelů a díky jemuž nebudou mít neoprávněné uživatelské účty přístup do administrace</w:t>
-      </w:r>
-      <w:r>
-        <w:t>.</w:t>
+        <w:t>Nové řešení bude obsahovat 3 typy uživatelských účtů. Každý typ bude mít své pravomoce na základě kterých bude moci s nově navrženým systémem interagovat. Mezi tyto role patří administrátor, trenér, závodník. S webovou stránkou bude moci interagovat i běžný návštěvník, avšak nebude mít přístup do administrace či nebude mít možnost přihlašovat se na různé turnaje nebo zkoušky. Definování uživatelských rolí je velmi důležitým aspektem, který slouží k jasnému stanovení pravomocí a možností jednotlivých uživatelů a díky jemuž nebudou mít neoprávněné uživatelské účty přístup do administrace.</w:t>
       </w:r>
     </w:p>
     <w:p/>
@@ -6900,15 +6900,7 @@
         <w:t xml:space="preserve">Pro správnou funkcionalitu webových stránek je potřeba navrhnout kvalitní a dobře strukturovanou databázi, která bude popsána v této sekci. Pro samotný návrh jsem využíval webovou </w:t>
       </w:r>
       <w:r>
-        <w:t xml:space="preserve">stránku </w:t>
-      </w:r>
-      <w:proofErr w:type="spellStart"/>
-      <w:r>
-        <w:t>dbdiagram</w:t>
-      </w:r>
-      <w:proofErr w:type="spellEnd"/>
-      <w:r>
-        <w:t>, ve které jsem si specifikoval všechny potřebné entity a vazby mezi nimi.</w:t>
+        <w:t>stránku dbdiagram, ve které jsem si specifikoval všechny potřebné entity a vazby mezi nimi.</w:t>
       </w:r>
       <w:r>
         <w:t xml:space="preserve"> Databáze je implementována v relačním databázovém systému MySQL a obsahuje celkem 14 tabulek, které jsou vzájemně provázány pomocí cizích klíčů.</w:t>
@@ -6923,343 +6915,161 @@
       </w:r>
     </w:p>
     <w:p>
-      <w:proofErr w:type="spellStart"/>
       <w:r>
         <w:rPr>
           <w:b/>
           <w:bCs/>
         </w:rPr>
-        <w:t>Fighters</w:t>
-      </w:r>
-      <w:proofErr w:type="spellEnd"/>
-      <w:r>
+        <w:t>Fighters – závodníci</w:t>
+      </w:r>
+    </w:p>
+    <w:p>
+      <w:r>
+        <w:t xml:space="preserve">Tabulka fighters představuje centrální entitu celého systému a uchovává informace o všech závodnících oddílu. Každý záznam obsahuje základní osobní údaje jako jméno (name), příjmení (surname) a datum narození (birth). Dále jsou zde uloženy </w:t>
+      </w:r>
+      <w:r>
+        <w:t>záznamy týkající se úspěchů závodníků</w:t>
+      </w:r>
+      <w:r>
+        <w:t xml:space="preserve"> – cizí klíč belts_id odkazující na aktuální technický stupeň závodníka, category_id určující věkovou kategorii a actual_weight_category reprezentující aktuální váhovou kategorii závodníka v kilogramech.</w:t>
+      </w:r>
+    </w:p>
+    <w:p>
+      <w:r>
+        <w:t xml:space="preserve">Tabulka také obsahuje booleovské </w:t>
+      </w:r>
+      <w:r>
+        <w:t>hodnoty</w:t>
+      </w:r>
+      <w:r>
+        <w:t xml:space="preserve"> best a legend, které slouží k označení výjimečných závodníků zobrazovaných na veřejné části webu, a </w:t>
+      </w:r>
+      <w:r>
+        <w:t>stav</w:t>
+      </w:r>
+      <w:r>
+        <w:t xml:space="preserve"> active určující, zda je závodník aktuálně aktivním členem oddílu</w:t>
+      </w:r>
+      <w:r>
+        <w:t xml:space="preserve"> či nikoliv</w:t>
+      </w:r>
+      <w:r>
+        <w:t>. Sloupec img_path uchovává cestu k profilové fotografii závodníka.</w:t>
+      </w:r>
+    </w:p>
+    <w:p/>
+    <w:p>
+      <w:pPr>
         <w:rPr>
           <w:b/>
           <w:bCs/>
         </w:rPr>
-        <w:t xml:space="preserve"> – závodníci</w:t>
-      </w:r>
-    </w:p>
-    <w:p>
-      <w:r>
-        <w:t xml:space="preserve">Tabulka </w:t>
-      </w:r>
-      <w:proofErr w:type="spellStart"/>
-      <w:r>
-        <w:t>fighters</w:t>
-      </w:r>
-      <w:proofErr w:type="spellEnd"/>
-      <w:r>
-        <w:t xml:space="preserve"> představuje centrální entitu celého systému a uchovává informace o všech závodnících oddílu. Každý záznam obsahuje základní osobní údaje jako jméno (</w:t>
-      </w:r>
-      <w:proofErr w:type="spellStart"/>
-      <w:r>
-        <w:t>name</w:t>
-      </w:r>
-      <w:proofErr w:type="spellEnd"/>
-      <w:r>
-        <w:t>), příjmení (</w:t>
-      </w:r>
-      <w:proofErr w:type="spellStart"/>
-      <w:r>
-        <w:t>surname</w:t>
-      </w:r>
-      <w:proofErr w:type="spellEnd"/>
-      <w:r>
-        <w:t>) a datum narození (</w:t>
-      </w:r>
-      <w:proofErr w:type="spellStart"/>
-      <w:r>
-        <w:t>birth</w:t>
-      </w:r>
-      <w:proofErr w:type="spellEnd"/>
-      <w:r>
-        <w:t xml:space="preserve">). Dále jsou zde uloženy </w:t>
-      </w:r>
-      <w:r>
-        <w:t>záznamy týkající se úspěchů závodníků</w:t>
-      </w:r>
-      <w:r>
-        <w:t xml:space="preserve"> – cizí klíč </w:t>
-      </w:r>
-      <w:proofErr w:type="spellStart"/>
-      <w:r>
-        <w:t>belts_id</w:t>
-      </w:r>
-      <w:proofErr w:type="spellEnd"/>
-      <w:r>
-        <w:t xml:space="preserve"> odkazující na aktuální technický stupeň závodníka, </w:t>
-      </w:r>
-      <w:proofErr w:type="spellStart"/>
-      <w:r>
-        <w:t>category_id</w:t>
-      </w:r>
-      <w:proofErr w:type="spellEnd"/>
-      <w:r>
-        <w:t xml:space="preserve"> určující věkovou kategorii a </w:t>
-      </w:r>
-      <w:proofErr w:type="spellStart"/>
-      <w:r>
-        <w:t>actual_weight_category</w:t>
-      </w:r>
-      <w:proofErr w:type="spellEnd"/>
-      <w:r>
-        <w:t xml:space="preserve"> reprezentující aktuální váhovou kategorii závodníka v kilogramech.</w:t>
-      </w:r>
-    </w:p>
-    <w:p>
-      <w:r>
-        <w:t xml:space="preserve">Tabulka také obsahuje booleovské </w:t>
-      </w:r>
-      <w:r>
-        <w:t>hodnoty</w:t>
-      </w:r>
-      <w:r>
-        <w:t xml:space="preserve"> </w:t>
-      </w:r>
-      <w:proofErr w:type="spellStart"/>
-      <w:r>
-        <w:t>best</w:t>
-      </w:r>
-      <w:proofErr w:type="spellEnd"/>
-      <w:r>
-        <w:t xml:space="preserve"> a legend, které slouží k označení výjimečných závodníků zobrazovaných na veřejné části webu, a </w:t>
-      </w:r>
-      <w:r>
-        <w:t>stav</w:t>
-      </w:r>
-      <w:r>
-        <w:t xml:space="preserve"> </w:t>
-      </w:r>
-      <w:proofErr w:type="spellStart"/>
-      <w:r>
-        <w:t>active</w:t>
-      </w:r>
-      <w:proofErr w:type="spellEnd"/>
-      <w:r>
-        <w:t xml:space="preserve"> určující, zda je závodník aktuálně aktivním členem oddílu</w:t>
-      </w:r>
-      <w:r>
-        <w:t xml:space="preserve"> či nikoliv</w:t>
-      </w:r>
-      <w:r>
-        <w:t xml:space="preserve">. Sloupec </w:t>
-      </w:r>
-      <w:proofErr w:type="spellStart"/>
-      <w:r>
-        <w:t>img_path</w:t>
-      </w:r>
-      <w:proofErr w:type="spellEnd"/>
-      <w:r>
-        <w:t xml:space="preserve"> uchovává cestu k profilové fotografii závodníka.</w:t>
-      </w:r>
-    </w:p>
-    <w:p/>
-    <w:p>
-      <w:pPr>
+      </w:pPr>
+      <w:r>
         <w:rPr>
           <w:b/>
           <w:bCs/>
         </w:rPr>
-      </w:pPr>
-      <w:proofErr w:type="spellStart"/>
+        <w:t>Belts – pásky</w:t>
+      </w:r>
+    </w:p>
+    <w:p>
+      <w:r>
+        <w:t xml:space="preserve">Tabulka belts </w:t>
+      </w:r>
+      <w:r>
+        <w:t>obsahuje všechny</w:t>
+      </w:r>
+      <w:r>
+        <w:t xml:space="preserve"> dostupné technické stupně v </w:t>
+      </w:r>
+      <w:r>
+        <w:t>Taekwodnu</w:t>
+      </w:r>
+      <w:r>
+        <w:t xml:space="preserve">, od </w:t>
+      </w:r>
+      <w:r>
+        <w:t>bílého</w:t>
+      </w:r>
+      <w:r>
+        <w:t xml:space="preserve"> pásku přes barevné pásky až po jednotlivé dany černého pásku. Každý stupeň má svůj název (belt_name), označení cupu (cup, např. „8. CUP" nebo „1. DAN"),  cenu zkoušky (price), cestu k obrázku pásku (img_path), doplňující informace (info) a cestu k výukovému videu (video_path). Tabulka je ve vztahu 1:N s tabulkou fighters – jeden technický stupeň může mít více závodníků, ale každý závodník má právě jeden aktuální stupeň.</w:t>
+      </w:r>
+    </w:p>
+    <w:p/>
+    <w:p>
       <w:r>
         <w:rPr>
           <w:b/>
           <w:bCs/>
         </w:rPr>
-        <w:t>Belts</w:t>
-      </w:r>
-      <w:proofErr w:type="spellEnd"/>
+        <w:t>Category – kategorie</w:t>
+      </w:r>
+    </w:p>
+    <w:p>
+      <w:r>
+        <w:t>Tabulka category definuje věkové kategorie závodníků používané v soutěž</w:t>
+      </w:r>
+      <w:r>
+        <w:t>ích</w:t>
+      </w:r>
+      <w:r>
+        <w:t xml:space="preserve"> taekwondo. Každá kategorie je charakterizována názvem (name, např. Youth, Cadet, Junior, Senior, Ultra) a věkovým rozsahem vyjádřeným sloupci min a max. Vztah s tabulkou fighters je opět 1:N – v jedné kategorii může závodit více závodníků, ale každý závodník patří do právě jedné kategorie.</w:t>
+      </w:r>
+    </w:p>
+    <w:p/>
+    <w:p>
       <w:r>
         <w:rPr>
           <w:b/>
           <w:bCs/>
         </w:rPr>
-        <w:t xml:space="preserve"> – pásky</w:t>
-      </w:r>
-    </w:p>
-    <w:p>
-      <w:r>
-        <w:t xml:space="preserve">Tabulka </w:t>
-      </w:r>
-      <w:proofErr w:type="spellStart"/>
-      <w:r>
-        <w:t>belts</w:t>
-      </w:r>
-      <w:proofErr w:type="spellEnd"/>
-      <w:r>
-        <w:t xml:space="preserve"> </w:t>
-      </w:r>
-      <w:r>
-        <w:t>obsahuje všechny</w:t>
-      </w:r>
-      <w:r>
-        <w:t xml:space="preserve"> dostupné technické stupně v </w:t>
-      </w:r>
-      <w:proofErr w:type="spellStart"/>
-      <w:r>
-        <w:t>Taekwodnu</w:t>
-      </w:r>
-      <w:proofErr w:type="spellEnd"/>
-      <w:r>
-        <w:t xml:space="preserve">, od </w:t>
-      </w:r>
-      <w:r>
-        <w:t>bílého</w:t>
-      </w:r>
-      <w:r>
-        <w:t xml:space="preserve"> pásku přes barevné pásky až po jednotlivé dany černého pásku. Každý stupeň má svůj název (</w:t>
-      </w:r>
-      <w:proofErr w:type="spellStart"/>
-      <w:r>
-        <w:t>belt_name</w:t>
-      </w:r>
-      <w:proofErr w:type="spellEnd"/>
-      <w:r>
-        <w:t xml:space="preserve">), označení </w:t>
-      </w:r>
-      <w:proofErr w:type="spellStart"/>
-      <w:r>
-        <w:t>cupu</w:t>
-      </w:r>
-      <w:proofErr w:type="spellEnd"/>
-      <w:r>
-        <w:t xml:space="preserve"> (cup, např. „8. CUP" nebo „1. DAN"</w:t>
-      </w:r>
-      <w:proofErr w:type="gramStart"/>
-      <w:r>
-        <w:t>),  cenu</w:t>
-      </w:r>
-      <w:proofErr w:type="gramEnd"/>
-      <w:r>
-        <w:t xml:space="preserve"> zkoušky (</w:t>
-      </w:r>
-      <w:proofErr w:type="spellStart"/>
-      <w:r>
-        <w:t>price</w:t>
-      </w:r>
-      <w:proofErr w:type="spellEnd"/>
-      <w:r>
-        <w:t>), cestu k obrázku pásku (</w:t>
-      </w:r>
-      <w:proofErr w:type="spellStart"/>
-      <w:r>
-        <w:t>img_path</w:t>
-      </w:r>
-      <w:proofErr w:type="spellEnd"/>
-      <w:r>
-        <w:t>), doplňující informace (</w:t>
-      </w:r>
-      <w:proofErr w:type="spellStart"/>
-      <w:r>
-        <w:t>info</w:t>
-      </w:r>
-      <w:proofErr w:type="spellEnd"/>
-      <w:r>
-        <w:t>) a cestu k výukovému videu (</w:t>
-      </w:r>
-      <w:proofErr w:type="spellStart"/>
-      <w:r>
-        <w:t>video_path</w:t>
-      </w:r>
-      <w:proofErr w:type="spellEnd"/>
-      <w:r>
-        <w:t xml:space="preserve">). Tabulka je ve vztahu </w:t>
-      </w:r>
-      <w:proofErr w:type="gramStart"/>
-      <w:r>
-        <w:t>1:N</w:t>
-      </w:r>
-      <w:proofErr w:type="gramEnd"/>
-      <w:r>
-        <w:t xml:space="preserve"> s tabulkou </w:t>
-      </w:r>
-      <w:proofErr w:type="spellStart"/>
-      <w:r>
-        <w:t>fighters</w:t>
-      </w:r>
-      <w:proofErr w:type="spellEnd"/>
-      <w:r>
-        <w:t xml:space="preserve"> – jeden technický stupeň může mít více závodníků, ale každý závodník má právě jeden aktuální stupeň.</w:t>
+        <w:t>Users – uživatelé</w:t>
+      </w:r>
+    </w:p>
+    <w:p>
+      <w:r>
+        <w:lastRenderedPageBreak/>
+        <w:t>Tabulka users spravuje uživatelské účty systému. Každý uživatel má přihlašovací jméno (login), zahashované heslo (password)</w:t>
+      </w:r>
+      <w:r>
+        <w:t xml:space="preserve"> pomocí byCriptu</w:t>
+      </w:r>
+      <w:r>
+        <w:t>, volitelný e-mail (email) a telefonní číslo (phone). Sloupec role_id určuje oprávnění uživatele v systému a fighter_id umožňuje provázání uživatelského účtu s konkrétním závodníkem. Toto propojení je ve vztahu 1:1 – jeden závodník může mít právě jeden uživatelský účet a jeden uživatelský účet může být přiřazen právě jednomu závodníkovi. Toto provázání umožňuje závodníkům přihlásit se do systému a spravovat vlastní profil nebo</w:t>
+      </w:r>
+      <w:r>
+        <w:t xml:space="preserve"> své</w:t>
+      </w:r>
+      <w:r>
+        <w:t xml:space="preserve"> registrace na turnaje</w:t>
+      </w:r>
+      <w:r>
+        <w:t xml:space="preserve"> či zkoušky</w:t>
+      </w:r>
+      <w:r>
+        <w:t>.</w:t>
       </w:r>
     </w:p>
     <w:p/>
     <w:p>
-      <w:proofErr w:type="spellStart"/>
-      <w:r>
+      <w:pPr>
         <w:rPr>
           <w:b/>
           <w:bCs/>
         </w:rPr>
-        <w:t>Category</w:t>
-      </w:r>
-      <w:proofErr w:type="spellEnd"/>
+      </w:pPr>
       <w:r>
         <w:rPr>
           <w:b/>
           <w:bCs/>
         </w:rPr>
-        <w:t xml:space="preserve"> – kategorie</w:t>
-      </w:r>
-    </w:p>
-    <w:p>
-      <w:r>
-        <w:t xml:space="preserve">Tabulka </w:t>
-      </w:r>
-      <w:proofErr w:type="spellStart"/>
-      <w:r>
-        <w:t>category</w:t>
-      </w:r>
-      <w:proofErr w:type="spellEnd"/>
-      <w:r>
-        <w:t xml:space="preserve"> definuje věkové kategorie závodníků používané v soutěž</w:t>
-      </w:r>
-      <w:r>
-        <w:t>ích</w:t>
-      </w:r>
-      <w:r>
-        <w:t xml:space="preserve"> taekwondo. Každá kategorie je charakterizována názvem (</w:t>
-      </w:r>
-      <w:proofErr w:type="spellStart"/>
-      <w:r>
-        <w:t>name</w:t>
-      </w:r>
-      <w:proofErr w:type="spellEnd"/>
-      <w:r>
-        <w:t xml:space="preserve">, např. </w:t>
-      </w:r>
-      <w:proofErr w:type="spellStart"/>
-      <w:r>
-        <w:t>Youth</w:t>
-      </w:r>
-      <w:proofErr w:type="spellEnd"/>
-      <w:r>
-        <w:t xml:space="preserve">, </w:t>
-      </w:r>
-      <w:proofErr w:type="spellStart"/>
-      <w:r>
-        <w:t>Cadet</w:t>
-      </w:r>
-      <w:proofErr w:type="spellEnd"/>
-      <w:r>
-        <w:t xml:space="preserve">, Junior, Senior, Ultra) a věkovým rozsahem vyjádřeným sloupci min a max. Vztah s tabulkou </w:t>
-      </w:r>
-      <w:proofErr w:type="spellStart"/>
-      <w:r>
-        <w:t>fighters</w:t>
-      </w:r>
-      <w:proofErr w:type="spellEnd"/>
-      <w:r>
-        <w:t xml:space="preserve"> je opět </w:t>
-      </w:r>
-      <w:proofErr w:type="gramStart"/>
-      <w:r>
-        <w:t>1:N</w:t>
-      </w:r>
-      <w:proofErr w:type="gramEnd"/>
-      <w:r>
-        <w:t xml:space="preserve"> – v jedné kategorii může závodit více závodníků, ale každý závodník patří do právě jedné kategorie.</w:t>
+        <w:t>Role</w:t>
+      </w:r>
+    </w:p>
+    <w:p>
+      <w:r>
+        <w:t>Tabulka role definuje role a oprávnění uživatelů v systému. Aktuálně jsou definovány role jako administrátor (admin), trenér (trainer), uživatel (user) a různé třídy trenérů. Vztah s tabulkou users je 1:N – jedna role může být přiřazena více uživatelům, ale každý uživatel má právě jednu roli. Tato tabulka je klíčová pro řízení přístupu k administraci systému.</w:t>
       </w:r>
     </w:p>
     <w:p/>
@@ -7269,477 +7079,179 @@
           <w:b/>
           <w:bCs/>
         </w:rPr>
-        <w:t>Users – uživatelé</w:t>
-      </w:r>
-    </w:p>
-    <w:p>
-      <w:r>
-        <w:lastRenderedPageBreak/>
-        <w:t xml:space="preserve">Tabulka users spravuje uživatelské účty systému. Každý uživatel má přihlašovací jméno (login), </w:t>
-      </w:r>
-      <w:proofErr w:type="spellStart"/>
-      <w:r>
-        <w:t>zahashované</w:t>
-      </w:r>
-      <w:proofErr w:type="spellEnd"/>
-      <w:r>
-        <w:t xml:space="preserve"> heslo (</w:t>
-      </w:r>
-      <w:proofErr w:type="spellStart"/>
-      <w:r>
-        <w:t>password</w:t>
-      </w:r>
-      <w:proofErr w:type="spellEnd"/>
-      <w:r>
-        <w:t>)</w:t>
-      </w:r>
-      <w:r>
-        <w:t xml:space="preserve"> pomocí </w:t>
-      </w:r>
-      <w:proofErr w:type="spellStart"/>
-      <w:r>
-        <w:t>byCriptu</w:t>
-      </w:r>
-      <w:proofErr w:type="spellEnd"/>
-      <w:r>
-        <w:t xml:space="preserve">, volitelný e-mail (email) a telefonní číslo (phone). Sloupec </w:t>
-      </w:r>
-      <w:proofErr w:type="spellStart"/>
-      <w:r>
-        <w:t>role_id</w:t>
-      </w:r>
-      <w:proofErr w:type="spellEnd"/>
-      <w:r>
-        <w:t xml:space="preserve"> určuje oprávnění uživatele v systému a </w:t>
-      </w:r>
-      <w:proofErr w:type="spellStart"/>
-      <w:r>
-        <w:t>fighter_id</w:t>
-      </w:r>
-      <w:proofErr w:type="spellEnd"/>
-      <w:r>
-        <w:t xml:space="preserve"> umožňuje provázání uživatelského účtu s konkrétním závodníkem. Toto propojení je ve vztahu 1:1 – jeden závodník může mít právě jeden uživatelský účet a jeden uživatelský účet může být přiřazen právě jednomu závodníkovi. Toto provázání umožňuje závodníkům přihlásit se do systému a spravovat vlastní profil nebo</w:t>
-      </w:r>
-      <w:r>
-        <w:t xml:space="preserve"> své</w:t>
-      </w:r>
-      <w:r>
-        <w:t xml:space="preserve"> registrace na turnaje</w:t>
-      </w:r>
-      <w:r>
-        <w:t xml:space="preserve"> či zkoušky</w:t>
-      </w:r>
-      <w:r>
-        <w:t>.</w:t>
-      </w:r>
-    </w:p>
-    <w:p/>
-    <w:p>
-      <w:pPr>
+        <w:t>Tournament – turnaje a akce</w:t>
+      </w:r>
+      <w:r>
         <w:rPr>
           <w:b/>
           <w:bCs/>
         </w:rPr>
-      </w:pPr>
-      <w:r>
+        <w:t xml:space="preserve"> </w:t>
+      </w:r>
+    </w:p>
+    <w:p>
+      <w:r>
+        <w:t xml:space="preserve">Tabulka tournament uchovává informace o plánovaných i proběhlých turnajích a soustředěních oddílu. Každý záznam obsahuje název akce (name), místo konání (location), startovné (price), datum začátku a konce (start_date, end_date), datum uzávěrky přihlášek (registrable_date), doplňující informace (info) a cestu k fotografii nebo plakátu akce (img_path). Sloupec type_id odkazuje na typ akce a users_id eviduje, který uživatel akci vytvořil. </w:t>
+      </w:r>
+      <w:r>
+        <w:t xml:space="preserve"> S</w:t>
+      </w:r>
+      <w:r>
+        <w:t xml:space="preserve">loupec google_event_id </w:t>
+      </w:r>
+      <w:r>
+        <w:t>slouží pro interakci a zobrazování turnajů a akcí pomocí integrace</w:t>
+      </w:r>
+      <w:r>
+        <w:t xml:space="preserve"> Google Calendar API.</w:t>
+      </w:r>
+    </w:p>
+    <w:p/>
+    <w:p>
+      <w:pPr>
         <w:rPr>
           <w:b/>
           <w:bCs/>
         </w:rPr>
-        <w:t>Role</w:t>
-      </w:r>
-    </w:p>
-    <w:p>
-      <w:r>
-        <w:t>Tabulka role definuje role a oprávnění uživatelů v systému. Aktuálně jsou definovány role jako administrátor (admin), trenér (</w:t>
-      </w:r>
-      <w:proofErr w:type="spellStart"/>
-      <w:r>
-        <w:t>trainer</w:t>
-      </w:r>
-      <w:proofErr w:type="spellEnd"/>
-      <w:r>
-        <w:t xml:space="preserve">), uživatel (user) a různé třídy trenérů. Vztah s tabulkou users je </w:t>
-      </w:r>
-      <w:proofErr w:type="gramStart"/>
-      <w:r>
-        <w:t>1:N</w:t>
-      </w:r>
-      <w:proofErr w:type="gramEnd"/>
-      <w:r>
-        <w:t xml:space="preserve"> – jedna role může být přiřazena více uživatelům, ale každý uživatel má právě jednu roli. Tato tabulka je klíčová pro řízení přístupu k administraci systému.</w:t>
-      </w:r>
-    </w:p>
-    <w:p/>
-    <w:p>
-      <w:proofErr w:type="spellStart"/>
+      </w:pPr>
       <w:r>
         <w:rPr>
           <w:b/>
           <w:bCs/>
         </w:rPr>
-        <w:t>Tournament</w:t>
-      </w:r>
-      <w:proofErr w:type="spellEnd"/>
-      <w:r>
+        <w:t xml:space="preserve">Type – typy akcí </w:t>
+      </w:r>
+    </w:p>
+    <w:p>
+      <w:r>
+        <w:t>Tabulka type je pomocná tabulka definující typy akcí, například Turnaj nebo Soustředění. Je ve vztahu 1:N s tabulkou tournament – jeden typ může zahrnovat více turnajů.</w:t>
+      </w:r>
+    </w:p>
+    <w:p/>
+    <w:p>
+      <w:pPr>
         <w:rPr>
           <w:b/>
           <w:bCs/>
         </w:rPr>
-        <w:t xml:space="preserve"> – turnaje a akce</w:t>
-      </w:r>
+      </w:pPr>
       <w:r>
         <w:rPr>
           <w:b/>
           <w:bCs/>
         </w:rPr>
-        <w:t xml:space="preserve"> </w:t>
-      </w:r>
-    </w:p>
-    <w:p>
-      <w:r>
-        <w:t xml:space="preserve">Tabulka </w:t>
-      </w:r>
-      <w:proofErr w:type="spellStart"/>
-      <w:r>
-        <w:t>tournament</w:t>
-      </w:r>
-      <w:proofErr w:type="spellEnd"/>
-      <w:r>
-        <w:t xml:space="preserve"> uchovává informace o plánovaných i proběhlých turnajích a soustředěních oddílu. Každý záznam obsahuje název akce (</w:t>
-      </w:r>
-      <w:proofErr w:type="spellStart"/>
-      <w:r>
-        <w:t>name</w:t>
-      </w:r>
-      <w:proofErr w:type="spellEnd"/>
-      <w:r>
-        <w:t>), místo konání (</w:t>
-      </w:r>
-      <w:proofErr w:type="spellStart"/>
-      <w:r>
-        <w:t>location</w:t>
-      </w:r>
-      <w:proofErr w:type="spellEnd"/>
-      <w:r>
-        <w:t>), startovné (</w:t>
-      </w:r>
-      <w:proofErr w:type="spellStart"/>
-      <w:r>
-        <w:t>price</w:t>
-      </w:r>
-      <w:proofErr w:type="spellEnd"/>
-      <w:r>
-        <w:t>), datum začátku a konce (</w:t>
-      </w:r>
-      <w:proofErr w:type="spellStart"/>
-      <w:r>
-        <w:t>start_date</w:t>
-      </w:r>
-      <w:proofErr w:type="spellEnd"/>
-      <w:r>
-        <w:t xml:space="preserve">, </w:t>
-      </w:r>
-      <w:proofErr w:type="spellStart"/>
-      <w:r>
-        <w:t>end_date</w:t>
-      </w:r>
-      <w:proofErr w:type="spellEnd"/>
-      <w:r>
-        <w:t>), datum uzávěrky přihlášek (</w:t>
-      </w:r>
-      <w:proofErr w:type="spellStart"/>
-      <w:r>
-        <w:t>registrable_date</w:t>
-      </w:r>
-      <w:proofErr w:type="spellEnd"/>
-      <w:r>
-        <w:t>), doplňující informace (</w:t>
-      </w:r>
-      <w:proofErr w:type="spellStart"/>
-      <w:r>
-        <w:t>info</w:t>
-      </w:r>
-      <w:proofErr w:type="spellEnd"/>
-      <w:r>
-        <w:t>) a cestu k fotografii nebo plakátu akce (</w:t>
-      </w:r>
-      <w:proofErr w:type="spellStart"/>
-      <w:r>
-        <w:t>img_path</w:t>
-      </w:r>
-      <w:proofErr w:type="spellEnd"/>
-      <w:r>
-        <w:t xml:space="preserve">). Sloupec </w:t>
-      </w:r>
-      <w:proofErr w:type="spellStart"/>
-      <w:r>
-        <w:t>type_id</w:t>
-      </w:r>
-      <w:proofErr w:type="spellEnd"/>
-      <w:r>
-        <w:t xml:space="preserve"> odkazuje na typ akce a </w:t>
-      </w:r>
-      <w:proofErr w:type="spellStart"/>
-      <w:r>
-        <w:t>users_id</w:t>
-      </w:r>
-      <w:proofErr w:type="spellEnd"/>
-      <w:r>
-        <w:t xml:space="preserve"> eviduje, který uživatel akci vytvořil. </w:t>
-      </w:r>
-      <w:r>
-        <w:t xml:space="preserve"> S</w:t>
-      </w:r>
-      <w:r>
-        <w:t xml:space="preserve">loupec </w:t>
-      </w:r>
-      <w:proofErr w:type="spellStart"/>
-      <w:r>
-        <w:t>google_event_id</w:t>
-      </w:r>
-      <w:proofErr w:type="spellEnd"/>
-      <w:r>
-        <w:t xml:space="preserve"> </w:t>
-      </w:r>
-      <w:r>
-        <w:t>slouží pro interakci a zobrazování turnajů a akcí pomocí integrace</w:t>
-      </w:r>
-      <w:r>
-        <w:t xml:space="preserve"> Google </w:t>
-      </w:r>
-      <w:proofErr w:type="spellStart"/>
-      <w:r>
-        <w:t>Calendar</w:t>
-      </w:r>
-      <w:proofErr w:type="spellEnd"/>
-      <w:r>
-        <w:t xml:space="preserve"> API.</w:t>
+        <w:t>Tournament_registration – registrace na turnaje</w:t>
+      </w:r>
+    </w:p>
+    <w:p>
+      <w:r>
+        <w:t>Tabulka tournament_registration realizuje vazební tabulku vztahu M:N mezi závodníky a turnaji. Závodník se může registrovat na více turnajů a jeden turnaj může mít více registrovaných závodníků. Každá registrace obsahuje volitelnou poznámku (note), stav registrace (status) a dosažené umístění (place), které lze vyplnit zpětně po skončení turnaje.</w:t>
       </w:r>
     </w:p>
     <w:p/>
     <w:p>
-      <w:pPr>
+      <w:r>
         <w:rPr>
           <w:b/>
           <w:bCs/>
         </w:rPr>
-      </w:pPr>
-      <w:r>
+        <w:t>Event – aktuality</w:t>
+      </w:r>
+    </w:p>
+    <w:p>
+      <w:r>
+        <w:t>Tabulka event uchovává aktuality a příspěvky zveřejňované na webu oddílu. Každá aktualita má název (title), textový obsah (body), stav (status), datum zveřejnění (date_start), časové razítko poslední úpravy (created_at) a cestu k titulní fotografii (photo). Cizí klíč user_id odkazuje na autora příspěvku. Vztah s tabulkou users je 1:N – jeden uživatel může vytvořit více aktualit.</w:t>
+      </w:r>
+    </w:p>
+    <w:p/>
+    <w:p>
+      <w:pPr>
         <w:rPr>
           <w:b/>
           <w:bCs/>
         </w:rPr>
-        <w:t xml:space="preserve">Type – typy akcí </w:t>
-      </w:r>
-    </w:p>
-    <w:p>
-      <w:r>
-        <w:t xml:space="preserve">Tabulka type je pomocná tabulka definující typy akcí, například Turnaj nebo Soustředění. Je ve vztahu </w:t>
-      </w:r>
-      <w:proofErr w:type="gramStart"/>
-      <w:r>
-        <w:t>1:N</w:t>
-      </w:r>
-      <w:proofErr w:type="gramEnd"/>
-      <w:r>
-        <w:t xml:space="preserve"> s tabulkou </w:t>
-      </w:r>
-      <w:proofErr w:type="spellStart"/>
-      <w:r>
-        <w:t>tournament</w:t>
-      </w:r>
-      <w:proofErr w:type="spellEnd"/>
-      <w:r>
-        <w:t xml:space="preserve"> – jeden typ může zahrnovat více turnajů.</w:t>
-      </w:r>
-    </w:p>
-    <w:p/>
-    <w:p>
-      <w:pPr>
+      </w:pPr>
+      <w:r>
         <w:rPr>
           <w:b/>
           <w:bCs/>
         </w:rPr>
-      </w:pPr>
-      <w:proofErr w:type="spellStart"/>
-      <w:r>
+        <w:lastRenderedPageBreak/>
+        <w:t>Event_photos – fotogalerie aktualit</w:t>
+      </w:r>
+    </w:p>
+    <w:p>
+      <w:r>
+        <w:t>Tabulka event_photos rozšiřuje systém aktualit o podporu více fotografií u jednoho příspěvku. Každý záznam obsahuje cestu k souboru (img_path), pořadí fotografie (sort_order) pro správné zobrazení galerie a cizí klíč event_id odkazující na příslušnou aktualitu. Vazba na tabulku event je definována s kaskádovým mazáním (ON DELETE CASCADE), což zajišťuje, že při smazání aktuality se automaticky odstraní i všechny její fotografie. Vztah je 1:N – jedna aktualita může mít více fotografií.</w:t>
+      </w:r>
+    </w:p>
+    <w:p/>
+    <w:p>
+      <w:pPr>
         <w:rPr>
           <w:b/>
           <w:bCs/>
         </w:rPr>
-        <w:t>Tournament_registration</w:t>
-      </w:r>
-      <w:proofErr w:type="spellEnd"/>
+      </w:pPr>
       <w:r>
         <w:rPr>
           <w:b/>
           <w:bCs/>
         </w:rPr>
-        <w:t xml:space="preserve"> – registrace na turnaje</w:t>
-      </w:r>
-    </w:p>
-    <w:p>
-      <w:r>
-        <w:t xml:space="preserve">Tabulka </w:t>
-      </w:r>
-      <w:proofErr w:type="spellStart"/>
-      <w:r>
-        <w:t>tournament_registration</w:t>
-      </w:r>
-      <w:proofErr w:type="spellEnd"/>
-      <w:r>
-        <w:t xml:space="preserve"> realizuje vazební tabulku vztahu </w:t>
-      </w:r>
-      <w:proofErr w:type="gramStart"/>
-      <w:r>
-        <w:t>M:N</w:t>
-      </w:r>
-      <w:proofErr w:type="gramEnd"/>
-      <w:r>
-        <w:t xml:space="preserve"> mezi závodníky a turnaji. Závodník se může registrovat na více turnajů a jeden turnaj může mít více registrovaných závodníků. Každá registrace obsahuje volitelnou poznámku (</w:t>
-      </w:r>
-      <w:proofErr w:type="spellStart"/>
-      <w:r>
-        <w:t>note</w:t>
-      </w:r>
-      <w:proofErr w:type="spellEnd"/>
-      <w:r>
-        <w:t>), stav registrace (status) a dosažené umístění (place), které lze vyplnit zpětně po skončení turnaje.</w:t>
+        <w:t>Sponsors – sponzoři</w:t>
+      </w:r>
+    </w:p>
+    <w:p>
+      <w:r>
+        <w:t>Tabulka sponsors eviduje sponzory oddílu zobrazované na webu. Každý sponzor má název (sponsor_name), volitelný odkaz na web (url) a cestu k logu (img_path).</w:t>
       </w:r>
     </w:p>
     <w:p/>
     <w:p>
-      <w:r>
+      <w:pPr>
         <w:rPr>
           <w:b/>
           <w:bCs/>
         </w:rPr>
-        <w:t>Event – aktuality</w:t>
-      </w:r>
-    </w:p>
-    <w:p>
-      <w:r>
-        <w:t>Tabulka event uchovává aktuality a příspěvky zveřejňované na webu oddílu. Každá aktualita má název (</w:t>
-      </w:r>
-      <w:proofErr w:type="spellStart"/>
-      <w:r>
-        <w:t>title</w:t>
-      </w:r>
-      <w:proofErr w:type="spellEnd"/>
-      <w:r>
-        <w:t>), textový obsah (body), stav (status), datum zveřejnění (</w:t>
-      </w:r>
-      <w:proofErr w:type="spellStart"/>
-      <w:r>
-        <w:t>date_start</w:t>
-      </w:r>
-      <w:proofErr w:type="spellEnd"/>
-      <w:r>
-        <w:t>), časové razítko poslední úpravy (</w:t>
-      </w:r>
-      <w:proofErr w:type="spellStart"/>
-      <w:r>
-        <w:t>created_at</w:t>
-      </w:r>
-      <w:proofErr w:type="spellEnd"/>
-      <w:r>
-        <w:t>) a cestu k titulní fotografii (</w:t>
-      </w:r>
-      <w:proofErr w:type="spellStart"/>
-      <w:r>
-        <w:t>photo</w:t>
-      </w:r>
-      <w:proofErr w:type="spellEnd"/>
-      <w:r>
-        <w:t xml:space="preserve">). Cizí klíč </w:t>
-      </w:r>
-      <w:proofErr w:type="spellStart"/>
-      <w:r>
-        <w:t>user_id</w:t>
-      </w:r>
-      <w:proofErr w:type="spellEnd"/>
-      <w:r>
-        <w:t xml:space="preserve"> odkazuje na autora příspěvku. Vztah s tabulkou users je </w:t>
-      </w:r>
-      <w:proofErr w:type="gramStart"/>
-      <w:r>
-        <w:t>1:N</w:t>
-      </w:r>
-      <w:proofErr w:type="gramEnd"/>
-      <w:r>
-        <w:t xml:space="preserve"> – jeden uživatel může vytvořit více aktualit.</w:t>
-      </w:r>
-    </w:p>
-    <w:p/>
-    <w:p>
-      <w:pPr>
+      </w:pPr>
+      <w:r>
         <w:rPr>
           <w:b/>
           <w:bCs/>
         </w:rPr>
-      </w:pPr>
-      <w:proofErr w:type="spellStart"/>
-      <w:r>
+        <w:t>Banner</w:t>
+      </w:r>
+    </w:p>
+    <w:p>
+      <w:r>
+        <w:t>Tabulka banner spravuje reklamní bannery zobrazované na úvodní stránce webu. Každý banner má název (banner_name), cestu k obrázku (img_path) a příznak active určující, zda je banner aktuálně zobrazen.</w:t>
+      </w:r>
+    </w:p>
+    <w:p/>
+    <w:p>
+      <w:pPr>
         <w:rPr>
           <w:b/>
           <w:bCs/>
         </w:rPr>
-        <w:lastRenderedPageBreak/>
-        <w:t>Event_photos</w:t>
-      </w:r>
-      <w:proofErr w:type="spellEnd"/>
+      </w:pPr>
       <w:r>
         <w:rPr>
           <w:b/>
           <w:bCs/>
         </w:rPr>
-        <w:t xml:space="preserve"> – fotogalerie aktualit</w:t>
-      </w:r>
-    </w:p>
-    <w:p>
-      <w:r>
-        <w:t xml:space="preserve">Tabulka </w:t>
-      </w:r>
-      <w:proofErr w:type="spellStart"/>
-      <w:r>
-        <w:t>event_photos</w:t>
-      </w:r>
-      <w:proofErr w:type="spellEnd"/>
-      <w:r>
-        <w:t xml:space="preserve"> rozšiřuje systém aktualit o podporu více fotografií u jednoho příspěvku. Každý záznam obsahuje cestu k souboru (</w:t>
-      </w:r>
-      <w:proofErr w:type="spellStart"/>
-      <w:r>
-        <w:t>img_path</w:t>
-      </w:r>
-      <w:proofErr w:type="spellEnd"/>
-      <w:r>
-        <w:t>), pořadí fotografie (</w:t>
-      </w:r>
-      <w:proofErr w:type="spellStart"/>
-      <w:r>
-        <w:t>sort_order</w:t>
-      </w:r>
-      <w:proofErr w:type="spellEnd"/>
-      <w:r>
-        <w:t xml:space="preserve">) pro správné zobrazení galerie a cizí klíč </w:t>
-      </w:r>
-      <w:proofErr w:type="spellStart"/>
-      <w:r>
-        <w:t>event_id</w:t>
-      </w:r>
-      <w:proofErr w:type="spellEnd"/>
-      <w:r>
-        <w:t xml:space="preserve"> odkazující na příslušnou aktualitu. Vazba na tabulku event je definována s kaskádovým mazáním (ON DELETE CASCADE), což zajišťuje, že při smazání aktuality se automaticky odstraní i všechny její fotografie. Vztah je </w:t>
-      </w:r>
-      <w:proofErr w:type="gramStart"/>
-      <w:r>
-        <w:t>1:N</w:t>
-      </w:r>
-      <w:proofErr w:type="gramEnd"/>
-      <w:r>
-        <w:t xml:space="preserve"> – jedna aktualita může mít více fotografií.</w:t>
+        <w:t>Trainings – tréninky</w:t>
+      </w:r>
+    </w:p>
+    <w:p>
+      <w:r>
+        <w:t xml:space="preserve">Tabulka trainings uchovává pravidelný tréninkový rozvrh oddílu. Každý záznam definuje den začátku a konce tréninku (day_start, day_end), typ tréninku (type, např. začátečníci nebo pokročilí) a čas </w:t>
+      </w:r>
+      <w:r>
+        <w:t>začátku i konce</w:t>
+      </w:r>
+      <w:r>
+        <w:t xml:space="preserve"> (time_start, time_end).</w:t>
       </w:r>
     </w:p>
     <w:p/>
@@ -7750,305 +7262,49 @@
           <w:bCs/>
         </w:rPr>
       </w:pPr>
-      <w:proofErr w:type="spellStart"/>
       <w:r>
         <w:rPr>
           <w:b/>
           <w:bCs/>
         </w:rPr>
-        <w:t>Sponsors</w:t>
-      </w:r>
-      <w:proofErr w:type="spellEnd"/>
-      <w:r>
+        <w:t>Subscriber_email – newsletter</w:t>
+      </w:r>
+    </w:p>
+    <w:p>
+      <w:r>
+        <w:t xml:space="preserve">Tabulka subscriber_email spravuje odběratele e-mailového newsletteru. Každý odběratel je identifikován e-mailovou adresou (email), </w:t>
+      </w:r>
+      <w:r>
+        <w:t>zobrazení</w:t>
+      </w:r>
+      <w:r>
+        <w:t xml:space="preserve"> aktivního odběru (active), odkazem na konkrétní novinku (news_id) a ověřovacím tokenem (token) používaným pro potvrzení odběru nebo odhlášení.</w:t>
+      </w:r>
+    </w:p>
+    <w:p/>
+    <w:p>
+      <w:pPr>
         <w:rPr>
           <w:b/>
           <w:bCs/>
         </w:rPr>
-        <w:t xml:space="preserve"> – sponzoři</w:t>
-      </w:r>
-    </w:p>
-    <w:p>
-      <w:r>
-        <w:t xml:space="preserve">Tabulka </w:t>
-      </w:r>
-      <w:proofErr w:type="spellStart"/>
-      <w:r>
-        <w:t>sponsors</w:t>
-      </w:r>
-      <w:proofErr w:type="spellEnd"/>
-      <w:r>
-        <w:t xml:space="preserve"> eviduje sponzory oddílu zobrazované na webu. Každý sponzor má název (</w:t>
-      </w:r>
-      <w:proofErr w:type="spellStart"/>
-      <w:r>
-        <w:t>sponsor_name</w:t>
-      </w:r>
-      <w:proofErr w:type="spellEnd"/>
-      <w:r>
-        <w:t>), volitelný odkaz na web (</w:t>
-      </w:r>
-      <w:proofErr w:type="spellStart"/>
-      <w:r>
-        <w:t>url</w:t>
-      </w:r>
-      <w:proofErr w:type="spellEnd"/>
-      <w:r>
-        <w:t>) a cestu k logu (</w:t>
-      </w:r>
-      <w:proofErr w:type="spellStart"/>
-      <w:r>
-        <w:t>img_path</w:t>
-      </w:r>
-      <w:proofErr w:type="spellEnd"/>
-      <w:r>
-        <w:t>).</w:t>
-      </w:r>
-    </w:p>
-    <w:p/>
-    <w:p>
-      <w:pPr>
+      </w:pPr>
+      <w:r>
         <w:rPr>
           <w:b/>
           <w:bCs/>
         </w:rPr>
-      </w:pPr>
-      <w:r>
-        <w:rPr>
-          <w:b/>
-          <w:bCs/>
-        </w:rPr>
-        <w:t>Banner</w:t>
-      </w:r>
-    </w:p>
-    <w:p>
-      <w:r>
-        <w:t>Tabulka banner spravuje reklamní bannery zobrazované na úvodní stránce webu. Každý banner má název (</w:t>
-      </w:r>
-      <w:proofErr w:type="spellStart"/>
-      <w:r>
-        <w:t>banner_name</w:t>
-      </w:r>
-      <w:proofErr w:type="spellEnd"/>
-      <w:r>
-        <w:t>), cestu k obrázku (</w:t>
-      </w:r>
-      <w:proofErr w:type="spellStart"/>
-      <w:r>
-        <w:t>img_path</w:t>
-      </w:r>
-      <w:proofErr w:type="spellEnd"/>
-      <w:r>
-        <w:t xml:space="preserve">) a příznak </w:t>
-      </w:r>
-      <w:proofErr w:type="spellStart"/>
-      <w:r>
-        <w:t>active</w:t>
-      </w:r>
-      <w:proofErr w:type="spellEnd"/>
-      <w:r>
-        <w:t xml:space="preserve"> určující, zda je banner aktuálně zobrazen.</w:t>
-      </w:r>
-    </w:p>
-    <w:p/>
-    <w:p>
-      <w:pPr>
-        <w:rPr>
-          <w:b/>
-          <w:bCs/>
-        </w:rPr>
-      </w:pPr>
-      <w:proofErr w:type="spellStart"/>
-      <w:r>
-        <w:rPr>
-          <w:b/>
-          <w:bCs/>
-        </w:rPr>
-        <w:t>Trainings</w:t>
-      </w:r>
-      <w:proofErr w:type="spellEnd"/>
-      <w:r>
-        <w:rPr>
-          <w:b/>
-          <w:bCs/>
-        </w:rPr>
-        <w:t xml:space="preserve"> – tréninky</w:t>
-      </w:r>
-    </w:p>
-    <w:p>
-      <w:r>
-        <w:t xml:space="preserve">Tabulka </w:t>
-      </w:r>
-      <w:proofErr w:type="spellStart"/>
-      <w:r>
-        <w:t>trainings</w:t>
-      </w:r>
-      <w:proofErr w:type="spellEnd"/>
-      <w:r>
-        <w:t xml:space="preserve"> uchovává pravidelný tréninkový rozvrh oddílu. Každý záznam definuje den začátku a konce tréninku (</w:t>
-      </w:r>
-      <w:proofErr w:type="spellStart"/>
-      <w:r>
-        <w:t>day_start</w:t>
-      </w:r>
-      <w:proofErr w:type="spellEnd"/>
-      <w:r>
-        <w:t xml:space="preserve">, </w:t>
-      </w:r>
-      <w:proofErr w:type="spellStart"/>
-      <w:r>
-        <w:t>day_end</w:t>
-      </w:r>
-      <w:proofErr w:type="spellEnd"/>
-      <w:r>
-        <w:t xml:space="preserve">), typ tréninku (type, např. začátečníci nebo pokročilí) a čas </w:t>
-      </w:r>
-      <w:r>
-        <w:t>začátku i konce</w:t>
-      </w:r>
-      <w:r>
-        <w:t xml:space="preserve"> (</w:t>
-      </w:r>
-      <w:proofErr w:type="spellStart"/>
-      <w:r>
-        <w:t>time_start</w:t>
-      </w:r>
-      <w:proofErr w:type="spellEnd"/>
-      <w:r>
-        <w:t xml:space="preserve">, </w:t>
-      </w:r>
-      <w:proofErr w:type="spellStart"/>
-      <w:r>
-        <w:t>time_end</w:t>
-      </w:r>
-      <w:proofErr w:type="spellEnd"/>
-      <w:r>
-        <w:t>).</w:t>
-      </w:r>
-    </w:p>
-    <w:p/>
-    <w:p>
-      <w:pPr>
-        <w:rPr>
-          <w:b/>
-          <w:bCs/>
-        </w:rPr>
-      </w:pPr>
-      <w:proofErr w:type="spellStart"/>
-      <w:r>
-        <w:rPr>
-          <w:b/>
-          <w:bCs/>
-        </w:rPr>
-        <w:t>Subscriber_email</w:t>
-      </w:r>
-      <w:proofErr w:type="spellEnd"/>
-      <w:r>
-        <w:rPr>
-          <w:b/>
-          <w:bCs/>
-        </w:rPr>
-        <w:t xml:space="preserve"> – newsletter</w:t>
-      </w:r>
-    </w:p>
-    <w:p>
-      <w:r>
-        <w:t xml:space="preserve">Tabulka </w:t>
-      </w:r>
-      <w:proofErr w:type="spellStart"/>
-      <w:r>
-        <w:t>subscriber_email</w:t>
-      </w:r>
-      <w:proofErr w:type="spellEnd"/>
-      <w:r>
-        <w:t xml:space="preserve"> spravuje odběratele e-mailového newsletteru. Každý odběratel je identifikován e-mailovou adresou (email), </w:t>
-      </w:r>
-      <w:r>
-        <w:t>zobrazení</w:t>
-      </w:r>
-      <w:r>
-        <w:t xml:space="preserve"> aktivního odběru (</w:t>
-      </w:r>
-      <w:proofErr w:type="spellStart"/>
-      <w:r>
-        <w:t>active</w:t>
-      </w:r>
-      <w:proofErr w:type="spellEnd"/>
-      <w:r>
-        <w:t>), odkazem na konkrétní novinku (</w:t>
-      </w:r>
-      <w:proofErr w:type="spellStart"/>
-      <w:r>
-        <w:t>news_id</w:t>
-      </w:r>
-      <w:proofErr w:type="spellEnd"/>
-      <w:r>
-        <w:t>) a ověřovacím tokenem (token) používaným pro potvrzení odběru nebo odhlášení.</w:t>
-      </w:r>
-    </w:p>
-    <w:p/>
-    <w:p>
-      <w:pPr>
-        <w:rPr>
-          <w:b/>
-          <w:bCs/>
-        </w:rPr>
-      </w:pPr>
-      <w:r>
-        <w:rPr>
-          <w:b/>
-          <w:bCs/>
-        </w:rPr>
         <w:t>Relace mezi tabulkami</w:t>
       </w:r>
     </w:p>
     <w:p>
       <w:r>
-        <w:t xml:space="preserve">Databáze využívá standardní typy relací relačního modelu. Vztahy </w:t>
-      </w:r>
-      <w:proofErr w:type="gramStart"/>
-      <w:r>
-        <w:t>1:N</w:t>
-      </w:r>
-      <w:proofErr w:type="gramEnd"/>
-      <w:r>
-        <w:t xml:space="preserve"> jsou nejčastější – například jeden technický stupeň může mít více závodníků, jedna role více uživatelů nebo jedna aktualita více fotografií. Vztah 1:1 je realizován mezi tabulkami users a </w:t>
-      </w:r>
-      <w:proofErr w:type="spellStart"/>
-      <w:r>
-        <w:t>fighters</w:t>
-      </w:r>
-      <w:proofErr w:type="spellEnd"/>
-      <w:r>
-        <w:t xml:space="preserve">, kde každý závodník může mít nejvýše jeden uživatelský účet. Vztah </w:t>
-      </w:r>
-      <w:proofErr w:type="gramStart"/>
-      <w:r>
-        <w:t>M:N</w:t>
-      </w:r>
-      <w:proofErr w:type="gramEnd"/>
-      <w:r>
-        <w:t xml:space="preserve"> je implementován prostřednictvím vazební tabulky </w:t>
-      </w:r>
-      <w:proofErr w:type="spellStart"/>
-      <w:r>
-        <w:t>tournament_registration</w:t>
-      </w:r>
-      <w:proofErr w:type="spellEnd"/>
-      <w:r>
-        <w:t>, která propojuje závodníky s turnaji a umožňuje evidovat jejich přihlášky a výsledky.</w:t>
-      </w:r>
-    </w:p>
-    <w:p>
-      <w:r>
-        <w:t xml:space="preserve">Referenční integrita je vynucována pomocí cizích klíčů s různými strategiemi při mazání záznamů. Tabulka </w:t>
-      </w:r>
-      <w:proofErr w:type="spellStart"/>
-      <w:r>
-        <w:t>event_photos</w:t>
-      </w:r>
-      <w:proofErr w:type="spellEnd"/>
-      <w:r>
-        <w:t xml:space="preserve"> používá kaskádové mazání, zatímco ostatní vazby používají </w:t>
+        <w:t>Databáze využívá standardní typy relací relačního modelu. Vztahy 1:N jsou nejčastější – například jeden technický stupeň může mít více závodníků, jedna role více uživatelů nebo jedna aktualita více fotografií. Vztah 1:1 je realizován mezi tabulkami users a fighters, kde každý závodník může mít nejvýše jeden uživatelský účet. Vztah M:N je implementován prostřednictvím vazební tabulky tournament_registration, která propojuje závodníky s turnaji a umožňuje evidovat jejich přihlášky a výsledky.</w:t>
+      </w:r>
+    </w:p>
+    <w:p>
+      <w:r>
+        <w:t xml:space="preserve">Referenční integrita je vynucována pomocí cizích klíčů s různými strategiemi při mazání záznamů. Tabulka event_photos používá kaskádové mazání, zatímco ostatní vazby používají </w:t>
       </w:r>
       <w:r>
         <w:lastRenderedPageBreak/>
@@ -8060,6 +7316,9 @@
         <w:keepNext/>
       </w:pPr>
       <w:r>
+        <w:rPr>
+          <w:noProof/>
+        </w:rPr>
         <w:drawing>
           <wp:inline distT="0" distB="0" distL="0" distR="0" wp14:anchorId="0A479DE2" wp14:editId="3B987C7F">
             <wp:extent cx="5399405" cy="2806700"/>
@@ -8476,13 +7735,8 @@
         <w:t>Layout</w:t>
       </w:r>
       <w:r>
-        <w:t xml:space="preserve"> – skládá se z částí, které tvoří layout aplikace, patří sem například header, footer, </w:t>
-      </w:r>
-      <w:proofErr w:type="spellStart"/>
-      <w:r>
-        <w:t>container</w:t>
-      </w:r>
-      <w:proofErr w:type="spellEnd"/>
+        <w:t xml:space="preserve"> – skládá se z částí, které tvoří layout aplikace, patří sem například header, footer, container</w:t>
+      </w:r>
     </w:p>
     <w:p>
       <w:pPr>
@@ -8492,21 +7746,11 @@
           <w:numId w:val="42"/>
         </w:numPr>
       </w:pPr>
-      <w:proofErr w:type="spellStart"/>
       <w:r>
         <w:t>Pages</w:t>
       </w:r>
-      <w:proofErr w:type="spellEnd"/>
-      <w:r>
-        <w:t xml:space="preserve"> – obsahuje složky pojmenované po stránkách, kterými aplikace disponuje, každá složka obsahuje unikátní </w:t>
-      </w:r>
-      <w:proofErr w:type="spellStart"/>
-      <w:r>
-        <w:t>componenty</w:t>
-      </w:r>
-      <w:proofErr w:type="spellEnd"/>
-      <w:r>
-        <w:t>, které jsou na dané stránce použité</w:t>
+      <w:r>
+        <w:t xml:space="preserve"> – obsahuje složky pojmenované po stránkách, kterými aplikace disponuje, každá složka obsahuje unikátní componenty, které jsou na dané stránce použité</w:t>
       </w:r>
     </w:p>
     <w:p>
@@ -8517,11 +7761,9 @@
           <w:numId w:val="42"/>
         </w:numPr>
       </w:pPr>
-      <w:proofErr w:type="spellStart"/>
       <w:r>
         <w:t>Utils</w:t>
       </w:r>
-      <w:proofErr w:type="spellEnd"/>
     </w:p>
     <w:p>
       <w:pPr>
@@ -8561,42 +7803,42 @@
       </w:r>
     </w:p>
     <w:p>
-      <w:proofErr w:type="gramStart"/>
       <w:r>
         <w:rPr>
           <w:b/>
           <w:bCs/>
         </w:rPr>
-        <w:t>.</w:t>
-      </w:r>
-      <w:proofErr w:type="spellStart"/>
+        <w:t>.gitignore</w:t>
+      </w:r>
+      <w:r>
+        <w:t xml:space="preserve"> – jsou zde definovány složky a soubory, které nemají být zpracovávány verzovacími systémy jako je například Git</w:t>
+      </w:r>
+      <w:r>
+        <w:t>, typickým příkladem bývá soubor .env ve kterém se nachází citlivé údaje jako jsou API klíče či konfigurace databáze ke které je projekt napojený.</w:t>
+      </w:r>
+    </w:p>
+    <w:p>
       <w:r>
         <w:rPr>
           <w:b/>
           <w:bCs/>
         </w:rPr>
-        <w:t>gitignore</w:t>
-      </w:r>
-      <w:proofErr w:type="spellEnd"/>
-      <w:proofErr w:type="gramEnd"/>
-      <w:r>
-        <w:t xml:space="preserve"> – jsou zde definovány složky a soubory, které nemají být zpracovávány verzovacími systémy jako je například Git</w:t>
-      </w:r>
-      <w:r>
-        <w:t xml:space="preserve">, typickým příkladem bývá </w:t>
-      </w:r>
-      <w:proofErr w:type="gramStart"/>
-      <w:r>
-        <w:t>soubor .</w:t>
-      </w:r>
-      <w:proofErr w:type="spellStart"/>
-      <w:r>
-        <w:t>env</w:t>
-      </w:r>
-      <w:proofErr w:type="spellEnd"/>
-      <w:proofErr w:type="gramEnd"/>
-      <w:r>
-        <w:t xml:space="preserve"> ve kterém se nachází citlivé údaje jako jsou API klíče či konfigurace databáze ke které je projekt napojený.</w:t>
+        <w:t>index.html</w:t>
+      </w:r>
+      <w:r>
+        <w:t xml:space="preserve"> –</w:t>
+      </w:r>
+      <w:r>
+        <w:t xml:space="preserve"> obsahuje</w:t>
+      </w:r>
+      <w:r>
+        <w:t xml:space="preserve"> HTML šablo</w:t>
+      </w:r>
+      <w:r>
+        <w:t>nu</w:t>
+      </w:r>
+      <w:r>
+        <w:t xml:space="preserve"> do které je vkládána React aplikace</w:t>
       </w:r>
     </w:p>
     <w:p>
@@ -8605,22 +7847,13 @@
           <w:b/>
           <w:bCs/>
         </w:rPr>
-        <w:t>index.html</w:t>
-      </w:r>
-      <w:r>
-        <w:t xml:space="preserve"> –</w:t>
-      </w:r>
-      <w:r>
-        <w:t xml:space="preserve"> obsahuje</w:t>
-      </w:r>
-      <w:r>
-        <w:t xml:space="preserve"> HTML šablo</w:t>
-      </w:r>
-      <w:r>
-        <w:t>nu</w:t>
-      </w:r>
-      <w:r>
-        <w:t xml:space="preserve"> do které je vkládána React aplikace</w:t>
+        <w:t>package-lock.json</w:t>
+      </w:r>
+      <w:r>
+        <w:t xml:space="preserve"> – </w:t>
+      </w:r>
+      <w:r>
+        <w:t>generuje se automaticky při každé instalaci a uživatel by do něj neměl vůbec zasahovat</w:t>
       </w:r>
     </w:p>
     <w:p>
@@ -8629,52 +7862,50 @@
           <w:b/>
           <w:bCs/>
         </w:rPr>
-        <w:t>package-</w:t>
-      </w:r>
-      <w:proofErr w:type="gramStart"/>
-      <w:r>
+        <w:t>package.json</w:t>
+      </w:r>
+      <w:r>
+        <w:t xml:space="preserve"> – jsou zde základní informace o projektu a seznam hlavních závislostí </w:t>
+      </w:r>
+    </w:p>
+    <w:p/>
+    <w:p>
+      <w:pPr>
         <w:rPr>
           <w:b/>
           <w:bCs/>
         </w:rPr>
-        <w:t>lock.json</w:t>
-      </w:r>
-      <w:proofErr w:type="gramEnd"/>
-      <w:r>
-        <w:t xml:space="preserve"> – </w:t>
-      </w:r>
-      <w:r>
-        <w:t>generuje se automaticky při každé instalaci a uživatel by do něj neměl vůbec zasahovat</w:t>
-      </w:r>
-    </w:p>
-    <w:p>
-      <w:proofErr w:type="gramStart"/>
+      </w:pPr>
       <w:r>
         <w:rPr>
           <w:b/>
           <w:bCs/>
         </w:rPr>
-        <w:t>package.json</w:t>
-      </w:r>
-      <w:proofErr w:type="gramEnd"/>
-      <w:r>
-        <w:t xml:space="preserve"> – jsou zde základní informace o projektu a seznam hlavních závislostí </w:t>
-      </w:r>
-    </w:p>
-    <w:p/>
-    <w:p>
-      <w:pPr>
+        <w:t>Konfigurační soubory:</w:t>
+      </w:r>
+    </w:p>
+    <w:p>
+      <w:r>
         <w:rPr>
           <w:b/>
           <w:bCs/>
         </w:rPr>
-      </w:pPr>
+        <w:t>eslint.config.js</w:t>
+      </w:r>
+      <w:r>
+        <w:t xml:space="preserve"> – konfigurační soubor nástroje ESLint, který slouží k statické analýze zdrojového kódu, definuje sadu syntaktických a stylových pravidel, zajišťuje konzistenci kódu</w:t>
+      </w:r>
+    </w:p>
+    <w:p>
       <w:r>
         <w:rPr>
           <w:b/>
           <w:bCs/>
         </w:rPr>
-        <w:t>Konfigurační soubory:</w:t>
+        <w:t>postcss.config.js</w:t>
+      </w:r>
+      <w:r>
+        <w:t xml:space="preserve"> – konfigurační soubor pro PostCSS, které optimalizuje CSS a umožňuje práci s TailWindCSS</w:t>
       </w:r>
     </w:p>
     <w:p>
@@ -8683,10 +7914,11 @@
           <w:b/>
           <w:bCs/>
         </w:rPr>
-        <w:t>eslint.config.js</w:t>
-      </w:r>
-      <w:r>
-        <w:t xml:space="preserve"> – konfigurační soubor nástroje ESLint, který slouží k statické analýze zdrojového kódu, definuje sadu syntaktických a stylových pravidel, zajišťuje konzistenci kódu</w:t>
+        <w:lastRenderedPageBreak/>
+        <w:t>tailwind.config.js</w:t>
+      </w:r>
+      <w:r>
+        <w:t xml:space="preserve"> – konfigurační soubor pro TailWindCSS</w:t>
       </w:r>
     </w:p>
     <w:p>
@@ -8695,43 +7927,18 @@
           <w:b/>
           <w:bCs/>
         </w:rPr>
-        <w:t>postcss.config.js</w:t>
-      </w:r>
-      <w:r>
-        <w:t xml:space="preserve"> – konfigurační soubor pro PostCSS, které optimalizuje CSS a umožňuje práci s TailWindCSS</w:t>
-      </w:r>
-    </w:p>
-    <w:p>
-      <w:r>
+        <w:t>vite.config.js</w:t>
+      </w:r>
+      <w:r>
+        <w:t xml:space="preserve"> – nachází se zde definice toho, jak se má projekt spouštět, sestavovat a jaké technologie má podporovat</w:t>
+      </w:r>
+    </w:p>
+    <w:p>
+      <w:pPr>
         <w:rPr>
           <w:b/>
           <w:bCs/>
         </w:rPr>
-        <w:lastRenderedPageBreak/>
-        <w:t>tailwind.config.js</w:t>
-      </w:r>
-      <w:r>
-        <w:t xml:space="preserve"> – konfigurační soubor pro TailWindCSS</w:t>
-      </w:r>
-    </w:p>
-    <w:p>
-      <w:r>
-        <w:rPr>
-          <w:b/>
-          <w:bCs/>
-        </w:rPr>
-        <w:t>vite.config.js</w:t>
-      </w:r>
-      <w:r>
-        <w:t xml:space="preserve"> – nachází se zde definice toho, jak se má projekt spouštět, sestavovat a jaké technologie má podporovat</w:t>
-      </w:r>
-    </w:p>
-    <w:p>
-      <w:pPr>
-        <w:rPr>
-          <w:b/>
-          <w:bCs/>
-        </w:rPr>
       </w:pPr>
     </w:p>
     <w:p>
@@ -8744,70 +7951,23 @@
     </w:p>
     <w:p>
       <w:r>
-        <w:t xml:space="preserve">V projektu se nachází složka </w:t>
-      </w:r>
-      <w:proofErr w:type="gramStart"/>
-      <w:r>
-        <w:t>layout</w:t>
-      </w:r>
-      <w:proofErr w:type="gramEnd"/>
-      <w:r>
-        <w:t xml:space="preserve"> ve které jsou definovány všechny klíčové komponenty, které definují </w:t>
-      </w:r>
-      <w:proofErr w:type="gramStart"/>
-      <w:r>
-        <w:t>to</w:t>
-      </w:r>
-      <w:proofErr w:type="gramEnd"/>
-      <w:r>
-        <w:t xml:space="preserve"> jak bude stránka vypadat. Nachází se zde </w:t>
-      </w:r>
-      <w:proofErr w:type="spellStart"/>
-      <w:r>
-        <w:t>header</w:t>
-      </w:r>
-      <w:proofErr w:type="spellEnd"/>
-      <w:r>
-        <w:t xml:space="preserve">, footer, </w:t>
-      </w:r>
-      <w:proofErr w:type="spellStart"/>
-      <w:r>
-        <w:t>sidebar</w:t>
-      </w:r>
-      <w:proofErr w:type="spellEnd"/>
-      <w:r>
-        <w:t xml:space="preserve"> a také </w:t>
-      </w:r>
-      <w:proofErr w:type="spellStart"/>
-      <w:r>
-        <w:t>container</w:t>
-      </w:r>
-      <w:proofErr w:type="spellEnd"/>
-      <w:r>
-        <w:t xml:space="preserve"> ve kterém se vykreslují všechny komponenty specifické pro určité stránky.</w:t>
-      </w:r>
-      <w:r>
-        <w:t xml:space="preserve"> Komponenty z této složky jsou poté importovány do souboru </w:t>
-      </w:r>
-      <w:proofErr w:type="spellStart"/>
+        <w:t>V projektu se nachází složka layout ve které jsou definovány všechny klíčové komponenty, které definují to jak bude stránka vypadat. Nachází se zde header, footer, sidebar a také container ve kterém se vykreslují všechny komponenty specifické pro určité stránky.</w:t>
+      </w:r>
+      <w:r>
+        <w:t xml:space="preserve"> Komponenty z této složky jsou poté importovány do souboru App.jsx</w:t>
+      </w:r>
+      <w:r>
+        <w:t>.</w:t>
+      </w:r>
+    </w:p>
+    <w:p/>
+    <w:p>
+      <w:pPr>
+        <w:pStyle w:val="Nadpis3"/>
+      </w:pPr>
       <w:r>
         <w:t>App.jsx</w:t>
       </w:r>
-      <w:proofErr w:type="spellEnd"/>
-      <w:r>
-        <w:t>.</w:t>
-      </w:r>
-    </w:p>
-    <w:p/>
-    <w:p>
-      <w:pPr>
-        <w:pStyle w:val="Nadpis3"/>
-      </w:pPr>
-      <w:proofErr w:type="spellStart"/>
-      <w:r>
-        <w:t>App.jsx</w:t>
-      </w:r>
-      <w:proofErr w:type="spellEnd"/>
     </w:p>
     <w:p>
       <w:r>
@@ -8817,10 +7977,28 @@
         <w:t xml:space="preserve"> který slouží jako hlavní komponenta aplikace a kde se skládá celá struktura aplikace</w:t>
       </w:r>
       <w:r>
-        <w:t xml:space="preserve">. Jsou zde </w:t>
+        <w:t xml:space="preserve">. </w:t>
+      </w:r>
+      <w:r>
+        <w:t xml:space="preserve">Stará se o to, co uživatel uvidí a jak se aplikace bude chovat jako celek. </w:t>
+      </w:r>
+      <w:r>
+        <w:t xml:space="preserve">Jsou zde </w:t>
       </w:r>
       <w:r>
         <w:t>naimportovány všechny stránky</w:t>
+      </w:r>
+      <w:r>
+        <w:t xml:space="preserve"> a</w:t>
+      </w:r>
+      <w:r>
+        <w:t xml:space="preserve"> pomocí logiky &lt;ProtectedRoute&gt; jsou</w:t>
+      </w:r>
+      <w:r>
+        <w:t xml:space="preserve"> rozděleny na veřejnou část a část která se skrývá za loginem. Nachází se zde i importované globální CSS ve kterém jsou definovány použité třídy na stylizaci komponent a celé aplikace. </w:t>
+      </w:r>
+      <w:r>
+        <w:t>Routování jde zde zajištěno pomocí knihovny react-router-dom.</w:t>
       </w:r>
     </w:p>
     <w:p>
@@ -8936,6 +8114,9 @@
         <w:jc w:val="center"/>
       </w:pPr>
       <w:r>
+        <w:rPr>
+          <w:noProof/>
+        </w:rPr>
         <w:drawing>
           <wp:inline distT="0" distB="0" distL="0" distR="0" wp14:anchorId="7B1861B0" wp14:editId="56468741">
             <wp:extent cx="1552792" cy="3534268"/>
@@ -9057,43 +8238,14 @@
     </w:p>
     <w:p>
       <w:r>
-        <w:t xml:space="preserve">Komunikace mezi </w:t>
-      </w:r>
-      <w:proofErr w:type="spellStart"/>
-      <w:r>
-        <w:t>frontendovou</w:t>
-      </w:r>
-      <w:proofErr w:type="spellEnd"/>
-      <w:r>
-        <w:t xml:space="preserve"> a </w:t>
-      </w:r>
-      <w:proofErr w:type="spellStart"/>
-      <w:r>
-        <w:t>backendovou</w:t>
-      </w:r>
-      <w:proofErr w:type="spellEnd"/>
-      <w:r>
-        <w:t xml:space="preserve"> částí aplikace je realizována prostřednictvím REST API. Backend postaven na Node.js s frameworkem Express.js vystavuje sadu </w:t>
-      </w:r>
-      <w:proofErr w:type="spellStart"/>
-      <w:r>
-        <w:t>endpointů</w:t>
-      </w:r>
-      <w:proofErr w:type="spellEnd"/>
-      <w:r>
-        <w:t xml:space="preserve"> organizovaných podle jednotlivých zdrojů (</w:t>
-      </w:r>
-      <w:proofErr w:type="spellStart"/>
-      <w:r>
-        <w:t>resources</w:t>
-      </w:r>
-      <w:proofErr w:type="spellEnd"/>
-      <w:r>
-        <w:t>). Každý zdroj má vlastní router umístěný v samostatném souboru, přičemž HTTP metody GET, POST, PUT a DELETE odpovídají operacím čtení, vytváření, úpravy a mazání dat. Přenos dat probíhá ve formátu JSON. Autentizace je řešena pomocí JWT tokenu předávaného v hlavičce každého požadavku.</w:t>
-      </w:r>
-    </w:p>
-    <w:p>
-      <w:r>
+        <w:t>Komunikace mezi frontendovou a backendovou částí aplikace je realizována prostřednictvím REST API. Backend postaven na Node.js s frameworkem Express.js vystavuje sadu endpointů organizovaných podle jednotlivých zdrojů (resources). Každý zdroj má vlastní router umístěný v samostatném souboru, přičemž HTTP metody GET, POST, PUT a DELETE odpovídají operacím čtení, vytváření, úpravy a mazání dat. Přenos dat probíhá ve formátu JSON. Autentizace je řešena pomocí JWT tokenu předávaného v hlavičce každého požadavku.</w:t>
+      </w:r>
+    </w:p>
+    <w:p>
+      <w:r>
+        <w:rPr>
+          <w:noProof/>
+        </w:rPr>
         <w:drawing>
           <wp:inline distT="0" distB="0" distL="0" distR="0" wp14:anchorId="04590C5C" wp14:editId="312B536B">
             <wp:extent cx="5399405" cy="1932305"/>
@@ -9135,96 +8287,240 @@
     <w:p>
       <w:pPr>
         <w:pStyle w:val="Nadpis1"/>
+      </w:pPr>
+      <w:r>
+        <w:lastRenderedPageBreak/>
+        <w:t>Implementace řešení</w:t>
+      </w:r>
+    </w:p>
+    <w:p>
+      <w:r>
+        <w:t xml:space="preserve">Nasazení webové aplikace na školní server probíhalo v několika krocích, které zajistily správné fungování backendu i frontendu a jejich dostupnost na adrese </w:t>
+      </w:r>
+      <w:hyperlink r:id="rId42" w:tgtFrame="_new" w:history="1">
+        <w:r>
+          <w:rPr>
+            <w:rStyle w:val="Hypertextovodkaz"/>
+            <w:b/>
+            <w:bCs/>
+          </w:rPr>
+          <w:t>http://alpha.kts.vspj.cz:</w:t>
+        </w:r>
+      </w:hyperlink>
+      <w:r>
+        <w:t xml:space="preserve"> </w:t>
+      </w:r>
+      <w:r>
+        <w:t>. Celý proces lze popsat následovně:</w:t>
+      </w:r>
+    </w:p>
+    <w:p>
+      <w:pPr>
         <w:numPr>
           <w:ilvl w:val="0"/>
-          <w:numId w:val="0"/>
+          <w:numId w:val="44"/>
         </w:numPr>
-        <w:ind w:left="431" w:hanging="431"/>
-      </w:pPr>
-      <w:bookmarkStart w:id="29" w:name="_Toc60053869"/>
-      <w:bookmarkStart w:id="30" w:name="_Toc187493172"/>
-      <w:r>
-        <w:lastRenderedPageBreak/>
-        <w:t>Závěr</w:t>
-      </w:r>
-      <w:bookmarkEnd w:id="29"/>
-      <w:bookmarkEnd w:id="30"/>
-    </w:p>
-    <w:p>
-      <w:r>
-        <w:t xml:space="preserve">Cílem bakalářské práce bylo kompletně restrukturalizovat webové stránky sportovního oddílu Taekwondo Lacek. Původní webové stránky měly zastaralý design, nebyly responzivní a chybělo jim několik klíčových funkcionalit, které jsem při tvorbě nového webu zohlednil </w:t>
+      </w:pPr>
+      <w:r>
+        <w:rPr>
+          <w:b/>
+          <w:bCs/>
+        </w:rPr>
+        <w:t>Nahrání projektu na server</w:t>
+      </w:r>
+      <w:r>
+        <w:t xml:space="preserve">: </w:t>
+      </w:r>
+      <w:r>
+        <w:t xml:space="preserve">Pomocí nástroje </w:t>
+      </w:r>
+      <w:r>
+        <w:rPr>
+          <w:b/>
+          <w:bCs/>
+        </w:rPr>
+        <w:t>FileZilla</w:t>
+      </w:r>
+      <w:r>
+        <w:t xml:space="preserve"> byly soubory frontendu </w:t>
       </w:r>
       <w:r>
         <w:br/>
       </w:r>
       <w:r>
-        <w:t>a implementoval. Jednou z klíčových funkcionalit je přihlašování závodníků na turnaje či zkoušky což majiteli oddílu šetří spoustu času a zvyšuje efektivitu, protože nyní již nemusí složitě vyhledávat a sepisovat závodníky, kteří mají zájem o účast na oddílových akcích.</w:t>
-      </w:r>
-    </w:p>
-    <w:p>
-      <w:r>
-        <w:t xml:space="preserve">Obě verze webů splňují </w:t>
-      </w:r>
-      <w:r>
-        <w:t>veškeré stanovené</w:t>
-      </w:r>
-      <w:r>
-        <w:t xml:space="preserve"> požadavky</w:t>
-      </w:r>
-      <w:r>
-        <w:t xml:space="preserve">. Výsledem jsou webové stránky, které odpovídají současným požadavkům na design a technické standardy jako je například bezpečnost dat či responzivita, která je pro většinu uživatelů klíčová. </w:t>
-      </w:r>
-    </w:p>
-    <w:p>
-      <w:r>
-        <w:t xml:space="preserve">Tvorba bakalářské práce mi přinesla cenné zkušenosti nejen v oblasti programování, ale </w:t>
-      </w:r>
-      <w:r>
-        <w:br/>
-      </w:r>
-      <w:r>
-        <w:t xml:space="preserve">i v oblasti komunikace se zákazníkem a vyjednávání. Během vývoje jsem se seznámil s principy moderního designu a bezpečnosti webových stránek, tyto zkušenosti považuji za velmi cenné </w:t>
-      </w:r>
-      <w:r>
-        <w:br/>
-      </w:r>
-      <w:r>
-        <w:t xml:space="preserve">a jsem si jistý, že mi pomohou v mém profesním růstu. Vytvořil jsem funkční webovou stránku, která splňuje veškeré požadavky, má praktickou hodnotu a přispívá k efektivnější organizaci </w:t>
-      </w:r>
-      <w:r>
-        <w:br/>
-      </w:r>
-      <w:r>
-        <w:t>a propagaci oddílu Taekwondo Lacek.</w:t>
-      </w:r>
-    </w:p>
-    <w:p>
-      <w:r>
-        <w:t xml:space="preserve">Do budoucna přemýšlím, že bych web rozšířil o možnost objednat si týmové oblečení, zažádat </w:t>
-      </w:r>
-      <w:r>
-        <w:br/>
-      </w:r>
-      <w:r>
-        <w:t xml:space="preserve">o svazovou známku či svazovou knížečku. Dále bych zde i rád přidal možnost </w:t>
-      </w:r>
-      <w:r>
-        <w:t>posílání zpráv mezi závodníky webu.</w:t>
-      </w:r>
-    </w:p>
-    <w:p/>
-    <w:p>
-      <w:pPr>
-        <w:pStyle w:val="Odstavecseseznamem"/>
+        <w:t>i backendu přeneseny na školní server. Pro zachování přehlednosti byly soubory organizovány do samostatných adresářů pro frontend a backend</w:t>
+      </w:r>
+      <w:r>
+        <w:t xml:space="preserve"> v hlavní složce BP</w:t>
+      </w:r>
+      <w:r>
+        <w:t>.</w:t>
+      </w:r>
+    </w:p>
+    <w:p>
+      <w:pPr>
         <w:numPr>
           <w:ilvl w:val="0"/>
-          <w:numId w:val="40"/>
+          <w:numId w:val="44"/>
         </w:numPr>
       </w:pPr>
       <w:r>
-        <w:t>Víc to rozepiš, excel export, nějaký zálohy, výpis/smlouvy pomocí .docx šablon jako jsi dělal ve Webrexu.</w:t>
-      </w:r>
-    </w:p>
+        <w:rPr>
+          <w:b/>
+          <w:bCs/>
+        </w:rPr>
+        <w:t>Instalace závislostí</w:t>
+      </w:r>
+      <w:r>
+        <w:t xml:space="preserve">: </w:t>
+      </w:r>
+      <w:r>
+        <w:t xml:space="preserve">Po nahrání projektu byly přímo na serveru spuštěny příkazy pro instalaci potřebných závislostí pomocí </w:t>
+      </w:r>
+      <w:r>
+        <w:rPr>
+          <w:b/>
+          <w:bCs/>
+        </w:rPr>
+        <w:t>npm</w:t>
+      </w:r>
+      <w:r>
+        <w:t>. Tento krok zajistil, že aplikace bude mít přístup ke všem knihovnám a modulům nezbytným pro její běh.</w:t>
+      </w:r>
+    </w:p>
+    <w:p>
+      <w:pPr>
+        <w:numPr>
+          <w:ilvl w:val="0"/>
+          <w:numId w:val="44"/>
+        </w:numPr>
+      </w:pPr>
+      <w:r>
+        <w:rPr>
+          <w:b/>
+          <w:bCs/>
+        </w:rPr>
+        <w:t>Nastavení veřejných portů</w:t>
+      </w:r>
+      <w:r>
+        <w:t xml:space="preserve">: </w:t>
+      </w:r>
+      <w:r>
+        <w:t>Pro zajištění dostupnosti aplikace byly na serveru otevřeny porty:</w:t>
+      </w:r>
+    </w:p>
+    <w:p>
+      <w:pPr>
+        <w:numPr>
+          <w:ilvl w:val="1"/>
+          <w:numId w:val="44"/>
+        </w:numPr>
+      </w:pPr>
+      <w:r>
+        <w:rPr>
+          <w:b/>
+          <w:bCs/>
+        </w:rPr>
+        <w:t>8098</w:t>
+      </w:r>
+      <w:r>
+        <w:t xml:space="preserve"> –</w:t>
+      </w:r>
+      <w:r>
+        <w:t xml:space="preserve"> </w:t>
+      </w:r>
+      <w:r>
+        <w:t>pro frontend, který zpřístupňuje uživatelské rozhraní,</w:t>
+      </w:r>
+    </w:p>
+    <w:p>
+      <w:pPr>
+        <w:numPr>
+          <w:ilvl w:val="1"/>
+          <w:numId w:val="44"/>
+        </w:numPr>
+      </w:pPr>
+      <w:r>
+        <w:rPr>
+          <w:b/>
+          <w:bCs/>
+        </w:rPr>
+        <w:t>8099</w:t>
+      </w:r>
+      <w:r>
+        <w:t xml:space="preserve"> </w:t>
+      </w:r>
+      <w:r>
+        <w:t>–</w:t>
+      </w:r>
+      <w:r>
+        <w:t xml:space="preserve"> </w:t>
+      </w:r>
+      <w:r>
+        <w:t>pro backend, který obsluhuje API endpointy.</w:t>
+      </w:r>
+      <w:r>
+        <w:t xml:space="preserve"> P</w:t>
+      </w:r>
+      <w:r>
+        <w:t>orty byly následně propojeny tak, aby frontend správně komunikoval s</w:t>
+      </w:r>
+      <w:r>
+        <w:t> </w:t>
+      </w:r>
+      <w:r>
+        <w:t>backendem.</w:t>
+      </w:r>
+    </w:p>
+    <w:p>
+      <w:pPr>
+        <w:numPr>
+          <w:ilvl w:val="0"/>
+          <w:numId w:val="44"/>
+        </w:numPr>
+      </w:pPr>
+      <w:r>
+        <w:rPr>
+          <w:b/>
+          <w:bCs/>
+        </w:rPr>
+        <w:t>Spuštění aplikace</w:t>
+      </w:r>
+      <w:r>
+        <w:t xml:space="preserve">: </w:t>
+      </w:r>
+      <w:r>
+        <w:t xml:space="preserve">Obě části aplikace byly spuštěny pomocí nástroje </w:t>
+      </w:r>
+      <w:r>
+        <w:rPr>
+          <w:b/>
+          <w:bCs/>
+        </w:rPr>
+        <w:t>screen</w:t>
+      </w:r>
+      <w:r>
+        <w:t>, který umožňuje běh procesů i po odhlášení ze serveru</w:t>
+      </w:r>
+      <w:r>
+        <w:t xml:space="preserve"> a </w:t>
+      </w:r>
+      <w:r>
+        <w:t>zajišťuje nepřetržitý provoz aplikace. V případě výpadku lze aplikaci snadno znovu spustit připojením do příslušné obrazovky nástroje screen.</w:t>
+      </w:r>
+    </w:p>
+    <w:p>
+      <w:r>
+        <w:t xml:space="preserve">Po dokončení těchto kroků byla aplikace otestována z hlediska dostupnosti, správné funkčnosti jednotlivých funkcí a propojení mezi frontendem a backendem. </w:t>
+      </w:r>
+    </w:p>
+    <w:p/>
+    <w:p>
+      <w:r>
+        <w:t>PŘEDĚLAT!!!!</w:t>
+      </w:r>
+    </w:p>
+    <w:p/>
     <w:p>
       <w:pPr>
         <w:pStyle w:val="Nadpis1"/>
@@ -9234,6 +8530,99 @@
         </w:numPr>
         <w:ind w:left="431" w:hanging="431"/>
       </w:pPr>
+      <w:bookmarkStart w:id="29" w:name="_Toc60053869"/>
+      <w:bookmarkStart w:id="30" w:name="_Toc187493172"/>
+      <w:r>
+        <w:lastRenderedPageBreak/>
+        <w:t>Závěr</w:t>
+      </w:r>
+      <w:bookmarkEnd w:id="29"/>
+      <w:bookmarkEnd w:id="30"/>
+    </w:p>
+    <w:p>
+      <w:r>
+        <w:t xml:space="preserve">Cílem bakalářské práce bylo kompletně restrukturalizovat webové stránky sportovního oddílu Taekwondo Lacek. Původní webové stránky měly zastaralý design, nebyly responzivní a chybělo jim několik klíčových funkcionalit, které jsem při tvorbě nového webu zohlednil </w:t>
+      </w:r>
+      <w:r>
+        <w:br/>
+      </w:r>
+      <w:r>
+        <w:t>a implementoval. Jednou z klíčových funkcionalit je přihlašování závodníků na turnaje či zkoušky což majiteli oddílu šetří spoustu času a zvyšuje efektivitu, protože nyní již nemusí složitě vyhledávat a sepisovat závodníky, kteří mají zájem o účast na oddílových akcích.</w:t>
+      </w:r>
+    </w:p>
+    <w:p>
+      <w:r>
+        <w:t xml:space="preserve">Obě verze webů splňují </w:t>
+      </w:r>
+      <w:r>
+        <w:t>veškeré stanovené</w:t>
+      </w:r>
+      <w:r>
+        <w:t xml:space="preserve"> požadavky</w:t>
+      </w:r>
+      <w:r>
+        <w:t xml:space="preserve">. Výsledem jsou webové stránky, které odpovídají současným požadavkům na design a technické standardy jako je například bezpečnost dat či responzivita, která je pro většinu uživatelů klíčová. </w:t>
+      </w:r>
+    </w:p>
+    <w:p>
+      <w:r>
+        <w:t xml:space="preserve">Tvorba bakalářské práce mi přinesla cenné zkušenosti nejen v oblasti programování, ale </w:t>
+      </w:r>
+      <w:r>
+        <w:br/>
+      </w:r>
+      <w:r>
+        <w:t xml:space="preserve">i v oblasti komunikace se zákazníkem a vyjednávání. Během vývoje jsem se seznámil s principy moderního designu a bezpečnosti webových stránek, tyto zkušenosti považuji za velmi cenné </w:t>
+      </w:r>
+      <w:r>
+        <w:br/>
+      </w:r>
+      <w:r>
+        <w:t xml:space="preserve">a jsem si jistý, že mi pomohou v mém profesním růstu. Vytvořil jsem funkční webovou stránku, která splňuje veškeré požadavky, má praktickou hodnotu a přispívá k efektivnější organizaci </w:t>
+      </w:r>
+      <w:r>
+        <w:br/>
+      </w:r>
+      <w:r>
+        <w:t>a propagaci oddílu Taekwondo Lacek.</w:t>
+      </w:r>
+    </w:p>
+    <w:p>
+      <w:r>
+        <w:t xml:space="preserve">Do budoucna přemýšlím, že bych web rozšířil o možnost objednat si týmové oblečení, zažádat </w:t>
+      </w:r>
+      <w:r>
+        <w:br/>
+      </w:r>
+      <w:r>
+        <w:t xml:space="preserve">o svazovou známku či svazovou knížečku. Dále bych zde i rád přidal možnost </w:t>
+      </w:r>
+      <w:r>
+        <w:t>posílání zpráv mezi závodníky webu.</w:t>
+      </w:r>
+    </w:p>
+    <w:p/>
+    <w:p>
+      <w:pPr>
+        <w:pStyle w:val="Odstavecseseznamem"/>
+        <w:numPr>
+          <w:ilvl w:val="0"/>
+          <w:numId w:val="40"/>
+        </w:numPr>
+      </w:pPr>
+      <w:r>
+        <w:t>Víc to rozepiš, excel export, nějaký zálohy, výpis/smlouvy pomocí .docx šablon jako jsi dělal ve Webrexu.</w:t>
+      </w:r>
+    </w:p>
+    <w:p>
+      <w:pPr>
+        <w:pStyle w:val="Nadpis1"/>
+        <w:numPr>
+          <w:ilvl w:val="0"/>
+          <w:numId w:val="0"/>
+        </w:numPr>
+        <w:ind w:left="431" w:hanging="431"/>
+      </w:pPr>
       <w:bookmarkStart w:id="31" w:name="_Toc187493173"/>
       <w:r>
         <w:lastRenderedPageBreak/>
@@ -9255,7 +8644,7 @@
       <w:r>
         <w:t>. Online. 2024. Dostupné z: </w:t>
       </w:r>
-      <w:hyperlink r:id="rId42" w:history="1">
+      <w:hyperlink r:id="rId43" w:history="1">
         <w:r>
           <w:rPr>
             <w:rStyle w:val="Hypertextovodkaz"/>
@@ -9281,7 +8670,7 @@
       <w:r>
         <w:t xml:space="preserve">, T. The World Wide Web. Online. 1991. Dostupné z: </w:t>
       </w:r>
-      <w:hyperlink r:id="rId43" w:history="1">
+      <w:hyperlink r:id="rId44" w:history="1">
         <w:r>
           <w:rPr>
             <w:rStyle w:val="Hypertextovodkaz"/>
@@ -9307,7 +8696,7 @@
       <w:r>
         <w:t>. Online. 2024. Dostupné z: </w:t>
       </w:r>
-      <w:hyperlink r:id="rId44" w:history="1">
+      <w:hyperlink r:id="rId45" w:history="1">
         <w:r>
           <w:rPr>
             <w:rStyle w:val="Hypertextovodkaz"/>
@@ -9333,7 +8722,7 @@
       <w:r>
         <w:t>. Online. 2016. Dostupné z: </w:t>
       </w:r>
-      <w:hyperlink r:id="rId45" w:history="1">
+      <w:hyperlink r:id="rId46" w:history="1">
         <w:r>
           <w:rPr>
             <w:rStyle w:val="Hypertextovodkaz"/>
@@ -9359,7 +8748,7 @@
       <w:r>
         <w:t>. Online. HTTPS://WWW.WORLDTAEKWONDO.CZ/CZ/O-TAEKWONDO-CO-JE-TO-TAEKWONDO.HTML. Český svaz Taekwondo. 2024. Dostupné z: </w:t>
       </w:r>
-      <w:hyperlink r:id="rId46" w:history="1">
+      <w:hyperlink r:id="rId47" w:history="1">
         <w:r>
           <w:rPr>
             <w:rStyle w:val="Hypertextovodkaz"/>
@@ -9385,7 +8774,7 @@
       <w:r>
         <w:t>. Online. 2016. Dostupné z: </w:t>
       </w:r>
-      <w:hyperlink r:id="rId47" w:history="1">
+      <w:hyperlink r:id="rId48" w:history="1">
         <w:r>
           <w:rPr>
             <w:rStyle w:val="Hypertextovodkaz"/>
@@ -9414,7 +8803,7 @@
       <w:r>
         <w:t>. 2023, roč. 2023, č. 12, s. 1. Dostupné z: </w:t>
       </w:r>
-      <w:hyperlink r:id="rId48" w:history="1">
+      <w:hyperlink r:id="rId49" w:history="1">
         <w:r>
           <w:rPr>
             <w:rStyle w:val="Hypertextovodkaz"/>
@@ -9440,7 +8829,7 @@
       <w:r>
         <w:t xml:space="preserve">, D., &amp; Ellis-Chadwick, F. Digital Marketing. Online. 2022. Dostupné z: </w:t>
       </w:r>
-      <w:hyperlink r:id="rId49" w:history="1">
+      <w:hyperlink r:id="rId50" w:history="1">
         <w:r>
           <w:rPr>
             <w:rStyle w:val="Hypertextovodkaz"/>
@@ -9466,7 +8855,7 @@
       <w:r>
         <w:t xml:space="preserve">, E. Responsive Web Design. Online. 2010. Dostupné z: </w:t>
       </w:r>
-      <w:hyperlink r:id="rId50" w:history="1">
+      <w:hyperlink r:id="rId51" w:history="1">
         <w:r>
           <w:rPr>
             <w:rStyle w:val="Hypertextovodkaz"/>
@@ -9492,7 +8881,7 @@
       <w:r>
         <w:t xml:space="preserve">. Online. 2024. Dostupné z: </w:t>
       </w:r>
-      <w:hyperlink r:id="rId51" w:tgtFrame="_new" w:history="1">
+      <w:hyperlink r:id="rId52" w:tgtFrame="_new" w:history="1">
         <w:r>
           <w:rPr>
             <w:rStyle w:val="Hypertextovodkaz"/>
@@ -9518,7 +8907,7 @@
       <w:r>
         <w:t>. Online. 2016. Dostupné z: </w:t>
       </w:r>
-      <w:hyperlink r:id="rId52" w:history="1">
+      <w:hyperlink r:id="rId53" w:history="1">
         <w:r>
           <w:rPr>
             <w:rStyle w:val="Hypertextovodkaz"/>
@@ -9544,7 +8933,7 @@
       <w:r>
         <w:t>. Online. 2009. Dostupné z: </w:t>
       </w:r>
-      <w:hyperlink r:id="rId53" w:history="1">
+      <w:hyperlink r:id="rId54" w:history="1">
         <w:r>
           <w:rPr>
             <w:rStyle w:val="Hypertextovodkaz"/>
@@ -9570,7 +8959,7 @@
       <w:r>
         <w:t xml:space="preserve">, T. What Is Web 2.0. Online. 2005. Dostupné z: </w:t>
       </w:r>
-      <w:hyperlink r:id="rId54" w:history="1">
+      <w:hyperlink r:id="rId55" w:history="1">
         <w:r>
           <w:rPr>
             <w:rStyle w:val="Hypertextovodkaz"/>
@@ -9596,7 +8985,7 @@
       <w:r>
         <w:t xml:space="preserve">. OWASP Top Ten. Online. 2024. Dostupné z: </w:t>
       </w:r>
-      <w:hyperlink r:id="rId55" w:history="1">
+      <w:hyperlink r:id="rId56" w:history="1">
         <w:r>
           <w:rPr>
             <w:rStyle w:val="Hypertextovodkaz"/>
@@ -9622,7 +9011,7 @@
       <w:r>
         <w:t>. Online. 2016. Dostupné z: </w:t>
       </w:r>
-      <w:hyperlink r:id="rId56" w:history="1">
+      <w:hyperlink r:id="rId57" w:history="1">
         <w:r>
           <w:rPr>
             <w:rStyle w:val="Hypertextovodkaz"/>
@@ -9648,7 +9037,7 @@
       <w:r>
         <w:t>. Online. 2013. Dostupné z: </w:t>
       </w:r>
-      <w:hyperlink r:id="rId57" w:history="1">
+      <w:hyperlink r:id="rId58" w:history="1">
         <w:r>
           <w:rPr>
             <w:rStyle w:val="Hypertextovodkaz"/>
@@ -9674,7 +9063,7 @@
       <w:r>
         <w:t>. Online. 2024. Dostupné z: </w:t>
       </w:r>
-      <w:hyperlink r:id="rId58" w:history="1">
+      <w:hyperlink r:id="rId59" w:history="1">
         <w:r>
           <w:rPr>
             <w:rStyle w:val="Hypertextovodkaz"/>
@@ -9700,7 +9089,7 @@
       <w:r>
         <w:t xml:space="preserve">. The Transport Layer Security (TLS) Protocol. Online. 2008. Dostupné z: </w:t>
       </w:r>
-      <w:hyperlink r:id="rId59" w:history="1">
+      <w:hyperlink r:id="rId60" w:history="1">
         <w:r>
           <w:rPr>
             <w:rStyle w:val="Hypertextovodkaz"/>
@@ -9726,7 +9115,7 @@
       <w:r>
         <w:t xml:space="preserve">, B. Artificial Intelligence in web Development. Online. 2023. Dostupné z: </w:t>
       </w:r>
-      <w:hyperlink r:id="rId60" w:history="1">
+      <w:hyperlink r:id="rId61" w:history="1">
         <w:r>
           <w:rPr>
             <w:rStyle w:val="Hypertextovodkaz"/>
@@ -9753,7 +9142,7 @@
       <w:r>
         <w:t>. Online. 2024. Dostupné z: </w:t>
       </w:r>
-      <w:hyperlink r:id="rId61" w:history="1">
+      <w:hyperlink r:id="rId62" w:history="1">
         <w:r>
           <w:rPr>
             <w:rStyle w:val="Hypertextovodkaz"/>
@@ -9779,7 +9168,7 @@
       <w:r>
         <w:t>. Online. 2024. Dostupné z: </w:t>
       </w:r>
-      <w:hyperlink r:id="rId62" w:history="1">
+      <w:hyperlink r:id="rId63" w:history="1">
         <w:r>
           <w:rPr>
             <w:rStyle w:val="Hypertextovodkaz"/>
@@ -9805,7 +9194,7 @@
       <w:r>
         <w:t xml:space="preserve">. HTML and Web Standards. Online. 2024. Dostupné z: </w:t>
       </w:r>
-      <w:hyperlink r:id="rId63" w:history="1">
+      <w:hyperlink r:id="rId64" w:history="1">
         <w:r>
           <w:rPr>
             <w:rStyle w:val="Hypertextovodkaz"/>
@@ -9818,7 +9207,7 @@
       </w:r>
     </w:p>
     <w:sectPr>
-      <w:footerReference w:type="default" r:id="rId64"/>
+      <w:footerReference w:type="default" r:id="rId65"/>
       <w:pgSz w:w="11906" w:h="16838"/>
       <w:pgMar w:top="1418" w:right="1418" w:bottom="1418" w:left="1985" w:header="709" w:footer="709" w:gutter="0"/>
       <w:cols w:space="708"/>
@@ -12404,6 +11793,123 @@
     </w:lvl>
   </w:abstractNum>
   <w:abstractNum w:abstractNumId="22" w15:restartNumberingAfterBreak="0">
+    <w:nsid w:val="434439A7"/>
+    <w:multiLevelType w:val="multilevel"/>
+    <w:tmpl w:val="D7906C18"/>
+    <w:lvl w:ilvl="0">
+      <w:start w:val="1"/>
+      <w:numFmt w:val="decimal"/>
+      <w:lvlText w:val="%1."/>
+      <w:lvlJc w:val="left"/>
+      <w:pPr>
+        <w:tabs>
+          <w:tab w:val="num" w:pos="720"/>
+        </w:tabs>
+        <w:ind w:left="720" w:hanging="360"/>
+      </w:pPr>
+    </w:lvl>
+    <w:lvl w:ilvl="1">
+      <w:start w:val="1"/>
+      <w:numFmt w:val="bullet"/>
+      <w:lvlText w:val="o"/>
+      <w:lvlJc w:val="left"/>
+      <w:pPr>
+        <w:tabs>
+          <w:tab w:val="num" w:pos="1440"/>
+        </w:tabs>
+        <w:ind w:left="1440" w:hanging="360"/>
+      </w:pPr>
+      <w:rPr>
+        <w:rFonts w:ascii="Courier New" w:hAnsi="Courier New" w:hint="default"/>
+        <w:sz w:val="20"/>
+      </w:rPr>
+    </w:lvl>
+    <w:lvl w:ilvl="2" w:tentative="1">
+      <w:start w:val="1"/>
+      <w:numFmt w:val="decimal"/>
+      <w:lvlText w:val="%3."/>
+      <w:lvlJc w:val="left"/>
+      <w:pPr>
+        <w:tabs>
+          <w:tab w:val="num" w:pos="2160"/>
+        </w:tabs>
+        <w:ind w:left="2160" w:hanging="360"/>
+      </w:pPr>
+    </w:lvl>
+    <w:lvl w:ilvl="3" w:tentative="1">
+      <w:start w:val="1"/>
+      <w:numFmt w:val="decimal"/>
+      <w:lvlText w:val="%4."/>
+      <w:lvlJc w:val="left"/>
+      <w:pPr>
+        <w:tabs>
+          <w:tab w:val="num" w:pos="2880"/>
+        </w:tabs>
+        <w:ind w:left="2880" w:hanging="360"/>
+      </w:pPr>
+    </w:lvl>
+    <w:lvl w:ilvl="4" w:tentative="1">
+      <w:start w:val="1"/>
+      <w:numFmt w:val="decimal"/>
+      <w:lvlText w:val="%5."/>
+      <w:lvlJc w:val="left"/>
+      <w:pPr>
+        <w:tabs>
+          <w:tab w:val="num" w:pos="3600"/>
+        </w:tabs>
+        <w:ind w:left="3600" w:hanging="360"/>
+      </w:pPr>
+    </w:lvl>
+    <w:lvl w:ilvl="5" w:tentative="1">
+      <w:start w:val="1"/>
+      <w:numFmt w:val="decimal"/>
+      <w:lvlText w:val="%6."/>
+      <w:lvlJc w:val="left"/>
+      <w:pPr>
+        <w:tabs>
+          <w:tab w:val="num" w:pos="4320"/>
+        </w:tabs>
+        <w:ind w:left="4320" w:hanging="360"/>
+      </w:pPr>
+    </w:lvl>
+    <w:lvl w:ilvl="6" w:tentative="1">
+      <w:start w:val="1"/>
+      <w:numFmt w:val="decimal"/>
+      <w:lvlText w:val="%7."/>
+      <w:lvlJc w:val="left"/>
+      <w:pPr>
+        <w:tabs>
+          <w:tab w:val="num" w:pos="5040"/>
+        </w:tabs>
+        <w:ind w:left="5040" w:hanging="360"/>
+      </w:pPr>
+    </w:lvl>
+    <w:lvl w:ilvl="7" w:tentative="1">
+      <w:start w:val="1"/>
+      <w:numFmt w:val="decimal"/>
+      <w:lvlText w:val="%8."/>
+      <w:lvlJc w:val="left"/>
+      <w:pPr>
+        <w:tabs>
+          <w:tab w:val="num" w:pos="5760"/>
+        </w:tabs>
+        <w:ind w:left="5760" w:hanging="360"/>
+      </w:pPr>
+    </w:lvl>
+    <w:lvl w:ilvl="8" w:tentative="1">
+      <w:start w:val="1"/>
+      <w:numFmt w:val="decimal"/>
+      <w:lvlText w:val="%9."/>
+      <w:lvlJc w:val="left"/>
+      <w:pPr>
+        <w:tabs>
+          <w:tab w:val="num" w:pos="6480"/>
+        </w:tabs>
+        <w:ind w:left="6480" w:hanging="360"/>
+      </w:pPr>
+    </w:lvl>
+  </w:abstractNum>
+  <w:abstractNum w:abstractNumId="23" w15:restartNumberingAfterBreak="0">
     <w:nsid w:val="4575495E"/>
     <w:multiLevelType w:val="hybridMultilevel"/>
     <w:tmpl w:val="E4F064E0"/>
@@ -12516,7 +12022,7 @@
       </w:rPr>
     </w:lvl>
   </w:abstractNum>
-  <w:abstractNum w:abstractNumId="23" w15:restartNumberingAfterBreak="0">
+  <w:abstractNum w:abstractNumId="24" w15:restartNumberingAfterBreak="0">
     <w:nsid w:val="46E509FF"/>
     <w:multiLevelType w:val="hybridMultilevel"/>
     <w:tmpl w:val="16E6C92C"/>
@@ -12641,7 +12147,7 @@
       </w:rPr>
     </w:lvl>
   </w:abstractNum>
-  <w:abstractNum w:abstractNumId="24" w15:restartNumberingAfterBreak="0">
+  <w:abstractNum w:abstractNumId="25" w15:restartNumberingAfterBreak="0">
     <w:nsid w:val="46FE4CC4"/>
     <w:multiLevelType w:val="hybridMultilevel"/>
     <w:tmpl w:val="7234943C"/>
@@ -12754,7 +12260,7 @@
       </w:rPr>
     </w:lvl>
   </w:abstractNum>
-  <w:abstractNum w:abstractNumId="25" w15:restartNumberingAfterBreak="0">
+  <w:abstractNum w:abstractNumId="26" w15:restartNumberingAfterBreak="0">
     <w:nsid w:val="4BBD4598"/>
     <w:multiLevelType w:val="hybridMultilevel"/>
     <w:tmpl w:val="5A8E75B6"/>
@@ -12867,7 +12373,7 @@
       </w:rPr>
     </w:lvl>
   </w:abstractNum>
-  <w:abstractNum w:abstractNumId="26" w15:restartNumberingAfterBreak="0">
+  <w:abstractNum w:abstractNumId="27" w15:restartNumberingAfterBreak="0">
     <w:nsid w:val="4C0F14F5"/>
     <w:multiLevelType w:val="hybridMultilevel"/>
     <w:tmpl w:val="5A12B6E6"/>
@@ -12956,7 +12462,7 @@
       </w:pPr>
     </w:lvl>
   </w:abstractNum>
-  <w:abstractNum w:abstractNumId="27" w15:restartNumberingAfterBreak="0">
+  <w:abstractNum w:abstractNumId="28" w15:restartNumberingAfterBreak="0">
     <w:nsid w:val="51167291"/>
     <w:multiLevelType w:val="hybridMultilevel"/>
     <w:tmpl w:val="8CFC3FCC"/>
@@ -13045,7 +12551,7 @@
       </w:pPr>
     </w:lvl>
   </w:abstractNum>
-  <w:abstractNum w:abstractNumId="28" w15:restartNumberingAfterBreak="0">
+  <w:abstractNum w:abstractNumId="29" w15:restartNumberingAfterBreak="0">
     <w:nsid w:val="557649DC"/>
     <w:multiLevelType w:val="multilevel"/>
     <w:tmpl w:val="45B45B66"/>
@@ -13140,7 +12646,7 @@
       </w:pPr>
     </w:lvl>
   </w:abstractNum>
-  <w:abstractNum w:abstractNumId="29" w15:restartNumberingAfterBreak="0">
+  <w:abstractNum w:abstractNumId="30" w15:restartNumberingAfterBreak="0">
     <w:nsid w:val="5E2B5BFA"/>
     <w:multiLevelType w:val="hybridMultilevel"/>
     <w:tmpl w:val="8EEEDC5A"/>
@@ -13253,7 +12759,7 @@
       </w:rPr>
     </w:lvl>
   </w:abstractNum>
-  <w:abstractNum w:abstractNumId="30" w15:restartNumberingAfterBreak="0">
+  <w:abstractNum w:abstractNumId="31" w15:restartNumberingAfterBreak="0">
     <w:nsid w:val="5F9F248F"/>
     <w:multiLevelType w:val="hybridMultilevel"/>
     <w:tmpl w:val="04050021"/>
@@ -13366,7 +12872,7 @@
       </w:rPr>
     </w:lvl>
   </w:abstractNum>
-  <w:abstractNum w:abstractNumId="31" w15:restartNumberingAfterBreak="0">
+  <w:abstractNum w:abstractNumId="32" w15:restartNumberingAfterBreak="0">
     <w:nsid w:val="610C5558"/>
     <w:multiLevelType w:val="hybridMultilevel"/>
     <w:tmpl w:val="BD84002E"/>
@@ -13479,7 +12985,7 @@
       </w:rPr>
     </w:lvl>
   </w:abstractNum>
-  <w:abstractNum w:abstractNumId="32" w15:restartNumberingAfterBreak="0">
+  <w:abstractNum w:abstractNumId="33" w15:restartNumberingAfterBreak="0">
     <w:nsid w:val="6AD42460"/>
     <w:multiLevelType w:val="hybridMultilevel"/>
     <w:tmpl w:val="8CFC3FCC"/>
@@ -13568,7 +13074,7 @@
       </w:pPr>
     </w:lvl>
   </w:abstractNum>
-  <w:abstractNum w:abstractNumId="33" w15:restartNumberingAfterBreak="0">
+  <w:abstractNum w:abstractNumId="34" w15:restartNumberingAfterBreak="0">
     <w:nsid w:val="6B4E5A6F"/>
     <w:multiLevelType w:val="multilevel"/>
     <w:tmpl w:val="200A6AF6"/>
@@ -13681,7 +13187,7 @@
       </w:pPr>
     </w:lvl>
   </w:abstractNum>
-  <w:abstractNum w:abstractNumId="34" w15:restartNumberingAfterBreak="0">
+  <w:abstractNum w:abstractNumId="35" w15:restartNumberingAfterBreak="0">
     <w:nsid w:val="6C497107"/>
     <w:multiLevelType w:val="hybridMultilevel"/>
     <w:tmpl w:val="EB7A42A0"/>
@@ -13794,7 +13300,7 @@
       </w:rPr>
     </w:lvl>
   </w:abstractNum>
-  <w:abstractNum w:abstractNumId="35" w15:restartNumberingAfterBreak="0">
+  <w:abstractNum w:abstractNumId="36" w15:restartNumberingAfterBreak="0">
     <w:nsid w:val="6EAE5475"/>
     <w:multiLevelType w:val="hybridMultilevel"/>
     <w:tmpl w:val="C0806FF2"/>
@@ -13907,7 +13413,7 @@
       </w:rPr>
     </w:lvl>
   </w:abstractNum>
-  <w:abstractNum w:abstractNumId="36" w15:restartNumberingAfterBreak="0">
+  <w:abstractNum w:abstractNumId="37" w15:restartNumberingAfterBreak="0">
     <w:nsid w:val="782750EB"/>
     <w:multiLevelType w:val="hybridMultilevel"/>
     <w:tmpl w:val="0D6AF1E4"/>
@@ -14020,7 +13526,7 @@
       </w:rPr>
     </w:lvl>
   </w:abstractNum>
-  <w:abstractNum w:abstractNumId="37" w15:restartNumberingAfterBreak="0">
+  <w:abstractNum w:abstractNumId="38" w15:restartNumberingAfterBreak="0">
     <w:nsid w:val="7A4B5D5C"/>
     <w:multiLevelType w:val="hybridMultilevel"/>
     <w:tmpl w:val="D496FADC"/>
@@ -14106,7 +13612,7 @@
       </w:pPr>
     </w:lvl>
   </w:abstractNum>
-  <w:abstractNum w:abstractNumId="38" w15:restartNumberingAfterBreak="0">
+  <w:abstractNum w:abstractNumId="39" w15:restartNumberingAfterBreak="0">
     <w:nsid w:val="7AF7268C"/>
     <w:multiLevelType w:val="hybridMultilevel"/>
     <w:tmpl w:val="09D0B6A0"/>
@@ -14218,7 +13724,7 @@
       </w:rPr>
     </w:lvl>
   </w:abstractNum>
-  <w:abstractNum w:abstractNumId="39" w15:restartNumberingAfterBreak="0">
+  <w:abstractNum w:abstractNumId="40" w15:restartNumberingAfterBreak="0">
     <w:nsid w:val="7D6D0E59"/>
     <w:multiLevelType w:val="hybridMultilevel"/>
     <w:tmpl w:val="5720D306"/>
@@ -14331,7 +13837,7 @@
       </w:rPr>
     </w:lvl>
   </w:abstractNum>
-  <w:abstractNum w:abstractNumId="40" w15:restartNumberingAfterBreak="0">
+  <w:abstractNum w:abstractNumId="41" w15:restartNumberingAfterBreak="0">
     <w:nsid w:val="7D8102B7"/>
     <w:multiLevelType w:val="hybridMultilevel"/>
     <w:tmpl w:val="E21AA672"/>
@@ -14443,7 +13949,7 @@
       </w:rPr>
     </w:lvl>
   </w:abstractNum>
-  <w:abstractNum w:abstractNumId="41" w15:restartNumberingAfterBreak="0">
+  <w:abstractNum w:abstractNumId="42" w15:restartNumberingAfterBreak="0">
     <w:nsid w:val="7E7804A0"/>
     <w:multiLevelType w:val="hybridMultilevel"/>
     <w:tmpl w:val="4BF8FF76"/>
@@ -14563,19 +14069,19 @@
     <w:abstractNumId w:val="4"/>
   </w:num>
   <w:num w:numId="3" w16cid:durableId="402947605">
-    <w:abstractNumId w:val="28"/>
+    <w:abstractNumId w:val="29"/>
   </w:num>
   <w:num w:numId="4" w16cid:durableId="1949000298">
+    <w:abstractNumId w:val="37"/>
+  </w:num>
+  <w:num w:numId="5" w16cid:durableId="89399167">
     <w:abstractNumId w:val="36"/>
   </w:num>
-  <w:num w:numId="5" w16cid:durableId="89399167">
-    <w:abstractNumId w:val="35"/>
-  </w:num>
   <w:num w:numId="6" w16cid:durableId="469175344">
-    <w:abstractNumId w:val="31"/>
+    <w:abstractNumId w:val="32"/>
   </w:num>
   <w:num w:numId="7" w16cid:durableId="208298722">
-    <w:abstractNumId w:val="23"/>
+    <w:abstractNumId w:val="24"/>
   </w:num>
   <w:num w:numId="8" w16cid:durableId="177620192">
     <w:abstractNumId w:val="2"/>
@@ -14584,7 +14090,7 @@
     <w:abstractNumId w:val="0"/>
   </w:num>
   <w:num w:numId="10" w16cid:durableId="557058186">
-    <w:abstractNumId w:val="37"/>
+    <w:abstractNumId w:val="38"/>
   </w:num>
   <w:num w:numId="11" w16cid:durableId="813908948">
     <w:abstractNumId w:val="18"/>
@@ -14593,22 +14099,22 @@
     <w:abstractNumId w:val="7"/>
   </w:num>
   <w:num w:numId="13" w16cid:durableId="1187863165">
-    <w:abstractNumId w:val="30"/>
+    <w:abstractNumId w:val="31"/>
   </w:num>
   <w:num w:numId="14" w16cid:durableId="1258904774">
     <w:abstractNumId w:val="16"/>
   </w:num>
   <w:num w:numId="15" w16cid:durableId="625307972">
-    <w:abstractNumId w:val="32"/>
+    <w:abstractNumId w:val="33"/>
   </w:num>
   <w:num w:numId="16" w16cid:durableId="1657297398">
-    <w:abstractNumId w:val="27"/>
+    <w:abstractNumId w:val="28"/>
   </w:num>
   <w:num w:numId="17" w16cid:durableId="723871448">
-    <w:abstractNumId w:val="34"/>
+    <w:abstractNumId w:val="35"/>
   </w:num>
   <w:num w:numId="18" w16cid:durableId="137112280">
-    <w:abstractNumId w:val="39"/>
+    <w:abstractNumId w:val="40"/>
   </w:num>
   <w:num w:numId="19" w16cid:durableId="352072345">
     <w:abstractNumId w:val="3"/>
@@ -14620,7 +14126,7 @@
     <w:abstractNumId w:val="9"/>
   </w:num>
   <w:num w:numId="22" w16cid:durableId="747113366">
-    <w:abstractNumId w:val="38"/>
+    <w:abstractNumId w:val="39"/>
   </w:num>
   <w:num w:numId="23" w16cid:durableId="1057168060">
     <w:abstractNumId w:val="15"/>
@@ -14629,31 +14135,31 @@
     <w:abstractNumId w:val="5"/>
   </w:num>
   <w:num w:numId="25" w16cid:durableId="98837639">
-    <w:abstractNumId w:val="26"/>
+    <w:abstractNumId w:val="27"/>
   </w:num>
   <w:num w:numId="26" w16cid:durableId="693266025">
-    <w:abstractNumId w:val="29"/>
+    <w:abstractNumId w:val="30"/>
   </w:num>
   <w:num w:numId="27" w16cid:durableId="1892493753">
-    <w:abstractNumId w:val="33"/>
+    <w:abstractNumId w:val="34"/>
   </w:num>
   <w:num w:numId="28" w16cid:durableId="1558861174">
-    <w:abstractNumId w:val="28"/>
+    <w:abstractNumId w:val="29"/>
   </w:num>
   <w:num w:numId="29" w16cid:durableId="1134061409">
     <w:abstractNumId w:val="19"/>
   </w:num>
   <w:num w:numId="30" w16cid:durableId="1744794599">
-    <w:abstractNumId w:val="22"/>
+    <w:abstractNumId w:val="23"/>
   </w:num>
   <w:num w:numId="31" w16cid:durableId="1817844041">
-    <w:abstractNumId w:val="24"/>
+    <w:abstractNumId w:val="25"/>
   </w:num>
   <w:num w:numId="32" w16cid:durableId="472908971">
     <w:abstractNumId w:val="14"/>
   </w:num>
   <w:num w:numId="33" w16cid:durableId="429549034">
-    <w:abstractNumId w:val="41"/>
+    <w:abstractNumId w:val="42"/>
   </w:num>
   <w:num w:numId="34" w16cid:durableId="1563367793">
     <w:abstractNumId w:val="12"/>
@@ -14665,7 +14171,7 @@
     <w:abstractNumId w:val="21"/>
   </w:num>
   <w:num w:numId="37" w16cid:durableId="1535191084">
-    <w:abstractNumId w:val="25"/>
+    <w:abstractNumId w:val="26"/>
   </w:num>
   <w:num w:numId="38" w16cid:durableId="1616475969">
     <w:abstractNumId w:val="20"/>
@@ -14680,10 +14186,13 @@
     <w:abstractNumId w:val="6"/>
   </w:num>
   <w:num w:numId="42" w16cid:durableId="1439136245">
-    <w:abstractNumId w:val="40"/>
+    <w:abstractNumId w:val="41"/>
   </w:num>
   <w:num w:numId="43" w16cid:durableId="1486357054">
     <w:abstractNumId w:val="17"/>
+  </w:num>
+  <w:num w:numId="44" w16cid:durableId="906382337">
+    <w:abstractNumId w:val="22"/>
   </w:num>
 </w:numbering>
 </file>
@@ -15320,6 +14829,7 @@
   <w:style w:type="character" w:default="1" w:styleId="Standardnpsmoodstavce">
     <w:name w:val="Default Paragraph Font"/>
     <w:uiPriority w:val="1"/>
+    <w:semiHidden/>
     <w:unhideWhenUsed/>
   </w:style>
   <w:style w:type="table" w:default="1" w:styleId="Normlntabulka">
@@ -16343,10 +15853,12 @@
     <w:rsid w:val="00D17CE7"/>
     <w:rsid w:val="00E0364E"/>
     <w:rsid w:val="00E53066"/>
+    <w:rsid w:val="00E866B4"/>
     <w:rsid w:val="00EB3F8A"/>
     <w:rsid w:val="00F73B1B"/>
     <w:rsid w:val="00FC053B"/>
     <w:rsid w:val="00FE0195"/>
+    <w:rsid w:val="00FF34A8"/>
   </w:rsids>
   <m:mathPr>
     <m:mathFont m:val="Cambria Math"/>
@@ -17117,10 +16629,16 @@
 </file>
 
 <file path=customXml/item3.xml><?xml version="1.0" encoding="utf-8"?>
+<p:properties xmlns:p="http://schemas.microsoft.com/office/2006/metadata/properties" xmlns:xsi="http://www.w3.org/2001/XMLSchema-instance" xmlns:pc="http://schemas.microsoft.com/office/infopath/2007/PartnerControls">
+  <documentManagement/>
+</p:properties>
+</file>
+
+<file path=customXml/item4.xml><?xml version="1.0" encoding="utf-8"?>
 <b:Sources xmlns:b="http://schemas.openxmlformats.org/officeDocument/2006/bibliography" xmlns="http://schemas.openxmlformats.org/officeDocument/2006/bibliography" SelectedStyle="\APASixthEditionOfficeOnline.xsl" StyleName="APA" Version="6"/>
 </file>
 
-<file path=customXml/item4.xml><?xml version="1.0" encoding="utf-8"?>
+<file path=customXml/item5.xml><?xml version="1.0" encoding="utf-8"?>
 <ct:contentTypeSchema xmlns:ct="http://schemas.microsoft.com/office/2006/metadata/contentType" xmlns:ma="http://schemas.microsoft.com/office/2006/metadata/properties/metaAttributes" ct:_="" ma:_="" ma:contentTypeName="Dokument" ma:contentTypeID="0x010100AB4421CFC579A4449DC25ACBD6176571" ma:contentTypeVersion="2" ma:contentTypeDescription="Vytvoří nový dokument" ma:contentTypeScope="" ma:versionID="571ac08f18df58b33840592d245cde2d">
   <xsd:schema xmlns:xsd="http://www.w3.org/2001/XMLSchema" xmlns:xs="http://www.w3.org/2001/XMLSchema" xmlns:p="http://schemas.microsoft.com/office/2006/metadata/properties" xmlns:ns2="921a4a19-005d-42bf-a6ee-1c0f1cd55622" targetNamespace="http://schemas.microsoft.com/office/2006/metadata/properties" ma:root="true" ma:fieldsID="4559ad2502f86f60dcde6a0f6b3f7266" ns2:_="">
     <xsd:import namespace="921a4a19-005d-42bf-a6ee-1c0f1cd55622"/>
@@ -17252,12 +16770,6 @@
 </ct:contentTypeSchema>
 </file>
 
-<file path=customXml/item5.xml><?xml version="1.0" encoding="utf-8"?>
-<p:properties xmlns:p="http://schemas.microsoft.com/office/2006/metadata/properties" xmlns:xsi="http://www.w3.org/2001/XMLSchema-instance" xmlns:pc="http://schemas.microsoft.com/office/infopath/2007/PartnerControls">
-  <documentManagement/>
-</p:properties>
-</file>
-
 <file path=customXml/itemProps1.xml><?xml version="1.0" encoding="utf-8"?>
 <ds:datastoreItem xmlns:ds="http://schemas.openxmlformats.org/officeDocument/2006/customXml" ds:itemID="{55AF091B-3C7A-41E3-B477-F2FDAA23CFDA}">
   <ds:schemaRefs>
@@ -17275,6 +16787,15 @@
 </file>
 
 <file path=customXml/itemProps3.xml><?xml version="1.0" encoding="utf-8"?>
+<ds:datastoreItem xmlns:ds="http://schemas.openxmlformats.org/officeDocument/2006/customXml" ds:itemID="{EDE7D767-2E0D-494D-8433-FAEBD4A37F8E}">
+  <ds:schemaRefs>
+    <ds:schemaRef ds:uri="http://schemas.microsoft.com/office/2006/metadata/properties"/>
+    <ds:schemaRef ds:uri="http://schemas.microsoft.com/office/infopath/2007/PartnerControls"/>
+  </ds:schemaRefs>
+</ds:datastoreItem>
+</file>
+
+<file path=customXml/itemProps4.xml><?xml version="1.0" encoding="utf-8"?>
 <ds:datastoreItem xmlns:ds="http://schemas.openxmlformats.org/officeDocument/2006/customXml" ds:itemID="{016BB16A-1E0F-4115-AADC-10D5070CD6B8}">
   <ds:schemaRefs>
     <ds:schemaRef ds:uri="http://schemas.openxmlformats.org/officeDocument/2006/bibliography"/>
@@ -17282,7 +16803,7 @@
 </ds:datastoreItem>
 </file>
 
-<file path=customXml/itemProps4.xml><?xml version="1.0" encoding="utf-8"?>
+<file path=customXml/itemProps5.xml><?xml version="1.0" encoding="utf-8"?>
 <ds:datastoreItem xmlns:ds="http://schemas.openxmlformats.org/officeDocument/2006/customXml" ds:itemID="{838CEF72-1B4D-4D33-9891-FFC95F507282}">
   <ds:schemaRefs>
     <ds:schemaRef ds:uri="http://schemas.microsoft.com/office/2006/metadata/contentType"/>
@@ -17298,13 +16819,4 @@
     <ds:schemaRef ds:uri="http://schemas.microsoft.com/internal/obd"/>
   </ds:schemaRefs>
 </ds:datastoreItem>
-</file>
-
-<file path=customXml/itemProps5.xml><?xml version="1.0" encoding="utf-8"?>
-<ds:datastoreItem xmlns:ds="http://schemas.openxmlformats.org/officeDocument/2006/customXml" ds:itemID="{EDE7D767-2E0D-494D-8433-FAEBD4A37F8E}">
-  <ds:schemaRefs>
-    <ds:schemaRef ds:uri="http://schemas.microsoft.com/office/2006/metadata/properties"/>
-    <ds:schemaRef ds:uri="http://schemas.microsoft.com/office/infopath/2007/PartnerControls"/>
-  </ds:schemaRefs>
-</ds:datastoreItem>
 </file>
</xml_diff>

<commit_message>
Raději to sem hodím
</commit_message>
<xml_diff>
--- a/bp_svobo229_v2.docx
+++ b/bp_svobo229_v2.docx
@@ -8302,7 +8302,10 @@
         <w:t>Trenér</w:t>
       </w:r>
       <w:r>
-        <w:t xml:space="preserve"> – může přidávat, mazat a upravovat závody, zkoušky, aktuality, upravovat uživatelům technické stupně pásu, přidávat úspěchy, ocenění, měnit jejich stav a přidávat uživatelům roli trenér – nikoli vyšší roli, jak mají oni sami.</w:t>
+        <w:t xml:space="preserve"> – může přidávat, mazat a upravovat závody, zkoušky, aktuality, upravovat uživatelům technické stupně pásu, přidávat úspěchy, ocenění, měnit jejich stav</w:t>
+      </w:r>
+      <w:r>
+        <w:t>.</w:t>
       </w:r>
     </w:p>
     <w:p>
@@ -45319,6 +45322,7 @@
     <w:rsid w:val="005B74A1"/>
     <w:rsid w:val="005D5255"/>
     <w:rsid w:val="005D768A"/>
+    <w:rsid w:val="005F19B0"/>
     <w:rsid w:val="00604492"/>
     <w:rsid w:val="00667E7A"/>
     <w:rsid w:val="00684E0D"/>
@@ -45369,6 +45373,7 @@
     <w:rsid w:val="00E85F47"/>
     <w:rsid w:val="00E866B4"/>
     <w:rsid w:val="00EB3F8A"/>
+    <w:rsid w:val="00F12DE4"/>
     <w:rsid w:val="00F73B1B"/>
     <w:rsid w:val="00FC053B"/>
     <w:rsid w:val="00FC4095"/>
@@ -46144,10 +46149,16 @@
 </file>
 
 <file path=customXml/item3.xml><?xml version="1.0" encoding="utf-8"?>
+<p:properties xmlns:p="http://schemas.microsoft.com/office/2006/metadata/properties" xmlns:xsi="http://www.w3.org/2001/XMLSchema-instance" xmlns:pc="http://schemas.microsoft.com/office/infopath/2007/PartnerControls">
+  <documentManagement/>
+</p:properties>
+</file>
+
+<file path=customXml/item4.xml><?xml version="1.0" encoding="utf-8"?>
 <b:Sources xmlns:b="http://schemas.openxmlformats.org/officeDocument/2006/bibliography" xmlns="http://schemas.openxmlformats.org/officeDocument/2006/bibliography" SelectedStyle="\APASixthEditionOfficeOnline.xsl" StyleName="APA" Version="6"/>
 </file>
 
-<file path=customXml/item4.xml><?xml version="1.0" encoding="utf-8"?>
+<file path=customXml/item5.xml><?xml version="1.0" encoding="utf-8"?>
 <ct:contentTypeSchema xmlns:ct="http://schemas.microsoft.com/office/2006/metadata/contentType" xmlns:ma="http://schemas.microsoft.com/office/2006/metadata/properties/metaAttributes" ct:_="" ma:_="" ma:contentTypeName="Dokument" ma:contentTypeID="0x010100AB4421CFC579A4449DC25ACBD6176571" ma:contentTypeVersion="2" ma:contentTypeDescription="Vytvoří nový dokument" ma:contentTypeScope="" ma:versionID="571ac08f18df58b33840592d245cde2d">
   <xsd:schema xmlns:xsd="http://www.w3.org/2001/XMLSchema" xmlns:xs="http://www.w3.org/2001/XMLSchema" xmlns:p="http://schemas.microsoft.com/office/2006/metadata/properties" xmlns:ns2="921a4a19-005d-42bf-a6ee-1c0f1cd55622" targetNamespace="http://schemas.microsoft.com/office/2006/metadata/properties" ma:root="true" ma:fieldsID="4559ad2502f86f60dcde6a0f6b3f7266" ns2:_="">
     <xsd:import namespace="921a4a19-005d-42bf-a6ee-1c0f1cd55622"/>
@@ -46279,12 +46290,6 @@
 </ct:contentTypeSchema>
 </file>
 
-<file path=customXml/item5.xml><?xml version="1.0" encoding="utf-8"?>
-<p:properties xmlns:p="http://schemas.microsoft.com/office/2006/metadata/properties" xmlns:xsi="http://www.w3.org/2001/XMLSchema-instance" xmlns:pc="http://schemas.microsoft.com/office/infopath/2007/PartnerControls">
-  <documentManagement/>
-</p:properties>
-</file>
-
 <file path=customXml/itemProps1.xml><?xml version="1.0" encoding="utf-8"?>
 <ds:datastoreItem xmlns:ds="http://schemas.openxmlformats.org/officeDocument/2006/customXml" ds:itemID="{55AF091B-3C7A-41E3-B477-F2FDAA23CFDA}">
   <ds:schemaRefs>
@@ -46302,6 +46307,15 @@
 </file>
 
 <file path=customXml/itemProps3.xml><?xml version="1.0" encoding="utf-8"?>
+<ds:datastoreItem xmlns:ds="http://schemas.openxmlformats.org/officeDocument/2006/customXml" ds:itemID="{EDE7D767-2E0D-494D-8433-FAEBD4A37F8E}">
+  <ds:schemaRefs>
+    <ds:schemaRef ds:uri="http://schemas.microsoft.com/office/2006/metadata/properties"/>
+    <ds:schemaRef ds:uri="http://schemas.microsoft.com/office/infopath/2007/PartnerControls"/>
+  </ds:schemaRefs>
+</ds:datastoreItem>
+</file>
+
+<file path=customXml/itemProps4.xml><?xml version="1.0" encoding="utf-8"?>
 <ds:datastoreItem xmlns:ds="http://schemas.openxmlformats.org/officeDocument/2006/customXml" ds:itemID="{016BB16A-1E0F-4115-AADC-10D5070CD6B8}">
   <ds:schemaRefs>
     <ds:schemaRef ds:uri="http://schemas.openxmlformats.org/officeDocument/2006/bibliography"/>
@@ -46309,7 +46323,7 @@
 </ds:datastoreItem>
 </file>
 
-<file path=customXml/itemProps4.xml><?xml version="1.0" encoding="utf-8"?>
+<file path=customXml/itemProps5.xml><?xml version="1.0" encoding="utf-8"?>
 <ds:datastoreItem xmlns:ds="http://schemas.openxmlformats.org/officeDocument/2006/customXml" ds:itemID="{838CEF72-1B4D-4D33-9891-FFC95F507282}">
   <ds:schemaRefs>
     <ds:schemaRef ds:uri="http://schemas.microsoft.com/office/2006/metadata/contentType"/>
@@ -46325,13 +46339,4 @@
     <ds:schemaRef ds:uri="http://schemas.microsoft.com/internal/obd"/>
   </ds:schemaRefs>
 </ds:datastoreItem>
-</file>
-
-<file path=customXml/itemProps5.xml><?xml version="1.0" encoding="utf-8"?>
-<ds:datastoreItem xmlns:ds="http://schemas.openxmlformats.org/officeDocument/2006/customXml" ds:itemID="{EDE7D767-2E0D-494D-8433-FAEBD4A37F8E}">
-  <ds:schemaRefs>
-    <ds:schemaRef ds:uri="http://schemas.microsoft.com/office/2006/metadata/properties"/>
-    <ds:schemaRef ds:uri="http://schemas.microsoft.com/office/infopath/2007/PartnerControls"/>
-  </ds:schemaRefs>
-</ds:datastoreItem>
 </file>
</xml_diff>

<commit_message>
Oprava mazání uživatelů - vyřešen problém s exam_registration
</commit_message>
<xml_diff>
--- a/bp_svobo229_v2.docx
+++ b/bp_svobo229_v2.docx
@@ -6319,14 +6319,27 @@
       <w:r>
         <w:t xml:space="preserve">Obr. </w:t>
       </w:r>
-      <w:fldSimple w:instr=" SEQ Obr. \* ARABIC ">
-        <w:r>
-          <w:rPr>
-            <w:noProof/>
-          </w:rPr>
-          <w:t>1</w:t>
-        </w:r>
-      </w:fldSimple>
+      <w:r>
+        <w:fldChar w:fldCharType="begin"/>
+      </w:r>
+      <w:r>
+        <w:instrText xml:space="preserve"> SEQ Obr. \* ARABIC </w:instrText>
+      </w:r>
+      <w:r>
+        <w:fldChar w:fldCharType="separate"/>
+      </w:r>
+      <w:r>
+        <w:rPr>
+          <w:noProof/>
+        </w:rPr>
+        <w:t>1</w:t>
+      </w:r>
+      <w:r>
+        <w:rPr>
+          <w:noProof/>
+        </w:rPr>
+        <w:fldChar w:fldCharType="end"/>
+      </w:r>
       <w:r>
         <w:t xml:space="preserve">: </w:t>
       </w:r>
@@ -6626,14 +6639,27 @@
       <w:r>
         <w:t xml:space="preserve">Obr. </w:t>
       </w:r>
-      <w:fldSimple w:instr=" SEQ Obr. \* ARABIC ">
-        <w:r>
-          <w:rPr>
-            <w:noProof/>
-          </w:rPr>
-          <w:t>2</w:t>
-        </w:r>
-      </w:fldSimple>
+      <w:r>
+        <w:fldChar w:fldCharType="begin"/>
+      </w:r>
+      <w:r>
+        <w:instrText xml:space="preserve"> SEQ Obr. \* ARABIC </w:instrText>
+      </w:r>
+      <w:r>
+        <w:fldChar w:fldCharType="separate"/>
+      </w:r>
+      <w:r>
+        <w:rPr>
+          <w:noProof/>
+        </w:rPr>
+        <w:t>2</w:t>
+      </w:r>
+      <w:r>
+        <w:rPr>
+          <w:noProof/>
+        </w:rPr>
+        <w:fldChar w:fldCharType="end"/>
+      </w:r>
       <w:r>
         <w:t>: Ukázka hooku</w:t>
       </w:r>
@@ -6745,14 +6771,27 @@
       <w:r>
         <w:t xml:space="preserve">Obr. </w:t>
       </w:r>
-      <w:fldSimple w:instr=" SEQ Obr. \* ARABIC ">
-        <w:r>
-          <w:rPr>
-            <w:noProof/>
-          </w:rPr>
-          <w:t>3</w:t>
-        </w:r>
-      </w:fldSimple>
+      <w:r>
+        <w:fldChar w:fldCharType="begin"/>
+      </w:r>
+      <w:r>
+        <w:instrText xml:space="preserve"> SEQ Obr. \* ARABIC </w:instrText>
+      </w:r>
+      <w:r>
+        <w:fldChar w:fldCharType="separate"/>
+      </w:r>
+      <w:r>
+        <w:rPr>
+          <w:noProof/>
+        </w:rPr>
+        <w:t>3</w:t>
+      </w:r>
+      <w:r>
+        <w:rPr>
+          <w:noProof/>
+        </w:rPr>
+        <w:fldChar w:fldCharType="end"/>
+      </w:r>
       <w:r>
         <w:t>: Příklad komponenty</w:t>
       </w:r>
@@ -6861,14 +6900,27 @@
       <w:r>
         <w:t xml:space="preserve">Obr. </w:t>
       </w:r>
-      <w:fldSimple w:instr=" SEQ Obr. \* ARABIC ">
-        <w:r>
-          <w:rPr>
-            <w:noProof/>
-          </w:rPr>
-          <w:t>4</w:t>
-        </w:r>
-      </w:fldSimple>
+      <w:r>
+        <w:fldChar w:fldCharType="begin"/>
+      </w:r>
+      <w:r>
+        <w:instrText xml:space="preserve"> SEQ Obr. \* ARABIC </w:instrText>
+      </w:r>
+      <w:r>
+        <w:fldChar w:fldCharType="separate"/>
+      </w:r>
+      <w:r>
+        <w:rPr>
+          <w:noProof/>
+        </w:rPr>
+        <w:t>4</w:t>
+      </w:r>
+      <w:r>
+        <w:rPr>
+          <w:noProof/>
+        </w:rPr>
+        <w:fldChar w:fldCharType="end"/>
+      </w:r>
       <w:r>
         <w:t>: Komponenta se vstupy</w:t>
       </w:r>
@@ -6937,14 +6989,27 @@
       <w:r>
         <w:t xml:space="preserve">Obr. </w:t>
       </w:r>
-      <w:fldSimple w:instr=" SEQ Obr. \* ARABIC ">
-        <w:r>
-          <w:rPr>
-            <w:noProof/>
-          </w:rPr>
-          <w:t>5</w:t>
-        </w:r>
-      </w:fldSimple>
+      <w:r>
+        <w:fldChar w:fldCharType="begin"/>
+      </w:r>
+      <w:r>
+        <w:instrText xml:space="preserve"> SEQ Obr. \* ARABIC </w:instrText>
+      </w:r>
+      <w:r>
+        <w:fldChar w:fldCharType="separate"/>
+      </w:r>
+      <w:r>
+        <w:rPr>
+          <w:noProof/>
+        </w:rPr>
+        <w:t>5</w:t>
+      </w:r>
+      <w:r>
+        <w:rPr>
+          <w:noProof/>
+        </w:rPr>
+        <w:fldChar w:fldCharType="end"/>
+      </w:r>
       <w:r>
         <w:t>: Práce se vstupy</w:t>
       </w:r>
@@ -7017,14 +7082,27 @@
       <w:r>
         <w:t xml:space="preserve">Obr. </w:t>
       </w:r>
-      <w:fldSimple w:instr=" SEQ Obr. \* ARABIC ">
-        <w:r>
-          <w:rPr>
-            <w:noProof/>
-          </w:rPr>
-          <w:t>6</w:t>
-        </w:r>
-      </w:fldSimple>
+      <w:r>
+        <w:fldChar w:fldCharType="begin"/>
+      </w:r>
+      <w:r>
+        <w:instrText xml:space="preserve"> SEQ Obr. \* ARABIC </w:instrText>
+      </w:r>
+      <w:r>
+        <w:fldChar w:fldCharType="separate"/>
+      </w:r>
+      <w:r>
+        <w:rPr>
+          <w:noProof/>
+        </w:rPr>
+        <w:t>6</w:t>
+      </w:r>
+      <w:r>
+        <w:rPr>
+          <w:noProof/>
+        </w:rPr>
+        <w:fldChar w:fldCharType="end"/>
+      </w:r>
       <w:r>
         <w:t>: Použití komponenty</w:t>
       </w:r>
@@ -7131,14 +7209,27 @@
       <w:r>
         <w:t xml:space="preserve">Obr. </w:t>
       </w:r>
-      <w:fldSimple w:instr=" SEQ Obr. \* ARABIC ">
-        <w:r>
-          <w:rPr>
-            <w:noProof/>
-          </w:rPr>
-          <w:t>7</w:t>
-        </w:r>
-      </w:fldSimple>
+      <w:r>
+        <w:fldChar w:fldCharType="begin"/>
+      </w:r>
+      <w:r>
+        <w:instrText xml:space="preserve"> SEQ Obr. \* ARABIC </w:instrText>
+      </w:r>
+      <w:r>
+        <w:fldChar w:fldCharType="separate"/>
+      </w:r>
+      <w:r>
+        <w:rPr>
+          <w:noProof/>
+        </w:rPr>
+        <w:t>7</w:t>
+      </w:r>
+      <w:r>
+        <w:rPr>
+          <w:noProof/>
+        </w:rPr>
+        <w:fldChar w:fldCharType="end"/>
+      </w:r>
       <w:r>
         <w:t>: Porovnání DOMu</w:t>
       </w:r>
@@ -7248,14 +7339,27 @@
       <w:r>
         <w:t xml:space="preserve">Obr. </w:t>
       </w:r>
-      <w:fldSimple w:instr=" SEQ Obr. \* ARABIC ">
-        <w:r>
-          <w:rPr>
-            <w:noProof/>
-          </w:rPr>
-          <w:t>8</w:t>
-        </w:r>
-      </w:fldSimple>
+      <w:r>
+        <w:fldChar w:fldCharType="begin"/>
+      </w:r>
+      <w:r>
+        <w:instrText xml:space="preserve"> SEQ Obr. \* ARABIC </w:instrText>
+      </w:r>
+      <w:r>
+        <w:fldChar w:fldCharType="separate"/>
+      </w:r>
+      <w:r>
+        <w:rPr>
+          <w:noProof/>
+        </w:rPr>
+        <w:t>8</w:t>
+      </w:r>
+      <w:r>
+        <w:rPr>
+          <w:noProof/>
+        </w:rPr>
+        <w:fldChar w:fldCharType="end"/>
+      </w:r>
       <w:r>
         <w:t>: Ukázka JSX</w:t>
       </w:r>
@@ -7402,14 +7506,27 @@
       <w:r>
         <w:t xml:space="preserve">Obr. </w:t>
       </w:r>
-      <w:fldSimple w:instr=" SEQ Obr. \* ARABIC ">
-        <w:r>
-          <w:rPr>
-            <w:noProof/>
-          </w:rPr>
-          <w:t>9</w:t>
-        </w:r>
-      </w:fldSimple>
+      <w:r>
+        <w:fldChar w:fldCharType="begin"/>
+      </w:r>
+      <w:r>
+        <w:instrText xml:space="preserve"> SEQ Obr. \* ARABIC </w:instrText>
+      </w:r>
+      <w:r>
+        <w:fldChar w:fldCharType="separate"/>
+      </w:r>
+      <w:r>
+        <w:rPr>
+          <w:noProof/>
+        </w:rPr>
+        <w:t>9</w:t>
+      </w:r>
+      <w:r>
+        <w:rPr>
+          <w:noProof/>
+        </w:rPr>
+        <w:fldChar w:fldCharType="end"/>
+      </w:r>
       <w:r>
         <w:t>: Ukázka kódu NodeJS</w:t>
       </w:r>
@@ -7680,14 +7797,27 @@
       <w:r>
         <w:t xml:space="preserve">Obr. </w:t>
       </w:r>
-      <w:fldSimple w:instr=" SEQ Obr. \* ARABIC ">
-        <w:r>
-          <w:rPr>
-            <w:noProof/>
-          </w:rPr>
-          <w:t>10</w:t>
-        </w:r>
-      </w:fldSimple>
+      <w:r>
+        <w:fldChar w:fldCharType="begin"/>
+      </w:r>
+      <w:r>
+        <w:instrText xml:space="preserve"> SEQ Obr. \* ARABIC </w:instrText>
+      </w:r>
+      <w:r>
+        <w:fldChar w:fldCharType="separate"/>
+      </w:r>
+      <w:r>
+        <w:rPr>
+          <w:noProof/>
+        </w:rPr>
+        <w:t>10</w:t>
+      </w:r>
+      <w:r>
+        <w:rPr>
+          <w:noProof/>
+        </w:rPr>
+        <w:fldChar w:fldCharType="end"/>
+      </w:r>
       <w:r>
         <w:t>: Logo NPM</w:t>
       </w:r>
@@ -7804,14 +7934,27 @@
       <w:r>
         <w:t xml:space="preserve">Obr. </w:t>
       </w:r>
-      <w:fldSimple w:instr=" SEQ Obr. \* ARABIC ">
-        <w:r>
-          <w:rPr>
-            <w:noProof/>
-          </w:rPr>
-          <w:t>11</w:t>
-        </w:r>
-      </w:fldSimple>
+      <w:r>
+        <w:fldChar w:fldCharType="begin"/>
+      </w:r>
+      <w:r>
+        <w:instrText xml:space="preserve"> SEQ Obr. \* ARABIC </w:instrText>
+      </w:r>
+      <w:r>
+        <w:fldChar w:fldCharType="separate"/>
+      </w:r>
+      <w:r>
+        <w:rPr>
+          <w:noProof/>
+        </w:rPr>
+        <w:t>11</w:t>
+      </w:r>
+      <w:r>
+        <w:rPr>
+          <w:noProof/>
+        </w:rPr>
+        <w:fldChar w:fldCharType="end"/>
+      </w:r>
       <w:r>
         <w:t>: Prostředí MySQL</w:t>
       </w:r>
@@ -7943,14 +8086,27 @@
       <w:r>
         <w:t xml:space="preserve">Obr. </w:t>
       </w:r>
-      <w:fldSimple w:instr=" SEQ Obr. \* ARABIC ">
-        <w:r>
-          <w:rPr>
-            <w:noProof/>
-          </w:rPr>
-          <w:t>12</w:t>
-        </w:r>
-      </w:fldSimple>
+      <w:r>
+        <w:fldChar w:fldCharType="begin"/>
+      </w:r>
+      <w:r>
+        <w:instrText xml:space="preserve"> SEQ Obr. \* ARABIC </w:instrText>
+      </w:r>
+      <w:r>
+        <w:fldChar w:fldCharType="separate"/>
+      </w:r>
+      <w:r>
+        <w:rPr>
+          <w:noProof/>
+        </w:rPr>
+        <w:t>12</w:t>
+      </w:r>
+      <w:r>
+        <w:rPr>
+          <w:noProof/>
+        </w:rPr>
+        <w:fldChar w:fldCharType="end"/>
+      </w:r>
       <w:r>
         <w:t>: Prostřední Figmy</w:t>
       </w:r>
@@ -8073,14 +8229,27 @@
       <w:r>
         <w:t xml:space="preserve">Obr. </w:t>
       </w:r>
-      <w:fldSimple w:instr=" SEQ Obr. \* ARABIC ">
-        <w:r>
-          <w:rPr>
-            <w:noProof/>
-          </w:rPr>
-          <w:t>13</w:t>
-        </w:r>
-      </w:fldSimple>
+      <w:r>
+        <w:fldChar w:fldCharType="begin"/>
+      </w:r>
+      <w:r>
+        <w:instrText xml:space="preserve"> SEQ Obr. \* ARABIC </w:instrText>
+      </w:r>
+      <w:r>
+        <w:fldChar w:fldCharType="separate"/>
+      </w:r>
+      <w:r>
+        <w:rPr>
+          <w:noProof/>
+        </w:rPr>
+        <w:t>13</w:t>
+      </w:r>
+      <w:r>
+        <w:rPr>
+          <w:noProof/>
+        </w:rPr>
+        <w:fldChar w:fldCharType="end"/>
+      </w:r>
       <w:r>
         <w:t>: Prostředí Visual Studio Code</w:t>
       </w:r>
@@ -8239,14 +8408,27 @@
       <w:r>
         <w:t xml:space="preserve">Obr. </w:t>
       </w:r>
-      <w:fldSimple w:instr=" SEQ Obr. \* ARABIC ">
-        <w:r>
-          <w:rPr>
-            <w:noProof/>
-          </w:rPr>
-          <w:t>14</w:t>
-        </w:r>
-      </w:fldSimple>
+      <w:r>
+        <w:fldChar w:fldCharType="begin"/>
+      </w:r>
+      <w:r>
+        <w:instrText xml:space="preserve"> SEQ Obr. \* ARABIC </w:instrText>
+      </w:r>
+      <w:r>
+        <w:fldChar w:fldCharType="separate"/>
+      </w:r>
+      <w:r>
+        <w:rPr>
+          <w:noProof/>
+        </w:rPr>
+        <w:t>14</w:t>
+      </w:r>
+      <w:r>
+        <w:rPr>
+          <w:noProof/>
+        </w:rPr>
+        <w:fldChar w:fldCharType="end"/>
+      </w:r>
       <w:r>
         <w:t>: Návrh úvodní stránky</w:t>
       </w:r>
@@ -9268,14 +9450,27 @@
       <w:r>
         <w:t xml:space="preserve">Obr. </w:t>
       </w:r>
-      <w:fldSimple w:instr=" SEQ Obr. \* ARABIC ">
-        <w:r>
-          <w:rPr>
-            <w:noProof/>
-          </w:rPr>
-          <w:t>16</w:t>
-        </w:r>
-      </w:fldSimple>
+      <w:r>
+        <w:fldChar w:fldCharType="begin"/>
+      </w:r>
+      <w:r>
+        <w:instrText xml:space="preserve"> SEQ Obr. \* ARABIC </w:instrText>
+      </w:r>
+      <w:r>
+        <w:fldChar w:fldCharType="separate"/>
+      </w:r>
+      <w:r>
+        <w:rPr>
+          <w:noProof/>
+        </w:rPr>
+        <w:t>15</w:t>
+      </w:r>
+      <w:r>
+        <w:rPr>
+          <w:noProof/>
+        </w:rPr>
+        <w:fldChar w:fldCharType="end"/>
+      </w:r>
       <w:r>
         <w:t xml:space="preserve"> </w:t>
       </w:r>
@@ -9410,14 +9605,11 @@
         <w:jc w:val="center"/>
       </w:pPr>
       <w:r>
-        <w:rPr>
-          <w:noProof/>
-        </w:rPr>
         <w:drawing>
-          <wp:inline distT="0" distB="0" distL="0" distR="0" wp14:anchorId="7B5E2BA2" wp14:editId="20D62497">
-            <wp:extent cx="1252871" cy="3171825"/>
-            <wp:effectExtent l="0" t="0" r="4445" b="0"/>
-            <wp:docPr id="602272705" name="Obrázek 1" descr="Obsah obrázku text, snímek obrazovky, Písmo, číslo&#10;&#10;Obsah generovaný pomocí AI může být nesprávný."/>
+          <wp:inline distT="0" distB="0" distL="0" distR="0" wp14:anchorId="7A206AB8" wp14:editId="2DA018F0">
+            <wp:extent cx="2060812" cy="3124103"/>
+            <wp:effectExtent l="0" t="0" r="0" b="635"/>
+            <wp:docPr id="1218419402" name="Obrázek 1"/>
             <wp:cNvGraphicFramePr>
               <a:graphicFrameLocks xmlns:a="http://schemas.openxmlformats.org/drawingml/2006/main" noChangeAspect="1"/>
             </wp:cNvGraphicFramePr>
@@ -9425,7 +9617,7 @@
               <a:graphicData uri="http://schemas.openxmlformats.org/drawingml/2006/picture">
                 <pic:pic xmlns:pic="http://schemas.openxmlformats.org/drawingml/2006/picture">
                   <pic:nvPicPr>
-                    <pic:cNvPr id="602272705" name="Obrázek 1" descr="Obsah obrázku text, snímek obrazovky, Písmo, číslo&#10;&#10;Obsah generovaný pomocí AI může být nesprávný."/>
+                    <pic:cNvPr id="1218419402" name=""/>
                     <pic:cNvPicPr/>
                   </pic:nvPicPr>
                   <pic:blipFill>
@@ -9437,7 +9629,7 @@
                   <pic:spPr>
                     <a:xfrm>
                       <a:off x="0" y="0"/>
-                      <a:ext cx="1256794" cy="3181757"/>
+                      <a:ext cx="2063893" cy="3128774"/>
                     </a:xfrm>
                     <a:prstGeom prst="rect">
                       <a:avLst/>
@@ -9458,14 +9650,27 @@
       <w:r>
         <w:t xml:space="preserve">Obr. </w:t>
       </w:r>
-      <w:fldSimple w:instr=" SEQ Obr. \* ARABIC ">
-        <w:r>
-          <w:rPr>
-            <w:noProof/>
-          </w:rPr>
-          <w:t>17</w:t>
-        </w:r>
-      </w:fldSimple>
+      <w:r>
+        <w:fldChar w:fldCharType="begin"/>
+      </w:r>
+      <w:r>
+        <w:instrText xml:space="preserve"> SEQ Obr. \* ARABIC </w:instrText>
+      </w:r>
+      <w:r>
+        <w:fldChar w:fldCharType="separate"/>
+      </w:r>
+      <w:r>
+        <w:rPr>
+          <w:noProof/>
+        </w:rPr>
+        <w:t>16</w:t>
+      </w:r>
+      <w:r>
+        <w:rPr>
+          <w:noProof/>
+        </w:rPr>
+        <w:fldChar w:fldCharType="end"/>
+      </w:r>
       <w:r>
         <w:t>: Struktura frontendu</w:t>
       </w:r>
@@ -20515,7 +20720,7 @@
     </w:p>
     <w:p>
       <w:r>
-        <w:t>Zde se nachází ukázka komponenty zkoušky</w:t>
+        <w:t>Komponenta zkoušky slouží jako hlavní kontejner ve kterém jsou naimportovány jednotlivé menší komponenty, které jsou společně propojené a které dohromady tvoří funkční celek pro zobrazení zkoušek uživateli.</w:t>
       </w:r>
     </w:p>
     <w:p>
@@ -22584,28 +22789,189 @@
     </w:p>
     <w:p>
       <w:r>
-        <w:t>Popsat importy, pak ten stav a jak to funguje, jak se jako předávají dynamicky hodnoty</w:t>
-      </w:r>
-    </w:p>
-    <w:p>
-      <w:pPr>
-        <w:pStyle w:val="Nadpis2"/>
-      </w:pPr>
-      <w:bookmarkStart w:id="37" w:name="_Toc226373089"/>
-      <w:r>
-        <w:t>Backend</w:t>
-      </w:r>
-      <w:bookmarkEnd w:id="37"/>
-    </w:p>
-    <w:p>
-      <w:r>
-        <w:t>Backendová část je postavena na JavaScriptovém enginu NodeJS</w:t>
-      </w:r>
-      <w:r>
-        <w:t xml:space="preserve"> a frameworku Express</w:t>
-      </w:r>
-      <w:r>
-        <w:t>. Ve složkách se nachází důležité soubory, které se starají o zabezpečení webu, navigaci a o výpis informací z databáze.</w:t>
+        <w:t xml:space="preserve">Stránku tvoří tabulka s přehledem pásků obsahující informace o názvu pásku, třídě danu či cupu, ceně za zkoušku na jednotlivý technický stupeň a obrázek páku. Pod tabulkou se nachází sekce, která se dynamicky mění na základě vybraného technického stupně. Sekci tvoří komponenty </w:t>
+      </w:r>
+      <w:r>
+        <w:t xml:space="preserve">Video a </w:t>
+      </w:r>
+      <w:proofErr w:type="spellStart"/>
+      <w:r>
+        <w:t>SestavyInfo</w:t>
+      </w:r>
+      <w:proofErr w:type="spellEnd"/>
+      <w:r>
+        <w:t xml:space="preserve">. Komponenta Video se vykresluje pouze v případě, pokud má daný technický stupeň v databázi uložený odkaz na video. Klíčové pojmy k jednotlivým sestavám vykresluje komponenta </w:t>
+      </w:r>
+      <w:proofErr w:type="spellStart"/>
+      <w:r>
+        <w:t>SestavyInfo</w:t>
+      </w:r>
+      <w:proofErr w:type="spellEnd"/>
+      <w:r>
+        <w:t>.</w:t>
+      </w:r>
+    </w:p>
+    <w:p>
+      <w:r>
+        <w:t xml:space="preserve">Dynamické vykreslování je realizováno pomocí </w:t>
+      </w:r>
+      <w:proofErr w:type="spellStart"/>
+      <w:r>
+        <w:t>useState</w:t>
+      </w:r>
+      <w:proofErr w:type="spellEnd"/>
+      <w:r>
+        <w:t xml:space="preserve"> </w:t>
+      </w:r>
+      <w:r>
+        <w:t>hooku</w:t>
+      </w:r>
+      <w:r>
+        <w:t>, kter</w:t>
+      </w:r>
+      <w:r>
+        <w:t>ý</w:t>
+      </w:r>
+      <w:r>
+        <w:t xml:space="preserve"> pracuje s informacemi o aktuálně zvoleném technickém stupni. Výchozí hodnota je nastavena na null, což zajišťuje, že při prvotním načtení stránky nebude vybrán žádný technický stupeň a tím pádem nebudou vykreslovány komponenty Video a </w:t>
+      </w:r>
+      <w:proofErr w:type="spellStart"/>
+      <w:r>
+        <w:t>Sestavy</w:t>
+      </w:r>
+      <w:r>
+        <w:t>I</w:t>
+      </w:r>
+      <w:r>
+        <w:t>nfo</w:t>
+      </w:r>
+      <w:proofErr w:type="spellEnd"/>
+      <w:r>
+        <w:t>. Pokud však uživatel vybere určitý technický stupeň pásu, tak dojde k dynamickému předání hodnot do jednotlivých komponent a vykreslí se komponenty se specifickými informacemi.</w:t>
+      </w:r>
+    </w:p>
+    <w:p>
+      <w:r>
+        <w:t>Spodní část</w:t>
+      </w:r>
+      <w:r>
+        <w:t xml:space="preserve"> stránky</w:t>
+      </w:r>
+      <w:r>
+        <w:t xml:space="preserve"> </w:t>
+      </w:r>
+      <w:r>
+        <w:t>tvoří</w:t>
+      </w:r>
+      <w:r>
+        <w:t xml:space="preserve"> </w:t>
+      </w:r>
+      <w:r>
+        <w:t>komponenta</w:t>
+      </w:r>
+      <w:r>
+        <w:t xml:space="preserve"> </w:t>
+      </w:r>
+      <w:proofErr w:type="spellStart"/>
+      <w:r>
+        <w:t>Prihlasky</w:t>
+      </w:r>
+      <w:proofErr w:type="spellEnd"/>
+      <w:r>
+        <w:t xml:space="preserve">, která zobrazuje </w:t>
+      </w:r>
+      <w:r>
+        <w:t xml:space="preserve">informace týkající se vypsaných zkoušek. Obsahuje informace o zkoušce, </w:t>
+      </w:r>
+      <w:r>
+        <w:t xml:space="preserve">datum konání a konce přihlášek, místo konání, cenu za účast a seznam přihlášených závodníků. </w:t>
+      </w:r>
+      <w:r>
+        <w:t xml:space="preserve">Závodníkům kteří jsou přihlášeni do systému je zde dostupné i tlačítko na přihlášení a odhlášení ze zkoušky. </w:t>
+      </w:r>
+      <w:r>
+        <w:t>Zobrazení zkoušek podléhá administrátorům a trenérům, kteří mají v administraci možnost zkoušku vytvořit, upravit, smazat a rozhodovat zda zkouška bude veřejná či skrytá.</w:t>
+      </w:r>
+    </w:p>
+    <w:p>
+      <w:pPr>
+        <w:pStyle w:val="Titulek"/>
+        <w:keepNext/>
+      </w:pPr>
+      <w:r>
+        <w:lastRenderedPageBreak/>
+        <w:drawing>
+          <wp:inline distT="0" distB="0" distL="0" distR="0" wp14:anchorId="6C22070A" wp14:editId="10C34F34">
+            <wp:extent cx="5399405" cy="5642610"/>
+            <wp:effectExtent l="0" t="0" r="0" b="0"/>
+            <wp:docPr id="1532986230" name="Obrázek 1"/>
+            <wp:cNvGraphicFramePr>
+              <a:graphicFrameLocks xmlns:a="http://schemas.openxmlformats.org/drawingml/2006/main" noChangeAspect="1"/>
+            </wp:cNvGraphicFramePr>
+            <a:graphic xmlns:a="http://schemas.openxmlformats.org/drawingml/2006/main">
+              <a:graphicData uri="http://schemas.openxmlformats.org/drawingml/2006/picture">
+                <pic:pic xmlns:pic="http://schemas.openxmlformats.org/drawingml/2006/picture">
+                  <pic:nvPicPr>
+                    <pic:cNvPr id="1532986230" name=""/>
+                    <pic:cNvPicPr/>
+                  </pic:nvPicPr>
+                  <pic:blipFill>
+                    <a:blip r:embed="rId35"/>
+                    <a:stretch>
+                      <a:fillRect/>
+                    </a:stretch>
+                  </pic:blipFill>
+                  <pic:spPr>
+                    <a:xfrm>
+                      <a:off x="0" y="0"/>
+                      <a:ext cx="5399405" cy="5642610"/>
+                    </a:xfrm>
+                    <a:prstGeom prst="rect">
+                      <a:avLst/>
+                    </a:prstGeom>
+                  </pic:spPr>
+                </pic:pic>
+              </a:graphicData>
+            </a:graphic>
+          </wp:inline>
+        </w:drawing>
+      </w:r>
+    </w:p>
+    <w:p>
+      <w:pPr>
+        <w:pStyle w:val="Titulek"/>
+      </w:pPr>
+      <w:r>
+        <w:t xml:space="preserve">Obr. </w:t>
+      </w:r>
+      <w:r>
+        <w:fldChar w:fldCharType="begin"/>
+      </w:r>
+      <w:r>
+        <w:instrText xml:space="preserve"> SEQ Obr. \* ARABIC </w:instrText>
+      </w:r>
+      <w:r>
+        <w:fldChar w:fldCharType="separate"/>
+      </w:r>
+      <w:r>
+        <w:rPr>
+          <w:noProof/>
+        </w:rPr>
+        <w:t>17</w:t>
+      </w:r>
+      <w:r>
+        <w:fldChar w:fldCharType="end"/>
+      </w:r>
+      <w:r>
+        <w:t>: Zkoušky</w:t>
+      </w:r>
+    </w:p>
+    <w:p>
+      <w:pPr>
+        <w:pStyle w:val="Zdroj"/>
+      </w:pPr>
+      <w:r>
+        <w:t>Zdroj: vlastní</w:t>
       </w:r>
     </w:p>
     <w:p>
@@ -22613,12 +22979,76 @@
         <w:pStyle w:val="Nadpis3"/>
       </w:pPr>
       <w:r>
-        <w:t>Struktura backendu</w:t>
-      </w:r>
-    </w:p>
-    <w:p>
-      <w:r>
-        <w:t>Backend složka obsahuje několik souborů a složek ve kterých se nachází všechny potřebné routy a konfigurace, které zajišťují správné dodávání dat pro frontend část aplikace.</w:t>
+        <w:t>Responzivita</w:t>
+      </w:r>
+    </w:p>
+    <w:p>
+      <w:r>
+        <w:t xml:space="preserve">Responzivita webových stránek je zajištěna pomocí CSS frameworku Tailwind CSS. </w:t>
+      </w:r>
+      <w:r>
+        <w:t xml:space="preserve">Hlavním úkolem bylo zajistit, aby se uživatelské rozhraní zobrazovalo správně na všech koncových zařízeních </w:t>
+      </w:r>
+      <w:r>
+        <w:t>bez ohledu</w:t>
+      </w:r>
+      <w:r>
+        <w:t xml:space="preserve"> na jejich rozlišení.</w:t>
+      </w:r>
+    </w:p>
+    <w:p>
+      <w:r>
+        <w:t>Řešení je realizováno metodou mobile-first, což znamená, že rozhraní bylo primárně optimalizováno pro mobilní zařízení a následně upravováno pro větší obrazovky</w:t>
+      </w:r>
+      <w:r>
+        <w:t xml:space="preserve"> jako jsou tablety, notebooky a desktopové počítače</w:t>
+      </w:r>
+      <w:r>
+        <w:t>. Zmíněná metoda zajišťuje dobré zobrazení na všech zařízeních</w:t>
+      </w:r>
+      <w:r>
+        <w:t>.</w:t>
+      </w:r>
+    </w:p>
+    <w:p>
+      <w:r>
+        <w:t xml:space="preserve">Správné rozvržení obsahu je především realizováno pomocí </w:t>
+      </w:r>
+      <w:proofErr w:type="spellStart"/>
+      <w:r>
+        <w:t>flexboxů</w:t>
+      </w:r>
+      <w:proofErr w:type="spellEnd"/>
+      <w:r>
+        <w:t xml:space="preserve"> a </w:t>
+      </w:r>
+      <w:proofErr w:type="spellStart"/>
+      <w:r>
+        <w:t>gridů</w:t>
+      </w:r>
+      <w:proofErr w:type="spellEnd"/>
+      <w:r>
+        <w:t>,</w:t>
+      </w:r>
+      <w:r>
+        <w:t xml:space="preserve"> které umožňují dynamicky přizpůsobovat rozmístění jednotlivých prvků na základě aktuálního rozlišení a v případě potřeby také některé prvky pro menší rozlišení skrýt. </w:t>
+      </w:r>
+    </w:p>
+    <w:p>
+      <w:proofErr w:type="spellStart"/>
+      <w:r>
+        <w:lastRenderedPageBreak/>
+        <w:t>Flexbox</w:t>
+      </w:r>
+      <w:proofErr w:type="spellEnd"/>
+      <w:r>
+        <w:t xml:space="preserve"> je využíván zejména pro zarovnání prvků jako je například navigační menu nebo </w:t>
+      </w:r>
+      <w:r>
+        <w:t>u některých komponent jako jsou informace týkající se závodníků. Grid je použit pro složitější rozvrhování obsahu jako jsou například seznamy závodníků nebo aktualit, kdy je potřeba měnit počet zobrazovaných prvků na základě aktuálního rozlišení.</w:t>
+      </w:r>
+      <w:r>
+        <w:t xml:space="preserve"> V případě většího rozlišení se prvky zobrazují vedle sebe a se zmenšováním rozlišení se prvky vykreslují pod sebe do sloupce.</w:t>
       </w:r>
     </w:p>
     <w:p>
@@ -22627,9 +23057,124 @@
         <w:jc w:val="center"/>
       </w:pPr>
       <w:r>
+        <w:drawing>
+          <wp:inline distT="0" distB="0" distL="0" distR="0" wp14:anchorId="315D7906" wp14:editId="42F2D4F7">
+            <wp:extent cx="1387000" cy="3700130"/>
+            <wp:effectExtent l="0" t="0" r="3810" b="0"/>
+            <wp:docPr id="1000507932" name="Obrázek 1"/>
+            <wp:cNvGraphicFramePr>
+              <a:graphicFrameLocks xmlns:a="http://schemas.openxmlformats.org/drawingml/2006/main" noChangeAspect="1"/>
+            </wp:cNvGraphicFramePr>
+            <a:graphic xmlns:a="http://schemas.openxmlformats.org/drawingml/2006/main">
+              <a:graphicData uri="http://schemas.openxmlformats.org/drawingml/2006/picture">
+                <pic:pic xmlns:pic="http://schemas.openxmlformats.org/drawingml/2006/picture">
+                  <pic:nvPicPr>
+                    <pic:cNvPr id="1000507932" name=""/>
+                    <pic:cNvPicPr/>
+                  </pic:nvPicPr>
+                  <pic:blipFill>
+                    <a:blip r:embed="rId36"/>
+                    <a:stretch>
+                      <a:fillRect/>
+                    </a:stretch>
+                  </pic:blipFill>
+                  <pic:spPr>
+                    <a:xfrm>
+                      <a:off x="0" y="0"/>
+                      <a:ext cx="1392426" cy="3714605"/>
+                    </a:xfrm>
+                    <a:prstGeom prst="rect">
+                      <a:avLst/>
+                    </a:prstGeom>
+                  </pic:spPr>
+                </pic:pic>
+              </a:graphicData>
+            </a:graphic>
+          </wp:inline>
+        </w:drawing>
+      </w:r>
+    </w:p>
+    <w:p>
+      <w:pPr>
+        <w:pStyle w:val="Titulek"/>
+      </w:pPr>
+      <w:r>
+        <w:t xml:space="preserve">Obr. </w:t>
+      </w:r>
+      <w:r>
+        <w:fldChar w:fldCharType="begin"/>
+      </w:r>
+      <w:r>
+        <w:instrText xml:space="preserve"> SEQ Obr. \* ARABIC </w:instrText>
+      </w:r>
+      <w:r>
+        <w:fldChar w:fldCharType="separate"/>
+      </w:r>
+      <w:r>
         <w:rPr>
           <w:noProof/>
         </w:rPr>
+        <w:t>18</w:t>
+      </w:r>
+      <w:r>
+        <w:fldChar w:fldCharType="end"/>
+      </w:r>
+      <w:r>
+        <w:t>: Ukázka mobilní responzivity</w:t>
+      </w:r>
+    </w:p>
+    <w:p>
+      <w:pPr>
+        <w:pStyle w:val="Zdroj"/>
+      </w:pPr>
+      <w:r>
+        <w:t>Zdroj: vlastní</w:t>
+      </w:r>
+    </w:p>
+    <w:p>
+      <w:pPr>
+        <w:pStyle w:val="Nadpis2"/>
+      </w:pPr>
+      <w:bookmarkStart w:id="37" w:name="_Toc226373089"/>
+      <w:r>
+        <w:t>Backend</w:t>
+      </w:r>
+      <w:bookmarkEnd w:id="37"/>
+    </w:p>
+    <w:p>
+      <w:r>
+        <w:t>Backendová část je postavena na JavaScriptovém enginu NodeJS</w:t>
+      </w:r>
+      <w:r>
+        <w:t xml:space="preserve"> a frameworku Express</w:t>
+      </w:r>
+      <w:r>
+        <w:t>. Ve složkách se nachází důležité soubory, které se starají o zabezpečení webu, navigaci a o výpis informací z databáze.</w:t>
+      </w:r>
+    </w:p>
+    <w:p>
+      <w:pPr>
+        <w:pStyle w:val="Nadpis3"/>
+      </w:pPr>
+      <w:r>
+        <w:t>Struktura backendu</w:t>
+      </w:r>
+    </w:p>
+    <w:p>
+      <w:r>
+        <w:t>Backend složka obsahuje několik souborů a složek ve kterých se nachází všechny potřebné routy a konfigurace, které zajišťují správné dodávání dat pro frontend část aplikace.</w:t>
+      </w:r>
+    </w:p>
+    <w:p>
+      <w:pPr>
+        <w:keepNext/>
+        <w:jc w:val="center"/>
+      </w:pPr>
+      <w:r>
+        <w:rPr>
+          <w:noProof/>
+        </w:rPr>
+        <w:lastRenderedPageBreak/>
         <w:drawing>
           <wp:inline distT="0" distB="0" distL="0" distR="0" wp14:anchorId="7608AF1E" wp14:editId="4632F6C0">
             <wp:extent cx="1733792" cy="2924583"/>
@@ -22646,7 +23191,7 @@
                     <pic:cNvPicPr/>
                   </pic:nvPicPr>
                   <pic:blipFill>
-                    <a:blip r:embed="rId35"/>
+                    <a:blip r:embed="rId37"/>
                     <a:stretch>
                       <a:fillRect/>
                     </a:stretch>
@@ -22681,14 +23226,27 @@
       <w:r>
         <w:t xml:space="preserve">Obr. </w:t>
       </w:r>
-      <w:fldSimple w:instr=" SEQ Obr. \* ARABIC ">
-        <w:r>
-          <w:rPr>
-            <w:noProof/>
-          </w:rPr>
-          <w:t>18</w:t>
-        </w:r>
-      </w:fldSimple>
+      <w:r>
+        <w:fldChar w:fldCharType="begin"/>
+      </w:r>
+      <w:r>
+        <w:instrText xml:space="preserve"> SEQ Obr. \* ARABIC </w:instrText>
+      </w:r>
+      <w:r>
+        <w:fldChar w:fldCharType="separate"/>
+      </w:r>
+      <w:r>
+        <w:rPr>
+          <w:noProof/>
+        </w:rPr>
+        <w:t>19</w:t>
+      </w:r>
+      <w:r>
+        <w:rPr>
+          <w:noProof/>
+        </w:rPr>
+        <w:fldChar w:fldCharType="end"/>
+      </w:r>
       <w:r>
         <w:t>: Struktura backendu</w:t>
       </w:r>
@@ -22696,15 +23254,9 @@
     </w:p>
     <w:p>
       <w:pPr>
-        <w:jc w:val="center"/>
-        <w:rPr>
-          <w:i/>
-        </w:rPr>
-      </w:pPr>
-      <w:r>
-        <w:rPr>
-          <w:i/>
-        </w:rPr>
+        <w:pStyle w:val="Zdroj"/>
+      </w:pPr>
+      <w:r>
         <w:t>Zdroj: vlastní</w:t>
       </w:r>
     </w:p>
@@ -22774,7 +23326,6 @@
           <w:b/>
           <w:bCs/>
         </w:rPr>
-        <w:lastRenderedPageBreak/>
         <w:t>Libs/</w:t>
       </w:r>
       <w:r>
@@ -23127,6 +23678,7 @@
         <w:pStyle w:val="Nadpis3"/>
       </w:pPr>
       <w:r>
+        <w:lastRenderedPageBreak/>
         <w:t>Routy</w:t>
       </w:r>
     </w:p>
@@ -24499,7 +25051,6 @@
           <w:szCs w:val="21"/>
           <w:lang w:eastAsia="cs-CZ"/>
         </w:rPr>
-        <w:lastRenderedPageBreak/>
         <w:t>const</w:t>
       </w:r>
       <w:r>
@@ -26180,6 +26731,7 @@
         <w:t xml:space="preserve">v samostatném souboru, přičemž HTTP metody GET, POST, PUT a DELETE odpovídají operacím </w:t>
       </w:r>
       <w:r>
+        <w:lastRenderedPageBreak/>
         <w:t>CRUD – vytváření</w:t>
       </w:r>
       <w:r>
@@ -26578,7 +27130,6 @@
           <w:szCs w:val="21"/>
           <w:lang w:eastAsia="cs-CZ"/>
         </w:rPr>
-        <w:lastRenderedPageBreak/>
         <w:t>        e.title,</w:t>
       </w:r>
     </w:p>
@@ -28189,6 +28740,7 @@
           <w:szCs w:val="21"/>
           <w:lang w:eastAsia="cs-CZ"/>
         </w:rPr>
+        <w:lastRenderedPageBreak/>
         <w:t xml:space="preserve">            </w:t>
       </w:r>
       <w:r>
@@ -28931,7 +29483,6 @@
           <w:szCs w:val="21"/>
           <w:lang w:eastAsia="cs-CZ"/>
         </w:rPr>
-        <w:lastRenderedPageBreak/>
         <w:t>        DATE_FORMAT(e.date_start, '%d.%m.%Y') AS date_start</w:t>
       </w:r>
     </w:p>
@@ -30375,6 +30926,7 @@
           <w:szCs w:val="21"/>
           <w:lang w:eastAsia="cs-CZ"/>
         </w:rPr>
+        <w:lastRenderedPageBreak/>
         <w:t xml:space="preserve">      </w:t>
       </w:r>
       <w:r>
@@ -31316,7 +31868,6 @@
           <w:szCs w:val="21"/>
           <w:lang w:eastAsia="cs-CZ"/>
         </w:rPr>
-        <w:lastRenderedPageBreak/>
         <w:t>router</w:t>
       </w:r>
       <w:r>
@@ -33539,6 +34090,7 @@
           <w:szCs w:val="21"/>
           <w:lang w:eastAsia="cs-CZ"/>
         </w:rPr>
+        <w:lastRenderedPageBreak/>
         <w:t xml:space="preserve">        </w:t>
       </w:r>
       <w:r>
@@ -36731,6 +37283,7 @@
           <w:szCs w:val="21"/>
           <w:lang w:eastAsia="cs-CZ"/>
         </w:rPr>
+        <w:lastRenderedPageBreak/>
         <w:t xml:space="preserve">    </w:t>
       </w:r>
       <w:r>
@@ -38501,7 +39054,6 @@
           <w:szCs w:val="21"/>
           <w:lang w:eastAsia="cs-CZ"/>
         </w:rPr>
-        <w:lastRenderedPageBreak/>
         <w:t xml:space="preserve">    </w:t>
       </w:r>
       <w:r>
@@ -40137,6 +40689,7 @@
     </w:p>
     <w:p>
       <w:r>
+        <w:lastRenderedPageBreak/>
         <w:t xml:space="preserve">Mazání aktualit zajišťuje metoda </w:t>
       </w:r>
       <w:r>
@@ -43121,6 +43674,7 @@
         <w:pStyle w:val="Nadpis3"/>
       </w:pPr>
       <w:r>
+        <w:lastRenderedPageBreak/>
         <w:t>Autentizace pomocí JWT</w:t>
       </w:r>
     </w:p>
@@ -43645,7 +44199,6 @@
         <w:pStyle w:val="Nadpis3"/>
       </w:pPr>
       <w:r>
-        <w:lastRenderedPageBreak/>
         <w:t>Hashování hesel</w:t>
       </w:r>
     </w:p>
@@ -43877,6 +44430,7 @@
         <w:pStyle w:val="Nadpis3"/>
       </w:pPr>
       <w:r>
+        <w:lastRenderedPageBreak/>
         <w:t>CORS</w:t>
       </w:r>
     </w:p>
@@ -44028,26 +44582,12 @@
       <w:r>
         <w:t>. Online. 2024. Dostupné z: </w:t>
       </w:r>
-      <w:hyperlink r:id="rId36" w:history="1">
+      <w:hyperlink r:id="rId38" w:history="1">
         <w:r>
           <w:rPr>
             <w:rStyle w:val="Hypertextovodkaz"/>
           </w:rPr>
-          <w:t>https://docs.npmjs.com/</w:t>
-        </w:r>
-        <w:proofErr w:type="spellStart"/>
-        <w:r>
-          <w:rPr>
-            <w:rStyle w:val="Hypertextovodkaz"/>
-          </w:rPr>
-          <w:t>about</w:t>
-        </w:r>
-        <w:proofErr w:type="spellEnd"/>
-        <w:r>
-          <w:rPr>
-            <w:rStyle w:val="Hypertextovodkaz"/>
-          </w:rPr>
-          <w:t>-npm</w:t>
+          <w:t>https://docs.npmjs.com/about-npm</w:t>
         </w:r>
       </w:hyperlink>
       <w:r>
@@ -44068,7 +44608,7 @@
       <w:r>
         <w:t xml:space="preserve">, T. The World Wide Web. Online. 1991. Dostupné z: </w:t>
       </w:r>
-      <w:hyperlink r:id="rId37" w:history="1">
+      <w:hyperlink r:id="rId39" w:history="1">
         <w:r>
           <w:rPr>
             <w:rStyle w:val="Hypertextovodkaz"/>
@@ -44094,7 +44634,7 @@
       <w:r>
         <w:t>. Online. 2024. Dostupné z: </w:t>
       </w:r>
-      <w:hyperlink r:id="rId38" w:history="1">
+      <w:hyperlink r:id="rId40" w:history="1">
         <w:r>
           <w:rPr>
             <w:rStyle w:val="Hypertextovodkaz"/>
@@ -44120,40 +44660,12 @@
       <w:r>
         <w:t>. Online. 2016. Dostupné z: </w:t>
       </w:r>
-      <w:hyperlink r:id="rId39" w:history="1">
+      <w:hyperlink r:id="rId41" w:history="1">
         <w:r>
           <w:rPr>
             <w:rStyle w:val="Hypertextovodkaz"/>
           </w:rPr>
-          <w:t>https://mv.gov.cz/</w:t>
-        </w:r>
-        <w:proofErr w:type="spellStart"/>
-        <w:r>
-          <w:rPr>
-            <w:rStyle w:val="Hypertextovodkaz"/>
-          </w:rPr>
-          <w:t>gdpr</w:t>
-        </w:r>
-        <w:proofErr w:type="spellEnd"/>
-        <w:r>
-          <w:rPr>
-            <w:rStyle w:val="Hypertextovodkaz"/>
-          </w:rPr>
-          <w:t>/</w:t>
-        </w:r>
-        <w:proofErr w:type="spellStart"/>
-        <w:r>
-          <w:rPr>
-            <w:rStyle w:val="Hypertextovodkaz"/>
-          </w:rPr>
-          <w:t>clanek</w:t>
-        </w:r>
-        <w:proofErr w:type="spellEnd"/>
-        <w:r>
-          <w:rPr>
-            <w:rStyle w:val="Hypertextovodkaz"/>
-          </w:rPr>
-          <w:t>/co-je-gdpr.aspx</w:t>
+          <w:t>https://mv.gov.cz/gdpr/clanek/co-je-gdpr.aspx</w:t>
         </w:r>
       </w:hyperlink>
       <w:r>
@@ -44174,7 +44686,7 @@
       <w:r>
         <w:t>. Online. HTTPS://WWW.WORLDTAEKWONDO.CZ/CZ/O-TAEKWONDO-CO-JE-TO-TAEKWONDO.HTML. Český svaz Taekwondo. 2024. Dostupné z: </w:t>
       </w:r>
-      <w:hyperlink r:id="rId40" w:history="1">
+      <w:hyperlink r:id="rId42" w:history="1">
         <w:r>
           <w:rPr>
             <w:rStyle w:val="Hypertextovodkaz"/>
@@ -44200,26 +44712,41 @@
       <w:r>
         <w:t>. Online. 2016. Dostupné z: </w:t>
       </w:r>
-      <w:hyperlink r:id="rId41" w:history="1">
+      <w:hyperlink r:id="rId43" w:history="1">
         <w:r>
           <w:rPr>
             <w:rStyle w:val="Hypertextovodkaz"/>
           </w:rPr>
-          <w:t>https://www.figma.com/</w:t>
+          <w:t>https://www.figma.com/about/</w:t>
         </w:r>
-        <w:proofErr w:type="spellStart"/>
+      </w:hyperlink>
+      <w:r>
+        <w:t>. [cit. 2024-12-22].</w:t>
+      </w:r>
+    </w:p>
+    <w:p>
+      <w:pPr>
+        <w:pStyle w:val="Seznamliteratury"/>
+      </w:pPr>
+      <w:r>
+        <w:t>Figma: co to je a jaké jsou jeho základní funkce a principy? Online. </w:t>
+      </w:r>
+      <w:r>
+        <w:rPr>
+          <w:i/>
+          <w:iCs/>
+        </w:rPr>
+        <w:t>DrawPlanet</w:t>
+      </w:r>
+      <w:r>
+        <w:t>. 2023, roč. 2023, č. 12, s. 1. Dostupné z: </w:t>
+      </w:r>
+      <w:hyperlink r:id="rId44" w:history="1">
         <w:r>
           <w:rPr>
             <w:rStyle w:val="Hypertextovodkaz"/>
           </w:rPr>
-          <w:t>about</w:t>
-        </w:r>
-        <w:proofErr w:type="spellEnd"/>
-        <w:r>
-          <w:rPr>
-            <w:rStyle w:val="Hypertextovodkaz"/>
-          </w:rPr>
-          <w:t>/</w:t>
+          <w:t>https://www.drawplanet.cz/co-je-tedy-figma/</w:t>
         </w:r>
       </w:hyperlink>
       <w:r>
@@ -44231,59 +44758,16 @@
         <w:pStyle w:val="Seznamliteratury"/>
       </w:pPr>
       <w:r>
-        <w:t>Figma: co to je a jaké jsou jeho základní funkce a principy? Online. </w:t>
-      </w:r>
-      <w:r>
         <w:rPr>
           <w:i/>
           <w:iCs/>
         </w:rPr>
-        <w:t>DrawPlanet</w:t>
-      </w:r>
-      <w:r>
-        <w:t>. 2023, roč. 2023, č. 12, s. 1. Dostupné z: </w:t>
-      </w:r>
-      <w:hyperlink r:id="rId42" w:history="1">
-        <w:r>
-          <w:rPr>
-            <w:rStyle w:val="Hypertextovodkaz"/>
-          </w:rPr>
-          <w:t>https://www.drawplanet.cz/co-je-tedy-</w:t>
-        </w:r>
-        <w:proofErr w:type="spellStart"/>
-        <w:r>
-          <w:rPr>
-            <w:rStyle w:val="Hypertextovodkaz"/>
-          </w:rPr>
-          <w:t>figma</w:t>
-        </w:r>
-        <w:proofErr w:type="spellEnd"/>
-        <w:r>
-          <w:rPr>
-            <w:rStyle w:val="Hypertextovodkaz"/>
-          </w:rPr>
-          <w:t>/</w:t>
-        </w:r>
-      </w:hyperlink>
-      <w:r>
-        <w:t>. [cit. 2024-12-22].</w:t>
-      </w:r>
-    </w:p>
-    <w:p>
-      <w:pPr>
-        <w:pStyle w:val="Seznamliteratury"/>
-      </w:pPr>
-      <w:r>
-        <w:rPr>
-          <w:i/>
-          <w:iCs/>
-        </w:rPr>
         <w:t>Chaffey</w:t>
       </w:r>
       <w:r>
         <w:t xml:space="preserve">, D., &amp; Ellis-Chadwick, F. Digital Marketing. Online. 2022. Dostupné z: </w:t>
       </w:r>
-      <w:hyperlink r:id="rId43" w:history="1">
+      <w:hyperlink r:id="rId45" w:history="1">
         <w:r>
           <w:rPr>
             <w:rStyle w:val="Hypertextovodkaz"/>
@@ -44309,7 +44793,7 @@
       <w:r>
         <w:t xml:space="preserve">, E. Responsive Web Design. Online. 2010. Dostupné z: </w:t>
       </w:r>
-      <w:hyperlink r:id="rId44" w:history="1">
+      <w:hyperlink r:id="rId46" w:history="1">
         <w:r>
           <w:rPr>
             <w:rStyle w:val="Hypertextovodkaz"/>
@@ -44335,7 +44819,7 @@
       <w:r>
         <w:t xml:space="preserve">. Online. 2024. Dostupné z: </w:t>
       </w:r>
-      <w:hyperlink r:id="rId45" w:tgtFrame="_new" w:history="1">
+      <w:hyperlink r:id="rId47" w:tgtFrame="_new" w:history="1">
         <w:r>
           <w:rPr>
             <w:rStyle w:val="Hypertextovodkaz"/>
@@ -44361,7 +44845,7 @@
       <w:r>
         <w:t>. Online. 2016. Dostupné z: </w:t>
       </w:r>
-      <w:hyperlink r:id="rId46" w:history="1">
+      <w:hyperlink r:id="rId48" w:history="1">
         <w:r>
           <w:rPr>
             <w:rStyle w:val="Hypertextovodkaz"/>
@@ -44387,21 +44871,13 @@
       <w:r>
         <w:t>. Online. 2009. Dostupné z: </w:t>
       </w:r>
-      <w:hyperlink r:id="rId47" w:history="1">
+      <w:hyperlink r:id="rId49" w:history="1">
         <w:r>
           <w:rPr>
             <w:rStyle w:val="Hypertextovodkaz"/>
           </w:rPr>
-          <w:t>https://nodejs.org/en/</w:t>
+          <w:t>https://nodejs.org/en/about</w:t>
         </w:r>
-        <w:proofErr w:type="spellStart"/>
-        <w:r>
-          <w:rPr>
-            <w:rStyle w:val="Hypertextovodkaz"/>
-          </w:rPr>
-          <w:t>about</w:t>
-        </w:r>
-        <w:proofErr w:type="spellEnd"/>
       </w:hyperlink>
       <w:r>
         <w:t>. [cit. 2024-12-22].</w:t>
@@ -44421,7 +44897,7 @@
       <w:r>
         <w:t xml:space="preserve">, T. What Is Web 2.0. Online. 2005. Dostupné z: </w:t>
       </w:r>
-      <w:hyperlink r:id="rId48" w:history="1">
+      <w:hyperlink r:id="rId50" w:history="1">
         <w:r>
           <w:rPr>
             <w:rStyle w:val="Hypertextovodkaz"/>
@@ -44447,7 +44923,7 @@
       <w:r>
         <w:t xml:space="preserve">. OWASP Top Ten. Online. 2024. Dostupné z: </w:t>
       </w:r>
-      <w:hyperlink r:id="rId49" w:history="1">
+      <w:hyperlink r:id="rId51" w:history="1">
         <w:r>
           <w:rPr>
             <w:rStyle w:val="Hypertextovodkaz"/>
@@ -44473,40 +44949,12 @@
       <w:r>
         <w:t>. Online. 2016. Dostupné z: </w:t>
       </w:r>
-      <w:hyperlink r:id="rId50" w:history="1">
+      <w:hyperlink r:id="rId52" w:history="1">
         <w:r>
           <w:rPr>
             <w:rStyle w:val="Hypertextovodkaz"/>
           </w:rPr>
-          <w:t>https://mv.gov.cz/</w:t>
-        </w:r>
-        <w:proofErr w:type="spellStart"/>
-        <w:r>
-          <w:rPr>
-            <w:rStyle w:val="Hypertextovodkaz"/>
-          </w:rPr>
-          <w:t>gdpr</w:t>
-        </w:r>
-        <w:proofErr w:type="spellEnd"/>
-        <w:r>
-          <w:rPr>
-            <w:rStyle w:val="Hypertextovodkaz"/>
-          </w:rPr>
-          <w:t>/</w:t>
-        </w:r>
-        <w:proofErr w:type="spellStart"/>
-        <w:r>
-          <w:rPr>
-            <w:rStyle w:val="Hypertextovodkaz"/>
-          </w:rPr>
-          <w:t>clanek</w:t>
-        </w:r>
-        <w:proofErr w:type="spellEnd"/>
-        <w:r>
-          <w:rPr>
-            <w:rStyle w:val="Hypertextovodkaz"/>
-          </w:rPr>
-          <w:t>/prava-subjektu-udaju.aspx</w:t>
+          <w:t>https://mv.gov.cz/gdpr/clanek/prava-subjektu-udaju.aspx</w:t>
         </w:r>
       </w:hyperlink>
       <w:r>
@@ -44527,7 +44975,7 @@
       <w:r>
         <w:t>. Online. 2013. Dostupné z: </w:t>
       </w:r>
-      <w:hyperlink r:id="rId51" w:history="1">
+      <w:hyperlink r:id="rId53" w:history="1">
         <w:r>
           <w:rPr>
             <w:rStyle w:val="Hypertextovodkaz"/>
@@ -44553,40 +45001,12 @@
       <w:r>
         <w:t>. Online. 2024. Dostupné z: </w:t>
       </w:r>
-      <w:hyperlink r:id="rId52" w:history="1">
+      <w:hyperlink r:id="rId54" w:history="1">
         <w:r>
           <w:rPr>
             <w:rStyle w:val="Hypertextovodkaz"/>
           </w:rPr>
-          <w:t>https://www.geeksforgeeks.org/</w:t>
-        </w:r>
-        <w:proofErr w:type="spellStart"/>
-        <w:r>
-          <w:rPr>
-            <w:rStyle w:val="Hypertextovodkaz"/>
-          </w:rPr>
-          <w:t>reactjs</w:t>
-        </w:r>
-        <w:proofErr w:type="spellEnd"/>
-        <w:r>
-          <w:rPr>
-            <w:rStyle w:val="Hypertextovodkaz"/>
-          </w:rPr>
-          <w:t>-</w:t>
-        </w:r>
-        <w:proofErr w:type="spellStart"/>
-        <w:r>
-          <w:rPr>
-            <w:rStyle w:val="Hypertextovodkaz"/>
-          </w:rPr>
-          <w:t>virtual</w:t>
-        </w:r>
-        <w:proofErr w:type="spellEnd"/>
-        <w:r>
-          <w:rPr>
-            <w:rStyle w:val="Hypertextovodkaz"/>
-          </w:rPr>
-          <w:t>-dom/</w:t>
+          <w:t>https://www.geeksforgeeks.org/reactjs-virtual-dom/</w:t>
         </w:r>
       </w:hyperlink>
       <w:r>
@@ -44607,7 +45027,7 @@
       <w:r>
         <w:t xml:space="preserve">. The Transport Layer Security (TLS) Protocol. Online. 2008. Dostupné z: </w:t>
       </w:r>
-      <w:hyperlink r:id="rId53" w:history="1">
+      <w:hyperlink r:id="rId55" w:history="1">
         <w:r>
           <w:rPr>
             <w:rStyle w:val="Hypertextovodkaz"/>
@@ -44633,7 +45053,7 @@
       <w:r>
         <w:t xml:space="preserve">, B. Artificial Intelligence in web Development. Online. 2023. Dostupné z: </w:t>
       </w:r>
-      <w:hyperlink r:id="rId54" w:history="1">
+      <w:hyperlink r:id="rId56" w:history="1">
         <w:r>
           <w:rPr>
             <w:rStyle w:val="Hypertextovodkaz"/>
@@ -44667,7 +45087,7 @@
       <w:r>
         <w:t>. Online. 2024. Dostupné z: </w:t>
       </w:r>
-      <w:hyperlink r:id="rId55" w:history="1">
+      <w:hyperlink r:id="rId57" w:history="1">
         <w:r>
           <w:rPr>
             <w:rStyle w:val="Hypertextovodkaz"/>
@@ -44705,7 +45125,7 @@
       <w:r>
         <w:t>. Online. 2024. Dostupné z: </w:t>
       </w:r>
-      <w:hyperlink r:id="rId56" w:history="1">
+      <w:hyperlink r:id="rId58" w:history="1">
         <w:r>
           <w:rPr>
             <w:rStyle w:val="Hypertextovodkaz"/>
@@ -44731,7 +45151,7 @@
       <w:r>
         <w:t xml:space="preserve">. HTML and Web Standards. Online. 2024. Dostupné z: </w:t>
       </w:r>
-      <w:hyperlink r:id="rId57" w:history="1">
+      <w:hyperlink r:id="rId59" w:history="1">
         <w:r>
           <w:rPr>
             <w:rStyle w:val="Hypertextovodkaz"/>
@@ -44744,7 +45164,7 @@
       </w:r>
     </w:p>
     <w:sectPr>
-      <w:footerReference w:type="default" r:id="rId58"/>
+      <w:footerReference w:type="default" r:id="rId60"/>
       <w:pgSz w:w="11906" w:h="16838"/>
       <w:pgMar w:top="1418" w:right="1418" w:bottom="1418" w:left="1985" w:header="709" w:footer="709" w:gutter="0"/>
       <w:cols w:space="708"/>
@@ -51638,6 +52058,7 @@
     <w:rsid w:val="00406C6A"/>
     <w:rsid w:val="00427646"/>
     <w:rsid w:val="00427C7D"/>
+    <w:rsid w:val="00450CBF"/>
     <w:rsid w:val="00460741"/>
     <w:rsid w:val="00463D1E"/>
     <w:rsid w:val="004649D4"/>
@@ -51680,6 +52101,7 @@
     <w:rsid w:val="00A43524"/>
     <w:rsid w:val="00A50638"/>
     <w:rsid w:val="00A766F6"/>
+    <w:rsid w:val="00AE56EA"/>
     <w:rsid w:val="00B12775"/>
     <w:rsid w:val="00B50241"/>
     <w:rsid w:val="00B67870"/>
@@ -52478,10 +52900,19 @@
 </file>
 
 <file path=customXml/item3.xml><?xml version="1.0" encoding="utf-8"?>
+<?mso-contentType ?>
+<FormTemplates xmlns="http://schemas.microsoft.com/sharepoint/v3/contenttype/forms">
+  <Display>DocumentLibraryForm</Display>
+  <Edit>DocumentLibraryForm</Edit>
+  <New>DocumentLibraryForm</New>
+</FormTemplates>
+</file>
+
+<file path=customXml/item4.xml><?xml version="1.0" encoding="utf-8"?>
 <b:Sources xmlns:b="http://schemas.openxmlformats.org/officeDocument/2006/bibliography" xmlns="http://schemas.openxmlformats.org/officeDocument/2006/bibliography" SelectedStyle="\APASixthEditionOfficeOnline.xsl" StyleName="APA" Version="6"/>
 </file>
 
-<file path=customXml/item4.xml><?xml version="1.0" encoding="utf-8"?>
+<file path=customXml/item5.xml><?xml version="1.0" encoding="utf-8"?>
 <ct:contentTypeSchema xmlns:ct="http://schemas.microsoft.com/office/2006/metadata/contentType" xmlns:ma="http://schemas.microsoft.com/office/2006/metadata/properties/metaAttributes" ct:_="" ma:_="" ma:contentTypeName="Dokument" ma:contentTypeID="0x010100AB4421CFC579A4449DC25ACBD6176571" ma:contentTypeVersion="2" ma:contentTypeDescription="Vytvoří nový dokument" ma:contentTypeScope="" ma:versionID="571ac08f18df58b33840592d245cde2d">
   <xsd:schema xmlns:xsd="http://www.w3.org/2001/XMLSchema" xmlns:xs="http://www.w3.org/2001/XMLSchema" xmlns:p="http://schemas.microsoft.com/office/2006/metadata/properties" xmlns:ns2="921a4a19-005d-42bf-a6ee-1c0f1cd55622" targetNamespace="http://schemas.microsoft.com/office/2006/metadata/properties" ma:root="true" ma:fieldsID="4559ad2502f86f60dcde6a0f6b3f7266" ns2:_="">
     <xsd:import namespace="921a4a19-005d-42bf-a6ee-1c0f1cd55622"/>
@@ -52613,15 +53044,6 @@
 </ct:contentTypeSchema>
 </file>
 
-<file path=customXml/item5.xml><?xml version="1.0" encoding="utf-8"?>
-<?mso-contentType ?>
-<FormTemplates xmlns="http://schemas.microsoft.com/sharepoint/v3/contenttype/forms">
-  <Display>DocumentLibraryForm</Display>
-  <Edit>DocumentLibraryForm</Edit>
-  <New>DocumentLibraryForm</New>
-</FormTemplates>
-</file>
-
 <file path=customXml/itemProps1.xml><?xml version="1.0" encoding="utf-8"?>
 <ds:datastoreItem xmlns:ds="http://schemas.openxmlformats.org/officeDocument/2006/customXml" ds:itemID="{55AF091B-3C7A-41E3-B477-F2FDAA23CFDA}">
   <ds:schemaRefs>
@@ -52640,6 +53062,14 @@
 </file>
 
 <file path=customXml/itemProps3.xml><?xml version="1.0" encoding="utf-8"?>
+<ds:datastoreItem xmlns:ds="http://schemas.openxmlformats.org/officeDocument/2006/customXml" ds:itemID="{B7C1A596-E5BE-4405-BB39-8891EE7E0A9A}">
+  <ds:schemaRefs>
+    <ds:schemaRef ds:uri="http://schemas.microsoft.com/sharepoint/v3/contenttype/forms"/>
+  </ds:schemaRefs>
+</ds:datastoreItem>
+</file>
+
+<file path=customXml/itemProps4.xml><?xml version="1.0" encoding="utf-8"?>
 <ds:datastoreItem xmlns:ds="http://schemas.openxmlformats.org/officeDocument/2006/customXml" ds:itemID="{016BB16A-1E0F-4115-AADC-10D5070CD6B8}">
   <ds:schemaRefs>
     <ds:schemaRef ds:uri="http://schemas.openxmlformats.org/officeDocument/2006/bibliography"/>
@@ -52647,7 +53077,7 @@
 </ds:datastoreItem>
 </file>
 
-<file path=customXml/itemProps4.xml><?xml version="1.0" encoding="utf-8"?>
+<file path=customXml/itemProps5.xml><?xml version="1.0" encoding="utf-8"?>
 <ds:datastoreItem xmlns:ds="http://schemas.openxmlformats.org/officeDocument/2006/customXml" ds:itemID="{838CEF72-1B4D-4D33-9891-FFC95F507282}">
   <ds:schemaRefs>
     <ds:schemaRef ds:uri="http://schemas.microsoft.com/office/2006/metadata/contentType"/>
@@ -52663,12 +53093,4 @@
     <ds:schemaRef ds:uri="http://schemas.microsoft.com/internal/obd"/>
   </ds:schemaRefs>
 </ds:datastoreItem>
-</file>
-
-<file path=customXml/itemProps5.xml><?xml version="1.0" encoding="utf-8"?>
-<ds:datastoreItem xmlns:ds="http://schemas.openxmlformats.org/officeDocument/2006/customXml" ds:itemID="{B7C1A596-E5BE-4405-BB39-8891EE7E0A9A}">
-  <ds:schemaRefs>
-    <ds:schemaRef ds:uri="http://schemas.microsoft.com/sharepoint/v3/contenttype/forms"/>
-  </ds:schemaRefs>
-</ds:datastoreItem>
 </file>
</xml_diff>

<commit_message>
Úprava bp a smazání nepotřebných fotek
</commit_message>
<xml_diff>
--- a/bp_svobo229_v2.docx
+++ b/bp_svobo229_v2.docx
@@ -1260,7 +1260,7 @@
       <w:r>
         <w:fldChar w:fldCharType="separate"/>
       </w:r>
-      <w:hyperlink w:anchor="_Toc226373068" w:history="1">
+      <w:hyperlink w:anchor="_Toc226829936" w:history="1">
         <w:r>
           <w:rPr>
             <w:rStyle w:val="Hypertextovodkaz"/>
@@ -1287,7 +1287,7 @@
             <w:noProof/>
             <w:webHidden/>
           </w:rPr>
-          <w:instrText xml:space="preserve"> PAGEREF _Toc226373068 \h </w:instrText>
+          <w:instrText xml:space="preserve"> PAGEREF _Toc226829936 \h </w:instrText>
         </w:r>
         <w:r>
           <w:rPr>
@@ -1335,7 +1335,7 @@
           <w14:ligatures w14:val="standardContextual"/>
         </w:rPr>
       </w:pPr>
-      <w:hyperlink w:anchor="_Toc226373069" w:history="1">
+      <w:hyperlink w:anchor="_Toc226829937" w:history="1">
         <w:r>
           <w:rPr>
             <w:rStyle w:val="Hypertextovodkaz"/>
@@ -1362,7 +1362,7 @@
             <w:noProof/>
             <w:webHidden/>
           </w:rPr>
-          <w:instrText xml:space="preserve"> PAGEREF _Toc226373069 \h </w:instrText>
+          <w:instrText xml:space="preserve"> PAGEREF _Toc226829937 \h </w:instrText>
         </w:r>
         <w:r>
           <w:rPr>
@@ -1410,7 +1410,7 @@
           <w14:ligatures w14:val="standardContextual"/>
         </w:rPr>
       </w:pPr>
-      <w:hyperlink w:anchor="_Toc226373070" w:history="1">
+      <w:hyperlink w:anchor="_Toc226829938" w:history="1">
         <w:r>
           <w:rPr>
             <w:rStyle w:val="Hypertextovodkaz"/>
@@ -1437,7 +1437,7 @@
             <w:noProof/>
             <w:webHidden/>
           </w:rPr>
-          <w:instrText xml:space="preserve"> PAGEREF _Toc226373070 \h </w:instrText>
+          <w:instrText xml:space="preserve"> PAGEREF _Toc226829938 \h </w:instrText>
         </w:r>
         <w:r>
           <w:rPr>
@@ -1486,7 +1486,7 @@
           <w14:ligatures w14:val="standardContextual"/>
         </w:rPr>
       </w:pPr>
-      <w:hyperlink w:anchor="_Toc226373071" w:history="1">
+      <w:hyperlink w:anchor="_Toc226829939" w:history="1">
         <w:r>
           <w:rPr>
             <w:rStyle w:val="Hypertextovodkaz"/>
@@ -1533,7 +1533,7 @@
             <w:noProof/>
             <w:webHidden/>
           </w:rPr>
-          <w:instrText xml:space="preserve"> PAGEREF _Toc226373071 \h </w:instrText>
+          <w:instrText xml:space="preserve"> PAGEREF _Toc226829939 \h </w:instrText>
         </w:r>
         <w:r>
           <w:rPr>
@@ -1581,7 +1581,7 @@
           <w14:ligatures w14:val="standardContextual"/>
         </w:rPr>
       </w:pPr>
-      <w:hyperlink w:anchor="_Toc226373072" w:history="1">
+      <w:hyperlink w:anchor="_Toc226829940" w:history="1">
         <w:r>
           <w:rPr>
             <w:rStyle w:val="Hypertextovodkaz"/>
@@ -1627,7 +1627,7 @@
             <w:noProof/>
             <w:webHidden/>
           </w:rPr>
-          <w:instrText xml:space="preserve"> PAGEREF _Toc226373072 \h </w:instrText>
+          <w:instrText xml:space="preserve"> PAGEREF _Toc226829940 \h </w:instrText>
         </w:r>
         <w:r>
           <w:rPr>
@@ -1675,7 +1675,7 @@
           <w14:ligatures w14:val="standardContextual"/>
         </w:rPr>
       </w:pPr>
-      <w:hyperlink w:anchor="_Toc226373073" w:history="1">
+      <w:hyperlink w:anchor="_Toc226829941" w:history="1">
         <w:r>
           <w:rPr>
             <w:rStyle w:val="Hypertextovodkaz"/>
@@ -1721,7 +1721,7 @@
             <w:noProof/>
             <w:webHidden/>
           </w:rPr>
-          <w:instrText xml:space="preserve"> PAGEREF _Toc226373073 \h </w:instrText>
+          <w:instrText xml:space="preserve"> PAGEREF _Toc226829941 \h </w:instrText>
         </w:r>
         <w:r>
           <w:rPr>
@@ -1770,7 +1770,7 @@
           <w14:ligatures w14:val="standardContextual"/>
         </w:rPr>
       </w:pPr>
-      <w:hyperlink w:anchor="_Toc226373074" w:history="1">
+      <w:hyperlink w:anchor="_Toc226829942" w:history="1">
         <w:r>
           <w:rPr>
             <w:rStyle w:val="Hypertextovodkaz"/>
@@ -1817,7 +1817,7 @@
             <w:noProof/>
             <w:webHidden/>
           </w:rPr>
-          <w:instrText xml:space="preserve"> PAGEREF _Toc226373074 \h </w:instrText>
+          <w:instrText xml:space="preserve"> PAGEREF _Toc226829942 \h </w:instrText>
         </w:r>
         <w:r>
           <w:rPr>
@@ -1865,7 +1865,7 @@
           <w14:ligatures w14:val="standardContextual"/>
         </w:rPr>
       </w:pPr>
-      <w:hyperlink w:anchor="_Toc226373075" w:history="1">
+      <w:hyperlink w:anchor="_Toc226829943" w:history="1">
         <w:r>
           <w:rPr>
             <w:rStyle w:val="Hypertextovodkaz"/>
@@ -1911,7 +1911,7 @@
             <w:noProof/>
             <w:webHidden/>
           </w:rPr>
-          <w:instrText xml:space="preserve"> PAGEREF _Toc226373075 \h </w:instrText>
+          <w:instrText xml:space="preserve"> PAGEREF _Toc226829943 \h </w:instrText>
         </w:r>
         <w:r>
           <w:rPr>
@@ -1959,7 +1959,7 @@
           <w14:ligatures w14:val="standardContextual"/>
         </w:rPr>
       </w:pPr>
-      <w:hyperlink w:anchor="_Toc226373076" w:history="1">
+      <w:hyperlink w:anchor="_Toc226829944" w:history="1">
         <w:r>
           <w:rPr>
             <w:rStyle w:val="Hypertextovodkaz"/>
@@ -2005,7 +2005,7 @@
             <w:noProof/>
             <w:webHidden/>
           </w:rPr>
-          <w:instrText xml:space="preserve"> PAGEREF _Toc226373076 \h </w:instrText>
+          <w:instrText xml:space="preserve"> PAGEREF _Toc226829944 \h </w:instrText>
         </w:r>
         <w:r>
           <w:rPr>
@@ -2053,7 +2053,7 @@
           <w14:ligatures w14:val="standardContextual"/>
         </w:rPr>
       </w:pPr>
-      <w:hyperlink w:anchor="_Toc226373077" w:history="1">
+      <w:hyperlink w:anchor="_Toc226829945" w:history="1">
         <w:r>
           <w:rPr>
             <w:rStyle w:val="Hypertextovodkaz"/>
@@ -2099,7 +2099,7 @@
             <w:noProof/>
             <w:webHidden/>
           </w:rPr>
-          <w:instrText xml:space="preserve"> PAGEREF _Toc226373077 \h </w:instrText>
+          <w:instrText xml:space="preserve"> PAGEREF _Toc226829945 \h </w:instrText>
         </w:r>
         <w:r>
           <w:rPr>
@@ -2147,7 +2147,7 @@
           <w14:ligatures w14:val="standardContextual"/>
         </w:rPr>
       </w:pPr>
-      <w:hyperlink w:anchor="_Toc226373078" w:history="1">
+      <w:hyperlink w:anchor="_Toc226829946" w:history="1">
         <w:r>
           <w:rPr>
             <w:rStyle w:val="Hypertextovodkaz"/>
@@ -2193,7 +2193,7 @@
             <w:noProof/>
             <w:webHidden/>
           </w:rPr>
-          <w:instrText xml:space="preserve"> PAGEREF _Toc226373078 \h </w:instrText>
+          <w:instrText xml:space="preserve"> PAGEREF _Toc226829946 \h </w:instrText>
         </w:r>
         <w:r>
           <w:rPr>
@@ -2241,7 +2241,7 @@
           <w14:ligatures w14:val="standardContextual"/>
         </w:rPr>
       </w:pPr>
-      <w:hyperlink w:anchor="_Toc226373079" w:history="1">
+      <w:hyperlink w:anchor="_Toc226829947" w:history="1">
         <w:r>
           <w:rPr>
             <w:rStyle w:val="Hypertextovodkaz"/>
@@ -2287,7 +2287,7 @@
             <w:noProof/>
             <w:webHidden/>
           </w:rPr>
-          <w:instrText xml:space="preserve"> PAGEREF _Toc226373079 \h </w:instrText>
+          <w:instrText xml:space="preserve"> PAGEREF _Toc226829947 \h </w:instrText>
         </w:r>
         <w:r>
           <w:rPr>
@@ -2335,7 +2335,7 @@
           <w14:ligatures w14:val="standardContextual"/>
         </w:rPr>
       </w:pPr>
-      <w:hyperlink w:anchor="_Toc226373080" w:history="1">
+      <w:hyperlink w:anchor="_Toc226829948" w:history="1">
         <w:r>
           <w:rPr>
             <w:rStyle w:val="Hypertextovodkaz"/>
@@ -2381,7 +2381,7 @@
             <w:noProof/>
             <w:webHidden/>
           </w:rPr>
-          <w:instrText xml:space="preserve"> PAGEREF _Toc226373080 \h </w:instrText>
+          <w:instrText xml:space="preserve"> PAGEREF _Toc226829948 \h </w:instrText>
         </w:r>
         <w:r>
           <w:rPr>
@@ -2429,7 +2429,7 @@
           <w14:ligatures w14:val="standardContextual"/>
         </w:rPr>
       </w:pPr>
-      <w:hyperlink w:anchor="_Toc226373081" w:history="1">
+      <w:hyperlink w:anchor="_Toc226829949" w:history="1">
         <w:r>
           <w:rPr>
             <w:rStyle w:val="Hypertextovodkaz"/>
@@ -2475,7 +2475,7 @@
             <w:noProof/>
             <w:webHidden/>
           </w:rPr>
-          <w:instrText xml:space="preserve"> PAGEREF _Toc226373081 \h </w:instrText>
+          <w:instrText xml:space="preserve"> PAGEREF _Toc226829949 \h </w:instrText>
         </w:r>
         <w:r>
           <w:rPr>
@@ -2523,7 +2523,7 @@
           <w14:ligatures w14:val="standardContextual"/>
         </w:rPr>
       </w:pPr>
-      <w:hyperlink w:anchor="_Toc226373082" w:history="1">
+      <w:hyperlink w:anchor="_Toc226829950" w:history="1">
         <w:r>
           <w:rPr>
             <w:rStyle w:val="Hypertextovodkaz"/>
@@ -2569,7 +2569,7 @@
             <w:noProof/>
             <w:webHidden/>
           </w:rPr>
-          <w:instrText xml:space="preserve"> PAGEREF _Toc226373082 \h </w:instrText>
+          <w:instrText xml:space="preserve"> PAGEREF _Toc226829950 \h </w:instrText>
         </w:r>
         <w:r>
           <w:rPr>
@@ -2618,7 +2618,7 @@
           <w14:ligatures w14:val="standardContextual"/>
         </w:rPr>
       </w:pPr>
-      <w:hyperlink w:anchor="_Toc226373083" w:history="1">
+      <w:hyperlink w:anchor="_Toc226829951" w:history="1">
         <w:r>
           <w:rPr>
             <w:rStyle w:val="Hypertextovodkaz"/>
@@ -2665,7 +2665,7 @@
             <w:noProof/>
             <w:webHidden/>
           </w:rPr>
-          <w:instrText xml:space="preserve"> PAGEREF _Toc226373083 \h </w:instrText>
+          <w:instrText xml:space="preserve"> PAGEREF _Toc226829951 \h </w:instrText>
         </w:r>
         <w:r>
           <w:rPr>
@@ -2713,7 +2713,7 @@
           <w14:ligatures w14:val="standardContextual"/>
         </w:rPr>
       </w:pPr>
-      <w:hyperlink w:anchor="_Toc226373084" w:history="1">
+      <w:hyperlink w:anchor="_Toc226829952" w:history="1">
         <w:r>
           <w:rPr>
             <w:rStyle w:val="Hypertextovodkaz"/>
@@ -2759,7 +2759,7 @@
             <w:noProof/>
             <w:webHidden/>
           </w:rPr>
-          <w:instrText xml:space="preserve"> PAGEREF _Toc226373084 \h </w:instrText>
+          <w:instrText xml:space="preserve"> PAGEREF _Toc226829952 \h </w:instrText>
         </w:r>
         <w:r>
           <w:rPr>
@@ -2807,7 +2807,7 @@
           <w14:ligatures w14:val="standardContextual"/>
         </w:rPr>
       </w:pPr>
-      <w:hyperlink w:anchor="_Toc226373085" w:history="1">
+      <w:hyperlink w:anchor="_Toc226829953" w:history="1">
         <w:r>
           <w:rPr>
             <w:rStyle w:val="Hypertextovodkaz"/>
@@ -2853,7 +2853,7 @@
             <w:noProof/>
             <w:webHidden/>
           </w:rPr>
-          <w:instrText xml:space="preserve"> PAGEREF _Toc226373085 \h </w:instrText>
+          <w:instrText xml:space="preserve"> PAGEREF _Toc226829953 \h </w:instrText>
         </w:r>
         <w:r>
           <w:rPr>
@@ -2901,7 +2901,7 @@
           <w14:ligatures w14:val="standardContextual"/>
         </w:rPr>
       </w:pPr>
-      <w:hyperlink w:anchor="_Toc226373086" w:history="1">
+      <w:hyperlink w:anchor="_Toc226829954" w:history="1">
         <w:r>
           <w:rPr>
             <w:rStyle w:val="Hypertextovodkaz"/>
@@ -2947,7 +2947,7 @@
             <w:noProof/>
             <w:webHidden/>
           </w:rPr>
-          <w:instrText xml:space="preserve"> PAGEREF _Toc226373086 \h </w:instrText>
+          <w:instrText xml:space="preserve"> PAGEREF _Toc226829954 \h </w:instrText>
         </w:r>
         <w:r>
           <w:rPr>
@@ -2996,7 +2996,7 @@
           <w14:ligatures w14:val="standardContextual"/>
         </w:rPr>
       </w:pPr>
-      <w:hyperlink w:anchor="_Toc226373087" w:history="1">
+      <w:hyperlink w:anchor="_Toc226829955" w:history="1">
         <w:r>
           <w:rPr>
             <w:rStyle w:val="Hypertextovodkaz"/>
@@ -3043,7 +3043,7 @@
             <w:noProof/>
             <w:webHidden/>
           </w:rPr>
-          <w:instrText xml:space="preserve"> PAGEREF _Toc226373087 \h </w:instrText>
+          <w:instrText xml:space="preserve"> PAGEREF _Toc226829955 \h </w:instrText>
         </w:r>
         <w:r>
           <w:rPr>
@@ -3063,7 +3063,7 @@
             <w:noProof/>
             <w:webHidden/>
           </w:rPr>
-          <w:t>28</w:t>
+          <w:t>29</w:t>
         </w:r>
         <w:r>
           <w:rPr>
@@ -3091,7 +3091,7 @@
           <w14:ligatures w14:val="standardContextual"/>
         </w:rPr>
       </w:pPr>
-      <w:hyperlink w:anchor="_Toc226373088" w:history="1">
+      <w:hyperlink w:anchor="_Toc226829956" w:history="1">
         <w:r>
           <w:rPr>
             <w:rStyle w:val="Hypertextovodkaz"/>
@@ -3137,7 +3137,7 @@
             <w:noProof/>
             <w:webHidden/>
           </w:rPr>
-          <w:instrText xml:space="preserve"> PAGEREF _Toc226373088 \h </w:instrText>
+          <w:instrText xml:space="preserve"> PAGEREF _Toc226829956 \h </w:instrText>
         </w:r>
         <w:r>
           <w:rPr>
@@ -3157,7 +3157,7 @@
             <w:noProof/>
             <w:webHidden/>
           </w:rPr>
-          <w:t>28</w:t>
+          <w:t>29</w:t>
         </w:r>
         <w:r>
           <w:rPr>
@@ -3185,7 +3185,7 @@
           <w14:ligatures w14:val="standardContextual"/>
         </w:rPr>
       </w:pPr>
-      <w:hyperlink w:anchor="_Toc226373089" w:history="1">
+      <w:hyperlink w:anchor="_Toc226829957" w:history="1">
         <w:r>
           <w:rPr>
             <w:rStyle w:val="Hypertextovodkaz"/>
@@ -3231,7 +3231,7 @@
             <w:noProof/>
             <w:webHidden/>
           </w:rPr>
-          <w:instrText xml:space="preserve"> PAGEREF _Toc226373089 \h </w:instrText>
+          <w:instrText xml:space="preserve"> PAGEREF _Toc226829957 \h </w:instrText>
         </w:r>
         <w:r>
           <w:rPr>
@@ -3251,7 +3251,7 @@
             <w:noProof/>
             <w:webHidden/>
           </w:rPr>
-          <w:t>32</w:t>
+          <w:t>36</w:t>
         </w:r>
         <w:r>
           <w:rPr>
@@ -3280,7 +3280,7 @@
           <w14:ligatures w14:val="standardContextual"/>
         </w:rPr>
       </w:pPr>
-      <w:hyperlink w:anchor="_Toc226373090" w:history="1">
+      <w:hyperlink w:anchor="_Toc226829958" w:history="1">
         <w:r>
           <w:rPr>
             <w:rStyle w:val="Hypertextovodkaz"/>
@@ -3327,7 +3327,7 @@
             <w:noProof/>
             <w:webHidden/>
           </w:rPr>
-          <w:instrText xml:space="preserve"> PAGEREF _Toc226373090 \h </w:instrText>
+          <w:instrText xml:space="preserve"> PAGEREF _Toc226829958 \h </w:instrText>
         </w:r>
         <w:r>
           <w:rPr>
@@ -3347,7 +3347,7 @@
             <w:noProof/>
             <w:webHidden/>
           </w:rPr>
-          <w:t>42</w:t>
+          <w:t>47</w:t>
         </w:r>
         <w:r>
           <w:rPr>
@@ -3375,7 +3375,7 @@
           <w14:ligatures w14:val="standardContextual"/>
         </w:rPr>
       </w:pPr>
-      <w:hyperlink w:anchor="_Toc226373091" w:history="1">
+      <w:hyperlink w:anchor="_Toc226829959" w:history="1">
         <w:r>
           <w:rPr>
             <w:rStyle w:val="Hypertextovodkaz"/>
@@ -3402,7 +3402,7 @@
             <w:noProof/>
             <w:webHidden/>
           </w:rPr>
-          <w:instrText xml:space="preserve"> PAGEREF _Toc226373091 \h </w:instrText>
+          <w:instrText xml:space="preserve"> PAGEREF _Toc226829959 \h </w:instrText>
         </w:r>
         <w:r>
           <w:rPr>
@@ -3422,7 +3422,7 @@
             <w:noProof/>
             <w:webHidden/>
           </w:rPr>
-          <w:t>43</w:t>
+          <w:t>48</w:t>
         </w:r>
         <w:r>
           <w:rPr>
@@ -3450,7 +3450,7 @@
           <w14:ligatures w14:val="standardContextual"/>
         </w:rPr>
       </w:pPr>
-      <w:hyperlink w:anchor="_Toc226373092" w:history="1">
+      <w:hyperlink w:anchor="_Toc226829960" w:history="1">
         <w:r>
           <w:rPr>
             <w:rStyle w:val="Hypertextovodkaz"/>
@@ -3477,7 +3477,7 @@
             <w:noProof/>
             <w:webHidden/>
           </w:rPr>
-          <w:instrText xml:space="preserve"> PAGEREF _Toc226373092 \h </w:instrText>
+          <w:instrText xml:space="preserve"> PAGEREF _Toc226829960 \h </w:instrText>
         </w:r>
         <w:r>
           <w:rPr>
@@ -3497,7 +3497,7 @@
             <w:noProof/>
             <w:webHidden/>
           </w:rPr>
-          <w:t>44</w:t>
+          <w:t>49</w:t>
         </w:r>
         <w:r>
           <w:rPr>
@@ -3537,7 +3537,7 @@
           <w:numId w:val="0"/>
         </w:numPr>
       </w:pPr>
-      <w:bookmarkStart w:id="0" w:name="_Toc226373068"/>
+      <w:bookmarkStart w:id="0" w:name="_Toc226829936"/>
       <w:r>
         <w:lastRenderedPageBreak/>
         <w:t>Seznam obrázků</w:t>
@@ -3578,7 +3578,7 @@
         </w:rPr>
         <w:fldChar w:fldCharType="separate"/>
       </w:r>
-      <w:hyperlink w:anchor="_Toc226373051" w:history="1">
+      <w:hyperlink w:anchor="_Toc226829961" w:history="1">
         <w:r>
           <w:rPr>
             <w:rStyle w:val="Hypertextovodkaz"/>
@@ -3605,7 +3605,7 @@
             <w:noProof/>
             <w:webHidden/>
           </w:rPr>
-          <w:instrText xml:space="preserve"> PAGEREF _Toc226373051 \h </w:instrText>
+          <w:instrText xml:space="preserve"> PAGEREF _Toc226829961 \h </w:instrText>
         </w:r>
         <w:r>
           <w:rPr>
@@ -3652,7 +3652,7 @@
           <w14:ligatures w14:val="standardContextual"/>
         </w:rPr>
       </w:pPr>
-      <w:hyperlink w:anchor="_Toc226373052" w:history="1">
+      <w:hyperlink w:anchor="_Toc226829962" w:history="1">
         <w:r>
           <w:rPr>
             <w:rStyle w:val="Hypertextovodkaz"/>
@@ -3679,7 +3679,7 @@
             <w:noProof/>
             <w:webHidden/>
           </w:rPr>
-          <w:instrText xml:space="preserve"> PAGEREF _Toc226373052 \h </w:instrText>
+          <w:instrText xml:space="preserve"> PAGEREF _Toc226829962 \h </w:instrText>
         </w:r>
         <w:r>
           <w:rPr>
@@ -3726,7 +3726,7 @@
           <w14:ligatures w14:val="standardContextual"/>
         </w:rPr>
       </w:pPr>
-      <w:hyperlink w:anchor="_Toc226373053" w:history="1">
+      <w:hyperlink w:anchor="_Toc226829963" w:history="1">
         <w:r>
           <w:rPr>
             <w:rStyle w:val="Hypertextovodkaz"/>
@@ -3753,7 +3753,7 @@
             <w:noProof/>
             <w:webHidden/>
           </w:rPr>
-          <w:instrText xml:space="preserve"> PAGEREF _Toc226373053 \h </w:instrText>
+          <w:instrText xml:space="preserve"> PAGEREF _Toc226829963 \h </w:instrText>
         </w:r>
         <w:r>
           <w:rPr>
@@ -3800,7 +3800,7 @@
           <w14:ligatures w14:val="standardContextual"/>
         </w:rPr>
       </w:pPr>
-      <w:hyperlink w:anchor="_Toc226373054" w:history="1">
+      <w:hyperlink w:anchor="_Toc226829964" w:history="1">
         <w:r>
           <w:rPr>
             <w:rStyle w:val="Hypertextovodkaz"/>
@@ -3827,7 +3827,7 @@
             <w:noProof/>
             <w:webHidden/>
           </w:rPr>
-          <w:instrText xml:space="preserve"> PAGEREF _Toc226373054 \h </w:instrText>
+          <w:instrText xml:space="preserve"> PAGEREF _Toc226829964 \h </w:instrText>
         </w:r>
         <w:r>
           <w:rPr>
@@ -3874,7 +3874,7 @@
           <w14:ligatures w14:val="standardContextual"/>
         </w:rPr>
       </w:pPr>
-      <w:hyperlink w:anchor="_Toc226373055" w:history="1">
+      <w:hyperlink w:anchor="_Toc226829965" w:history="1">
         <w:r>
           <w:rPr>
             <w:rStyle w:val="Hypertextovodkaz"/>
@@ -3901,7 +3901,7 @@
             <w:noProof/>
             <w:webHidden/>
           </w:rPr>
-          <w:instrText xml:space="preserve"> PAGEREF _Toc226373055 \h </w:instrText>
+          <w:instrText xml:space="preserve"> PAGEREF _Toc226829965 \h </w:instrText>
         </w:r>
         <w:r>
           <w:rPr>
@@ -3948,7 +3948,7 @@
           <w14:ligatures w14:val="standardContextual"/>
         </w:rPr>
       </w:pPr>
-      <w:hyperlink w:anchor="_Toc226373056" w:history="1">
+      <w:hyperlink w:anchor="_Toc226829966" w:history="1">
         <w:r>
           <w:rPr>
             <w:rStyle w:val="Hypertextovodkaz"/>
@@ -3975,7 +3975,7 @@
             <w:noProof/>
             <w:webHidden/>
           </w:rPr>
-          <w:instrText xml:space="preserve"> PAGEREF _Toc226373056 \h </w:instrText>
+          <w:instrText xml:space="preserve"> PAGEREF _Toc226829966 \h </w:instrText>
         </w:r>
         <w:r>
           <w:rPr>
@@ -4022,7 +4022,7 @@
           <w14:ligatures w14:val="standardContextual"/>
         </w:rPr>
       </w:pPr>
-      <w:hyperlink w:anchor="_Toc226373057" w:history="1">
+      <w:hyperlink w:anchor="_Toc226829967" w:history="1">
         <w:r>
           <w:rPr>
             <w:rStyle w:val="Hypertextovodkaz"/>
@@ -4049,7 +4049,7 @@
             <w:noProof/>
             <w:webHidden/>
           </w:rPr>
-          <w:instrText xml:space="preserve"> PAGEREF _Toc226373057 \h </w:instrText>
+          <w:instrText xml:space="preserve"> PAGEREF _Toc226829967 \h </w:instrText>
         </w:r>
         <w:r>
           <w:rPr>
@@ -4096,7 +4096,7 @@
           <w14:ligatures w14:val="standardContextual"/>
         </w:rPr>
       </w:pPr>
-      <w:hyperlink w:anchor="_Toc226373058" w:history="1">
+      <w:hyperlink w:anchor="_Toc226829968" w:history="1">
         <w:r>
           <w:rPr>
             <w:rStyle w:val="Hypertextovodkaz"/>
@@ -4123,7 +4123,7 @@
             <w:noProof/>
             <w:webHidden/>
           </w:rPr>
-          <w:instrText xml:space="preserve"> PAGEREF _Toc226373058 \h </w:instrText>
+          <w:instrText xml:space="preserve"> PAGEREF _Toc226829968 \h </w:instrText>
         </w:r>
         <w:r>
           <w:rPr>
@@ -4170,7 +4170,7 @@
           <w14:ligatures w14:val="standardContextual"/>
         </w:rPr>
       </w:pPr>
-      <w:hyperlink w:anchor="_Toc226373059" w:history="1">
+      <w:hyperlink w:anchor="_Toc226829969" w:history="1">
         <w:r>
           <w:rPr>
             <w:rStyle w:val="Hypertextovodkaz"/>
@@ -4197,7 +4197,7 @@
             <w:noProof/>
             <w:webHidden/>
           </w:rPr>
-          <w:instrText xml:space="preserve"> PAGEREF _Toc226373059 \h </w:instrText>
+          <w:instrText xml:space="preserve"> PAGEREF _Toc226829969 \h </w:instrText>
         </w:r>
         <w:r>
           <w:rPr>
@@ -4244,7 +4244,7 @@
           <w14:ligatures w14:val="standardContextual"/>
         </w:rPr>
       </w:pPr>
-      <w:hyperlink w:anchor="_Toc226373060" w:history="1">
+      <w:hyperlink w:anchor="_Toc226829970" w:history="1">
         <w:r>
           <w:rPr>
             <w:rStyle w:val="Hypertextovodkaz"/>
@@ -4271,7 +4271,7 @@
             <w:noProof/>
             <w:webHidden/>
           </w:rPr>
-          <w:instrText xml:space="preserve"> PAGEREF _Toc226373060 \h </w:instrText>
+          <w:instrText xml:space="preserve"> PAGEREF _Toc226829970 \h </w:instrText>
         </w:r>
         <w:r>
           <w:rPr>
@@ -4318,7 +4318,7 @@
           <w14:ligatures w14:val="standardContextual"/>
         </w:rPr>
       </w:pPr>
-      <w:hyperlink w:anchor="_Toc226373061" w:history="1">
+      <w:hyperlink w:anchor="_Toc226829971" w:history="1">
         <w:r>
           <w:rPr>
             <w:rStyle w:val="Hypertextovodkaz"/>
@@ -4345,7 +4345,7 @@
             <w:noProof/>
             <w:webHidden/>
           </w:rPr>
-          <w:instrText xml:space="preserve"> PAGEREF _Toc226373061 \h </w:instrText>
+          <w:instrText xml:space="preserve"> PAGEREF _Toc226829971 \h </w:instrText>
         </w:r>
         <w:r>
           <w:rPr>
@@ -4392,7 +4392,7 @@
           <w14:ligatures w14:val="standardContextual"/>
         </w:rPr>
       </w:pPr>
-      <w:hyperlink w:anchor="_Toc226373062" w:history="1">
+      <w:hyperlink w:anchor="_Toc226829972" w:history="1">
         <w:r>
           <w:rPr>
             <w:rStyle w:val="Hypertextovodkaz"/>
@@ -4419,7 +4419,7 @@
             <w:noProof/>
             <w:webHidden/>
           </w:rPr>
-          <w:instrText xml:space="preserve"> PAGEREF _Toc226373062 \h </w:instrText>
+          <w:instrText xml:space="preserve"> PAGEREF _Toc226829972 \h </w:instrText>
         </w:r>
         <w:r>
           <w:rPr>
@@ -4466,7 +4466,7 @@
           <w14:ligatures w14:val="standardContextual"/>
         </w:rPr>
       </w:pPr>
-      <w:hyperlink w:anchor="_Toc226373063" w:history="1">
+      <w:hyperlink w:anchor="_Toc226829973" w:history="1">
         <w:r>
           <w:rPr>
             <w:rStyle w:val="Hypertextovodkaz"/>
@@ -4493,7 +4493,7 @@
             <w:noProof/>
             <w:webHidden/>
           </w:rPr>
-          <w:instrText xml:space="preserve"> PAGEREF _Toc226373063 \h </w:instrText>
+          <w:instrText xml:space="preserve"> PAGEREF _Toc226829973 \h </w:instrText>
         </w:r>
         <w:r>
           <w:rPr>
@@ -4540,7 +4540,7 @@
           <w14:ligatures w14:val="standardContextual"/>
         </w:rPr>
       </w:pPr>
-      <w:hyperlink w:anchor="_Toc226373064" w:history="1">
+      <w:hyperlink w:anchor="_Toc226829974" w:history="1">
         <w:r>
           <w:rPr>
             <w:rStyle w:val="Hypertextovodkaz"/>
@@ -4567,7 +4567,7 @@
             <w:noProof/>
             <w:webHidden/>
           </w:rPr>
-          <w:instrText xml:space="preserve"> PAGEREF _Toc226373064 \h </w:instrText>
+          <w:instrText xml:space="preserve"> PAGEREF _Toc226829974 \h </w:instrText>
         </w:r>
         <w:r>
           <w:rPr>
@@ -4614,13 +4614,13 @@
           <w14:ligatures w14:val="standardContextual"/>
         </w:rPr>
       </w:pPr>
-      <w:hyperlink w:anchor="_Toc226373065" w:history="1">
+      <w:hyperlink w:anchor="_Toc226829975" w:history="1">
         <w:r>
           <w:rPr>
             <w:rStyle w:val="Hypertextovodkaz"/>
             <w:noProof/>
           </w:rPr>
-          <w:t>Obr. 16 Diagram</w:t>
+          <w:t>Obr. 15 Diagram</w:t>
         </w:r>
         <w:r>
           <w:rPr>
@@ -4641,81 +4641,7 @@
             <w:noProof/>
             <w:webHidden/>
           </w:rPr>
-          <w:instrText xml:space="preserve"> PAGEREF _Toc226373065 \h </w:instrText>
-        </w:r>
-        <w:r>
-          <w:rPr>
-            <w:noProof/>
-            <w:webHidden/>
-          </w:rPr>
-        </w:r>
-        <w:r>
-          <w:rPr>
-            <w:noProof/>
-            <w:webHidden/>
-          </w:rPr>
-          <w:fldChar w:fldCharType="separate"/>
-        </w:r>
-        <w:r>
-          <w:rPr>
-            <w:noProof/>
-            <w:webHidden/>
-          </w:rPr>
-          <w:t>27</w:t>
-        </w:r>
-        <w:r>
-          <w:rPr>
-            <w:noProof/>
-            <w:webHidden/>
-          </w:rPr>
-          <w:fldChar w:fldCharType="end"/>
-        </w:r>
-      </w:hyperlink>
-    </w:p>
-    <w:p>
-      <w:pPr>
-        <w:pStyle w:val="Seznamobrzk"/>
-        <w:tabs>
-          <w:tab w:val="right" w:leader="dot" w:pos="8493"/>
-        </w:tabs>
-        <w:rPr>
-          <w:rFonts w:eastAsiaTheme="minorEastAsia"/>
-          <w:noProof/>
-          <w:kern w:val="2"/>
-          <w:sz w:val="24"/>
-          <w:szCs w:val="24"/>
-          <w:lang w:eastAsia="cs-CZ"/>
-          <w14:ligatures w14:val="standardContextual"/>
-        </w:rPr>
-      </w:pPr>
-      <w:hyperlink w:anchor="_Toc226373066" w:history="1">
-        <w:r>
-          <w:rPr>
-            <w:rStyle w:val="Hypertextovodkaz"/>
-            <w:noProof/>
-          </w:rPr>
-          <w:t>Obr. 17: Struktura frontendu</w:t>
-        </w:r>
-        <w:r>
-          <w:rPr>
-            <w:noProof/>
-            <w:webHidden/>
-          </w:rPr>
-          <w:tab/>
-        </w:r>
-        <w:r>
-          <w:rPr>
-            <w:noProof/>
-            <w:webHidden/>
-          </w:rPr>
-          <w:fldChar w:fldCharType="begin"/>
-        </w:r>
-        <w:r>
-          <w:rPr>
-            <w:noProof/>
-            <w:webHidden/>
-          </w:rPr>
-          <w:instrText xml:space="preserve"> PAGEREF _Toc226373066 \h </w:instrText>
+          <w:instrText xml:space="preserve"> PAGEREF _Toc226829975 \h </w:instrText>
         </w:r>
         <w:r>
           <w:rPr>
@@ -4762,13 +4688,13 @@
           <w14:ligatures w14:val="standardContextual"/>
         </w:rPr>
       </w:pPr>
-      <w:hyperlink w:anchor="_Toc226373067" w:history="1">
+      <w:hyperlink w:anchor="_Toc226829976" w:history="1">
         <w:r>
           <w:rPr>
             <w:rStyle w:val="Hypertextovodkaz"/>
             <w:noProof/>
           </w:rPr>
-          <w:t>Obr. 18: Struktura backendu</w:t>
+          <w:t>Obr. 16: Struktura frontendu</w:t>
         </w:r>
         <w:r>
           <w:rPr>
@@ -4789,7 +4715,7 @@
             <w:noProof/>
             <w:webHidden/>
           </w:rPr>
-          <w:instrText xml:space="preserve"> PAGEREF _Toc226373067 \h </w:instrText>
+          <w:instrText xml:space="preserve"> PAGEREF _Toc226829976 \h </w:instrText>
         </w:r>
         <w:r>
           <w:rPr>
@@ -4809,7 +4735,7 @@
             <w:noProof/>
             <w:webHidden/>
           </w:rPr>
-          <w:t>32</w:t>
+          <w:t>29</w:t>
         </w:r>
         <w:r>
           <w:rPr>
@@ -4822,6 +4748,228 @@
     </w:p>
     <w:p>
       <w:pPr>
+        <w:pStyle w:val="Seznamobrzk"/>
+        <w:tabs>
+          <w:tab w:val="right" w:leader="dot" w:pos="8493"/>
+        </w:tabs>
+        <w:rPr>
+          <w:rFonts w:eastAsiaTheme="minorEastAsia"/>
+          <w:noProof/>
+          <w:kern w:val="2"/>
+          <w:sz w:val="24"/>
+          <w:szCs w:val="24"/>
+          <w:lang w:eastAsia="cs-CZ"/>
+          <w14:ligatures w14:val="standardContextual"/>
+        </w:rPr>
+      </w:pPr>
+      <w:hyperlink w:anchor="_Toc226829977" w:history="1">
+        <w:r>
+          <w:rPr>
+            <w:rStyle w:val="Hypertextovodkaz"/>
+            <w:noProof/>
+          </w:rPr>
+          <w:t>Obr. 17: Zkoušky</w:t>
+        </w:r>
+        <w:r>
+          <w:rPr>
+            <w:noProof/>
+            <w:webHidden/>
+          </w:rPr>
+          <w:tab/>
+        </w:r>
+        <w:r>
+          <w:rPr>
+            <w:noProof/>
+            <w:webHidden/>
+          </w:rPr>
+          <w:fldChar w:fldCharType="begin"/>
+        </w:r>
+        <w:r>
+          <w:rPr>
+            <w:noProof/>
+            <w:webHidden/>
+          </w:rPr>
+          <w:instrText xml:space="preserve"> PAGEREF _Toc226829977 \h </w:instrText>
+        </w:r>
+        <w:r>
+          <w:rPr>
+            <w:noProof/>
+            <w:webHidden/>
+          </w:rPr>
+        </w:r>
+        <w:r>
+          <w:rPr>
+            <w:noProof/>
+            <w:webHidden/>
+          </w:rPr>
+          <w:fldChar w:fldCharType="separate"/>
+        </w:r>
+        <w:r>
+          <w:rPr>
+            <w:noProof/>
+            <w:webHidden/>
+          </w:rPr>
+          <w:t>35</w:t>
+        </w:r>
+        <w:r>
+          <w:rPr>
+            <w:noProof/>
+            <w:webHidden/>
+          </w:rPr>
+          <w:fldChar w:fldCharType="end"/>
+        </w:r>
+      </w:hyperlink>
+    </w:p>
+    <w:p>
+      <w:pPr>
+        <w:pStyle w:val="Seznamobrzk"/>
+        <w:tabs>
+          <w:tab w:val="right" w:leader="dot" w:pos="8493"/>
+        </w:tabs>
+        <w:rPr>
+          <w:rFonts w:eastAsiaTheme="minorEastAsia"/>
+          <w:noProof/>
+          <w:kern w:val="2"/>
+          <w:sz w:val="24"/>
+          <w:szCs w:val="24"/>
+          <w:lang w:eastAsia="cs-CZ"/>
+          <w14:ligatures w14:val="standardContextual"/>
+        </w:rPr>
+      </w:pPr>
+      <w:hyperlink w:anchor="_Toc226829978" w:history="1">
+        <w:r>
+          <w:rPr>
+            <w:rStyle w:val="Hypertextovodkaz"/>
+            <w:noProof/>
+          </w:rPr>
+          <w:t>Obr. 18: Ukázka mobilní responzivity</w:t>
+        </w:r>
+        <w:r>
+          <w:rPr>
+            <w:noProof/>
+            <w:webHidden/>
+          </w:rPr>
+          <w:tab/>
+        </w:r>
+        <w:r>
+          <w:rPr>
+            <w:noProof/>
+            <w:webHidden/>
+          </w:rPr>
+          <w:fldChar w:fldCharType="begin"/>
+        </w:r>
+        <w:r>
+          <w:rPr>
+            <w:noProof/>
+            <w:webHidden/>
+          </w:rPr>
+          <w:instrText xml:space="preserve"> PAGEREF _Toc226829978 \h </w:instrText>
+        </w:r>
+        <w:r>
+          <w:rPr>
+            <w:noProof/>
+            <w:webHidden/>
+          </w:rPr>
+        </w:r>
+        <w:r>
+          <w:rPr>
+            <w:noProof/>
+            <w:webHidden/>
+          </w:rPr>
+          <w:fldChar w:fldCharType="separate"/>
+        </w:r>
+        <w:r>
+          <w:rPr>
+            <w:noProof/>
+            <w:webHidden/>
+          </w:rPr>
+          <w:t>36</w:t>
+        </w:r>
+        <w:r>
+          <w:rPr>
+            <w:noProof/>
+            <w:webHidden/>
+          </w:rPr>
+          <w:fldChar w:fldCharType="end"/>
+        </w:r>
+      </w:hyperlink>
+    </w:p>
+    <w:p>
+      <w:pPr>
+        <w:pStyle w:val="Seznamobrzk"/>
+        <w:tabs>
+          <w:tab w:val="right" w:leader="dot" w:pos="8493"/>
+        </w:tabs>
+        <w:rPr>
+          <w:rFonts w:eastAsiaTheme="minorEastAsia"/>
+          <w:noProof/>
+          <w:kern w:val="2"/>
+          <w:sz w:val="24"/>
+          <w:szCs w:val="24"/>
+          <w:lang w:eastAsia="cs-CZ"/>
+          <w14:ligatures w14:val="standardContextual"/>
+        </w:rPr>
+      </w:pPr>
+      <w:hyperlink w:anchor="_Toc226829979" w:history="1">
+        <w:r>
+          <w:rPr>
+            <w:rStyle w:val="Hypertextovodkaz"/>
+            <w:noProof/>
+          </w:rPr>
+          <w:t>Obr. 19: Struktura backendu</w:t>
+        </w:r>
+        <w:r>
+          <w:rPr>
+            <w:noProof/>
+            <w:webHidden/>
+          </w:rPr>
+          <w:tab/>
+        </w:r>
+        <w:r>
+          <w:rPr>
+            <w:noProof/>
+            <w:webHidden/>
+          </w:rPr>
+          <w:fldChar w:fldCharType="begin"/>
+        </w:r>
+        <w:r>
+          <w:rPr>
+            <w:noProof/>
+            <w:webHidden/>
+          </w:rPr>
+          <w:instrText xml:space="preserve"> PAGEREF _Toc226829979 \h </w:instrText>
+        </w:r>
+        <w:r>
+          <w:rPr>
+            <w:noProof/>
+            <w:webHidden/>
+          </w:rPr>
+        </w:r>
+        <w:r>
+          <w:rPr>
+            <w:noProof/>
+            <w:webHidden/>
+          </w:rPr>
+          <w:fldChar w:fldCharType="separate"/>
+        </w:r>
+        <w:r>
+          <w:rPr>
+            <w:noProof/>
+            <w:webHidden/>
+          </w:rPr>
+          <w:t>37</w:t>
+        </w:r>
+        <w:r>
+          <w:rPr>
+            <w:noProof/>
+            <w:webHidden/>
+          </w:rPr>
+          <w:fldChar w:fldCharType="end"/>
+        </w:r>
+      </w:hyperlink>
+    </w:p>
+    <w:p>
+      <w:pPr>
         <w:spacing w:after="160"/>
         <w:rPr>
           <w:color w:val="A6A6A6" w:themeColor="background1" w:themeShade="A6"/>
@@ -4852,7 +5000,7 @@
         </w:numPr>
         <w:ind w:left="431" w:hanging="431"/>
       </w:pPr>
-      <w:bookmarkStart w:id="1" w:name="_Toc226373069"/>
+      <w:bookmarkStart w:id="1" w:name="_Toc226829937"/>
       <w:r>
         <w:lastRenderedPageBreak/>
         <w:t>Seznam zkratek</w:t>
@@ -5065,7 +5213,7 @@
         </w:numPr>
         <w:ind w:left="431" w:hanging="431"/>
       </w:pPr>
-      <w:bookmarkStart w:id="2" w:name="_Toc226373070"/>
+      <w:bookmarkStart w:id="2" w:name="_Toc226829938"/>
       <w:r>
         <w:lastRenderedPageBreak/>
         <w:t>Úvod</w:t>
@@ -5150,7 +5298,7 @@
       <w:pPr>
         <w:pStyle w:val="Nadpis1"/>
       </w:pPr>
-      <w:bookmarkStart w:id="3" w:name="_Toc226373071"/>
+      <w:bookmarkStart w:id="3" w:name="_Toc226829939"/>
       <w:r>
         <w:lastRenderedPageBreak/>
         <w:t>Komunikace se zákazníkem</w:t>
@@ -5197,7 +5345,7 @@
       <w:pPr>
         <w:pStyle w:val="Nadpis2"/>
       </w:pPr>
-      <w:bookmarkStart w:id="4" w:name="_Toc226373072"/>
+      <w:bookmarkStart w:id="4" w:name="_Toc226829940"/>
       <w:r>
         <w:t>Stanovení požadovaných funkcí</w:t>
       </w:r>
@@ -5251,7 +5399,7 @@
       <w:pPr>
         <w:pStyle w:val="Nadpis2"/>
       </w:pPr>
-      <w:bookmarkStart w:id="5" w:name="_Toc226373073"/>
+      <w:bookmarkStart w:id="5" w:name="_Toc226829941"/>
       <w:r>
         <w:t>Návrh grafického designu</w:t>
       </w:r>
@@ -5313,7 +5461,7 @@
       <w:pPr>
         <w:pStyle w:val="Nadpis1"/>
       </w:pPr>
-      <w:bookmarkStart w:id="6" w:name="_Toc226373074"/>
+      <w:bookmarkStart w:id="6" w:name="_Toc226829942"/>
       <w:r>
         <w:lastRenderedPageBreak/>
         <w:t>Teoretická východiska</w:t>
@@ -5356,7 +5504,7 @@
       <w:pPr>
         <w:pStyle w:val="Nadpis2"/>
       </w:pPr>
-      <w:bookmarkStart w:id="7" w:name="_Toc226373075"/>
+      <w:bookmarkStart w:id="7" w:name="_Toc226829943"/>
       <w:r>
         <w:t>Co to je Taekwondo</w:t>
       </w:r>
@@ -5506,7 +5654,7 @@
       <w:pPr>
         <w:pStyle w:val="Nadpis2"/>
       </w:pPr>
-      <w:bookmarkStart w:id="8" w:name="_Toc226373076"/>
+      <w:bookmarkStart w:id="8" w:name="_Toc226829944"/>
       <w:r>
         <w:t>Úvod do problematiky webových stránek</w:t>
       </w:r>
@@ -5622,7 +5770,7 @@
       <w:pPr>
         <w:pStyle w:val="Nadpis2"/>
       </w:pPr>
-      <w:bookmarkStart w:id="9" w:name="_Toc226373077"/>
+      <w:bookmarkStart w:id="9" w:name="_Toc226829945"/>
       <w:r>
         <w:lastRenderedPageBreak/>
         <w:t>Definice webových stránek</w:t>
@@ -5710,7 +5858,7 @@
       <w:pPr>
         <w:pStyle w:val="Nadpis2"/>
       </w:pPr>
-      <w:bookmarkStart w:id="10" w:name="_Toc226373078"/>
+      <w:bookmarkStart w:id="10" w:name="_Toc226829946"/>
       <w:r>
         <w:t>Význam webových stránek</w:t>
       </w:r>
@@ -5731,7 +5879,7 @@
       <w:pPr>
         <w:pStyle w:val="Nadpis2"/>
       </w:pPr>
-      <w:bookmarkStart w:id="11" w:name="_Toc226373079"/>
+      <w:bookmarkStart w:id="11" w:name="_Toc226829947"/>
       <w:r>
         <w:t>Historický vývoj</w:t>
       </w:r>
@@ -5752,7 +5900,7 @@
       <w:pPr>
         <w:pStyle w:val="Nadpis2"/>
       </w:pPr>
-      <w:bookmarkStart w:id="12" w:name="_Toc226373080"/>
+      <w:bookmarkStart w:id="12" w:name="_Toc226829948"/>
       <w:r>
         <w:t>Současné trendy</w:t>
       </w:r>
@@ -5815,7 +5963,7 @@
       <w:pPr>
         <w:pStyle w:val="Nadpis2"/>
       </w:pPr>
-      <w:bookmarkStart w:id="13" w:name="_Toc226373081"/>
+      <w:bookmarkStart w:id="13" w:name="_Toc226829949"/>
       <w:r>
         <w:lastRenderedPageBreak/>
         <w:t>Bezpečnost</w:t>
@@ -5980,7 +6128,13 @@
         <w:t>Subjekt údajů má právo na to být informován o zpracování jeho osobních údajů.</w:t>
       </w:r>
       <w:r>
-        <w:t xml:space="preserve"> Přístupem k osobním údajům se rozumí právo subjektu získat od správce informaci (potvrzení), zda jsou či nejsou jeho osobní údaje zpracovávány a pokud jsou zpracovávány, má subjekt údajů právo osobní údaje získat a zároveň má právo získat následující informace:</w:t>
+        <w:t xml:space="preserve"> Přístupem k osobním údajům se rozumí právo subjektu získat od správce informaci (potvrzení), zda jsou </w:t>
+      </w:r>
+      <w:r>
+        <w:br/>
+      </w:r>
+      <w:r>
+        <w:t>či nejsou jeho osobní údaje zpracovávány a pokud jsou zpracovávány, má subjekt údajů právo osobní údaje získat a zároveň má právo získat následující informace:</w:t>
       </w:r>
     </w:p>
     <w:p>
@@ -6089,7 +6243,7 @@
       <w:pPr>
         <w:pStyle w:val="Nadpis2"/>
       </w:pPr>
-      <w:bookmarkStart w:id="14" w:name="_Toc226373082"/>
+      <w:bookmarkStart w:id="14" w:name="_Toc226829950"/>
       <w:r>
         <w:lastRenderedPageBreak/>
         <w:t>Technologie a nástroje pro vývoj webu</w:t>
@@ -6315,31 +6469,18 @@
       <w:pPr>
         <w:pStyle w:val="Titulek"/>
       </w:pPr>
-      <w:bookmarkStart w:id="15" w:name="_Toc226373051"/>
+      <w:bookmarkStart w:id="15" w:name="_Toc226829961"/>
       <w:r>
         <w:t xml:space="preserve">Obr. </w:t>
       </w:r>
-      <w:r>
-        <w:fldChar w:fldCharType="begin"/>
-      </w:r>
-      <w:r>
-        <w:instrText xml:space="preserve"> SEQ Obr. \* ARABIC </w:instrText>
-      </w:r>
-      <w:r>
-        <w:fldChar w:fldCharType="separate"/>
-      </w:r>
-      <w:r>
-        <w:rPr>
-          <w:noProof/>
-        </w:rPr>
-        <w:t>1</w:t>
-      </w:r>
-      <w:r>
-        <w:rPr>
-          <w:noProof/>
-        </w:rPr>
-        <w:fldChar w:fldCharType="end"/>
-      </w:r>
+      <w:fldSimple w:instr=" SEQ Obr. \* ARABIC ">
+        <w:r>
+          <w:rPr>
+            <w:noProof/>
+          </w:rPr>
+          <w:t>1</w:t>
+        </w:r>
+      </w:fldSimple>
       <w:r>
         <w:t xml:space="preserve">: </w:t>
       </w:r>
@@ -6635,31 +6776,18 @@
       <w:pPr>
         <w:pStyle w:val="Titulek"/>
       </w:pPr>
-      <w:bookmarkStart w:id="16" w:name="_Toc226373052"/>
+      <w:bookmarkStart w:id="16" w:name="_Toc226829962"/>
       <w:r>
         <w:t xml:space="preserve">Obr. </w:t>
       </w:r>
-      <w:r>
-        <w:fldChar w:fldCharType="begin"/>
-      </w:r>
-      <w:r>
-        <w:instrText xml:space="preserve"> SEQ Obr. \* ARABIC </w:instrText>
-      </w:r>
-      <w:r>
-        <w:fldChar w:fldCharType="separate"/>
-      </w:r>
-      <w:r>
-        <w:rPr>
-          <w:noProof/>
-        </w:rPr>
-        <w:t>2</w:t>
-      </w:r>
-      <w:r>
-        <w:rPr>
-          <w:noProof/>
-        </w:rPr>
-        <w:fldChar w:fldCharType="end"/>
-      </w:r>
+      <w:fldSimple w:instr=" SEQ Obr. \* ARABIC ">
+        <w:r>
+          <w:rPr>
+            <w:noProof/>
+          </w:rPr>
+          <w:t>2</w:t>
+        </w:r>
+      </w:fldSimple>
       <w:r>
         <w:t>: Ukázka hooku</w:t>
       </w:r>
@@ -6767,31 +6895,18 @@
       <w:pPr>
         <w:pStyle w:val="Titulek"/>
       </w:pPr>
-      <w:bookmarkStart w:id="17" w:name="_Toc226373053"/>
+      <w:bookmarkStart w:id="17" w:name="_Toc226829963"/>
       <w:r>
         <w:t xml:space="preserve">Obr. </w:t>
       </w:r>
-      <w:r>
-        <w:fldChar w:fldCharType="begin"/>
-      </w:r>
-      <w:r>
-        <w:instrText xml:space="preserve"> SEQ Obr. \* ARABIC </w:instrText>
-      </w:r>
-      <w:r>
-        <w:fldChar w:fldCharType="separate"/>
-      </w:r>
-      <w:r>
-        <w:rPr>
-          <w:noProof/>
-        </w:rPr>
-        <w:t>3</w:t>
-      </w:r>
-      <w:r>
-        <w:rPr>
-          <w:noProof/>
-        </w:rPr>
-        <w:fldChar w:fldCharType="end"/>
-      </w:r>
+      <w:fldSimple w:instr=" SEQ Obr. \* ARABIC ">
+        <w:r>
+          <w:rPr>
+            <w:noProof/>
+          </w:rPr>
+          <w:t>3</w:t>
+        </w:r>
+      </w:fldSimple>
       <w:r>
         <w:t>: Příklad komponenty</w:t>
       </w:r>
@@ -6896,31 +7011,18 @@
       <w:pPr>
         <w:pStyle w:val="Titulek"/>
       </w:pPr>
-      <w:bookmarkStart w:id="18" w:name="_Toc226373054"/>
+      <w:bookmarkStart w:id="18" w:name="_Toc226829964"/>
       <w:r>
         <w:t xml:space="preserve">Obr. </w:t>
       </w:r>
-      <w:r>
-        <w:fldChar w:fldCharType="begin"/>
-      </w:r>
-      <w:r>
-        <w:instrText xml:space="preserve"> SEQ Obr. \* ARABIC </w:instrText>
-      </w:r>
-      <w:r>
-        <w:fldChar w:fldCharType="separate"/>
-      </w:r>
-      <w:r>
-        <w:rPr>
-          <w:noProof/>
-        </w:rPr>
-        <w:t>4</w:t>
-      </w:r>
-      <w:r>
-        <w:rPr>
-          <w:noProof/>
-        </w:rPr>
-        <w:fldChar w:fldCharType="end"/>
-      </w:r>
+      <w:fldSimple w:instr=" SEQ Obr. \* ARABIC ">
+        <w:r>
+          <w:rPr>
+            <w:noProof/>
+          </w:rPr>
+          <w:t>4</w:t>
+        </w:r>
+      </w:fldSimple>
       <w:r>
         <w:t>: Komponenta se vstupy</w:t>
       </w:r>
@@ -6985,31 +7087,18 @@
       <w:pPr>
         <w:pStyle w:val="Titulek"/>
       </w:pPr>
-      <w:bookmarkStart w:id="19" w:name="_Toc226373055"/>
+      <w:bookmarkStart w:id="19" w:name="_Toc226829965"/>
       <w:r>
         <w:t xml:space="preserve">Obr. </w:t>
       </w:r>
-      <w:r>
-        <w:fldChar w:fldCharType="begin"/>
-      </w:r>
-      <w:r>
-        <w:instrText xml:space="preserve"> SEQ Obr. \* ARABIC </w:instrText>
-      </w:r>
-      <w:r>
-        <w:fldChar w:fldCharType="separate"/>
-      </w:r>
-      <w:r>
-        <w:rPr>
-          <w:noProof/>
-        </w:rPr>
-        <w:t>5</w:t>
-      </w:r>
-      <w:r>
-        <w:rPr>
-          <w:noProof/>
-        </w:rPr>
-        <w:fldChar w:fldCharType="end"/>
-      </w:r>
+      <w:fldSimple w:instr=" SEQ Obr. \* ARABIC ">
+        <w:r>
+          <w:rPr>
+            <w:noProof/>
+          </w:rPr>
+          <w:t>5</w:t>
+        </w:r>
+      </w:fldSimple>
       <w:r>
         <w:t>: Práce se vstupy</w:t>
       </w:r>
@@ -7078,31 +7167,18 @@
       <w:pPr>
         <w:pStyle w:val="Titulek"/>
       </w:pPr>
-      <w:bookmarkStart w:id="20" w:name="_Toc226373056"/>
+      <w:bookmarkStart w:id="20" w:name="_Toc226829966"/>
       <w:r>
         <w:t xml:space="preserve">Obr. </w:t>
       </w:r>
-      <w:r>
-        <w:fldChar w:fldCharType="begin"/>
-      </w:r>
-      <w:r>
-        <w:instrText xml:space="preserve"> SEQ Obr. \* ARABIC </w:instrText>
-      </w:r>
-      <w:r>
-        <w:fldChar w:fldCharType="separate"/>
-      </w:r>
-      <w:r>
-        <w:rPr>
-          <w:noProof/>
-        </w:rPr>
-        <w:t>6</w:t>
-      </w:r>
-      <w:r>
-        <w:rPr>
-          <w:noProof/>
-        </w:rPr>
-        <w:fldChar w:fldCharType="end"/>
-      </w:r>
+      <w:fldSimple w:instr=" SEQ Obr. \* ARABIC ">
+        <w:r>
+          <w:rPr>
+            <w:noProof/>
+          </w:rPr>
+          <w:t>6</w:t>
+        </w:r>
+      </w:fldSimple>
       <w:r>
         <w:t>: Použití komponenty</w:t>
       </w:r>
@@ -7205,31 +7281,18 @@
       <w:pPr>
         <w:pStyle w:val="Titulek"/>
       </w:pPr>
-      <w:bookmarkStart w:id="21" w:name="_Toc226373057"/>
+      <w:bookmarkStart w:id="21" w:name="_Toc226829967"/>
       <w:r>
         <w:t xml:space="preserve">Obr. </w:t>
       </w:r>
-      <w:r>
-        <w:fldChar w:fldCharType="begin"/>
-      </w:r>
-      <w:r>
-        <w:instrText xml:space="preserve"> SEQ Obr. \* ARABIC </w:instrText>
-      </w:r>
-      <w:r>
-        <w:fldChar w:fldCharType="separate"/>
-      </w:r>
-      <w:r>
-        <w:rPr>
-          <w:noProof/>
-        </w:rPr>
-        <w:t>7</w:t>
-      </w:r>
-      <w:r>
-        <w:rPr>
-          <w:noProof/>
-        </w:rPr>
-        <w:fldChar w:fldCharType="end"/>
-      </w:r>
+      <w:fldSimple w:instr=" SEQ Obr. \* ARABIC ">
+        <w:r>
+          <w:rPr>
+            <w:noProof/>
+          </w:rPr>
+          <w:t>7</w:t>
+        </w:r>
+      </w:fldSimple>
       <w:r>
         <w:t>: Porovnání DOMu</w:t>
       </w:r>
@@ -7335,31 +7398,18 @@
       <w:pPr>
         <w:pStyle w:val="Titulek"/>
       </w:pPr>
-      <w:bookmarkStart w:id="22" w:name="_Toc226373058"/>
+      <w:bookmarkStart w:id="22" w:name="_Toc226829968"/>
       <w:r>
         <w:t xml:space="preserve">Obr. </w:t>
       </w:r>
-      <w:r>
-        <w:fldChar w:fldCharType="begin"/>
-      </w:r>
-      <w:r>
-        <w:instrText xml:space="preserve"> SEQ Obr. \* ARABIC </w:instrText>
-      </w:r>
-      <w:r>
-        <w:fldChar w:fldCharType="separate"/>
-      </w:r>
-      <w:r>
-        <w:rPr>
-          <w:noProof/>
-        </w:rPr>
-        <w:t>8</w:t>
-      </w:r>
-      <w:r>
-        <w:rPr>
-          <w:noProof/>
-        </w:rPr>
-        <w:fldChar w:fldCharType="end"/>
-      </w:r>
+      <w:fldSimple w:instr=" SEQ Obr. \* ARABIC ">
+        <w:r>
+          <w:rPr>
+            <w:noProof/>
+          </w:rPr>
+          <w:t>8</w:t>
+        </w:r>
+      </w:fldSimple>
       <w:r>
         <w:t>: Ukázka JSX</w:t>
       </w:r>
@@ -7502,31 +7552,18 @@
       <w:pPr>
         <w:pStyle w:val="Titulek"/>
       </w:pPr>
-      <w:bookmarkStart w:id="23" w:name="_Toc226373059"/>
+      <w:bookmarkStart w:id="23" w:name="_Toc226829969"/>
       <w:r>
         <w:t xml:space="preserve">Obr. </w:t>
       </w:r>
-      <w:r>
-        <w:fldChar w:fldCharType="begin"/>
-      </w:r>
-      <w:r>
-        <w:instrText xml:space="preserve"> SEQ Obr. \* ARABIC </w:instrText>
-      </w:r>
-      <w:r>
-        <w:fldChar w:fldCharType="separate"/>
-      </w:r>
-      <w:r>
-        <w:rPr>
-          <w:noProof/>
-        </w:rPr>
-        <w:t>9</w:t>
-      </w:r>
-      <w:r>
-        <w:rPr>
-          <w:noProof/>
-        </w:rPr>
-        <w:fldChar w:fldCharType="end"/>
-      </w:r>
+      <w:fldSimple w:instr=" SEQ Obr. \* ARABIC ">
+        <w:r>
+          <w:rPr>
+            <w:noProof/>
+          </w:rPr>
+          <w:t>9</w:t>
+        </w:r>
+      </w:fldSimple>
       <w:r>
         <w:t>: Ukázka kódu NodeJS</w:t>
       </w:r>
@@ -7793,31 +7830,18 @@
       <w:pPr>
         <w:pStyle w:val="Titulek"/>
       </w:pPr>
-      <w:bookmarkStart w:id="24" w:name="_Toc226373060"/>
+      <w:bookmarkStart w:id="24" w:name="_Toc226829970"/>
       <w:r>
         <w:t xml:space="preserve">Obr. </w:t>
       </w:r>
-      <w:r>
-        <w:fldChar w:fldCharType="begin"/>
-      </w:r>
-      <w:r>
-        <w:instrText xml:space="preserve"> SEQ Obr. \* ARABIC </w:instrText>
-      </w:r>
-      <w:r>
-        <w:fldChar w:fldCharType="separate"/>
-      </w:r>
-      <w:r>
-        <w:rPr>
-          <w:noProof/>
-        </w:rPr>
-        <w:t>10</w:t>
-      </w:r>
-      <w:r>
-        <w:rPr>
-          <w:noProof/>
-        </w:rPr>
-        <w:fldChar w:fldCharType="end"/>
-      </w:r>
+      <w:fldSimple w:instr=" SEQ Obr. \* ARABIC ">
+        <w:r>
+          <w:rPr>
+            <w:noProof/>
+          </w:rPr>
+          <w:t>10</w:t>
+        </w:r>
+      </w:fldSimple>
       <w:r>
         <w:t>: Logo NPM</w:t>
       </w:r>
@@ -7930,31 +7954,18 @@
       <w:pPr>
         <w:pStyle w:val="Titulek"/>
       </w:pPr>
-      <w:bookmarkStart w:id="25" w:name="_Toc226373061"/>
+      <w:bookmarkStart w:id="25" w:name="_Toc226829971"/>
       <w:r>
         <w:t xml:space="preserve">Obr. </w:t>
       </w:r>
-      <w:r>
-        <w:fldChar w:fldCharType="begin"/>
-      </w:r>
-      <w:r>
-        <w:instrText xml:space="preserve"> SEQ Obr. \* ARABIC </w:instrText>
-      </w:r>
-      <w:r>
-        <w:fldChar w:fldCharType="separate"/>
-      </w:r>
-      <w:r>
-        <w:rPr>
-          <w:noProof/>
-        </w:rPr>
-        <w:t>11</w:t>
-      </w:r>
-      <w:r>
-        <w:rPr>
-          <w:noProof/>
-        </w:rPr>
-        <w:fldChar w:fldCharType="end"/>
-      </w:r>
+      <w:fldSimple w:instr=" SEQ Obr. \* ARABIC ">
+        <w:r>
+          <w:rPr>
+            <w:noProof/>
+          </w:rPr>
+          <w:t>11</w:t>
+        </w:r>
+      </w:fldSimple>
       <w:r>
         <w:t>: Prostředí MySQL</w:t>
       </w:r>
@@ -8082,31 +8093,18 @@
       <w:pPr>
         <w:pStyle w:val="Titulek"/>
       </w:pPr>
-      <w:bookmarkStart w:id="26" w:name="_Toc226373062"/>
+      <w:bookmarkStart w:id="26" w:name="_Toc226829972"/>
       <w:r>
         <w:t xml:space="preserve">Obr. </w:t>
       </w:r>
-      <w:r>
-        <w:fldChar w:fldCharType="begin"/>
-      </w:r>
-      <w:r>
-        <w:instrText xml:space="preserve"> SEQ Obr. \* ARABIC </w:instrText>
-      </w:r>
-      <w:r>
-        <w:fldChar w:fldCharType="separate"/>
-      </w:r>
-      <w:r>
-        <w:rPr>
-          <w:noProof/>
-        </w:rPr>
-        <w:t>12</w:t>
-      </w:r>
-      <w:r>
-        <w:rPr>
-          <w:noProof/>
-        </w:rPr>
-        <w:fldChar w:fldCharType="end"/>
-      </w:r>
+      <w:fldSimple w:instr=" SEQ Obr. \* ARABIC ">
+        <w:r>
+          <w:rPr>
+            <w:noProof/>
+          </w:rPr>
+          <w:t>12</w:t>
+        </w:r>
+      </w:fldSimple>
       <w:r>
         <w:t>: Prostřední Figmy</w:t>
       </w:r>
@@ -8225,31 +8223,18 @@
       <w:pPr>
         <w:pStyle w:val="Titulek"/>
       </w:pPr>
-      <w:bookmarkStart w:id="27" w:name="_Toc226373063"/>
+      <w:bookmarkStart w:id="27" w:name="_Toc226829973"/>
       <w:r>
         <w:t xml:space="preserve">Obr. </w:t>
       </w:r>
-      <w:r>
-        <w:fldChar w:fldCharType="begin"/>
-      </w:r>
-      <w:r>
-        <w:instrText xml:space="preserve"> SEQ Obr. \* ARABIC </w:instrText>
-      </w:r>
-      <w:r>
-        <w:fldChar w:fldCharType="separate"/>
-      </w:r>
-      <w:r>
-        <w:rPr>
-          <w:noProof/>
-        </w:rPr>
-        <w:t>13</w:t>
-      </w:r>
-      <w:r>
-        <w:rPr>
-          <w:noProof/>
-        </w:rPr>
-        <w:fldChar w:fldCharType="end"/>
-      </w:r>
+      <w:fldSimple w:instr=" SEQ Obr. \* ARABIC ">
+        <w:r>
+          <w:rPr>
+            <w:noProof/>
+          </w:rPr>
+          <w:t>13</w:t>
+        </w:r>
+      </w:fldSimple>
       <w:r>
         <w:t>: Prostředí Visual Studio Code</w:t>
       </w:r>
@@ -8267,7 +8252,7 @@
       <w:pPr>
         <w:pStyle w:val="Nadpis1"/>
       </w:pPr>
-      <w:bookmarkStart w:id="28" w:name="_Toc226373083"/>
+      <w:bookmarkStart w:id="28" w:name="_Toc226829951"/>
       <w:r>
         <w:lastRenderedPageBreak/>
         <w:t>Návrh</w:t>
@@ -8289,7 +8274,7 @@
       <w:pPr>
         <w:pStyle w:val="Nadpis2"/>
       </w:pPr>
-      <w:bookmarkStart w:id="29" w:name="_Toc226373084"/>
+      <w:bookmarkStart w:id="29" w:name="_Toc226829952"/>
       <w:r>
         <w:t>Uživatelské prostředí</w:t>
       </w:r>
@@ -8404,31 +8389,18 @@
       <w:pPr>
         <w:pStyle w:val="Titulek"/>
       </w:pPr>
-      <w:bookmarkStart w:id="30" w:name="_Toc226373064"/>
+      <w:bookmarkStart w:id="30" w:name="_Toc226829974"/>
       <w:r>
         <w:t xml:space="preserve">Obr. </w:t>
       </w:r>
-      <w:r>
-        <w:fldChar w:fldCharType="begin"/>
-      </w:r>
-      <w:r>
-        <w:instrText xml:space="preserve"> SEQ Obr. \* ARABIC </w:instrText>
-      </w:r>
-      <w:r>
-        <w:fldChar w:fldCharType="separate"/>
-      </w:r>
-      <w:r>
-        <w:rPr>
-          <w:noProof/>
-        </w:rPr>
-        <w:t>14</w:t>
-      </w:r>
-      <w:r>
-        <w:rPr>
-          <w:noProof/>
-        </w:rPr>
-        <w:fldChar w:fldCharType="end"/>
-      </w:r>
+      <w:fldSimple w:instr=" SEQ Obr. \* ARABIC ">
+        <w:r>
+          <w:rPr>
+            <w:noProof/>
+          </w:rPr>
+          <w:t>14</w:t>
+        </w:r>
+      </w:fldSimple>
       <w:r>
         <w:t>: Návrh úvodní stránky</w:t>
       </w:r>
@@ -8454,7 +8426,7 @@
       <w:pPr>
         <w:pStyle w:val="Nadpis2"/>
       </w:pPr>
-      <w:bookmarkStart w:id="31" w:name="_Toc226373085"/>
+      <w:bookmarkStart w:id="31" w:name="_Toc226829953"/>
       <w:r>
         <w:lastRenderedPageBreak/>
         <w:t>Uživatelské role</w:t>
@@ -8637,7 +8609,13 @@
         <w:t xml:space="preserve"> webu.</w:t>
       </w:r>
       <w:r>
-        <w:t xml:space="preserve"> To zahrnuje turnaje, zkoušky, aktuality, informace týkající se oddílu, závodníky případně sestavy potřebné k</w:t>
+        <w:t xml:space="preserve"> To zahrnuje turnaje, zkoušky, aktuality, informace týkající se oddílu, závodníky případně sestavy potřebné </w:t>
+      </w:r>
+      <w:r>
+        <w:br/>
+      </w:r>
+      <w:r>
+        <w:t>k</w:t>
       </w:r>
       <w:r>
         <w:t xml:space="preserve"> úspěšnému</w:t>
@@ -8665,7 +8643,7 @@
       <w:pPr>
         <w:pStyle w:val="Nadpis2"/>
       </w:pPr>
-      <w:bookmarkStart w:id="32" w:name="_Toc226373086"/>
+      <w:bookmarkStart w:id="32" w:name="_Toc226829954"/>
       <w:r>
         <w:t>Databáze</w:t>
       </w:r>
@@ -8799,7 +8777,7 @@
         <w:t>bílého</w:t>
       </w:r>
       <w:r>
-        <w:t xml:space="preserve"> pásku přes barevné pásky až po jednotlivé dany černého pásku. Každý stupeň má svůj název (belt_name), označení cupu (cup, např. „8. CUP" nebo „1. DAN"),  cenu zkoušky (price), cestu k obrázku pásku (img_path), doplňující informace (info) a cestu k výukovému videu (video_path). Tabulka je ve vztahu 1:N s tabulkou fighters – jeden technický stupeň může mít více závodníků, ale každý závodník má právě jeden aktuální stupeň.</w:t>
+        <w:t xml:space="preserve"> pásku přes barevné pásky až po jednotlivé dany černého pásku. Každý stupeň má svůj název (belt_name), označení cupu (cup, např. „8. CUP" nebo „1. DAN"), cenu zkoušky (price), cestu k obrázku pásku (img_path), doplňující informace (info) a cestu k výukovému videu (video_path). Tabulka je ve vztahu 1:N s tabulkou fighters – jeden technický stupeň může mít více závodníků, ale každý závodník má právě jeden aktuální stupeň.</w:t>
       </w:r>
     </w:p>
     <w:p>
@@ -8866,7 +8844,13 @@
         <w:t>uživatelskou roli</w:t>
       </w:r>
       <w:r>
-        <w:t xml:space="preserve"> v systému a fighter_id umožňuje provázání uživatelského účtu s konkrétním závodníkem. </w:t>
+        <w:t xml:space="preserve"> v systému a fighter_id umožňuje provázání uživatelského účtu </w:t>
+      </w:r>
+      <w:r>
+        <w:br/>
+      </w:r>
+      <w:r>
+        <w:t xml:space="preserve">s konkrétním závodníkem. </w:t>
       </w:r>
       <w:r>
         <w:t>P</w:t>
@@ -8893,7 +8877,13 @@
         <w:t>.</w:t>
       </w:r>
       <w:r>
-        <w:t xml:space="preserve"> Tabulka obsahuje i sloupec status (status), který určuje v jakém stavu se nachází uživatelský účet po registraci, na výběr jsou 3 možnosti pending pro podané žádosti, approved pro potvrzené účty a rejected pro zamítnuté účty.</w:t>
+        <w:t xml:space="preserve"> Tabulka obsahuje i sloupec status (status), který určuje</w:t>
+      </w:r>
+      <w:r>
+        <w:t>,</w:t>
+      </w:r>
+      <w:r>
+        <w:t xml:space="preserve"> v jakém stavu se nachází uživatelský účet po registraci, na výběr jsou 3 možnosti pending pro podané žádosti, approved pro potvrzené účty a rejected pro zamítnuté účty.</w:t>
       </w:r>
     </w:p>
     <w:p>
@@ -8978,7 +8968,13 @@
         <w:t xml:space="preserve"> Nachází se zde i sloupec status (status), který </w:t>
       </w:r>
       <w:r>
-        <w:t>obsahuje záznam zda turnaj či zkouška již proběhly.</w:t>
+        <w:t>obsahuje záznam</w:t>
+      </w:r>
+      <w:r>
+        <w:t>,</w:t>
+      </w:r>
+      <w:r>
+        <w:t xml:space="preserve"> zda turnaj či zkouška již proběhly.</w:t>
       </w:r>
     </w:p>
     <w:p>
@@ -9144,7 +9140,6 @@
           <w:bCs/>
         </w:rPr>
       </w:pPr>
-      <w:proofErr w:type="spellStart"/>
       <w:r>
         <w:rPr>
           <w:b/>
@@ -9152,7 +9147,6 @@
         </w:rPr>
         <w:t>Exam</w:t>
       </w:r>
-      <w:proofErr w:type="spellEnd"/>
       <w:r>
         <w:rPr>
           <w:b/>
@@ -9170,29 +9164,8 @@
     </w:p>
     <w:p>
       <w:r>
-        <w:t>Tabulka zkoušky obsahuje informace o zkouškách, mezi tyto informace patří název zkoušky (title), potřebné informace (</w:t>
-      </w:r>
-      <w:proofErr w:type="spellStart"/>
-      <w:r>
-        <w:t>description</w:t>
-      </w:r>
-      <w:proofErr w:type="spellEnd"/>
-      <w:r>
-        <w:t>), datum konání (</w:t>
-      </w:r>
-      <w:proofErr w:type="spellStart"/>
-      <w:r>
-        <w:t>date</w:t>
-      </w:r>
-      <w:proofErr w:type="spellEnd"/>
-      <w:r>
-        <w:t>), datum do kterého je možné se na zkoušky přihlásit (registrable_date), místo konání (location), cenu zkoušky (price), status (status) určující, zda je zkouška viditelná či nikoliv, id uživatele, který zkoušku vytvořil (</w:t>
-      </w:r>
-      <w:proofErr w:type="spellStart"/>
-      <w:r>
-        <w:t>created_by</w:t>
-      </w:r>
-      <w:proofErr w:type="spellEnd"/>
+        <w:t>Tabulka zkoušky obsahuje informace o zkouškách, mezi tyto informace patří název zkoušky (title), potřebné informace (description), datum konání (date), datum do kterého je možné se na zkoušky přihlásit (registrable_date), místo konání (location), cenu zkoušky (price), status (status) určující, zda je zkouška viditelná či nikoliv, id uživatele, který zkoušku vytvořil (created_by</w:t>
+      </w:r>
       <w:r>
         <w:t>)</w:t>
       </w:r>
@@ -9203,15 +9176,7 @@
         <w:t xml:space="preserve"> časové razítko vypsání zkoušky (created_at)</w:t>
       </w:r>
       <w:r>
-        <w:t xml:space="preserve"> a Google Calendar API (</w:t>
-      </w:r>
-      <w:proofErr w:type="spellStart"/>
-      <w:r>
-        <w:t>google_calendar_api</w:t>
-      </w:r>
-      <w:proofErr w:type="spellEnd"/>
-      <w:r>
-        <w:t>) pro evidenci zkoušky v Google kalendáři</w:t>
+        <w:t xml:space="preserve"> a Google Calendar API (google_calendar_api) pro evidenci zkoušky v Google kalendáři</w:t>
       </w:r>
       <w:r>
         <w:t>.</w:t>
@@ -9224,7 +9189,6 @@
           <w:bCs/>
         </w:rPr>
       </w:pPr>
-      <w:proofErr w:type="spellStart"/>
       <w:r>
         <w:rPr>
           <w:b/>
@@ -9232,7 +9196,6 @@
         </w:rPr>
         <w:t>Exam_registration</w:t>
       </w:r>
-      <w:proofErr w:type="spellEnd"/>
       <w:r>
         <w:rPr>
           <w:b/>
@@ -9259,16 +9222,11 @@
       <w:r>
         <w:t xml:space="preserve">Tabulka </w:t>
       </w:r>
-      <w:proofErr w:type="spellStart"/>
       <w:r>
         <w:t>exam</w:t>
       </w:r>
       <w:r>
-        <w:t>_registration</w:t>
-      </w:r>
-      <w:proofErr w:type="spellEnd"/>
-      <w:r>
-        <w:t xml:space="preserve"> re</w:t>
+        <w:t>_registration re</w:t>
       </w:r>
       <w:r>
         <w:t>prezentuje</w:t>
@@ -9280,7 +9238,13 @@
         <w:t>spojovací</w:t>
       </w:r>
       <w:r>
-        <w:t xml:space="preserve"> tabulku vztahu M:N mezi závodníky a </w:t>
+        <w:t xml:space="preserve"> tabulku vztahu M:N mezi závodníky </w:t>
+      </w:r>
+      <w:r>
+        <w:br/>
+      </w:r>
+      <w:r>
+        <w:t xml:space="preserve">a </w:t>
       </w:r>
       <w:r>
         <w:t>zkouškami</w:t>
@@ -9289,15 +9253,7 @@
         <w:t xml:space="preserve">. </w:t>
       </w:r>
       <w:r>
-        <w:t xml:space="preserve">Závodník se může přihlásit na více zkoušek a jedna zkouška může mít více zaregistrovaných závodníků. Registrace obsahuje cizí klíč </w:t>
-      </w:r>
-      <w:proofErr w:type="spellStart"/>
-      <w:r>
-        <w:t>exam_id</w:t>
-      </w:r>
-      <w:proofErr w:type="spellEnd"/>
-      <w:r>
-        <w:t xml:space="preserve"> odkazující na zkoušku které registrace podléhá a fighter_id určující registrovaného závodníka</w:t>
+        <w:t>Závodník se může přihlásit na více zkoušek a jedna zkouška může mít více zaregistrovaných závodníků. Registrace obsahuje cizí klíč exam_id odkazující na zkoušku které registrace podléhá a fighter_id určující registrovaného závodníka</w:t>
       </w:r>
       <w:r>
         <w:t>, nachází se zde i časové razítko (created_at) určující, kdy se uživatel přihlásil.</w:t>
@@ -9335,13 +9291,8 @@
         <w:t xml:space="preserve"> tournament_registration</w:t>
       </w:r>
       <w:r>
-        <w:t xml:space="preserve"> a </w:t>
-      </w:r>
-      <w:proofErr w:type="spellStart"/>
-      <w:r>
-        <w:t>exam_registration</w:t>
-      </w:r>
-      <w:proofErr w:type="spellEnd"/>
+        <w:t xml:space="preserve"> a exam_registration</w:t>
+      </w:r>
       <w:r>
         <w:t>, kter</w:t>
       </w:r>
@@ -9355,7 +9306,13 @@
         <w:t>í</w:t>
       </w:r>
       <w:r>
-        <w:t xml:space="preserve"> závodníky s turnaji </w:t>
+        <w:t xml:space="preserve"> závodníky </w:t>
+      </w:r>
+      <w:r>
+        <w:br/>
+      </w:r>
+      <w:r>
+        <w:t xml:space="preserve">s turnaji </w:t>
       </w:r>
       <w:r>
         <w:t>a</w:t>
@@ -9378,13 +9335,8 @@
         <w:t xml:space="preserve"> event_photos</w:t>
       </w:r>
       <w:r>
-        <w:t xml:space="preserve">, tournament_registration a </w:t>
-      </w:r>
-      <w:proofErr w:type="spellStart"/>
-      <w:r>
-        <w:t>exam_registraion</w:t>
-      </w:r>
-      <w:proofErr w:type="spellEnd"/>
+        <w:t>, tournament_registration a exam_registraion</w:t>
+      </w:r>
       <w:r>
         <w:t xml:space="preserve"> použív</w:t>
       </w:r>
@@ -9446,31 +9398,18 @@
       <w:pPr>
         <w:pStyle w:val="Titulek"/>
       </w:pPr>
-      <w:bookmarkStart w:id="33" w:name="_Toc226373065"/>
+      <w:bookmarkStart w:id="33" w:name="_Toc226829975"/>
       <w:r>
         <w:t xml:space="preserve">Obr. </w:t>
       </w:r>
-      <w:r>
-        <w:fldChar w:fldCharType="begin"/>
-      </w:r>
-      <w:r>
-        <w:instrText xml:space="preserve"> SEQ Obr. \* ARABIC </w:instrText>
-      </w:r>
-      <w:r>
-        <w:fldChar w:fldCharType="separate"/>
-      </w:r>
-      <w:r>
-        <w:rPr>
-          <w:noProof/>
-        </w:rPr>
-        <w:t>15</w:t>
-      </w:r>
-      <w:r>
-        <w:rPr>
-          <w:noProof/>
-        </w:rPr>
-        <w:fldChar w:fldCharType="end"/>
-      </w:r>
+      <w:fldSimple w:instr=" SEQ Obr. \* ARABIC ">
+        <w:r>
+          <w:rPr>
+            <w:noProof/>
+          </w:rPr>
+          <w:t>15</w:t>
+        </w:r>
+      </w:fldSimple>
       <w:r>
         <w:t xml:space="preserve"> </w:t>
       </w:r>
@@ -9495,7 +9434,7 @@
       <w:pPr>
         <w:pStyle w:val="Nadpis1"/>
       </w:pPr>
-      <w:bookmarkStart w:id="34" w:name="_Toc226373087"/>
+      <w:bookmarkStart w:id="34" w:name="_Toc226829955"/>
       <w:r>
         <w:lastRenderedPageBreak/>
         <w:t>Praktická část</w:t>
@@ -9554,7 +9493,7 @@
       <w:pPr>
         <w:pStyle w:val="Nadpis2"/>
       </w:pPr>
-      <w:bookmarkStart w:id="35" w:name="_Toc226373088"/>
+      <w:bookmarkStart w:id="35" w:name="_Toc226829956"/>
       <w:r>
         <w:t>Frontend</w:t>
       </w:r>
@@ -9605,6 +9544,9 @@
         <w:jc w:val="center"/>
       </w:pPr>
       <w:r>
+        <w:rPr>
+          <w:noProof/>
+        </w:rPr>
         <w:drawing>
           <wp:inline distT="0" distB="0" distL="0" distR="0" wp14:anchorId="7A206AB8" wp14:editId="2DA018F0">
             <wp:extent cx="2060812" cy="3124103"/>
@@ -9646,31 +9588,18 @@
       <w:pPr>
         <w:pStyle w:val="Titulek"/>
       </w:pPr>
-      <w:bookmarkStart w:id="36" w:name="_Toc226373066"/>
+      <w:bookmarkStart w:id="36" w:name="_Toc226829976"/>
       <w:r>
         <w:t xml:space="preserve">Obr. </w:t>
       </w:r>
-      <w:r>
-        <w:fldChar w:fldCharType="begin"/>
-      </w:r>
-      <w:r>
-        <w:instrText xml:space="preserve"> SEQ Obr. \* ARABIC </w:instrText>
-      </w:r>
-      <w:r>
-        <w:fldChar w:fldCharType="separate"/>
-      </w:r>
-      <w:r>
-        <w:rPr>
-          <w:noProof/>
-        </w:rPr>
-        <w:t>16</w:t>
-      </w:r>
-      <w:r>
-        <w:rPr>
-          <w:noProof/>
-        </w:rPr>
-        <w:fldChar w:fldCharType="end"/>
-      </w:r>
+      <w:fldSimple w:instr=" SEQ Obr. \* ARABIC ">
+        <w:r>
+          <w:rPr>
+            <w:noProof/>
+          </w:rPr>
+          <w:t>16</w:t>
+        </w:r>
+      </w:fldSimple>
       <w:r>
         <w:t>: Struktura frontendu</w:t>
       </w:r>
@@ -10019,7 +9948,19 @@
     </w:p>
     <w:p>
       <w:r>
-        <w:t>V projektu se nachází složka layout ve které jsou definovány všechny klíčové komponenty, které definují to jak bude stránka vypadat. Nachází se zde header, footer, sidebar a také container ve kterém se vykreslují všechny komponenty specifické pro určité stránky.</w:t>
+        <w:t>V projektu se nachází složka layout</w:t>
+      </w:r>
+      <w:r>
+        <w:t>,</w:t>
+      </w:r>
+      <w:r>
+        <w:t xml:space="preserve"> ve které jsou definovány všechny klíčové komponenty, které definují to</w:t>
+      </w:r>
+      <w:r>
+        <w:t>,</w:t>
+      </w:r>
+      <w:r>
+        <w:t xml:space="preserve"> jak bude stránka vypadat. Nachází se zde header, footer, sidebar a také container ve kterém se vykreslují všechny komponenty specifické pro určité stránky.</w:t>
       </w:r>
       <w:r>
         <w:t xml:space="preserve"> Komponenty z </w:t>
@@ -10056,7 +9997,13 @@
         <w:t xml:space="preserve">. </w:t>
       </w:r>
       <w:r>
-        <w:t xml:space="preserve">Stará se o to, co uživatel uvidí a jak se aplikace bude chovat jako celek. </w:t>
+        <w:t xml:space="preserve">Stará se </w:t>
+      </w:r>
+      <w:r>
+        <w:br/>
+      </w:r>
+      <w:r>
+        <w:t xml:space="preserve">o to, co uživatel uvidí a jak se aplikace bude chovat jako celek. </w:t>
       </w:r>
       <w:r>
         <w:t xml:space="preserve">Jsou zde </w:t>
@@ -12833,7 +12780,6 @@
         </w:rPr>
         <w:t xml:space="preserve"> </w:t>
       </w:r>
-      <w:proofErr w:type="spellStart"/>
       <w:r>
         <w:rPr>
           <w:rFonts w:ascii="Consolas" w:eastAsia="Times New Roman" w:hAnsi="Consolas" w:cs="Times New Roman"/>
@@ -12844,7 +12790,6 @@
         </w:rPr>
         <w:t>AdminMe</w:t>
       </w:r>
-      <w:proofErr w:type="spellEnd"/>
       <w:r>
         <w:rPr>
           <w:rFonts w:ascii="Consolas" w:eastAsia="Times New Roman" w:hAnsi="Consolas" w:cs="Times New Roman"/>
@@ -12883,29 +12828,7 @@
           <w:szCs w:val="21"/>
           <w:lang w:eastAsia="cs-CZ"/>
         </w:rPr>
-        <w:t>"./pages/_Admin/</w:t>
-      </w:r>
-      <w:proofErr w:type="spellStart"/>
-      <w:r>
-        <w:rPr>
-          <w:rFonts w:ascii="Consolas" w:eastAsia="Times New Roman" w:hAnsi="Consolas" w:cs="Times New Roman"/>
-          <w:color w:val="A31515"/>
-          <w:sz w:val="21"/>
-          <w:szCs w:val="21"/>
-          <w:lang w:eastAsia="cs-CZ"/>
-        </w:rPr>
-        <w:t>AdminMe</w:t>
-      </w:r>
-      <w:proofErr w:type="spellEnd"/>
-      <w:r>
-        <w:rPr>
-          <w:rFonts w:ascii="Consolas" w:eastAsia="Times New Roman" w:hAnsi="Consolas" w:cs="Times New Roman"/>
-          <w:color w:val="A31515"/>
-          <w:sz w:val="21"/>
-          <w:szCs w:val="21"/>
-          <w:lang w:eastAsia="cs-CZ"/>
-        </w:rPr>
-        <w:t>"</w:t>
+        <w:t>"./pages/_Admin/AdminMe"</w:t>
       </w:r>
       <w:r>
         <w:rPr>
@@ -12957,7 +12880,6 @@
         </w:rPr>
         <w:t xml:space="preserve"> </w:t>
       </w:r>
-      <w:proofErr w:type="spellStart"/>
       <w:r>
         <w:rPr>
           <w:rFonts w:ascii="Consolas" w:eastAsia="Times New Roman" w:hAnsi="Consolas" w:cs="Times New Roman"/>
@@ -12968,7 +12890,6 @@
         </w:rPr>
         <w:t>AktualitaDetail</w:t>
       </w:r>
-      <w:proofErr w:type="spellEnd"/>
       <w:r>
         <w:rPr>
           <w:rFonts w:ascii="Consolas" w:eastAsia="Times New Roman" w:hAnsi="Consolas" w:cs="Times New Roman"/>
@@ -13007,29 +12928,7 @@
           <w:szCs w:val="21"/>
           <w:lang w:eastAsia="cs-CZ"/>
         </w:rPr>
-        <w:t>"./pages/Home/</w:t>
-      </w:r>
-      <w:proofErr w:type="spellStart"/>
-      <w:r>
-        <w:rPr>
-          <w:rFonts w:ascii="Consolas" w:eastAsia="Times New Roman" w:hAnsi="Consolas" w:cs="Times New Roman"/>
-          <w:color w:val="A31515"/>
-          <w:sz w:val="21"/>
-          <w:szCs w:val="21"/>
-          <w:lang w:eastAsia="cs-CZ"/>
-        </w:rPr>
-        <w:t>AktualitaDetail</w:t>
-      </w:r>
-      <w:proofErr w:type="spellEnd"/>
-      <w:r>
-        <w:rPr>
-          <w:rFonts w:ascii="Consolas" w:eastAsia="Times New Roman" w:hAnsi="Consolas" w:cs="Times New Roman"/>
-          <w:color w:val="A31515"/>
-          <w:sz w:val="21"/>
-          <w:szCs w:val="21"/>
-          <w:lang w:eastAsia="cs-CZ"/>
-        </w:rPr>
-        <w:t>"</w:t>
+        <w:t>"./pages/Home/AktualitaDetail"</w:t>
       </w:r>
       <w:r>
         <w:rPr>
@@ -13081,7 +12980,6 @@
         </w:rPr>
         <w:t xml:space="preserve"> </w:t>
       </w:r>
-      <w:proofErr w:type="spellStart"/>
       <w:r>
         <w:rPr>
           <w:rFonts w:ascii="Consolas" w:eastAsia="Times New Roman" w:hAnsi="Consolas" w:cs="Times New Roman"/>
@@ -13092,7 +12990,6 @@
         </w:rPr>
         <w:t>TurnajDetail</w:t>
       </w:r>
-      <w:proofErr w:type="spellEnd"/>
       <w:r>
         <w:rPr>
           <w:rFonts w:ascii="Consolas" w:eastAsia="Times New Roman" w:hAnsi="Consolas" w:cs="Times New Roman"/>
@@ -13131,29 +13028,7 @@
           <w:szCs w:val="21"/>
           <w:lang w:eastAsia="cs-CZ"/>
         </w:rPr>
-        <w:t>"./pages/Turnaje/</w:t>
-      </w:r>
-      <w:proofErr w:type="spellStart"/>
-      <w:r>
-        <w:rPr>
-          <w:rFonts w:ascii="Consolas" w:eastAsia="Times New Roman" w:hAnsi="Consolas" w:cs="Times New Roman"/>
-          <w:color w:val="A31515"/>
-          <w:sz w:val="21"/>
-          <w:szCs w:val="21"/>
-          <w:lang w:eastAsia="cs-CZ"/>
-        </w:rPr>
-        <w:t>TurnajDetail</w:t>
-      </w:r>
-      <w:proofErr w:type="spellEnd"/>
-      <w:r>
-        <w:rPr>
-          <w:rFonts w:ascii="Consolas" w:eastAsia="Times New Roman" w:hAnsi="Consolas" w:cs="Times New Roman"/>
-          <w:color w:val="A31515"/>
-          <w:sz w:val="21"/>
-          <w:szCs w:val="21"/>
-          <w:lang w:eastAsia="cs-CZ"/>
-        </w:rPr>
-        <w:t>"</w:t>
+        <w:t>"./pages/Turnaje/TurnajDetail"</w:t>
       </w:r>
       <w:r>
         <w:rPr>
@@ -13205,7 +13080,6 @@
         </w:rPr>
         <w:t xml:space="preserve"> </w:t>
       </w:r>
-      <w:proofErr w:type="spellStart"/>
       <w:r>
         <w:rPr>
           <w:rFonts w:ascii="Consolas" w:eastAsia="Times New Roman" w:hAnsi="Consolas" w:cs="Times New Roman"/>
@@ -13216,7 +13090,6 @@
         </w:rPr>
         <w:t>AdminRequests</w:t>
       </w:r>
-      <w:proofErr w:type="spellEnd"/>
       <w:r>
         <w:rPr>
           <w:rFonts w:ascii="Consolas" w:eastAsia="Times New Roman" w:hAnsi="Consolas" w:cs="Times New Roman"/>
@@ -13255,29 +13128,7 @@
           <w:szCs w:val="21"/>
           <w:lang w:eastAsia="cs-CZ"/>
         </w:rPr>
-        <w:t>"./pages/_Admin/</w:t>
-      </w:r>
-      <w:proofErr w:type="spellStart"/>
-      <w:r>
-        <w:rPr>
-          <w:rFonts w:ascii="Consolas" w:eastAsia="Times New Roman" w:hAnsi="Consolas" w:cs="Times New Roman"/>
-          <w:color w:val="A31515"/>
-          <w:sz w:val="21"/>
-          <w:szCs w:val="21"/>
-          <w:lang w:eastAsia="cs-CZ"/>
-        </w:rPr>
-        <w:t>AdminRequests</w:t>
-      </w:r>
-      <w:proofErr w:type="spellEnd"/>
-      <w:r>
-        <w:rPr>
-          <w:rFonts w:ascii="Consolas" w:eastAsia="Times New Roman" w:hAnsi="Consolas" w:cs="Times New Roman"/>
-          <w:color w:val="A31515"/>
-          <w:sz w:val="21"/>
-          <w:szCs w:val="21"/>
-          <w:lang w:eastAsia="cs-CZ"/>
-        </w:rPr>
-        <w:t>"</w:t>
+        <w:t>"./pages/_Admin/AdminRequests"</w:t>
       </w:r>
       <w:r>
         <w:rPr>
@@ -13329,7 +13180,6 @@
         </w:rPr>
         <w:t xml:space="preserve"> </w:t>
       </w:r>
-      <w:proofErr w:type="spellStart"/>
       <w:r>
         <w:rPr>
           <w:rFonts w:ascii="Consolas" w:eastAsia="Times New Roman" w:hAnsi="Consolas" w:cs="Times New Roman"/>
@@ -13340,7 +13190,6 @@
         </w:rPr>
         <w:t>FighterDetail</w:t>
       </w:r>
-      <w:proofErr w:type="spellEnd"/>
       <w:r>
         <w:rPr>
           <w:rFonts w:ascii="Consolas" w:eastAsia="Times New Roman" w:hAnsi="Consolas" w:cs="Times New Roman"/>
@@ -13379,29 +13228,7 @@
           <w:szCs w:val="21"/>
           <w:lang w:eastAsia="cs-CZ"/>
         </w:rPr>
-        <w:t>"./pages/Zavodnici/</w:t>
-      </w:r>
-      <w:proofErr w:type="spellStart"/>
-      <w:r>
-        <w:rPr>
-          <w:rFonts w:ascii="Consolas" w:eastAsia="Times New Roman" w:hAnsi="Consolas" w:cs="Times New Roman"/>
-          <w:color w:val="A31515"/>
-          <w:sz w:val="21"/>
-          <w:szCs w:val="21"/>
-          <w:lang w:eastAsia="cs-CZ"/>
-        </w:rPr>
-        <w:t>FighterDetail</w:t>
-      </w:r>
-      <w:proofErr w:type="spellEnd"/>
-      <w:r>
-        <w:rPr>
-          <w:rFonts w:ascii="Consolas" w:eastAsia="Times New Roman" w:hAnsi="Consolas" w:cs="Times New Roman"/>
-          <w:color w:val="A31515"/>
-          <w:sz w:val="21"/>
-          <w:szCs w:val="21"/>
-          <w:lang w:eastAsia="cs-CZ"/>
-        </w:rPr>
-        <w:t>"</w:t>
+        <w:t>"./pages/Zavodnici/FighterDetail"</w:t>
       </w:r>
       <w:r>
         <w:rPr>
@@ -13453,7 +13280,6 @@
         </w:rPr>
         <w:t xml:space="preserve"> </w:t>
       </w:r>
-      <w:proofErr w:type="spellStart"/>
       <w:r>
         <w:rPr>
           <w:rFonts w:ascii="Consolas" w:eastAsia="Times New Roman" w:hAnsi="Consolas" w:cs="Times New Roman"/>
@@ -13464,7 +13290,6 @@
         </w:rPr>
         <w:t>AdminZkousky</w:t>
       </w:r>
-      <w:proofErr w:type="spellEnd"/>
       <w:r>
         <w:rPr>
           <w:rFonts w:ascii="Consolas" w:eastAsia="Times New Roman" w:hAnsi="Consolas" w:cs="Times New Roman"/>
@@ -13503,29 +13328,7 @@
           <w:szCs w:val="21"/>
           <w:lang w:eastAsia="cs-CZ"/>
         </w:rPr>
-        <w:t>"./pages/_Admin/</w:t>
-      </w:r>
-      <w:proofErr w:type="spellStart"/>
-      <w:r>
-        <w:rPr>
-          <w:rFonts w:ascii="Consolas" w:eastAsia="Times New Roman" w:hAnsi="Consolas" w:cs="Times New Roman"/>
-          <w:color w:val="A31515"/>
-          <w:sz w:val="21"/>
-          <w:szCs w:val="21"/>
-          <w:lang w:eastAsia="cs-CZ"/>
-        </w:rPr>
-        <w:t>AdminZkousky</w:t>
-      </w:r>
-      <w:proofErr w:type="spellEnd"/>
-      <w:r>
-        <w:rPr>
-          <w:rFonts w:ascii="Consolas" w:eastAsia="Times New Roman" w:hAnsi="Consolas" w:cs="Times New Roman"/>
-          <w:color w:val="A31515"/>
-          <w:sz w:val="21"/>
-          <w:szCs w:val="21"/>
-          <w:lang w:eastAsia="cs-CZ"/>
-        </w:rPr>
-        <w:t>"</w:t>
+        <w:t>"./pages/_Admin/AdminZkousky"</w:t>
       </w:r>
       <w:r>
         <w:rPr>
@@ -13577,7 +13380,6 @@
         </w:rPr>
         <w:t xml:space="preserve"> </w:t>
       </w:r>
-      <w:proofErr w:type="spellStart"/>
       <w:r>
         <w:rPr>
           <w:rFonts w:ascii="Consolas" w:eastAsia="Times New Roman" w:hAnsi="Consolas" w:cs="Times New Roman"/>
@@ -13588,7 +13390,6 @@
         </w:rPr>
         <w:t>Gdpr</w:t>
       </w:r>
-      <w:proofErr w:type="spellEnd"/>
       <w:r>
         <w:rPr>
           <w:rFonts w:ascii="Consolas" w:eastAsia="Times New Roman" w:hAnsi="Consolas" w:cs="Times New Roman"/>
@@ -13627,29 +13428,7 @@
           <w:szCs w:val="21"/>
           <w:lang w:eastAsia="cs-CZ"/>
         </w:rPr>
-        <w:t>"./pages/Login/</w:t>
-      </w:r>
-      <w:proofErr w:type="spellStart"/>
-      <w:r>
-        <w:rPr>
-          <w:rFonts w:ascii="Consolas" w:eastAsia="Times New Roman" w:hAnsi="Consolas" w:cs="Times New Roman"/>
-          <w:color w:val="A31515"/>
-          <w:sz w:val="21"/>
-          <w:szCs w:val="21"/>
-          <w:lang w:eastAsia="cs-CZ"/>
-        </w:rPr>
-        <w:t>Gdpr</w:t>
-      </w:r>
-      <w:proofErr w:type="spellEnd"/>
-      <w:r>
-        <w:rPr>
-          <w:rFonts w:ascii="Consolas" w:eastAsia="Times New Roman" w:hAnsi="Consolas" w:cs="Times New Roman"/>
-          <w:color w:val="A31515"/>
-          <w:sz w:val="21"/>
-          <w:szCs w:val="21"/>
-          <w:lang w:eastAsia="cs-CZ"/>
-        </w:rPr>
-        <w:t>"</w:t>
+        <w:t>"./pages/Login/Gdpr"</w:t>
       </w:r>
       <w:r>
         <w:rPr>
@@ -13701,7 +13480,6 @@
         </w:rPr>
         <w:t xml:space="preserve"> </w:t>
       </w:r>
-      <w:proofErr w:type="spellStart"/>
       <w:r>
         <w:rPr>
           <w:rFonts w:ascii="Consolas" w:eastAsia="Times New Roman" w:hAnsi="Consolas" w:cs="Times New Roman"/>
@@ -13712,7 +13490,6 @@
         </w:rPr>
         <w:t>NotFound</w:t>
       </w:r>
-      <w:proofErr w:type="spellEnd"/>
       <w:r>
         <w:rPr>
           <w:rFonts w:ascii="Consolas" w:eastAsia="Times New Roman" w:hAnsi="Consolas" w:cs="Times New Roman"/>
@@ -13751,29 +13528,7 @@
           <w:szCs w:val="21"/>
           <w:lang w:eastAsia="cs-CZ"/>
         </w:rPr>
-        <w:t>"./pages/Login/</w:t>
-      </w:r>
-      <w:proofErr w:type="spellStart"/>
-      <w:r>
-        <w:rPr>
-          <w:rFonts w:ascii="Consolas" w:eastAsia="Times New Roman" w:hAnsi="Consolas" w:cs="Times New Roman"/>
-          <w:color w:val="A31515"/>
-          <w:sz w:val="21"/>
-          <w:szCs w:val="21"/>
-          <w:lang w:eastAsia="cs-CZ"/>
-        </w:rPr>
-        <w:t>NotFound</w:t>
-      </w:r>
-      <w:proofErr w:type="spellEnd"/>
-      <w:r>
-        <w:rPr>
-          <w:rFonts w:ascii="Consolas" w:eastAsia="Times New Roman" w:hAnsi="Consolas" w:cs="Times New Roman"/>
-          <w:color w:val="A31515"/>
-          <w:sz w:val="21"/>
-          <w:szCs w:val="21"/>
-          <w:lang w:eastAsia="cs-CZ"/>
-        </w:rPr>
-        <w:t>"</w:t>
+        <w:t>"./pages/Login/NotFound"</w:t>
       </w:r>
       <w:r>
         <w:rPr>
@@ -13825,7 +13580,6 @@
         </w:rPr>
         <w:t xml:space="preserve"> </w:t>
       </w:r>
-      <w:proofErr w:type="spellStart"/>
       <w:r>
         <w:rPr>
           <w:rFonts w:ascii="Consolas" w:eastAsia="Times New Roman" w:hAnsi="Consolas" w:cs="Times New Roman"/>
@@ -13836,7 +13590,6 @@
         </w:rPr>
         <w:t>ScrollToTop</w:t>
       </w:r>
-      <w:proofErr w:type="spellEnd"/>
       <w:r>
         <w:rPr>
           <w:rFonts w:ascii="Consolas" w:eastAsia="Times New Roman" w:hAnsi="Consolas" w:cs="Times New Roman"/>
@@ -13875,29 +13628,7 @@
           <w:szCs w:val="21"/>
           <w:lang w:eastAsia="cs-CZ"/>
         </w:rPr>
-        <w:t>"./Components/</w:t>
-      </w:r>
-      <w:proofErr w:type="spellStart"/>
-      <w:r>
-        <w:rPr>
-          <w:rFonts w:ascii="Consolas" w:eastAsia="Times New Roman" w:hAnsi="Consolas" w:cs="Times New Roman"/>
-          <w:color w:val="A31515"/>
-          <w:sz w:val="21"/>
-          <w:szCs w:val="21"/>
-          <w:lang w:eastAsia="cs-CZ"/>
-        </w:rPr>
-        <w:t>ScrollToTop</w:t>
-      </w:r>
-      <w:proofErr w:type="spellEnd"/>
-      <w:r>
-        <w:rPr>
-          <w:rFonts w:ascii="Consolas" w:eastAsia="Times New Roman" w:hAnsi="Consolas" w:cs="Times New Roman"/>
-          <w:color w:val="A31515"/>
-          <w:sz w:val="21"/>
-          <w:szCs w:val="21"/>
-          <w:lang w:eastAsia="cs-CZ"/>
-        </w:rPr>
-        <w:t>"</w:t>
+        <w:t>"./Components/ScrollToTop"</w:t>
       </w:r>
       <w:r>
         <w:rPr>
@@ -13921,6 +13652,9 @@
         <w:t xml:space="preserve"> import routeru</w:t>
       </w:r>
       <w:r>
+        <w:t>,</w:t>
+      </w:r>
+      <w:r>
         <w:t xml:space="preserve"> který je zajištěn pomocí knihovny react-router-dom</w:t>
       </w:r>
       <w:r>
@@ -13945,6 +13679,9 @@
         <w:t xml:space="preserve"> souboru</w:t>
       </w:r>
       <w:r>
+        <w:t>,</w:t>
+      </w:r>
+      <w:r>
         <w:t xml:space="preserve"> </w:t>
       </w:r>
       <w:r>
@@ -13974,7 +13711,19 @@
         <w:t xml:space="preserve"> také logika</w:t>
       </w:r>
       <w:r>
-        <w:t xml:space="preserve"> určující zda se jedná o komponentu, která je skrytá za autentizací či </w:t>
+        <w:t xml:space="preserve"> určující</w:t>
+      </w:r>
+      <w:r>
+        <w:t>,</w:t>
+      </w:r>
+      <w:r>
+        <w:t xml:space="preserve"> zda se jedná o komponentu, která je skrytá za autentizací </w:t>
+      </w:r>
+      <w:r>
+        <w:br/>
+      </w:r>
+      <w:r>
+        <w:t xml:space="preserve">či </w:t>
       </w:r>
       <w:r>
         <w:t>jde o veřejnou část webu dostupnou pro běžného návštěvníka</w:t>
@@ -15069,7 +14818,6 @@
         </w:rPr>
         <w:t>&lt;</w:t>
       </w:r>
-      <w:proofErr w:type="spellStart"/>
       <w:r>
         <w:rPr>
           <w:rFonts w:ascii="Consolas" w:eastAsia="Times New Roman" w:hAnsi="Consolas" w:cs="Times New Roman"/>
@@ -15080,7 +14828,6 @@
         </w:rPr>
         <w:t>NotFound</w:t>
       </w:r>
-      <w:proofErr w:type="spellEnd"/>
       <w:r>
         <w:rPr>
           <w:rFonts w:ascii="Consolas" w:eastAsia="Times New Roman" w:hAnsi="Consolas" w:cs="Times New Roman"/>
@@ -15259,29 +15006,7 @@
           <w:szCs w:val="21"/>
           <w:lang w:eastAsia="cs-CZ"/>
         </w:rPr>
-        <w:t>"/admin/</w:t>
-      </w:r>
-      <w:proofErr w:type="spellStart"/>
-      <w:r>
-        <w:rPr>
-          <w:rFonts w:ascii="Consolas" w:eastAsia="Times New Roman" w:hAnsi="Consolas" w:cs="Times New Roman"/>
-          <w:color w:val="A31515"/>
-          <w:sz w:val="21"/>
-          <w:szCs w:val="21"/>
-          <w:lang w:eastAsia="cs-CZ"/>
-        </w:rPr>
-        <w:t>me</w:t>
-      </w:r>
-      <w:proofErr w:type="spellEnd"/>
-      <w:r>
-        <w:rPr>
-          <w:rFonts w:ascii="Consolas" w:eastAsia="Times New Roman" w:hAnsi="Consolas" w:cs="Times New Roman"/>
-          <w:color w:val="A31515"/>
-          <w:sz w:val="21"/>
-          <w:szCs w:val="21"/>
-          <w:lang w:eastAsia="cs-CZ"/>
-        </w:rPr>
-        <w:t>"</w:t>
+        <w:t>"/admin/me"</w:t>
       </w:r>
     </w:p>
     <w:p>
@@ -15403,7 +15128,6 @@
         </w:rPr>
         <w:t xml:space="preserve"> </w:t>
       </w:r>
-      <w:proofErr w:type="spellStart"/>
       <w:r>
         <w:rPr>
           <w:rFonts w:ascii="Consolas" w:eastAsia="Times New Roman" w:hAnsi="Consolas" w:cs="Times New Roman"/>
@@ -15414,7 +15138,6 @@
         </w:rPr>
         <w:t>allowedRoles</w:t>
       </w:r>
-      <w:proofErr w:type="spellEnd"/>
       <w:r>
         <w:rPr>
           <w:rFonts w:ascii="Consolas" w:eastAsia="Times New Roman" w:hAnsi="Consolas" w:cs="Times New Roman"/>
@@ -15565,7 +15288,6 @@
         </w:rPr>
         <w:t>&lt;</w:t>
       </w:r>
-      <w:proofErr w:type="spellStart"/>
       <w:r>
         <w:rPr>
           <w:rFonts w:ascii="Consolas" w:eastAsia="Times New Roman" w:hAnsi="Consolas" w:cs="Times New Roman"/>
@@ -15576,7 +15298,6 @@
         </w:rPr>
         <w:t>AdminMe</w:t>
       </w:r>
-      <w:proofErr w:type="spellEnd"/>
       <w:r>
         <w:rPr>
           <w:rFonts w:ascii="Consolas" w:eastAsia="Times New Roman" w:hAnsi="Consolas" w:cs="Times New Roman"/>
@@ -15967,7 +15688,6 @@
         </w:rPr>
         <w:t xml:space="preserve"> </w:t>
       </w:r>
-      <w:proofErr w:type="spellStart"/>
       <w:r>
         <w:rPr>
           <w:rFonts w:ascii="Consolas" w:eastAsia="Times New Roman" w:hAnsi="Consolas" w:cs="Times New Roman"/>
@@ -15978,7 +15698,6 @@
         </w:rPr>
         <w:t>allowedRoles</w:t>
       </w:r>
-      <w:proofErr w:type="spellEnd"/>
       <w:r>
         <w:rPr>
           <w:rFonts w:ascii="Consolas" w:eastAsia="Times New Roman" w:hAnsi="Consolas" w:cs="Times New Roman"/>
@@ -16489,7 +16208,6 @@
         </w:rPr>
         <w:t xml:space="preserve"> </w:t>
       </w:r>
-      <w:proofErr w:type="spellStart"/>
       <w:r>
         <w:rPr>
           <w:rFonts w:ascii="Consolas" w:eastAsia="Times New Roman" w:hAnsi="Consolas" w:cs="Times New Roman"/>
@@ -16500,7 +16218,6 @@
         </w:rPr>
         <w:t>allowedRoles</w:t>
       </w:r>
-      <w:proofErr w:type="spellEnd"/>
       <w:r>
         <w:rPr>
           <w:rFonts w:ascii="Consolas" w:eastAsia="Times New Roman" w:hAnsi="Consolas" w:cs="Times New Roman"/>
@@ -16611,7 +16328,6 @@
         </w:rPr>
         <w:t>&lt;</w:t>
       </w:r>
-      <w:proofErr w:type="spellStart"/>
       <w:r>
         <w:rPr>
           <w:rFonts w:ascii="Consolas" w:eastAsia="Times New Roman" w:hAnsi="Consolas" w:cs="Times New Roman"/>
@@ -16622,7 +16338,6 @@
         </w:rPr>
         <w:t>AdminRequests</w:t>
       </w:r>
-      <w:proofErr w:type="spellEnd"/>
       <w:r>
         <w:rPr>
           <w:rFonts w:ascii="Consolas" w:eastAsia="Times New Roman" w:hAnsi="Consolas" w:cs="Times New Roman"/>
@@ -17284,7 +16999,6 @@
         </w:rPr>
         <w:t>&lt;</w:t>
       </w:r>
-      <w:proofErr w:type="spellStart"/>
       <w:r>
         <w:rPr>
           <w:rFonts w:ascii="Consolas" w:eastAsia="Times New Roman" w:hAnsi="Consolas" w:cs="Times New Roman"/>
@@ -17295,7 +17009,6 @@
         </w:rPr>
         <w:t>ScrollToTop</w:t>
       </w:r>
-      <w:proofErr w:type="spellEnd"/>
       <w:r>
         <w:rPr>
           <w:rFonts w:ascii="Consolas" w:eastAsia="Times New Roman" w:hAnsi="Consolas" w:cs="Times New Roman"/>
@@ -19516,7 +19229,6 @@
         </w:rPr>
         <w:t>&lt;</w:t>
       </w:r>
-      <w:proofErr w:type="spellStart"/>
       <w:r>
         <w:rPr>
           <w:rFonts w:ascii="Consolas" w:eastAsia="Times New Roman" w:hAnsi="Consolas" w:cs="Times New Roman"/>
@@ -19527,7 +19239,6 @@
         </w:rPr>
         <w:t>AktualitaDetail</w:t>
       </w:r>
-      <w:proofErr w:type="spellEnd"/>
       <w:r>
         <w:rPr>
           <w:rFonts w:ascii="Consolas" w:eastAsia="Times New Roman" w:hAnsi="Consolas" w:cs="Times New Roman"/>
@@ -19718,7 +19429,6 @@
         </w:rPr>
         <w:t>&lt;</w:t>
       </w:r>
-      <w:proofErr w:type="spellStart"/>
       <w:r>
         <w:rPr>
           <w:rFonts w:ascii="Consolas" w:eastAsia="Times New Roman" w:hAnsi="Consolas" w:cs="Times New Roman"/>
@@ -19729,7 +19439,6 @@
         </w:rPr>
         <w:t>TurnajDetail</w:t>
       </w:r>
-      <w:proofErr w:type="spellEnd"/>
       <w:r>
         <w:rPr>
           <w:rFonts w:ascii="Consolas" w:eastAsia="Times New Roman" w:hAnsi="Consolas" w:cs="Times New Roman"/>
@@ -19868,29 +19577,7 @@
           <w:szCs w:val="21"/>
           <w:lang w:eastAsia="cs-CZ"/>
         </w:rPr>
-        <w:t>"/</w:t>
-      </w:r>
-      <w:proofErr w:type="spellStart"/>
-      <w:r>
-        <w:rPr>
-          <w:rFonts w:ascii="Consolas" w:eastAsia="Times New Roman" w:hAnsi="Consolas" w:cs="Times New Roman"/>
-          <w:color w:val="A31515"/>
-          <w:sz w:val="21"/>
-          <w:szCs w:val="21"/>
-          <w:lang w:eastAsia="cs-CZ"/>
-        </w:rPr>
-        <w:t>zavodnik</w:t>
-      </w:r>
-      <w:proofErr w:type="spellEnd"/>
-      <w:r>
-        <w:rPr>
-          <w:rFonts w:ascii="Consolas" w:eastAsia="Times New Roman" w:hAnsi="Consolas" w:cs="Times New Roman"/>
-          <w:color w:val="A31515"/>
-          <w:sz w:val="21"/>
-          <w:szCs w:val="21"/>
-          <w:lang w:eastAsia="cs-CZ"/>
-        </w:rPr>
-        <w:t>/:id"</w:t>
+        <w:t>"/zavodnik/:id"</w:t>
       </w:r>
       <w:r>
         <w:rPr>
@@ -19942,7 +19629,6 @@
         </w:rPr>
         <w:t>&lt;</w:t>
       </w:r>
-      <w:proofErr w:type="spellStart"/>
       <w:r>
         <w:rPr>
           <w:rFonts w:ascii="Consolas" w:eastAsia="Times New Roman" w:hAnsi="Consolas" w:cs="Times New Roman"/>
@@ -19953,7 +19639,6 @@
         </w:rPr>
         <w:t>FighterDetail</w:t>
       </w:r>
-      <w:proofErr w:type="spellEnd"/>
       <w:r>
         <w:rPr>
           <w:rFonts w:ascii="Consolas" w:eastAsia="Times New Roman" w:hAnsi="Consolas" w:cs="Times New Roman"/>
@@ -20092,29 +19777,7 @@
           <w:szCs w:val="21"/>
           <w:lang w:eastAsia="cs-CZ"/>
         </w:rPr>
-        <w:t>"/</w:t>
-      </w:r>
-      <w:proofErr w:type="spellStart"/>
-      <w:r>
-        <w:rPr>
-          <w:rFonts w:ascii="Consolas" w:eastAsia="Times New Roman" w:hAnsi="Consolas" w:cs="Times New Roman"/>
-          <w:color w:val="A31515"/>
-          <w:sz w:val="21"/>
-          <w:szCs w:val="21"/>
-          <w:lang w:eastAsia="cs-CZ"/>
-        </w:rPr>
-        <w:t>gdpr</w:t>
-      </w:r>
-      <w:proofErr w:type="spellEnd"/>
-      <w:r>
-        <w:rPr>
-          <w:rFonts w:ascii="Consolas" w:eastAsia="Times New Roman" w:hAnsi="Consolas" w:cs="Times New Roman"/>
-          <w:color w:val="A31515"/>
-          <w:sz w:val="21"/>
-          <w:szCs w:val="21"/>
-          <w:lang w:eastAsia="cs-CZ"/>
-        </w:rPr>
-        <w:t>"</w:t>
+        <w:t>"/gdpr"</w:t>
       </w:r>
       <w:r>
         <w:rPr>
@@ -20166,7 +19829,6 @@
         </w:rPr>
         <w:t>&lt;</w:t>
       </w:r>
-      <w:proofErr w:type="spellStart"/>
       <w:r>
         <w:rPr>
           <w:rFonts w:ascii="Consolas" w:eastAsia="Times New Roman" w:hAnsi="Consolas" w:cs="Times New Roman"/>
@@ -20177,7 +19839,6 @@
         </w:rPr>
         <w:t>Gdpr</w:t>
       </w:r>
-      <w:proofErr w:type="spellEnd"/>
       <w:r>
         <w:rPr>
           <w:rFonts w:ascii="Consolas" w:eastAsia="Times New Roman" w:hAnsi="Consolas" w:cs="Times New Roman"/>
@@ -20368,7 +20029,6 @@
         </w:rPr>
         <w:t>&lt;</w:t>
       </w:r>
-      <w:proofErr w:type="spellStart"/>
       <w:r>
         <w:rPr>
           <w:rFonts w:ascii="Consolas" w:eastAsia="Times New Roman" w:hAnsi="Consolas" w:cs="Times New Roman"/>
@@ -20379,7 +20039,6 @@
         </w:rPr>
         <w:t>NotFound</w:t>
       </w:r>
-      <w:proofErr w:type="spellEnd"/>
       <w:r>
         <w:rPr>
           <w:rFonts w:ascii="Consolas" w:eastAsia="Times New Roman" w:hAnsi="Consolas" w:cs="Times New Roman"/>
@@ -20710,17 +20369,18 @@
         <w:pStyle w:val="Nadpis3"/>
       </w:pPr>
       <w:r>
-        <w:t xml:space="preserve">Ukázka komponenty </w:t>
-      </w:r>
-      <w:proofErr w:type="spellStart"/>
-      <w:r>
-        <w:t>Zkousky.jsx</w:t>
-      </w:r>
-      <w:proofErr w:type="spellEnd"/>
-    </w:p>
-    <w:p>
-      <w:r>
-        <w:t>Komponenta zkoušky slouží jako hlavní kontejner ve kterém jsou naimportovány jednotlivé menší komponenty, které jsou společně propojené a které dohromady tvoří funkční celek pro zobrazení zkoušek uživateli.</w:t>
+        <w:t>Ukázka komponenty Zkousky.jsx</w:t>
+      </w:r>
+    </w:p>
+    <w:p>
+      <w:r>
+        <w:t>Komponenta zkoušky slouží jako hlavní kontejner</w:t>
+      </w:r>
+      <w:r>
+        <w:t>,</w:t>
+      </w:r>
+      <w:r>
+        <w:t xml:space="preserve"> ve kterém jsou naimportovány jednotlivé menší komponenty, které jsou společně propojené a které dohromady tvoří funkční celek pro zobrazení zkoušek uživateli.</w:t>
       </w:r>
     </w:p>
     <w:p>
@@ -20782,7 +20442,6 @@
         </w:rPr>
         <w:t xml:space="preserve">, { </w:t>
       </w:r>
-      <w:proofErr w:type="spellStart"/>
       <w:r>
         <w:rPr>
           <w:rFonts w:ascii="Consolas" w:eastAsia="Times New Roman" w:hAnsi="Consolas" w:cs="Times New Roman"/>
@@ -20793,7 +20452,6 @@
         </w:rPr>
         <w:t>useState</w:t>
       </w:r>
-      <w:proofErr w:type="spellEnd"/>
       <w:r>
         <w:rPr>
           <w:rFonts w:ascii="Consolas" w:eastAsia="Times New Roman" w:hAnsi="Consolas" w:cs="Times New Roman"/>
@@ -20884,7 +20542,6 @@
         </w:rPr>
         <w:t xml:space="preserve"> </w:t>
       </w:r>
-      <w:proofErr w:type="spellStart"/>
       <w:r>
         <w:rPr>
           <w:rFonts w:ascii="Consolas" w:eastAsia="Times New Roman" w:hAnsi="Consolas" w:cs="Times New Roman"/>
@@ -20895,7 +20552,6 @@
         </w:rPr>
         <w:t>Cenik</w:t>
       </w:r>
-      <w:proofErr w:type="spellEnd"/>
       <w:r>
         <w:rPr>
           <w:rFonts w:ascii="Consolas" w:eastAsia="Times New Roman" w:hAnsi="Consolas" w:cs="Times New Roman"/>
@@ -20934,29 +20590,7 @@
           <w:szCs w:val="21"/>
           <w:lang w:eastAsia="cs-CZ"/>
         </w:rPr>
-        <w:t>"../pages/Zkousky/</w:t>
-      </w:r>
-      <w:proofErr w:type="spellStart"/>
-      <w:r>
-        <w:rPr>
-          <w:rFonts w:ascii="Consolas" w:eastAsia="Times New Roman" w:hAnsi="Consolas" w:cs="Times New Roman"/>
-          <w:color w:val="A31515"/>
-          <w:sz w:val="21"/>
-          <w:szCs w:val="21"/>
-          <w:lang w:eastAsia="cs-CZ"/>
-        </w:rPr>
-        <w:t>Cenik</w:t>
-      </w:r>
-      <w:proofErr w:type="spellEnd"/>
-      <w:r>
-        <w:rPr>
-          <w:rFonts w:ascii="Consolas" w:eastAsia="Times New Roman" w:hAnsi="Consolas" w:cs="Times New Roman"/>
-          <w:color w:val="A31515"/>
-          <w:sz w:val="21"/>
-          <w:szCs w:val="21"/>
-          <w:lang w:eastAsia="cs-CZ"/>
-        </w:rPr>
-        <w:t>"</w:t>
+        <w:t>"../pages/Zkousky/Cenik"</w:t>
       </w:r>
       <w:r>
         <w:rPr>
@@ -21108,7 +20742,6 @@
         </w:rPr>
         <w:t xml:space="preserve"> </w:t>
       </w:r>
-      <w:proofErr w:type="spellStart"/>
       <w:r>
         <w:rPr>
           <w:rFonts w:ascii="Consolas" w:eastAsia="Times New Roman" w:hAnsi="Consolas" w:cs="Times New Roman"/>
@@ -21119,7 +20752,6 @@
         </w:rPr>
         <w:t>SestavyInfo</w:t>
       </w:r>
-      <w:proofErr w:type="spellEnd"/>
       <w:r>
         <w:rPr>
           <w:rFonts w:ascii="Consolas" w:eastAsia="Times New Roman" w:hAnsi="Consolas" w:cs="Times New Roman"/>
@@ -21158,29 +20790,7 @@
           <w:szCs w:val="21"/>
           <w:lang w:eastAsia="cs-CZ"/>
         </w:rPr>
-        <w:t>"../pages/Zkousky/</w:t>
-      </w:r>
-      <w:proofErr w:type="spellStart"/>
-      <w:r>
-        <w:rPr>
-          <w:rFonts w:ascii="Consolas" w:eastAsia="Times New Roman" w:hAnsi="Consolas" w:cs="Times New Roman"/>
-          <w:color w:val="A31515"/>
-          <w:sz w:val="21"/>
-          <w:szCs w:val="21"/>
-          <w:lang w:eastAsia="cs-CZ"/>
-        </w:rPr>
-        <w:t>SestavyInfo</w:t>
-      </w:r>
-      <w:proofErr w:type="spellEnd"/>
-      <w:r>
-        <w:rPr>
-          <w:rFonts w:ascii="Consolas" w:eastAsia="Times New Roman" w:hAnsi="Consolas" w:cs="Times New Roman"/>
-          <w:color w:val="A31515"/>
-          <w:sz w:val="21"/>
-          <w:szCs w:val="21"/>
-          <w:lang w:eastAsia="cs-CZ"/>
-        </w:rPr>
-        <w:t>"</w:t>
+        <w:t>"../pages/Zkousky/SestavyInfo"</w:t>
       </w:r>
       <w:r>
         <w:rPr>
@@ -21232,7 +20842,6 @@
         </w:rPr>
         <w:t xml:space="preserve"> </w:t>
       </w:r>
-      <w:proofErr w:type="spellStart"/>
       <w:r>
         <w:rPr>
           <w:rFonts w:ascii="Consolas" w:eastAsia="Times New Roman" w:hAnsi="Consolas" w:cs="Times New Roman"/>
@@ -21243,7 +20852,6 @@
         </w:rPr>
         <w:t>Prihlasky</w:t>
       </w:r>
-      <w:proofErr w:type="spellEnd"/>
       <w:r>
         <w:rPr>
           <w:rFonts w:ascii="Consolas" w:eastAsia="Times New Roman" w:hAnsi="Consolas" w:cs="Times New Roman"/>
@@ -21282,29 +20890,7 @@
           <w:szCs w:val="21"/>
           <w:lang w:eastAsia="cs-CZ"/>
         </w:rPr>
-        <w:t>"../pages/Zkousky/</w:t>
-      </w:r>
-      <w:proofErr w:type="spellStart"/>
-      <w:r>
-        <w:rPr>
-          <w:rFonts w:ascii="Consolas" w:eastAsia="Times New Roman" w:hAnsi="Consolas" w:cs="Times New Roman"/>
-          <w:color w:val="A31515"/>
-          <w:sz w:val="21"/>
-          <w:szCs w:val="21"/>
-          <w:lang w:eastAsia="cs-CZ"/>
-        </w:rPr>
-        <w:t>Prihlasky</w:t>
-      </w:r>
-      <w:proofErr w:type="spellEnd"/>
-      <w:r>
-        <w:rPr>
-          <w:rFonts w:ascii="Consolas" w:eastAsia="Times New Roman" w:hAnsi="Consolas" w:cs="Times New Roman"/>
-          <w:color w:val="A31515"/>
-          <w:sz w:val="21"/>
-          <w:szCs w:val="21"/>
-          <w:lang w:eastAsia="cs-CZ"/>
-        </w:rPr>
-        <w:t>"</w:t>
+        <w:t>"../pages/Zkousky/Prihlasky"</w:t>
       </w:r>
       <w:r>
         <w:rPr>
@@ -21446,7 +21032,6 @@
         </w:rPr>
         <w:t xml:space="preserve"> [</w:t>
       </w:r>
-      <w:proofErr w:type="spellStart"/>
       <w:r>
         <w:rPr>
           <w:rFonts w:ascii="Consolas" w:eastAsia="Times New Roman" w:hAnsi="Consolas" w:cs="Times New Roman"/>
@@ -21457,7 +21042,6 @@
         </w:rPr>
         <w:t>selectedBelt</w:t>
       </w:r>
-      <w:proofErr w:type="spellEnd"/>
       <w:r>
         <w:rPr>
           <w:rFonts w:ascii="Consolas" w:eastAsia="Times New Roman" w:hAnsi="Consolas" w:cs="Times New Roman"/>
@@ -21468,7 +21052,6 @@
         </w:rPr>
         <w:t xml:space="preserve">, </w:t>
       </w:r>
-      <w:proofErr w:type="spellStart"/>
       <w:r>
         <w:rPr>
           <w:rFonts w:ascii="Consolas" w:eastAsia="Times New Roman" w:hAnsi="Consolas" w:cs="Times New Roman"/>
@@ -21479,7 +21062,6 @@
         </w:rPr>
         <w:t>setSelectedBelt</w:t>
       </w:r>
-      <w:proofErr w:type="spellEnd"/>
       <w:r>
         <w:rPr>
           <w:rFonts w:ascii="Consolas" w:eastAsia="Times New Roman" w:hAnsi="Consolas" w:cs="Times New Roman"/>
@@ -21510,7 +21092,6 @@
         </w:rPr>
         <w:t xml:space="preserve"> </w:t>
       </w:r>
-      <w:proofErr w:type="spellStart"/>
       <w:r>
         <w:rPr>
           <w:rFonts w:ascii="Consolas" w:eastAsia="Times New Roman" w:hAnsi="Consolas" w:cs="Times New Roman"/>
@@ -21521,7 +21102,6 @@
         </w:rPr>
         <w:t>useState</w:t>
       </w:r>
-      <w:proofErr w:type="spellEnd"/>
       <w:r>
         <w:rPr>
           <w:rFonts w:ascii="Consolas" w:eastAsia="Times New Roman" w:hAnsi="Consolas" w:cs="Times New Roman"/>
@@ -21740,29 +21320,7 @@
           <w:szCs w:val="21"/>
           <w:lang w:eastAsia="cs-CZ"/>
         </w:rPr>
-        <w:t>"</w:t>
-      </w:r>
-      <w:proofErr w:type="spellStart"/>
-      <w:r>
-        <w:rPr>
-          <w:rFonts w:ascii="Consolas" w:eastAsia="Times New Roman" w:hAnsi="Consolas" w:cs="Times New Roman"/>
-          <w:color w:val="A31515"/>
-          <w:sz w:val="21"/>
-          <w:szCs w:val="21"/>
-          <w:lang w:eastAsia="cs-CZ"/>
-        </w:rPr>
-        <w:t>devider</w:t>
-      </w:r>
-      <w:proofErr w:type="spellEnd"/>
-      <w:r>
-        <w:rPr>
-          <w:rFonts w:ascii="Consolas" w:eastAsia="Times New Roman" w:hAnsi="Consolas" w:cs="Times New Roman"/>
-          <w:color w:val="A31515"/>
-          <w:sz w:val="21"/>
-          <w:szCs w:val="21"/>
-          <w:lang w:eastAsia="cs-CZ"/>
-        </w:rPr>
-        <w:t>"</w:t>
+        <w:t>"devider"</w:t>
       </w:r>
       <w:r>
         <w:rPr>
@@ -21854,7 +21412,6 @@
         </w:rPr>
         <w:t>&lt;</w:t>
       </w:r>
-      <w:proofErr w:type="spellStart"/>
       <w:r>
         <w:rPr>
           <w:rFonts w:ascii="Consolas" w:eastAsia="Times New Roman" w:hAnsi="Consolas" w:cs="Times New Roman"/>
@@ -21865,7 +21422,6 @@
         </w:rPr>
         <w:t>Cenik</w:t>
       </w:r>
-      <w:proofErr w:type="spellEnd"/>
       <w:r>
         <w:rPr>
           <w:rFonts w:ascii="Consolas" w:eastAsia="Times New Roman" w:hAnsi="Consolas" w:cs="Times New Roman"/>
@@ -21876,7 +21432,6 @@
         </w:rPr>
         <w:t xml:space="preserve"> </w:t>
       </w:r>
-      <w:proofErr w:type="spellStart"/>
       <w:r>
         <w:rPr>
           <w:rFonts w:ascii="Consolas" w:eastAsia="Times New Roman" w:hAnsi="Consolas" w:cs="Times New Roman"/>
@@ -21887,7 +21442,6 @@
         </w:rPr>
         <w:t>onSelectBelt</w:t>
       </w:r>
-      <w:proofErr w:type="spellEnd"/>
       <w:r>
         <w:rPr>
           <w:rFonts w:ascii="Consolas" w:eastAsia="Times New Roman" w:hAnsi="Consolas" w:cs="Times New Roman"/>
@@ -21908,7 +21462,6 @@
         </w:rPr>
         <w:t>{</w:t>
       </w:r>
-      <w:proofErr w:type="spellStart"/>
       <w:r>
         <w:rPr>
           <w:rFonts w:ascii="Consolas" w:eastAsia="Times New Roman" w:hAnsi="Consolas" w:cs="Times New Roman"/>
@@ -21919,7 +21472,6 @@
         </w:rPr>
         <w:t>setSelectedBelt</w:t>
       </w:r>
-      <w:proofErr w:type="spellEnd"/>
       <w:r>
         <w:rPr>
           <w:rFonts w:ascii="Consolas" w:eastAsia="Times New Roman" w:hAnsi="Consolas" w:cs="Times New Roman"/>
@@ -22010,7 +21562,6 @@
         </w:rPr>
         <w:t>{</w:t>
       </w:r>
-      <w:proofErr w:type="spellStart"/>
       <w:r>
         <w:rPr>
           <w:rFonts w:ascii="Consolas" w:eastAsia="Times New Roman" w:hAnsi="Consolas" w:cs="Times New Roman"/>
@@ -22021,7 +21572,6 @@
         </w:rPr>
         <w:t>selectedBelt</w:t>
       </w:r>
-      <w:proofErr w:type="spellEnd"/>
       <w:r>
         <w:rPr>
           <w:rFonts w:ascii="Consolas" w:eastAsia="Times New Roman" w:hAnsi="Consolas" w:cs="Times New Roman"/>
@@ -22110,29 +21660,7 @@
           <w:szCs w:val="21"/>
           <w:lang w:eastAsia="cs-CZ"/>
         </w:rPr>
-        <w:t xml:space="preserve">"flex flex-col </w:t>
-      </w:r>
-      <w:proofErr w:type="spellStart"/>
-      <w:r>
-        <w:rPr>
-          <w:rFonts w:ascii="Consolas" w:eastAsia="Times New Roman" w:hAnsi="Consolas" w:cs="Times New Roman"/>
-          <w:color w:val="A31515"/>
-          <w:sz w:val="21"/>
-          <w:szCs w:val="21"/>
-          <w:lang w:eastAsia="cs-CZ"/>
-        </w:rPr>
-        <w:t>lg:flex-row</w:t>
-      </w:r>
-      <w:proofErr w:type="spellEnd"/>
-      <w:r>
-        <w:rPr>
-          <w:rFonts w:ascii="Consolas" w:eastAsia="Times New Roman" w:hAnsi="Consolas" w:cs="Times New Roman"/>
-          <w:color w:val="A31515"/>
-          <w:sz w:val="21"/>
-          <w:szCs w:val="21"/>
-          <w:lang w:eastAsia="cs-CZ"/>
-        </w:rPr>
-        <w:t xml:space="preserve"> gap-5"</w:t>
+        <w:t>"flex flex-col lg:flex-row gap-5"</w:t>
       </w:r>
       <w:r>
         <w:rPr>
@@ -22204,7 +21732,6 @@
         </w:rPr>
         <w:t xml:space="preserve"> </w:t>
       </w:r>
-      <w:proofErr w:type="spellStart"/>
       <w:r>
         <w:rPr>
           <w:rFonts w:ascii="Consolas" w:eastAsia="Times New Roman" w:hAnsi="Consolas" w:cs="Times New Roman"/>
@@ -22215,7 +21742,6 @@
         </w:rPr>
         <w:t>belt</w:t>
       </w:r>
-      <w:proofErr w:type="spellEnd"/>
       <w:r>
         <w:rPr>
           <w:rFonts w:ascii="Consolas" w:eastAsia="Times New Roman" w:hAnsi="Consolas" w:cs="Times New Roman"/>
@@ -22236,7 +21762,6 @@
         </w:rPr>
         <w:t>{</w:t>
       </w:r>
-      <w:proofErr w:type="spellStart"/>
       <w:r>
         <w:rPr>
           <w:rFonts w:ascii="Consolas" w:eastAsia="Times New Roman" w:hAnsi="Consolas" w:cs="Times New Roman"/>
@@ -22247,7 +21772,6 @@
         </w:rPr>
         <w:t>selectedBelt</w:t>
       </w:r>
-      <w:proofErr w:type="spellEnd"/>
       <w:r>
         <w:rPr>
           <w:rFonts w:ascii="Consolas" w:eastAsia="Times New Roman" w:hAnsi="Consolas" w:cs="Times New Roman"/>
@@ -22318,7 +21842,6 @@
         </w:rPr>
         <w:t>&lt;</w:t>
       </w:r>
-      <w:proofErr w:type="spellStart"/>
       <w:r>
         <w:rPr>
           <w:rFonts w:ascii="Consolas" w:eastAsia="Times New Roman" w:hAnsi="Consolas" w:cs="Times New Roman"/>
@@ -22329,7 +21852,6 @@
         </w:rPr>
         <w:t>SestavyInfo</w:t>
       </w:r>
-      <w:proofErr w:type="spellEnd"/>
       <w:r>
         <w:rPr>
           <w:rFonts w:ascii="Consolas" w:eastAsia="Times New Roman" w:hAnsi="Consolas" w:cs="Times New Roman"/>
@@ -22340,7 +21862,6 @@
         </w:rPr>
         <w:t xml:space="preserve"> </w:t>
       </w:r>
-      <w:proofErr w:type="spellStart"/>
       <w:r>
         <w:rPr>
           <w:rFonts w:ascii="Consolas" w:eastAsia="Times New Roman" w:hAnsi="Consolas" w:cs="Times New Roman"/>
@@ -22351,7 +21872,6 @@
         </w:rPr>
         <w:t>belt</w:t>
       </w:r>
-      <w:proofErr w:type="spellEnd"/>
       <w:r>
         <w:rPr>
           <w:rFonts w:ascii="Consolas" w:eastAsia="Times New Roman" w:hAnsi="Consolas" w:cs="Times New Roman"/>
@@ -22372,7 +21892,6 @@
         </w:rPr>
         <w:t>{</w:t>
       </w:r>
-      <w:proofErr w:type="spellStart"/>
       <w:r>
         <w:rPr>
           <w:rFonts w:ascii="Consolas" w:eastAsia="Times New Roman" w:hAnsi="Consolas" w:cs="Times New Roman"/>
@@ -22383,7 +21902,6 @@
         </w:rPr>
         <w:t>selectedBelt</w:t>
       </w:r>
-      <w:proofErr w:type="spellEnd"/>
       <w:r>
         <w:rPr>
           <w:rFonts w:ascii="Consolas" w:eastAsia="Times New Roman" w:hAnsi="Consolas" w:cs="Times New Roman"/>
@@ -22554,7 +22072,6 @@
         </w:rPr>
         <w:t>&lt;</w:t>
       </w:r>
-      <w:proofErr w:type="spellStart"/>
       <w:r>
         <w:rPr>
           <w:rFonts w:ascii="Consolas" w:eastAsia="Times New Roman" w:hAnsi="Consolas" w:cs="Times New Roman"/>
@@ -22565,7 +22082,6 @@
         </w:rPr>
         <w:t>Prihlasky</w:t>
       </w:r>
-      <w:proofErr w:type="spellEnd"/>
       <w:r>
         <w:rPr>
           <w:rFonts w:ascii="Consolas" w:eastAsia="Times New Roman" w:hAnsi="Consolas" w:cs="Times New Roman"/>
@@ -22792,91 +22308,122 @@
         <w:t xml:space="preserve">Stránku tvoří tabulka s přehledem pásků obsahující informace o názvu pásku, třídě danu či cupu, ceně za zkoušku na jednotlivý technický stupeň a obrázek páku. Pod tabulkou se nachází sekce, která se dynamicky mění na základě vybraného technického stupně. Sekci tvoří komponenty </w:t>
       </w:r>
       <w:r>
-        <w:t xml:space="preserve">Video a </w:t>
-      </w:r>
-      <w:proofErr w:type="spellStart"/>
-      <w:r>
+        <w:rPr>
+          <w:i/>
+          <w:iCs/>
+        </w:rPr>
+        <w:t>Video</w:t>
+      </w:r>
+      <w:r>
+        <w:t xml:space="preserve"> a </w:t>
+      </w:r>
+      <w:r>
+        <w:rPr>
+          <w:i/>
+          <w:iCs/>
+        </w:rPr>
         <w:t>SestavyInfo</w:t>
       </w:r>
-      <w:proofErr w:type="spellEnd"/>
       <w:r>
         <w:t xml:space="preserve">. Komponenta Video se vykresluje pouze v případě, pokud má daný technický stupeň v databázi uložený odkaz na video. Klíčové pojmy k jednotlivým sestavám vykresluje komponenta </w:t>
       </w:r>
-      <w:proofErr w:type="spellStart"/>
-      <w:r>
+      <w:r>
+        <w:rPr>
+          <w:i/>
+          <w:iCs/>
+        </w:rPr>
         <w:t>SestavyInfo</w:t>
       </w:r>
-      <w:proofErr w:type="spellEnd"/>
       <w:r>
         <w:t>.</w:t>
       </w:r>
     </w:p>
     <w:p>
       <w:r>
-        <w:t xml:space="preserve">Dynamické vykreslování je realizováno pomocí </w:t>
-      </w:r>
-      <w:proofErr w:type="spellStart"/>
-      <w:r>
-        <w:t>useState</w:t>
-      </w:r>
-      <w:proofErr w:type="spellEnd"/>
+        <w:t xml:space="preserve">Dynamické vykreslování je realizováno pomocí useState </w:t>
+      </w:r>
+      <w:r>
+        <w:t>hooku</w:t>
+      </w:r>
+      <w:r>
+        <w:t>, kter</w:t>
+      </w:r>
+      <w:r>
+        <w:t>ý</w:t>
+      </w:r>
+      <w:r>
+        <w:t xml:space="preserve"> pracuje s informacemi </w:t>
+      </w:r>
+      <w:r>
+        <w:br/>
+      </w:r>
+      <w:r>
+        <w:t xml:space="preserve">o aktuálně zvoleném technickém stupni. Výchozí hodnota je nastavena na null, což zajišťuje, že při prvotním načtení stránky nebude vybrán žádný technický stupeň a tím pádem nebudou vykreslovány komponenty </w:t>
+      </w:r>
+      <w:r>
+        <w:rPr>
+          <w:i/>
+          <w:iCs/>
+        </w:rPr>
+        <w:t>Video</w:t>
+      </w:r>
+      <w:r>
+        <w:t xml:space="preserve"> a </w:t>
+      </w:r>
+      <w:r>
+        <w:rPr>
+          <w:i/>
+          <w:iCs/>
+        </w:rPr>
+        <w:t>Sestavy</w:t>
+      </w:r>
+      <w:r>
+        <w:rPr>
+          <w:i/>
+          <w:iCs/>
+        </w:rPr>
+        <w:t>I</w:t>
+      </w:r>
+      <w:r>
+        <w:rPr>
+          <w:i/>
+          <w:iCs/>
+        </w:rPr>
+        <w:t>nfo</w:t>
+      </w:r>
+      <w:r>
+        <w:t>. Pokud však uživatel vybere určitý technický stupeň pásu, tak dojde k dynamickému předání hodnot do jednotlivých komponent a vykreslí se komponenty se specifickými informacemi.</w:t>
+      </w:r>
+    </w:p>
+    <w:p>
+      <w:r>
+        <w:t>Spodní část</w:t>
+      </w:r>
+      <w:r>
+        <w:t xml:space="preserve"> stránky</w:t>
+      </w:r>
       <w:r>
         <w:t xml:space="preserve"> </w:t>
       </w:r>
       <w:r>
-        <w:t>hooku</w:t>
-      </w:r>
-      <w:r>
-        <w:t>, kter</w:t>
-      </w:r>
-      <w:r>
-        <w:t>ý</w:t>
-      </w:r>
-      <w:r>
-        <w:t xml:space="preserve"> pracuje s informacemi o aktuálně zvoleném technickém stupni. Výchozí hodnota je nastavena na null, což zajišťuje, že při prvotním načtení stránky nebude vybrán žádný technický stupeň a tím pádem nebudou vykreslovány komponenty Video a </w:t>
-      </w:r>
-      <w:proofErr w:type="spellStart"/>
-      <w:r>
-        <w:t>Sestavy</w:t>
-      </w:r>
-      <w:r>
-        <w:t>I</w:t>
-      </w:r>
-      <w:r>
-        <w:t>nfo</w:t>
-      </w:r>
-      <w:proofErr w:type="spellEnd"/>
-      <w:r>
-        <w:t>. Pokud však uživatel vybere určitý technický stupeň pásu, tak dojde k dynamickému předání hodnot do jednotlivých komponent a vykreslí se komponenty se specifickými informacemi.</w:t>
-      </w:r>
-    </w:p>
-    <w:p>
-      <w:r>
-        <w:t>Spodní část</w:t>
-      </w:r>
-      <w:r>
-        <w:t xml:space="preserve"> stránky</w:t>
+        <w:t>tvoří</w:t>
       </w:r>
       <w:r>
         <w:t xml:space="preserve"> </w:t>
       </w:r>
       <w:r>
-        <w:t>tvoří</w:t>
+        <w:t>komponenta</w:t>
       </w:r>
       <w:r>
         <w:t xml:space="preserve"> </w:t>
       </w:r>
       <w:r>
-        <w:t>komponenta</w:t>
-      </w:r>
-      <w:r>
-        <w:t xml:space="preserve"> </w:t>
-      </w:r>
-      <w:proofErr w:type="spellStart"/>
-      <w:r>
+        <w:rPr>
+          <w:i/>
+          <w:iCs/>
+        </w:rPr>
         <w:t>Prihlasky</w:t>
       </w:r>
-      <w:proofErr w:type="spellEnd"/>
       <w:r>
         <w:t xml:space="preserve">, která zobrazuje </w:t>
       </w:r>
@@ -22887,10 +22434,22 @@
         <w:t xml:space="preserve">datum konání a konce přihlášek, místo konání, cenu za účast a seznam přihlášených závodníků. </w:t>
       </w:r>
       <w:r>
-        <w:t xml:space="preserve">Závodníkům kteří jsou přihlášeni do systému je zde dostupné i tlačítko na přihlášení a odhlášení ze zkoušky. </w:t>
-      </w:r>
-      <w:r>
-        <w:t>Zobrazení zkoušek podléhá administrátorům a trenérům, kteří mají v administraci možnost zkoušku vytvořit, upravit, smazat a rozhodovat zda zkouška bude veřejná či skrytá.</w:t>
+        <w:t>Závodníkům</w:t>
+      </w:r>
+      <w:r>
+        <w:t>,</w:t>
+      </w:r>
+      <w:r>
+        <w:t xml:space="preserve"> kteří jsou přihlášeni do systému je zde dostupné i tlačítko na přihlášení a odhlášení ze zkoušky. </w:t>
+      </w:r>
+      <w:r>
+        <w:t>Zobrazení zkoušek podléhá administrátorům a trenérům, kteří mají v administraci možnost zkoušku vytvořit, upravit, smazat a rozhodovat</w:t>
+      </w:r>
+      <w:r>
+        <w:t>,</w:t>
+      </w:r>
+      <w:r>
+        <w:t xml:space="preserve"> zda zkouška bude veřejná či skrytá.</w:t>
       </w:r>
     </w:p>
     <w:p>
@@ -22899,6 +22458,9 @@
         <w:keepNext/>
       </w:pPr>
       <w:r>
+        <w:rPr>
+          <w:noProof/>
+        </w:rPr>
         <w:lastRenderedPageBreak/>
         <w:drawing>
           <wp:inline distT="0" distB="0" distL="0" distR="0" wp14:anchorId="6C22070A" wp14:editId="10C34F34">
@@ -22941,30 +22503,22 @@
       <w:pPr>
         <w:pStyle w:val="Titulek"/>
       </w:pPr>
+      <w:bookmarkStart w:id="37" w:name="_Toc226829977"/>
       <w:r>
         <w:t xml:space="preserve">Obr. </w:t>
       </w:r>
-      <w:r>
-        <w:fldChar w:fldCharType="begin"/>
-      </w:r>
-      <w:r>
-        <w:instrText xml:space="preserve"> SEQ Obr. \* ARABIC </w:instrText>
-      </w:r>
-      <w:r>
-        <w:fldChar w:fldCharType="separate"/>
-      </w:r>
-      <w:r>
-        <w:rPr>
-          <w:noProof/>
-        </w:rPr>
-        <w:t>17</w:t>
-      </w:r>
-      <w:r>
-        <w:fldChar w:fldCharType="end"/>
-      </w:r>
+      <w:fldSimple w:instr=" SEQ Obr. \* ARABIC ">
+        <w:r>
+          <w:rPr>
+            <w:noProof/>
+          </w:rPr>
+          <w:t>17</w:t>
+        </w:r>
+      </w:fldSimple>
       <w:r>
         <w:t>: Zkoušky</w:t>
       </w:r>
+      <w:bookmarkEnd w:id="37"/>
     </w:p>
     <w:p>
       <w:pPr>
@@ -23001,6 +22555,9 @@
         <w:t>Řešení je realizováno metodou mobile-first, což znamená, že rozhraní bylo primárně optimalizováno pro mobilní zařízení a následně upravováno pro větší obrazovky</w:t>
       </w:r>
       <w:r>
+        <w:t>,</w:t>
+      </w:r>
+      <w:r>
         <w:t xml:space="preserve"> jako jsou tablety, notebooky a desktopové počítače</w:t>
       </w:r>
       <w:r>
@@ -23012,43 +22569,64 @@
     </w:p>
     <w:p>
       <w:r>
-        <w:t xml:space="preserve">Správné rozvržení obsahu je především realizováno pomocí </w:t>
-      </w:r>
-      <w:proofErr w:type="spellStart"/>
-      <w:r>
-        <w:t>flexboxů</w:t>
-      </w:r>
-      <w:proofErr w:type="spellEnd"/>
-      <w:r>
-        <w:t xml:space="preserve"> a </w:t>
-      </w:r>
-      <w:proofErr w:type="spellStart"/>
-      <w:r>
-        <w:t>gridů</w:t>
-      </w:r>
-      <w:proofErr w:type="spellEnd"/>
+        <w:t>Správné rozvržení obsahu je především realizováno pomocí flexboxů a gridů</w:t>
+      </w:r>
       <w:r>
         <w:t>,</w:t>
       </w:r>
       <w:r>
-        <w:t xml:space="preserve"> které umožňují dynamicky přizpůsobovat rozmístění jednotlivých prvků na základě aktuálního rozlišení a v případě potřeby také některé prvky pro menší rozlišení skrýt. </w:t>
-      </w:r>
-    </w:p>
-    <w:p>
-      <w:proofErr w:type="spellStart"/>
+        <w:t xml:space="preserve"> které umožňují dynamicky přizpůsobovat rozmístění jednotlivých prvků na základě aktuálního rozlišení</w:t>
+      </w:r>
+      <w:r>
+        <w:br/>
+      </w:r>
+      <w:r>
+        <w:t xml:space="preserve">a v případě potřeby také některé prvky pro menší rozlišení skrýt. </w:t>
+      </w:r>
+    </w:p>
+    <w:p>
       <w:r>
         <w:lastRenderedPageBreak/>
-        <w:t>Flexbox</w:t>
-      </w:r>
-      <w:proofErr w:type="spellEnd"/>
-      <w:r>
-        <w:t xml:space="preserve"> je využíván zejména pro zarovnání prvků jako je například navigační menu nebo </w:t>
-      </w:r>
-      <w:r>
-        <w:t>u některých komponent jako jsou informace týkající se závodníků. Grid je použit pro složitější rozvrhování obsahu jako jsou například seznamy závodníků nebo aktualit, kdy je potřeba měnit počet zobrazovaných prvků na základě aktuálního rozlišení.</w:t>
-      </w:r>
-      <w:r>
-        <w:t xml:space="preserve"> V případě většího rozlišení se prvky zobrazují vedle sebe a se zmenšováním rozlišení se prvky vykreslují pod sebe do sloupce.</w:t>
+        <w:t>Flexbox je využíván zejména pro zarovnání prvků</w:t>
+      </w:r>
+      <w:r>
+        <w:t>,</w:t>
+      </w:r>
+      <w:r>
+        <w:t xml:space="preserve"> jako je například navigační menu</w:t>
+      </w:r>
+      <w:r>
+        <w:t>,</w:t>
+      </w:r>
+      <w:r>
+        <w:t xml:space="preserve"> nebo </w:t>
+      </w:r>
+      <w:r>
+        <w:br/>
+      </w:r>
+      <w:r>
+        <w:t>u některých komponent</w:t>
+      </w:r>
+      <w:r>
+        <w:t>,</w:t>
+      </w:r>
+      <w:r>
+        <w:t xml:space="preserve"> jako jsou informace týkající se závodníků. Grid je použit pro složitější rozvrhování obsahu</w:t>
+      </w:r>
+      <w:r>
+        <w:t>,</w:t>
+      </w:r>
+      <w:r>
+        <w:t xml:space="preserve"> jako jsou například seznamy závodníků nebo aktualit, kdy je potřeba měnit počet zobrazovaných prvků na základě aktuálního rozlišení.</w:t>
+      </w:r>
+      <w:r>
+        <w:t xml:space="preserve"> V případě většího rozlišení se prvky zobrazují vedle sebe</w:t>
+      </w:r>
+      <w:r>
+        <w:t>, zatímco</w:t>
+      </w:r>
+      <w:r>
+        <w:t xml:space="preserve"> se zmenšováním rozlišení se prvky vykreslují pod sebe do sloupce.</w:t>
       </w:r>
     </w:p>
     <w:p>
@@ -23057,6 +22635,9 @@
         <w:jc w:val="center"/>
       </w:pPr>
       <w:r>
+        <w:rPr>
+          <w:noProof/>
+        </w:rPr>
         <w:drawing>
           <wp:inline distT="0" distB="0" distL="0" distR="0" wp14:anchorId="315D7906" wp14:editId="42F2D4F7">
             <wp:extent cx="1387000" cy="3700130"/>
@@ -23098,30 +22679,22 @@
       <w:pPr>
         <w:pStyle w:val="Titulek"/>
       </w:pPr>
+      <w:bookmarkStart w:id="38" w:name="_Toc226829978"/>
       <w:r>
         <w:t xml:space="preserve">Obr. </w:t>
       </w:r>
-      <w:r>
-        <w:fldChar w:fldCharType="begin"/>
-      </w:r>
-      <w:r>
-        <w:instrText xml:space="preserve"> SEQ Obr. \* ARABIC </w:instrText>
-      </w:r>
-      <w:r>
-        <w:fldChar w:fldCharType="separate"/>
-      </w:r>
-      <w:r>
-        <w:rPr>
-          <w:noProof/>
-        </w:rPr>
-        <w:t>18</w:t>
-      </w:r>
-      <w:r>
-        <w:fldChar w:fldCharType="end"/>
-      </w:r>
+      <w:fldSimple w:instr=" SEQ Obr. \* ARABIC ">
+        <w:r>
+          <w:rPr>
+            <w:noProof/>
+          </w:rPr>
+          <w:t>18</w:t>
+        </w:r>
+      </w:fldSimple>
       <w:r>
         <w:t>: Ukázka mobilní responzivity</w:t>
       </w:r>
+      <w:bookmarkEnd w:id="38"/>
     </w:p>
     <w:p>
       <w:pPr>
@@ -23135,11 +22708,11 @@
       <w:pPr>
         <w:pStyle w:val="Nadpis2"/>
       </w:pPr>
-      <w:bookmarkStart w:id="37" w:name="_Toc226373089"/>
+      <w:bookmarkStart w:id="39" w:name="_Toc226829957"/>
       <w:r>
         <w:t>Backend</w:t>
       </w:r>
-      <w:bookmarkEnd w:id="37"/>
+      <w:bookmarkEnd w:id="39"/>
     </w:p>
     <w:p>
       <w:r>
@@ -23222,35 +22795,22 @@
       <w:pPr>
         <w:pStyle w:val="Titulek"/>
       </w:pPr>
-      <w:bookmarkStart w:id="38" w:name="_Toc226373067"/>
+      <w:bookmarkStart w:id="40" w:name="_Toc226829979"/>
       <w:r>
         <w:t xml:space="preserve">Obr. </w:t>
       </w:r>
-      <w:r>
-        <w:fldChar w:fldCharType="begin"/>
-      </w:r>
-      <w:r>
-        <w:instrText xml:space="preserve"> SEQ Obr. \* ARABIC </w:instrText>
-      </w:r>
-      <w:r>
-        <w:fldChar w:fldCharType="separate"/>
-      </w:r>
-      <w:r>
-        <w:rPr>
-          <w:noProof/>
-        </w:rPr>
-        <w:t>19</w:t>
-      </w:r>
-      <w:r>
-        <w:rPr>
-          <w:noProof/>
-        </w:rPr>
-        <w:fldChar w:fldCharType="end"/>
-      </w:r>
+      <w:fldSimple w:instr=" SEQ Obr. \* ARABIC ">
+        <w:r>
+          <w:rPr>
+            <w:noProof/>
+          </w:rPr>
+          <w:t>19</w:t>
+        </w:r>
+      </w:fldSimple>
       <w:r>
         <w:t>: Struktura backendu</w:t>
       </w:r>
-      <w:bookmarkEnd w:id="38"/>
+      <w:bookmarkEnd w:id="40"/>
     </w:p>
     <w:p>
       <w:pPr>
@@ -23305,12 +22865,15 @@
         <w:rPr>
           <w:iCs/>
         </w:rPr>
-        <w:t xml:space="preserve"> adresář obsahující middleware a JWT logiku</w:t>
-      </w:r>
-      <w:r>
-        <w:rPr>
-          <w:iCs/>
-        </w:rPr>
+        <w:t xml:space="preserve"> </w:t>
+      </w:r>
+      <w:r>
+        <w:t>adresář obsahující middleware a JWT logiku</w:t>
+      </w:r>
+      <w:r>
+        <w:t>,</w:t>
+      </w:r>
+      <w:r>
         <w:t xml:space="preserve"> starající se o autorizaci uživatelů</w:t>
       </w:r>
     </w:p>
@@ -23341,7 +22904,10 @@
         <w:rPr>
           <w:iCs/>
         </w:rPr>
-        <w:t xml:space="preserve"> obsahem adresáře je soubor zprostředkovávající propojení s databází</w:t>
+        <w:t xml:space="preserve"> </w:t>
+      </w:r>
+      <w:r>
+        <w:t>obsahem adresáře je soubor zprostředkovávající propojení s databází</w:t>
       </w:r>
     </w:p>
     <w:p>
@@ -23371,7 +22937,16 @@
         <w:rPr>
           <w:iCs/>
         </w:rPr>
-        <w:t xml:space="preserve"> závislosti týkající se projektu </w:t>
+        <w:t xml:space="preserve"> </w:t>
+      </w:r>
+      <w:r>
+        <w:t>závislosti týkající se projektu</w:t>
+      </w:r>
+      <w:r>
+        <w:rPr>
+          <w:iCs/>
+        </w:rPr>
+        <w:t xml:space="preserve"> </w:t>
       </w:r>
     </w:p>
     <w:p>
@@ -23401,15 +22976,21 @@
         <w:rPr>
           <w:iCs/>
         </w:rPr>
-        <w:t xml:space="preserve"> nachází se zde centrální Router.js soubor a řada podsložek vytvořených podle stránek ve kterých se nachází jednotlivé routery pro dané stránky</w:t>
+        <w:t xml:space="preserve"> </w:t>
+      </w:r>
+      <w:r>
+        <w:t>nachází se zde centrální Router.js soubor a řada podsložek vytvořených podle stránek</w:t>
+      </w:r>
+      <w:r>
+        <w:t>,</w:t>
+      </w:r>
+      <w:r>
+        <w:t xml:space="preserve"> ve kterých se nachází jednotlivé routery pro dané stránky</w:t>
       </w:r>
     </w:p>
     <w:p>
       <w:pPr>
         <w:jc w:val="left"/>
-        <w:rPr>
-          <w:iCs/>
-        </w:rPr>
       </w:pPr>
       <w:r>
         <w:rPr>
@@ -23434,18 +23015,30 @@
         <w:t xml:space="preserve"> </w:t>
       </w:r>
       <w:r>
-        <w:rPr>
-          <w:iCs/>
-        </w:rPr>
-        <w:t>obsahuje fotografie které uživatel nahrál a poté jsou roztřízeny do podsložek podle entity ke které patří</w:t>
+        <w:t>obsahuje fotografie</w:t>
+      </w:r>
+      <w:r>
+        <w:t>,</w:t>
+      </w:r>
+      <w:r>
+        <w:t xml:space="preserve"> které uživatel nahrál</w:t>
+      </w:r>
+      <w:r>
+        <w:t>,</w:t>
+      </w:r>
+      <w:r>
+        <w:t xml:space="preserve"> a poté jsou roztřízeny do podsložek podle entity</w:t>
+      </w:r>
+      <w:r>
+        <w:t>,</w:t>
+      </w:r>
+      <w:r>
+        <w:t xml:space="preserve"> ke které patří</w:t>
       </w:r>
     </w:p>
     <w:p>
       <w:pPr>
         <w:jc w:val="left"/>
-        <w:rPr>
-          <w:iCs/>
-        </w:rPr>
       </w:pPr>
       <w:r>
         <w:rPr>
@@ -23464,9 +23057,6 @@
         <w:t xml:space="preserve">– </w:t>
       </w:r>
       <w:r>
-        <w:rPr>
-          <w:iCs/>
-        </w:rPr>
         <w:t xml:space="preserve">adresář obsahující pomocné funkce, jako je například práce s datem nebo nahrávání souborů </w:t>
       </w:r>
     </w:p>
@@ -23506,24 +23096,42 @@
         <w:rPr>
           <w:iCs/>
         </w:rPr>
-        <w:t xml:space="preserve"> – konfigurační soubor ve kterém jsou uloženy citlivé informace jako jsou API klíče</w:t>
-      </w:r>
-      <w:r>
-        <w:rPr>
-          <w:iCs/>
-        </w:rPr>
-        <w:t>, JWT tokeny a údaje týkající se databáze s</w:t>
-      </w:r>
-      <w:r>
-        <w:rPr>
-          <w:iCs/>
-        </w:rPr>
+        <w:t xml:space="preserve"> – </w:t>
+      </w:r>
+      <w:r>
+        <w:t>konfigurační soubor</w:t>
+      </w:r>
+      <w:r>
+        <w:t>,</w:t>
+      </w:r>
+      <w:r>
+        <w:t xml:space="preserve"> ve kterém jsou uloženy citlivé informace</w:t>
+      </w:r>
+      <w:r>
+        <w:t>,</w:t>
+      </w:r>
+      <w:r>
+        <w:t xml:space="preserve"> jako jsou API klíče</w:t>
+      </w:r>
+      <w:r>
+        <w:t>, JWT</w:t>
+      </w:r>
+      <w:r>
+        <w:t xml:space="preserve"> SECRET_KEY</w:t>
+      </w:r>
+      <w:r>
+        <w:t xml:space="preserve"> a údaje týkající se databáze</w:t>
+      </w:r>
+      <w:r>
+        <w:t>,</w:t>
+      </w:r>
+      <w:r>
+        <w:t xml:space="preserve"> s</w:t>
+      </w:r>
+      <w:r>
         <w:t>e</w:t>
       </w:r>
       <w:r>
-        <w:rPr>
-          <w:iCs/>
-        </w:rPr>
         <w:t> kterou aplikace interaguje</w:t>
       </w:r>
     </w:p>
@@ -23551,15 +23159,24 @@
         <w:rPr>
           <w:iCs/>
         </w:rPr>
-        <w:t>reprezentuje jak má vypadat .env soubor</w:t>
+        <w:t>reprezentuje</w:t>
+      </w:r>
+      <w:r>
+        <w:rPr>
+          <w:iCs/>
+        </w:rPr>
+        <w:t>,</w:t>
+      </w:r>
+      <w:r>
+        <w:rPr>
+          <w:iCs/>
+        </w:rPr>
+        <w:t xml:space="preserve"> jak má vypadat .env soubor</w:t>
       </w:r>
     </w:p>
     <w:p>
       <w:pPr>
         <w:jc w:val="left"/>
-        <w:rPr>
-          <w:iCs/>
-        </w:rPr>
       </w:pPr>
       <w:r>
         <w:rPr>
@@ -23572,18 +23189,15 @@
         <w:rPr>
           <w:iCs/>
         </w:rPr>
-        <w:t xml:space="preserve"> – obsahuje složky, soubory nebo koncovky souborů, které nemá </w:t>
-      </w:r>
-      <w:r>
-        <w:rPr>
-          <w:iCs/>
-        </w:rPr>
+        <w:t xml:space="preserve"> – </w:t>
+      </w:r>
+      <w:r>
+        <w:t xml:space="preserve">obsahuje složky, soubory nebo koncovky souborů, které nemá </w:t>
+      </w:r>
+      <w:r>
         <w:t>verzovací</w:t>
       </w:r>
       <w:r>
-        <w:rPr>
-          <w:iCs/>
-        </w:rPr>
         <w:t xml:space="preserve"> nástroj spravovat</w:t>
       </w:r>
     </w:p>
@@ -23619,12 +23233,12 @@
         <w:rPr>
           <w:iCs/>
         </w:rPr>
-        <w:t xml:space="preserve"> – konfigurační soubor pro Google </w:t>
-      </w:r>
-      <w:r>
-        <w:rPr>
-          <w:iCs/>
-        </w:rPr>
+        <w:t xml:space="preserve"> – </w:t>
+      </w:r>
+      <w:r>
+        <w:t xml:space="preserve">konfigurační soubor pro Google </w:t>
+      </w:r>
+      <w:r>
         <w:t>kalendář</w:t>
       </w:r>
     </w:p>
@@ -23670,7 +23284,10 @@
         <w:rPr>
           <w:iCs/>
         </w:rPr>
-        <w:t xml:space="preserve"> – vstupní bod aplikace</w:t>
+        <w:t xml:space="preserve"> – </w:t>
+      </w:r>
+      <w:r>
+        <w:t>vstupní bod aplikace</w:t>
       </w:r>
     </w:p>
     <w:p>
@@ -25063,7 +24680,6 @@
         </w:rPr>
         <w:t xml:space="preserve"> </w:t>
       </w:r>
-      <w:proofErr w:type="spellStart"/>
       <w:r>
         <w:rPr>
           <w:rFonts w:ascii="Consolas" w:eastAsia="Times New Roman" w:hAnsi="Consolas" w:cs="Times New Roman"/>
@@ -25074,7 +24690,6 @@
         </w:rPr>
         <w:t>tournamentRegistrationRouter</w:t>
       </w:r>
-      <w:proofErr w:type="spellEnd"/>
       <w:r>
         <w:rPr>
           <w:rFonts w:ascii="Consolas" w:eastAsia="Times New Roman" w:hAnsi="Consolas" w:cs="Times New Roman"/>
@@ -25185,7 +24800,6 @@
         </w:rPr>
         <w:t xml:space="preserve"> </w:t>
       </w:r>
-      <w:proofErr w:type="spellStart"/>
       <w:r>
         <w:rPr>
           <w:rFonts w:ascii="Consolas" w:eastAsia="Times New Roman" w:hAnsi="Consolas" w:cs="Times New Roman"/>
@@ -25196,7 +24810,6 @@
         </w:rPr>
         <w:t>examRouter</w:t>
       </w:r>
-      <w:proofErr w:type="spellEnd"/>
       <w:r>
         <w:rPr>
           <w:rFonts w:ascii="Consolas" w:eastAsia="Times New Roman" w:hAnsi="Consolas" w:cs="Times New Roman"/>
@@ -25255,51 +24868,7 @@
           <w:szCs w:val="21"/>
           <w:lang w:eastAsia="cs-CZ"/>
         </w:rPr>
-        <w:t>"./</w:t>
-      </w:r>
-      <w:proofErr w:type="spellStart"/>
-      <w:r>
-        <w:rPr>
-          <w:rFonts w:ascii="Consolas" w:eastAsia="Times New Roman" w:hAnsi="Consolas" w:cs="Times New Roman"/>
-          <w:color w:val="A31515"/>
-          <w:sz w:val="21"/>
-          <w:szCs w:val="21"/>
-          <w:lang w:eastAsia="cs-CZ"/>
-        </w:rPr>
-        <w:t>Exams</w:t>
-      </w:r>
-      <w:proofErr w:type="spellEnd"/>
-      <w:r>
-        <w:rPr>
-          <w:rFonts w:ascii="Consolas" w:eastAsia="Times New Roman" w:hAnsi="Consolas" w:cs="Times New Roman"/>
-          <w:color w:val="A31515"/>
-          <w:sz w:val="21"/>
-          <w:szCs w:val="21"/>
-          <w:lang w:eastAsia="cs-CZ"/>
-        </w:rPr>
-        <w:t>/</w:t>
-      </w:r>
-      <w:proofErr w:type="spellStart"/>
-      <w:r>
-        <w:rPr>
-          <w:rFonts w:ascii="Consolas" w:eastAsia="Times New Roman" w:hAnsi="Consolas" w:cs="Times New Roman"/>
-          <w:color w:val="A31515"/>
-          <w:sz w:val="21"/>
-          <w:szCs w:val="21"/>
-          <w:lang w:eastAsia="cs-CZ"/>
-        </w:rPr>
-        <w:t>RouterExams</w:t>
-      </w:r>
-      <w:proofErr w:type="spellEnd"/>
-      <w:r>
-        <w:rPr>
-          <w:rFonts w:ascii="Consolas" w:eastAsia="Times New Roman" w:hAnsi="Consolas" w:cs="Times New Roman"/>
-          <w:color w:val="A31515"/>
-          <w:sz w:val="21"/>
-          <w:szCs w:val="21"/>
-          <w:lang w:eastAsia="cs-CZ"/>
-        </w:rPr>
-        <w:t>"</w:t>
+        <w:t>"./Exams/RouterExams"</w:t>
       </w:r>
       <w:r>
         <w:rPr>
@@ -26510,29 +26079,7 @@
           <w:szCs w:val="21"/>
           <w:lang w:eastAsia="cs-CZ"/>
         </w:rPr>
-        <w:t>"/</w:t>
-      </w:r>
-      <w:proofErr w:type="spellStart"/>
-      <w:r>
-        <w:rPr>
-          <w:rFonts w:ascii="Consolas" w:eastAsia="Times New Roman" w:hAnsi="Consolas" w:cs="Times New Roman"/>
-          <w:color w:val="A31515"/>
-          <w:sz w:val="21"/>
-          <w:szCs w:val="21"/>
-          <w:lang w:eastAsia="cs-CZ"/>
-        </w:rPr>
-        <w:t>tournamentRegistration</w:t>
-      </w:r>
-      <w:proofErr w:type="spellEnd"/>
-      <w:r>
-        <w:rPr>
-          <w:rFonts w:ascii="Consolas" w:eastAsia="Times New Roman" w:hAnsi="Consolas" w:cs="Times New Roman"/>
-          <w:color w:val="A31515"/>
-          <w:sz w:val="21"/>
-          <w:szCs w:val="21"/>
-          <w:lang w:eastAsia="cs-CZ"/>
-        </w:rPr>
-        <w:t>"</w:t>
+        <w:t>"/tournamentRegistration"</w:t>
       </w:r>
       <w:r>
         <w:rPr>
@@ -26544,7 +26091,6 @@
         </w:rPr>
         <w:t xml:space="preserve">, </w:t>
       </w:r>
-      <w:proofErr w:type="spellStart"/>
       <w:r>
         <w:rPr>
           <w:rFonts w:ascii="Consolas" w:eastAsia="Times New Roman" w:hAnsi="Consolas" w:cs="Times New Roman"/>
@@ -26555,7 +26101,6 @@
         </w:rPr>
         <w:t>tournamentRegistrationRouter</w:t>
       </w:r>
-      <w:proofErr w:type="spellEnd"/>
       <w:r>
         <w:rPr>
           <w:rFonts w:ascii="Consolas" w:eastAsia="Times New Roman" w:hAnsi="Consolas" w:cs="Times New Roman"/>
@@ -26634,29 +26179,7 @@
           <w:szCs w:val="21"/>
           <w:lang w:eastAsia="cs-CZ"/>
         </w:rPr>
-        <w:t>"/</w:t>
-      </w:r>
-      <w:proofErr w:type="spellStart"/>
-      <w:r>
-        <w:rPr>
-          <w:rFonts w:ascii="Consolas" w:eastAsia="Times New Roman" w:hAnsi="Consolas" w:cs="Times New Roman"/>
-          <w:color w:val="A31515"/>
-          <w:sz w:val="21"/>
-          <w:szCs w:val="21"/>
-          <w:lang w:eastAsia="cs-CZ"/>
-        </w:rPr>
-        <w:t>exams</w:t>
-      </w:r>
-      <w:proofErr w:type="spellEnd"/>
-      <w:r>
-        <w:rPr>
-          <w:rFonts w:ascii="Consolas" w:eastAsia="Times New Roman" w:hAnsi="Consolas" w:cs="Times New Roman"/>
-          <w:color w:val="A31515"/>
-          <w:sz w:val="21"/>
-          <w:szCs w:val="21"/>
-          <w:lang w:eastAsia="cs-CZ"/>
-        </w:rPr>
-        <w:t>"</w:t>
+        <w:t>"/exams"</w:t>
       </w:r>
       <w:r>
         <w:rPr>
@@ -26668,7 +26191,6 @@
         </w:rPr>
         <w:t xml:space="preserve">, </w:t>
       </w:r>
-      <w:proofErr w:type="spellStart"/>
       <w:r>
         <w:rPr>
           <w:rFonts w:ascii="Consolas" w:eastAsia="Times New Roman" w:hAnsi="Consolas" w:cs="Times New Roman"/>
@@ -26679,7 +26201,6 @@
         </w:rPr>
         <w:t>examRouter</w:t>
       </w:r>
-      <w:proofErr w:type="spellEnd"/>
       <w:r>
         <w:rPr>
           <w:rFonts w:ascii="Consolas" w:eastAsia="Times New Roman" w:hAnsi="Consolas" w:cs="Times New Roman"/>
@@ -30074,29 +29595,7 @@
           <w:szCs w:val="21"/>
           <w:lang w:eastAsia="cs-CZ"/>
         </w:rPr>
-        <w:t xml:space="preserve">        DATE_FORMAT(e.created_at, '%d.%m.%Y') AS </w:t>
-      </w:r>
-      <w:proofErr w:type="spellStart"/>
-      <w:r>
-        <w:rPr>
-          <w:rFonts w:ascii="Consolas" w:eastAsia="Times New Roman" w:hAnsi="Consolas" w:cs="Times New Roman"/>
-          <w:color w:val="A31515"/>
-          <w:sz w:val="21"/>
-          <w:szCs w:val="21"/>
-          <w:lang w:eastAsia="cs-CZ"/>
-        </w:rPr>
-        <w:t>created_at_formatted</w:t>
-      </w:r>
-      <w:proofErr w:type="spellEnd"/>
-      <w:r>
-        <w:rPr>
-          <w:rFonts w:ascii="Consolas" w:eastAsia="Times New Roman" w:hAnsi="Consolas" w:cs="Times New Roman"/>
-          <w:color w:val="A31515"/>
-          <w:sz w:val="21"/>
-          <w:szCs w:val="21"/>
-          <w:lang w:eastAsia="cs-CZ"/>
-        </w:rPr>
-        <w:t>,</w:t>
+        <w:t>        DATE_FORMAT(e.created_at, '%d.%m.%Y') AS created_at_formatted,</w:t>
       </w:r>
     </w:p>
     <w:p>
@@ -31940,7 +31439,6 @@
         </w:rPr>
         <w:t xml:space="preserve">, </w:t>
       </w:r>
-      <w:proofErr w:type="spellStart"/>
       <w:r>
         <w:rPr>
           <w:rFonts w:ascii="Consolas" w:eastAsia="Times New Roman" w:hAnsi="Consolas" w:cs="Times New Roman"/>
@@ -31951,7 +31449,6 @@
         </w:rPr>
         <w:t>isAdminOrTrainer</w:t>
       </w:r>
-      <w:proofErr w:type="spellEnd"/>
       <w:r>
         <w:rPr>
           <w:rFonts w:ascii="Consolas" w:eastAsia="Times New Roman" w:hAnsi="Consolas" w:cs="Times New Roman"/>
@@ -36053,7 +35550,6 @@
         </w:rPr>
         <w:t xml:space="preserve">, </w:t>
       </w:r>
-      <w:proofErr w:type="spellStart"/>
       <w:r>
         <w:rPr>
           <w:rFonts w:ascii="Consolas" w:eastAsia="Times New Roman" w:hAnsi="Consolas" w:cs="Times New Roman"/>
@@ -36064,7 +35560,6 @@
         </w:rPr>
         <w:t>isAdminOrTrainer</w:t>
       </w:r>
-      <w:proofErr w:type="spellEnd"/>
       <w:r>
         <w:rPr>
           <w:rFonts w:ascii="Consolas" w:eastAsia="Times New Roman" w:hAnsi="Consolas" w:cs="Times New Roman"/>
@@ -40823,7 +40318,6 @@
         </w:rPr>
         <w:t xml:space="preserve">, </w:t>
       </w:r>
-      <w:proofErr w:type="spellStart"/>
       <w:r>
         <w:rPr>
           <w:rFonts w:ascii="Consolas" w:eastAsia="Times New Roman" w:hAnsi="Consolas" w:cs="Times New Roman"/>
@@ -40834,7 +40328,6 @@
         </w:rPr>
         <w:t>isAdminOrTrainer</w:t>
       </w:r>
-      <w:proofErr w:type="spellEnd"/>
       <w:r>
         <w:rPr>
           <w:rFonts w:ascii="Consolas" w:eastAsia="Times New Roman" w:hAnsi="Consolas" w:cs="Times New Roman"/>
@@ -42465,7 +41958,6 @@
         </w:rPr>
         <w:t xml:space="preserve"> </w:t>
       </w:r>
-      <w:proofErr w:type="spellStart"/>
       <w:r>
         <w:rPr>
           <w:rFonts w:ascii="Consolas" w:eastAsia="Times New Roman" w:hAnsi="Consolas" w:cs="Times New Roman"/>
@@ -42476,7 +41968,6 @@
         </w:rPr>
         <w:t>getFilePath</w:t>
       </w:r>
-      <w:proofErr w:type="spellEnd"/>
       <w:r>
         <w:rPr>
           <w:rFonts w:ascii="Consolas" w:eastAsia="Times New Roman" w:hAnsi="Consolas" w:cs="Times New Roman"/>
@@ -43037,7 +42528,6 @@
         </w:rPr>
         <w:t xml:space="preserve"> </w:t>
       </w:r>
-      <w:proofErr w:type="spellStart"/>
       <w:r>
         <w:rPr>
           <w:rFonts w:ascii="Consolas" w:eastAsia="Times New Roman" w:hAnsi="Consolas" w:cs="Times New Roman"/>
@@ -43048,7 +42538,6 @@
         </w:rPr>
         <w:t>getFilePath</w:t>
       </w:r>
-      <w:proofErr w:type="spellEnd"/>
       <w:r>
         <w:rPr>
           <w:rFonts w:ascii="Consolas" w:eastAsia="Times New Roman" w:hAnsi="Consolas" w:cs="Times New Roman"/>
@@ -44449,19 +43938,63 @@
       <w:pPr>
         <w:pStyle w:val="Nadpis1"/>
       </w:pPr>
-      <w:bookmarkStart w:id="39" w:name="_Toc226373090"/>
+      <w:bookmarkStart w:id="41" w:name="_Toc226829958"/>
       <w:r>
         <w:lastRenderedPageBreak/>
         <w:t>Implementace řešení</w:t>
       </w:r>
-      <w:bookmarkEnd w:id="39"/>
-    </w:p>
-    <w:p>
-      <w:r>
-        <w:t>DOPSAT</w:t>
-      </w:r>
-      <w:r>
-        <w:t>!!!</w:t>
+      <w:bookmarkEnd w:id="41"/>
+    </w:p>
+    <w:p>
+      <w:r>
+        <w:t xml:space="preserve">Výsledné řešení je rozdělené na frontendovou a backendovou část, které jsou </w:t>
+      </w:r>
+      <w:r>
+        <w:t>provozovány odděleně, avšak spolu vzájemně komunikují</w:t>
+      </w:r>
+    </w:p>
+    <w:p>
+      <w:r>
+        <w:t>Frontendová část aplikace je nejdříve sestavena</w:t>
+      </w:r>
+      <w:r>
+        <w:t>,</w:t>
+      </w:r>
+      <w:r>
+        <w:t xml:space="preserve"> přičemž dojde k optimalizaci zdrojových </w:t>
+      </w:r>
+      <w:r>
+        <w:t>kódu</w:t>
+      </w:r>
+      <w:r>
+        <w:t xml:space="preserve"> a jejich převedení do statických souborů (HTML, CSS, JavaScript). Soubory jsou poté servírovány pomocí reverzní proxy, která zajišťuje jejich dostupnost pro koncové uživatele.</w:t>
+      </w:r>
+    </w:p>
+    <w:p>
+      <w:r>
+        <w:t>Backendová část je implementována v prostředí NodeJS</w:t>
+      </w:r>
+      <w:r>
+        <w:t xml:space="preserve"> a je spuštěna pomocí příkazu npm start. Backend je provozován jako služba, což zajišťuje nepřetržitý běh a dochází k automatickému spuštění při startu serveru.</w:t>
+      </w:r>
+      <w:r>
+        <w:t xml:space="preserve"> Zmíněné řešení zajišťuje vyšší stabilitu aplikace.</w:t>
+      </w:r>
+    </w:p>
+    <w:p>
+      <w:r>
+        <w:t>Reverzní proxy slouží jako prostředník mezi klientem a serverem</w:t>
+      </w:r>
+      <w:r>
+        <w:t xml:space="preserve">. Slouží k přesměrování požadavků na frontend část aplikace a zároveň směruje API požadavky na backend, který běží na jiném portu. Zmíněné řešení zajišťuje oddělení jednotlivých částí aplikace a zároveň </w:t>
+      </w:r>
+      <w:r>
+        <w:t>zvyšuje bezpečnost a efektivitu komunikace mezi nimi.</w:t>
+      </w:r>
+    </w:p>
+    <w:p>
+      <w:r>
+        <w:t>Výše popsaná architektura umožňuje lepší škálovatelnost, jednodušší správu a vyšší bezpečnost celého řešení.</w:t>
       </w:r>
     </w:p>
     <w:p/>
@@ -44474,14 +44007,14 @@
         </w:numPr>
         <w:ind w:left="431" w:hanging="431"/>
       </w:pPr>
-      <w:bookmarkStart w:id="40" w:name="_Toc60053869"/>
-      <w:bookmarkStart w:id="41" w:name="_Toc226373091"/>
+      <w:bookmarkStart w:id="42" w:name="_Toc60053869"/>
+      <w:bookmarkStart w:id="43" w:name="_Toc226829959"/>
       <w:r>
         <w:lastRenderedPageBreak/>
         <w:t>Závěr</w:t>
       </w:r>
-      <w:bookmarkEnd w:id="40"/>
-      <w:bookmarkEnd w:id="41"/>
+      <w:bookmarkEnd w:id="42"/>
+      <w:bookmarkEnd w:id="43"/>
     </w:p>
     <w:p>
       <w:r>
@@ -44510,31 +44043,31 @@
     </w:p>
     <w:p>
       <w:r>
-        <w:t xml:space="preserve">Tvorba bakalářské práce mi přinesla cenné zkušenosti nejen v oblasti programování, ale </w:t>
+        <w:t xml:space="preserve">Tvorba bakalářské práce mi přinesla cenné zkušenosti nejen v oblasti programování, </w:t>
       </w:r>
       <w:r>
         <w:br/>
       </w:r>
       <w:r>
-        <w:t xml:space="preserve">i v oblasti komunikace se zákazníkem a vyjednávání. Během vývoje jsem se seznámil s principy moderního designu a bezpečnosti webových stránek, </w:t>
+        <w:t xml:space="preserve">ale i v oblasti komunikace se zákazníkem a vyjednávání. Během vývoje jsem se seznámil s principy moderního designu a bezpečnosti webových stránek, </w:t>
       </w:r>
       <w:r>
         <w:t>získané</w:t>
       </w:r>
       <w:r>
-        <w:t xml:space="preserve"> zkušenosti považuji za velmi cenné </w:t>
-      </w:r>
-      <w:r>
-        <w:br/>
-      </w:r>
-      <w:r>
-        <w:t xml:space="preserve">a jsem si jistý, že mi pomohou v mém profesním růstu. Vytvořil jsem funkční webovou stránku, která splňuje veškeré požadavky, má praktickou hodnotu a přispívá k efektivnější organizaci </w:t>
-      </w:r>
-      <w:r>
-        <w:br/>
-      </w:r>
-      <w:r>
-        <w:t>a propagaci oddílu Taekwondo Lacek.</w:t>
+        <w:t xml:space="preserve"> zkušenosti považuji za velmi cenné a jsem si jistý, že mi pomohou v mém profesním růstu. Vytvořil jsem funkční webovou stránku, která splňuje veškeré požadavky, má praktickou hodnotu a přispívá k</w:t>
+      </w:r>
+      <w:r>
+        <w:t> </w:t>
+      </w:r>
+      <w:r>
+        <w:t>efektivnější</w:t>
+      </w:r>
+      <w:r>
+        <w:t xml:space="preserve"> </w:t>
+      </w:r>
+      <w:r>
+        <w:t>organizaci a propagaci oddílu Taekwondo Lacek.</w:t>
       </w:r>
     </w:p>
     <w:p>
@@ -44561,12 +44094,12 @@
         </w:numPr>
         <w:ind w:left="431" w:hanging="431"/>
       </w:pPr>
-      <w:bookmarkStart w:id="42" w:name="_Toc226373092"/>
+      <w:bookmarkStart w:id="44" w:name="_Toc226829960"/>
       <w:r>
         <w:lastRenderedPageBreak/>
         <w:t>Seznam použité literatury</w:t>
       </w:r>
-      <w:bookmarkEnd w:id="42"/>
+      <w:bookmarkEnd w:id="44"/>
     </w:p>
     <w:p>
       <w:pPr>
@@ -52034,10 +51567,12 @@
     <w:rsid w:val="00030807"/>
     <w:rsid w:val="00063792"/>
     <w:rsid w:val="00066453"/>
+    <w:rsid w:val="000B6FE7"/>
     <w:rsid w:val="000E44EE"/>
     <w:rsid w:val="000E5915"/>
     <w:rsid w:val="0012777F"/>
     <w:rsid w:val="001476E4"/>
+    <w:rsid w:val="001F4362"/>
     <w:rsid w:val="0020159E"/>
     <w:rsid w:val="002173EE"/>
     <w:rsid w:val="00217A4D"/>
@@ -52059,6 +51594,7 @@
     <w:rsid w:val="00427646"/>
     <w:rsid w:val="00427C7D"/>
     <w:rsid w:val="00450CBF"/>
+    <w:rsid w:val="00454575"/>
     <w:rsid w:val="00460741"/>
     <w:rsid w:val="00463D1E"/>
     <w:rsid w:val="004649D4"/>
@@ -52074,6 +51610,7 @@
     <w:rsid w:val="005D768A"/>
     <w:rsid w:val="005F19B0"/>
     <w:rsid w:val="00604492"/>
+    <w:rsid w:val="00646D81"/>
     <w:rsid w:val="00667E7A"/>
     <w:rsid w:val="00684E0D"/>
     <w:rsid w:val="006944B7"/>
@@ -52123,11 +51660,13 @@
     <w:rsid w:val="00CD6760"/>
     <w:rsid w:val="00D17CE7"/>
     <w:rsid w:val="00E0364E"/>
+    <w:rsid w:val="00E161FC"/>
     <w:rsid w:val="00E53066"/>
     <w:rsid w:val="00E85F47"/>
     <w:rsid w:val="00E866B4"/>
     <w:rsid w:val="00EB3F8A"/>
     <w:rsid w:val="00F12DE4"/>
+    <w:rsid w:val="00F2245B"/>
     <w:rsid w:val="00F73B1B"/>
     <w:rsid w:val="00FC053B"/>
     <w:rsid w:val="00FC4095"/>
@@ -52894,25 +52433,6 @@
 </file>
 
 <file path=customXml/item2.xml><?xml version="1.0" encoding="utf-8"?>
-<p:properties xmlns:p="http://schemas.microsoft.com/office/2006/metadata/properties" xmlns:xsi="http://www.w3.org/2001/XMLSchema-instance" xmlns:pc="http://schemas.microsoft.com/office/infopath/2007/PartnerControls">
-  <documentManagement/>
-</p:properties>
-</file>
-
-<file path=customXml/item3.xml><?xml version="1.0" encoding="utf-8"?>
-<?mso-contentType ?>
-<FormTemplates xmlns="http://schemas.microsoft.com/sharepoint/v3/contenttype/forms">
-  <Display>DocumentLibraryForm</Display>
-  <Edit>DocumentLibraryForm</Edit>
-  <New>DocumentLibraryForm</New>
-</FormTemplates>
-</file>
-
-<file path=customXml/item4.xml><?xml version="1.0" encoding="utf-8"?>
-<b:Sources xmlns:b="http://schemas.openxmlformats.org/officeDocument/2006/bibliography" xmlns="http://schemas.openxmlformats.org/officeDocument/2006/bibliography" SelectedStyle="\APASixthEditionOfficeOnline.xsl" StyleName="APA" Version="6"/>
-</file>
-
-<file path=customXml/item5.xml><?xml version="1.0" encoding="utf-8"?>
 <ct:contentTypeSchema xmlns:ct="http://schemas.microsoft.com/office/2006/metadata/contentType" xmlns:ma="http://schemas.microsoft.com/office/2006/metadata/properties/metaAttributes" ct:_="" ma:_="" ma:contentTypeName="Dokument" ma:contentTypeID="0x010100AB4421CFC579A4449DC25ACBD6176571" ma:contentTypeVersion="2" ma:contentTypeDescription="Vytvoří nový dokument" ma:contentTypeScope="" ma:versionID="571ac08f18df58b33840592d245cde2d">
   <xsd:schema xmlns:xsd="http://www.w3.org/2001/XMLSchema" xmlns:xs="http://www.w3.org/2001/XMLSchema" xmlns:p="http://schemas.microsoft.com/office/2006/metadata/properties" xmlns:ns2="921a4a19-005d-42bf-a6ee-1c0f1cd55622" targetNamespace="http://schemas.microsoft.com/office/2006/metadata/properties" ma:root="true" ma:fieldsID="4559ad2502f86f60dcde6a0f6b3f7266" ns2:_="">
     <xsd:import namespace="921a4a19-005d-42bf-a6ee-1c0f1cd55622"/>
@@ -53044,6 +52564,25 @@
 </ct:contentTypeSchema>
 </file>
 
+<file path=customXml/item3.xml><?xml version="1.0" encoding="utf-8"?>
+<?mso-contentType ?>
+<FormTemplates xmlns="http://schemas.microsoft.com/sharepoint/v3/contenttype/forms">
+  <Display>DocumentLibraryForm</Display>
+  <Edit>DocumentLibraryForm</Edit>
+  <New>DocumentLibraryForm</New>
+</FormTemplates>
+</file>
+
+<file path=customXml/item4.xml><?xml version="1.0" encoding="utf-8"?>
+<b:Sources xmlns:b="http://schemas.openxmlformats.org/officeDocument/2006/bibliography" xmlns="http://schemas.openxmlformats.org/officeDocument/2006/bibliography" SelectedStyle="\APASixthEditionOfficeOnline.xsl" StyleName="APA" Version="6"/>
+</file>
+
+<file path=customXml/item5.xml><?xml version="1.0" encoding="utf-8"?>
+<p:properties xmlns:p="http://schemas.microsoft.com/office/2006/metadata/properties" xmlns:xsi="http://www.w3.org/2001/XMLSchema-instance" xmlns:pc="http://schemas.microsoft.com/office/infopath/2007/PartnerControls">
+  <documentManagement/>
+</p:properties>
+</file>
+
 <file path=customXml/itemProps1.xml><?xml version="1.0" encoding="utf-8"?>
 <ds:datastoreItem xmlns:ds="http://schemas.openxmlformats.org/officeDocument/2006/customXml" ds:itemID="{55AF091B-3C7A-41E3-B477-F2FDAA23CFDA}">
   <ds:schemaRefs>
@@ -53053,10 +52592,19 @@
 </file>
 
 <file path=customXml/itemProps2.xml><?xml version="1.0" encoding="utf-8"?>
-<ds:datastoreItem xmlns:ds="http://schemas.openxmlformats.org/officeDocument/2006/customXml" ds:itemID="{EDE7D767-2E0D-494D-8433-FAEBD4A37F8E}">
+<ds:datastoreItem xmlns:ds="http://schemas.openxmlformats.org/officeDocument/2006/customXml" ds:itemID="{838CEF72-1B4D-4D33-9891-FFC95F507282}">
   <ds:schemaRefs>
+    <ds:schemaRef ds:uri="http://schemas.microsoft.com/office/2006/metadata/contentType"/>
+    <ds:schemaRef ds:uri="http://schemas.microsoft.com/office/2006/metadata/properties/metaAttributes"/>
+    <ds:schemaRef ds:uri="http://www.w3.org/2001/XMLSchema"/>
     <ds:schemaRef ds:uri="http://schemas.microsoft.com/office/2006/metadata/properties"/>
+    <ds:schemaRef ds:uri="921a4a19-005d-42bf-a6ee-1c0f1cd55622"/>
+    <ds:schemaRef ds:uri="http://schemas.microsoft.com/office/2006/documentManagement/types"/>
     <ds:schemaRef ds:uri="http://schemas.microsoft.com/office/infopath/2007/PartnerControls"/>
+    <ds:schemaRef ds:uri="http://schemas.openxmlformats.org/package/2006/metadata/core-properties"/>
+    <ds:schemaRef ds:uri="http://purl.org/dc/elements/1.1/"/>
+    <ds:schemaRef ds:uri="http://purl.org/dc/terms/"/>
+    <ds:schemaRef ds:uri="http://schemas.microsoft.com/internal/obd"/>
   </ds:schemaRefs>
 </ds:datastoreItem>
 </file>
@@ -53078,19 +52626,10 @@
 </file>
 
 <file path=customXml/itemProps5.xml><?xml version="1.0" encoding="utf-8"?>
-<ds:datastoreItem xmlns:ds="http://schemas.openxmlformats.org/officeDocument/2006/customXml" ds:itemID="{838CEF72-1B4D-4D33-9891-FFC95F507282}">
+<ds:datastoreItem xmlns:ds="http://schemas.openxmlformats.org/officeDocument/2006/customXml" ds:itemID="{EDE7D767-2E0D-494D-8433-FAEBD4A37F8E}">
   <ds:schemaRefs>
-    <ds:schemaRef ds:uri="http://schemas.microsoft.com/office/2006/metadata/contentType"/>
-    <ds:schemaRef ds:uri="http://schemas.microsoft.com/office/2006/metadata/properties/metaAttributes"/>
-    <ds:schemaRef ds:uri="http://www.w3.org/2001/XMLSchema"/>
     <ds:schemaRef ds:uri="http://schemas.microsoft.com/office/2006/metadata/properties"/>
-    <ds:schemaRef ds:uri="921a4a19-005d-42bf-a6ee-1c0f1cd55622"/>
-    <ds:schemaRef ds:uri="http://schemas.microsoft.com/office/2006/documentManagement/types"/>
     <ds:schemaRef ds:uri="http://schemas.microsoft.com/office/infopath/2007/PartnerControls"/>
-    <ds:schemaRef ds:uri="http://schemas.openxmlformats.org/package/2006/metadata/core-properties"/>
-    <ds:schemaRef ds:uri="http://purl.org/dc/elements/1.1/"/>
-    <ds:schemaRef ds:uri="http://purl.org/dc/terms/"/>
-    <ds:schemaRef ds:uri="http://schemas.microsoft.com/internal/obd"/>
   </ds:schemaRefs>
 </ds:datastoreItem>
 </file>
</xml_diff>